<commit_message>
Adjust Orchestrator KB for non compete triage
</commit_message>
<xml_diff>
--- a/docs/orchestrator_kb.docx
+++ b/docs/orchestrator_kb.docx
@@ -27,7 +27,13 @@
     </w:p>
     <w:p>
       <w:r>
-        <w:t>* Only detect CLEAR and EXPLICIT signals in clause-like structures.</w:t>
+        <w:t>* Only dete</w:t>
+      </w:r>
+      <w:r>
+        <w:t>c</w:t>
+      </w:r>
+      <w:r>
+        <w:t>t CLEAR and EXPLICIT signals in clause-like structures.</w:t>
       </w:r>
     </w:p>
     <w:p>
@@ -57,15 +63,7 @@
     </w:p>
     <w:p>
       <w:r>
-        <w:t xml:space="preserve">* ALL Triage Signals must be matched using exact phrase matching, </w:t>
-      </w:r>
-      <w:proofErr w:type="gramStart"/>
-      <w:r>
-        <w:t>case-insensitive</w:t>
-      </w:r>
-      <w:proofErr w:type="gramEnd"/>
-      <w:r>
-        <w:t>.</w:t>
+        <w:t>* ALL Triage Signals must be matched using exact phrase matching, case-insensitive.</w:t>
       </w:r>
     </w:p>
     <w:p>
@@ -75,28 +73,12 @@
     </w:p>
     <w:p>
       <w:r>
-        <w:t xml:space="preserve">* Do NOT route </w:t>
-      </w:r>
-      <w:proofErr w:type="gramStart"/>
-      <w:r>
-        <w:t>based</w:t>
-      </w:r>
-      <w:proofErr w:type="gramEnd"/>
-      <w:r>
-        <w:t xml:space="preserve"> only on headings unless the clause body contains a matching triage signal.</w:t>
-      </w:r>
-    </w:p>
-    <w:p>
-      <w:r>
-        <w:t xml:space="preserve">* Do NOT route </w:t>
-      </w:r>
-      <w:proofErr w:type="gramStart"/>
-      <w:r>
-        <w:t>based</w:t>
-      </w:r>
-      <w:proofErr w:type="gramEnd"/>
-      <w:r>
-        <w:t xml:space="preserve"> only on standard NDA confidentiality language unless the clause also contains a specific triage signal below.</w:t>
+        <w:t>* Do NOT route based only on headings unless the clause body contains a matching triage signal.</w:t>
+      </w:r>
+    </w:p>
+    <w:p>
+      <w:r>
+        <w:t>* Do NOT route based only on standard NDA confidentiality language unless the clause also contains a specific triage signal below.</w:t>
       </w:r>
     </w:p>
     <w:p>
@@ -343,15 +325,7 @@
     </w:p>
     <w:p>
       <w:r>
-        <w:t>* Parties are defined as “Party/Parties</w:t>
-      </w:r>
-      <w:proofErr w:type="gramStart"/>
-      <w:r>
-        <w:t>”</w:t>
-      </w:r>
-      <w:proofErr w:type="gramEnd"/>
-      <w:r>
-        <w:t xml:space="preserve"> and confidentiality obligations apply to “Each Party” or “Either Party”</w:t>
+        <w:t>* Parties are defined as “Party/Parties” and confidentiality obligations apply to “Each Party” or “Either Party”</w:t>
       </w:r>
     </w:p>
     <w:p>
@@ -382,15 +356,7 @@
     </w:p>
     <w:p>
       <w:r>
-        <w:t xml:space="preserve">  * </w:t>
-      </w:r>
-      <w:proofErr w:type="gramStart"/>
-      <w:r>
-        <w:t>the</w:t>
-      </w:r>
-      <w:proofErr w:type="gramEnd"/>
-      <w:r>
-        <w:t xml:space="preserve"> recipient executes an “Undertaking” rather than a mutual NDA</w:t>
+        <w:t xml:space="preserve">  * the recipient executes an “Undertaking” rather than a mutual NDA</w:t>
       </w:r>
     </w:p>
     <w:p>
@@ -400,15 +366,7 @@
     </w:p>
     <w:p>
       <w:r>
-        <w:t xml:space="preserve">* Do NOT route Unilateral NDA if </w:t>
-      </w:r>
-      <w:proofErr w:type="gramStart"/>
-      <w:r>
-        <w:t>all of</w:t>
-      </w:r>
-      <w:proofErr w:type="gramEnd"/>
-      <w:r>
-        <w:t xml:space="preserve"> the following are present:</w:t>
+        <w:t>* Do NOT route Unilateral NDA if all of the following are present:</w:t>
       </w:r>
     </w:p>
     <w:p>
@@ -453,15 +411,7 @@
     </w:p>
     <w:p>
       <w:r>
-        <w:t xml:space="preserve">* Do NOT route Unilateral NDA if the same extracted snippets contain </w:t>
-      </w:r>
-      <w:proofErr w:type="gramStart"/>
-      <w:r>
-        <w:t>all of</w:t>
-      </w:r>
-      <w:proofErr w:type="gramEnd"/>
-      <w:r>
-        <w:t xml:space="preserve"> the following:</w:t>
+        <w:t>* Do NOT route Unilateral NDA if the same extracted snippets contain all of the following:</w:t>
       </w:r>
     </w:p>
     <w:p>
@@ -486,68 +436,28 @@
     </w:p>
     <w:p>
       <w:r>
-        <w:t xml:space="preserve">* Do NOT route Unilateral NDA if </w:t>
-      </w:r>
-      <w:proofErr w:type="gramStart"/>
-      <w:r>
-        <w:t>all of</w:t>
-      </w:r>
-      <w:proofErr w:type="gramEnd"/>
-      <w:r>
-        <w:t xml:space="preserve"> the following are present:</w:t>
-      </w:r>
-    </w:p>
-    <w:p>
-      <w:r>
-        <w:t xml:space="preserve">  * </w:t>
-      </w:r>
-      <w:proofErr w:type="gramStart"/>
-      <w:r>
-        <w:t>the</w:t>
-      </w:r>
-      <w:proofErr w:type="gramEnd"/>
-      <w:r>
-        <w:t xml:space="preserve"> agreement identifies one party as “Discloser”</w:t>
-      </w:r>
-    </w:p>
-    <w:p>
-      <w:r>
-        <w:t xml:space="preserve">  * </w:t>
-      </w:r>
-      <w:proofErr w:type="gramStart"/>
-      <w:r>
-        <w:t>the</w:t>
-      </w:r>
-      <w:proofErr w:type="gramEnd"/>
-      <w:r>
-        <w:t xml:space="preserve"> agreement identifies the other party as “Recipient”</w:t>
-      </w:r>
-    </w:p>
-    <w:p>
-      <w:r>
-        <w:t xml:space="preserve">  * </w:t>
-      </w:r>
-      <w:proofErr w:type="gramStart"/>
-      <w:r>
-        <w:t>the</w:t>
-      </w:r>
-      <w:proofErr w:type="gramEnd"/>
-      <w:r>
-        <w:t xml:space="preserve"> agreement references an existing “Mutual NDA”</w:t>
+        <w:t>* Do NOT route Unilateral NDA if all of the following are present:</w:t>
+      </w:r>
+    </w:p>
+    <w:p>
+      <w:r>
+        <w:t xml:space="preserve">  * the agreement identifies one party as “Discloser”</w:t>
+      </w:r>
+    </w:p>
+    <w:p>
+      <w:r>
+        <w:t xml:space="preserve">  * the agreement identifies the other party as “Recipient”</w:t>
+      </w:r>
+    </w:p>
+    <w:p>
+      <w:r>
+        <w:t xml:space="preserve">  * the agreement references an existing “Mutual NDA”</w:t>
       </w:r>
     </w:p>
     <w:p>
       <w:r>
         <w:lastRenderedPageBreak/>
-        <w:t xml:space="preserve">  * </w:t>
-      </w:r>
-      <w:proofErr w:type="gramStart"/>
-      <w:r>
-        <w:t>the</w:t>
-      </w:r>
-      <w:proofErr w:type="gramEnd"/>
-      <w:r>
-        <w:t xml:space="preserve"> agreement states that confidentiality protection is required in connection with, or in compliance with, the Mutual NDA</w:t>
+        <w:t xml:space="preserve">  * the agreement states that confidentiality protection is required in connection with, or in compliance with, the Mutual NDA</w:t>
       </w:r>
     </w:p>
     <w:p>
@@ -562,15 +472,7 @@
     </w:p>
     <w:p>
       <w:r>
-        <w:t xml:space="preserve">* If the protected information is consistently information of only one party, and the receiving obligations are imposed only on “you,” “your Representatives,” “Recipient,” or the receiving party, route Unilateral NDA unless a </w:t>
-      </w:r>
-      <w:proofErr w:type="gramStart"/>
-      <w:r>
-        <w:t>same-category</w:t>
-      </w:r>
-      <w:proofErr w:type="gramEnd"/>
-      <w:r>
-        <w:t xml:space="preserve"> Do NOT Trigger rule applies.</w:t>
+        <w:t>* If the protected information is consistently information of only one party, and the receiving obligations are imposed only on “you,” “your Representatives,” “Recipient,” or the receiving party, route Unilateral NDA unless a same-category Do NOT Trigger rule applies.</w:t>
       </w:r>
     </w:p>
     <w:p>
@@ -884,55 +786,26 @@
     <w:p>
       <w:r>
         <w:lastRenderedPageBreak/>
+        <w:t>* sign NDAs, undertakings, acknowledgements, or similar documents directly with the counterparty; OR</w:t>
+      </w:r>
+    </w:p>
+    <w:p>
+      <w:r>
+        <w:t>* become directly bound by confidentiality obligations under the NDA itself; OR</w:t>
+      </w:r>
+    </w:p>
+    <w:p>
+      <w:r>
         <w:t xml:space="preserve">* </w:t>
       </w:r>
-      <w:proofErr w:type="gramStart"/>
-      <w:r>
-        <w:t>sign</w:t>
-      </w:r>
-      <w:proofErr w:type="gramEnd"/>
-      <w:r>
-        <w:t xml:space="preserve"> NDAs, undertakings, acknowledgements, or similar documents directly with the counterparty; OR</w:t>
-      </w:r>
-    </w:p>
-    <w:p>
-      <w:r>
-        <w:t xml:space="preserve">* </w:t>
-      </w:r>
-      <w:proofErr w:type="gramStart"/>
-      <w:r>
-        <w:t>become</w:t>
-      </w:r>
-      <w:proofErr w:type="gramEnd"/>
-      <w:r>
-        <w:t xml:space="preserve"> directly bound by confidentiality obligations under the NDA itself; OR</w:t>
-      </w:r>
-    </w:p>
-    <w:p>
-      <w:r>
-        <w:t xml:space="preserve">* </w:t>
-      </w:r>
-      <w:proofErr w:type="gramStart"/>
-      <w:r>
-        <w:t>become</w:t>
-      </w:r>
-      <w:proofErr w:type="gramEnd"/>
-      <w:r>
-        <w:t xml:space="preserve"> directly bound through a separate NDA, undertaking, acknowledgement, or written agreement with the counterparty.</w:t>
+      <w:r>
+        <w:t>become directly bound through a separate NDA, undertaking, acknowledgement, or written agreement with the counterparty.</w:t>
       </w:r>
     </w:p>
     <w:p/>
     <w:p>
       <w:r>
-        <w:t xml:space="preserve">This risk applies where the NDA creates, or appears to </w:t>
-      </w:r>
-      <w:proofErr w:type="gramStart"/>
-      <w:r>
-        <w:t>create,</w:t>
-      </w:r>
-      <w:proofErr w:type="gramEnd"/>
-      <w:r>
-        <w:t xml:space="preserve"> direct contractual-style obligations on Accenture personnel or representatives, rather than confidentiality obligations remaining solely between Accenture and the counterparty as legal entities.</w:t>
+        <w:t>This risk applies where the NDA creates, or appears to create, direct contractual-style obligations on Accenture personnel or representatives, rather than confidentiality obligations remaining solely between Accenture and the counterparty as legal entities.</w:t>
       </w:r>
     </w:p>
     <w:p>
@@ -982,15 +855,7 @@
     </w:p>
     <w:p>
       <w:r>
-        <w:t xml:space="preserve">* “execute a non-disclosure undertaking in </w:t>
-      </w:r>
-      <w:proofErr w:type="spellStart"/>
-      <w:r>
-        <w:t>favour</w:t>
-      </w:r>
-      <w:proofErr w:type="spellEnd"/>
-      <w:r>
-        <w:t xml:space="preserve"> of Client”</w:t>
+        <w:t>* “execute a non-disclosure undertaking in favour of Client”</w:t>
       </w:r>
     </w:p>
     <w:p>
@@ -1037,15 +902,7 @@
     </w:p>
     <w:p>
       <w:r>
-        <w:t xml:space="preserve">* Personnel are bound by confidentiality obligations substantially </w:t>
-      </w:r>
-      <w:proofErr w:type="gramStart"/>
-      <w:r>
-        <w:t>similar to</w:t>
-      </w:r>
-      <w:proofErr w:type="gramEnd"/>
-      <w:r>
-        <w:t xml:space="preserve"> the NDA</w:t>
+        <w:t>* Personnel are bound by confidentiality obligations substantially similar to the NDA</w:t>
       </w:r>
     </w:p>
     <w:p>
@@ -1055,28 +912,12 @@
     </w:p>
     <w:p>
       <w:r>
-        <w:t xml:space="preserve">* Personnel are under </w:t>
-      </w:r>
-      <w:proofErr w:type="gramStart"/>
-      <w:r>
-        <w:t>a duty</w:t>
-      </w:r>
-      <w:proofErr w:type="gramEnd"/>
-      <w:r>
-        <w:t xml:space="preserve"> of non-disclosure</w:t>
-      </w:r>
-    </w:p>
-    <w:p>
-      <w:r>
-        <w:t xml:space="preserve">* Personnel are under </w:t>
-      </w:r>
-      <w:proofErr w:type="gramStart"/>
-      <w:r>
-        <w:t>a duty</w:t>
-      </w:r>
-      <w:proofErr w:type="gramEnd"/>
-      <w:r>
-        <w:t xml:space="preserve"> to maintain confidentiality, security, or integrity</w:t>
+        <w:t>* Personnel are under a duty of non-disclosure</w:t>
+      </w:r>
+    </w:p>
+    <w:p>
+      <w:r>
+        <w:t>* Personnel are under a duty to maintain confidentiality, security, or integrity</w:t>
       </w:r>
     </w:p>
     <w:p>
@@ -1137,15 +978,7 @@
     </w:p>
     <w:p>
       <w:r>
-        <w:t xml:space="preserve">* Clause contains </w:t>
-      </w:r>
-      <w:proofErr w:type="gramStart"/>
-      <w:r>
-        <w:t>all of</w:t>
-      </w:r>
-      <w:proofErr w:type="gramEnd"/>
-      <w:r>
-        <w:t xml:space="preserve"> the following:</w:t>
+        <w:t>* Clause contains all of the following:</w:t>
       </w:r>
     </w:p>
     <w:p>
@@ -1210,15 +1043,7 @@
     </w:p>
     <w:p>
       <w:r>
-        <w:t xml:space="preserve">  * “in </w:t>
-      </w:r>
-      <w:proofErr w:type="spellStart"/>
-      <w:r>
-        <w:t>favour</w:t>
-      </w:r>
-      <w:proofErr w:type="spellEnd"/>
-      <w:r>
-        <w:t xml:space="preserve"> of Client”</w:t>
+        <w:t xml:space="preserve">  * “in favour of Client”</w:t>
       </w:r>
     </w:p>
     <w:p>
@@ -1571,80 +1396,32 @@
     <w:p>
       <w:r>
         <w:lastRenderedPageBreak/>
-        <w:t xml:space="preserve">For </w:t>
-      </w:r>
-      <w:proofErr w:type="gramStart"/>
-      <w:r>
-        <w:t>Non-Solicitation</w:t>
-      </w:r>
-      <w:proofErr w:type="gramEnd"/>
-      <w:r>
-        <w:t xml:space="preserve"> triage only, if any Non-Solicitation Triage Signal is detected, the extracted snippet MUST include:</w:t>
-      </w:r>
-    </w:p>
-    <w:p>
-      <w:r>
-        <w:t xml:space="preserve">* </w:t>
-      </w:r>
-      <w:proofErr w:type="gramStart"/>
-      <w:r>
-        <w:t>the</w:t>
-      </w:r>
-      <w:proofErr w:type="gramEnd"/>
-      <w:r>
-        <w:t xml:space="preserve"> full sentence containing the matched Triage Signal;</w:t>
-      </w:r>
-    </w:p>
-    <w:p>
-      <w:r>
-        <w:t xml:space="preserve">* </w:t>
-      </w:r>
-      <w:proofErr w:type="gramStart"/>
-      <w:r>
-        <w:t>the</w:t>
-      </w:r>
-      <w:proofErr w:type="gramEnd"/>
-      <w:r>
-        <w:t xml:space="preserve"> immediately preceding sentence, if any;</w:t>
-      </w:r>
-    </w:p>
-    <w:p>
-      <w:r>
-        <w:t xml:space="preserve">* </w:t>
-      </w:r>
-      <w:proofErr w:type="gramStart"/>
-      <w:r>
-        <w:t>the</w:t>
-      </w:r>
-      <w:proofErr w:type="gramEnd"/>
-      <w:r>
-        <w:t xml:space="preserve"> immediately following sentence, if any; and</w:t>
-      </w:r>
-    </w:p>
-    <w:p>
-      <w:r>
-        <w:t xml:space="preserve">* </w:t>
-      </w:r>
-      <w:proofErr w:type="gramStart"/>
-      <w:r>
-        <w:t>any</w:t>
-      </w:r>
-      <w:proofErr w:type="gramEnd"/>
-      <w:r>
-        <w:t xml:space="preserve"> carve-out sentence in the same clause beginning with “However,” “Provided,” “provided, however,” “Such restrictions shall not apply,” “This shall not prohibit,” or similar carve-out wording.</w:t>
-      </w:r>
-    </w:p>
-    <w:p>
-      <w:r>
-        <w:t>* “</w:t>
-      </w:r>
-      <w:proofErr w:type="gramStart"/>
-      <w:r>
-        <w:t>However</w:t>
-      </w:r>
-      <w:proofErr w:type="gramEnd"/>
-      <w:r>
-        <w:t>”</w:t>
+        <w:t>For Non-Solicitation triage only, if any Non-Solicitation Triage Signal is detected, the extracted snippet MUST include:</w:t>
+      </w:r>
+    </w:p>
+    <w:p>
+      <w:r>
+        <w:t>* the full sentence containing the matched Triage Signal;</w:t>
+      </w:r>
+    </w:p>
+    <w:p>
+      <w:r>
+        <w:t>* the immediately preceding sentence, if any;</w:t>
+      </w:r>
+    </w:p>
+    <w:p>
+      <w:r>
+        <w:t>* the immediately following sentence, if any; and</w:t>
+      </w:r>
+    </w:p>
+    <w:p>
+      <w:r>
+        <w:t>* any carve-out sentence in the same clause beginning with “However,” “Provided,” “provided, however,” “Such restrictions shall not apply,” “This shall not prohibit,” or similar carve-out wording.</w:t>
+      </w:r>
+    </w:p>
+    <w:p>
+      <w:r>
+        <w:t>* “However”</w:t>
       </w:r>
     </w:p>
     <w:p>
@@ -1664,15 +1441,7 @@
     </w:p>
     <w:p>
       <w:r>
-        <w:t xml:space="preserve">For </w:t>
-      </w:r>
-      <w:proofErr w:type="gramStart"/>
-      <w:r>
-        <w:t>Non-Solicitation</w:t>
-      </w:r>
-      <w:proofErr w:type="gramEnd"/>
-      <w:r>
-        <w:t xml:space="preserve"> triage only, if the snippet contains “solicit for employment or engagement,” the extracted snippet MUST include any same-clause carve-out sentence containing:</w:t>
+        <w:t>For Non-Solicitation triage only, if the snippet contains “solicit for employment or engagement,” the extracted snippet MUST include any same-clause carve-out sentence containing:</w:t>
       </w:r>
     </w:p>
     <w:p>
@@ -1697,15 +1466,7 @@
     </w:p>
     <w:p>
       <w:r>
-        <w:t xml:space="preserve">If the carve-out sentence is not included in the extracted snippet, DO NOT finalize routing for </w:t>
-      </w:r>
-      <w:proofErr w:type="gramStart"/>
-      <w:r>
-        <w:t>Non-Solicitation</w:t>
-      </w:r>
-      <w:proofErr w:type="gramEnd"/>
-      <w:r>
-        <w:t xml:space="preserve"> until the full clause-level snippet has been captured.</w:t>
+        <w:t>If the carve-out sentence is not included in the extracted snippet, DO NOT finalize routing for Non-Solicitation until the full clause-level snippet has been captured.</w:t>
       </w:r>
     </w:p>
     <w:p>
@@ -1917,28 +1678,12 @@
     </w:p>
     <w:p>
       <w:r>
-        <w:t xml:space="preserve">* Clause is acceptable employee non-solicitation language under the playbook and does not contain a </w:t>
-      </w:r>
-      <w:proofErr w:type="gramStart"/>
-      <w:r>
-        <w:t>liquidated damages</w:t>
-      </w:r>
-      <w:proofErr w:type="gramEnd"/>
-      <w:r>
-        <w:t>, non-compete, or country supplement trigger</w:t>
-      </w:r>
-    </w:p>
-    <w:p>
-      <w:r>
-        <w:t xml:space="preserve">* Clause contains </w:t>
-      </w:r>
-      <w:proofErr w:type="gramStart"/>
-      <w:r>
-        <w:t>all of</w:t>
-      </w:r>
-      <w:proofErr w:type="gramEnd"/>
-      <w:r>
-        <w:t xml:space="preserve"> the following:</w:t>
+        <w:t>* Clause is acceptable employee non-solicitation language under the playbook and does not contain a liquidated damages, non-compete, or country supplement trigger</w:t>
+      </w:r>
+    </w:p>
+    <w:p>
+      <w:r>
+        <w:t>* Clause contains all of the following:</w:t>
       </w:r>
     </w:p>
     <w:p>
@@ -1963,15 +1708,7 @@
     </w:p>
     <w:p>
       <w:r>
-        <w:t xml:space="preserve">* Clause contains </w:t>
-      </w:r>
-      <w:proofErr w:type="gramStart"/>
-      <w:r>
-        <w:t>all of</w:t>
-      </w:r>
-      <w:proofErr w:type="gramEnd"/>
-      <w:r>
-        <w:t xml:space="preserve"> the following:</w:t>
+        <w:t>* Clause contains all of the following:</w:t>
       </w:r>
     </w:p>
     <w:p>
@@ -1996,15 +1733,7 @@
     </w:p>
     <w:p>
       <w:r>
-        <w:t xml:space="preserve">* Clause contains </w:t>
-      </w:r>
-      <w:proofErr w:type="gramStart"/>
-      <w:r>
-        <w:t>all of</w:t>
-      </w:r>
-      <w:proofErr w:type="gramEnd"/>
-      <w:r>
-        <w:t xml:space="preserve"> the following:</w:t>
+        <w:t>* Clause contains all of the following:</w:t>
       </w:r>
     </w:p>
     <w:p>
@@ -2030,15 +1759,7 @@
     </w:p>
     <w:p>
       <w:r>
-        <w:t xml:space="preserve">* Clause contains </w:t>
-      </w:r>
-      <w:proofErr w:type="gramStart"/>
-      <w:r>
-        <w:t>all of</w:t>
-      </w:r>
-      <w:proofErr w:type="gramEnd"/>
-      <w:r>
-        <w:t xml:space="preserve"> the following:</w:t>
+        <w:t>* Clause contains all of the following:</w:t>
       </w:r>
     </w:p>
     <w:p>
@@ -2058,15 +1779,7 @@
     </w:p>
     <w:p>
       <w:r>
-        <w:t xml:space="preserve">* Clause contains </w:t>
-      </w:r>
-      <w:proofErr w:type="gramStart"/>
-      <w:r>
-        <w:t>all of</w:t>
-      </w:r>
-      <w:proofErr w:type="gramEnd"/>
-      <w:r>
-        <w:t xml:space="preserve"> the following:</w:t>
+        <w:t>* Clause contains all of the following:</w:t>
       </w:r>
     </w:p>
     <w:p>
@@ -2091,15 +1804,7 @@
     </w:p>
     <w:p>
       <w:r>
-        <w:t xml:space="preserve">* Do NOT route </w:t>
-      </w:r>
-      <w:proofErr w:type="gramStart"/>
-      <w:r>
-        <w:t>Non-Solicitation</w:t>
-      </w:r>
-      <w:proofErr w:type="gramEnd"/>
-      <w:r>
-        <w:t xml:space="preserve"> if the only matched non-solicitation language is a mutual employee or independent contractor restriction and the same clause contains:</w:t>
+        <w:t>* Do NOT route Non-Solicitation if the only matched non-solicitation language is a mutual employee or independent contractor restriction and the same clause contains:</w:t>
       </w:r>
     </w:p>
     <w:p>
@@ -2129,23 +1834,7 @@
     </w:p>
     <w:p>
       <w:r>
-        <w:t xml:space="preserve">* Do NOT route </w:t>
-      </w:r>
-      <w:proofErr w:type="gramStart"/>
-      <w:r>
-        <w:t>Non-Solicitation</w:t>
-      </w:r>
-      <w:proofErr w:type="gramEnd"/>
-      <w:r>
-        <w:t xml:space="preserve"> if the same </w:t>
-      </w:r>
-      <w:proofErr w:type="gramStart"/>
-      <w:r>
-        <w:t>Non-Solicitation</w:t>
-      </w:r>
-      <w:proofErr w:type="gramEnd"/>
-      <w:r>
-        <w:t xml:space="preserve"> clause contains BOTH:</w:t>
+        <w:t>* Do NOT route Non-Solicitation if the same Non-Solicitation clause contains BOTH:</w:t>
       </w:r>
     </w:p>
     <w:p>
@@ -2160,28 +1849,12 @@
     </w:p>
     <w:p>
       <w:r>
-        <w:t xml:space="preserve">* Do NOT route </w:t>
-      </w:r>
-      <w:proofErr w:type="gramStart"/>
-      <w:r>
-        <w:t>Non-Solicitation</w:t>
-      </w:r>
-      <w:proofErr w:type="gramEnd"/>
-      <w:r>
-        <w:t xml:space="preserve"> if the clause is limited to officers only and contains standard public-recruitment carve-outs.</w:t>
-      </w:r>
-    </w:p>
-    <w:p>
-      <w:r>
-        <w:t xml:space="preserve">* Clause contains </w:t>
-      </w:r>
-      <w:proofErr w:type="gramStart"/>
-      <w:r>
-        <w:t>all of</w:t>
-      </w:r>
-      <w:proofErr w:type="gramEnd"/>
-      <w:r>
-        <w:t xml:space="preserve"> the following:</w:t>
+        <w:t>* Do NOT route Non-Solicitation if the clause is limited to officers only and contains standard public-recruitment carve-outs.</w:t>
+      </w:r>
+    </w:p>
+    <w:p>
+      <w:r>
+        <w:t>* Clause contains all of the following:</w:t>
       </w:r>
     </w:p>
     <w:p>
@@ -2207,15 +1880,7 @@
     </w:p>
     <w:p>
       <w:r>
-        <w:t xml:space="preserve">* Clause contains </w:t>
-      </w:r>
-      <w:proofErr w:type="gramStart"/>
-      <w:r>
-        <w:t>all of</w:t>
-      </w:r>
-      <w:proofErr w:type="gramEnd"/>
-      <w:r>
-        <w:t xml:space="preserve"> the following:</w:t>
+        <w:t>* Clause contains all of the following:</w:t>
       </w:r>
     </w:p>
     <w:p>
@@ -2240,15 +1905,7 @@
     </w:p>
     <w:p>
       <w:r>
-        <w:t xml:space="preserve">* Clause contains </w:t>
-      </w:r>
-      <w:proofErr w:type="gramStart"/>
-      <w:r>
-        <w:t>all of</w:t>
-      </w:r>
-      <w:proofErr w:type="gramEnd"/>
-      <w:r>
-        <w:t xml:space="preserve"> the following:</w:t>
+        <w:t>* Clause contains all of the following:</w:t>
       </w:r>
     </w:p>
     <w:p>
@@ -2283,15 +1940,7 @@
     </w:p>
     <w:p>
       <w:r>
-        <w:t xml:space="preserve">* If the NDA is connected to the Nordics Market Unit and contains any non-solicitation clause, route to </w:t>
-      </w:r>
-      <w:proofErr w:type="gramStart"/>
-      <w:r>
-        <w:t>Non-Solicitation</w:t>
-      </w:r>
-      <w:proofErr w:type="gramEnd"/>
-      <w:r>
-        <w:t xml:space="preserve"> even if standard carve-outs are present.</w:t>
+        <w:t>* If the NDA is connected to the Nordics Market Unit and contains any non-solicitation clause, route to Non-Solicitation even if standard carve-outs are present.</w:t>
       </w:r>
     </w:p>
     <w:p>
@@ -2326,6 +1975,15 @@
     </w:p>
     <w:p>
       <w:r>
+        <w:t xml:space="preserve">This risk also includes obligations requiring Accenture to disclose, notify, indicate, or report existing or potential work, contracts, consulting relationships, or service relationships with </w:t>
+      </w:r>
+      <w:r>
+        <w:lastRenderedPageBreak/>
+        <w:t>competitors of the client where the obligation is tied to competitor status and may constrain Accenture’s ability to serve other clients or competitors.</w:t>
+      </w:r>
+    </w:p>
+    <w:p>
+      <w:r>
         <w:t xml:space="preserve"> </w:t>
       </w:r>
     </w:p>
@@ -2336,117 +1994,117 @@
     </w:p>
     <w:p>
       <w:r>
+        <w:t>* “non-compete”</w:t>
+      </w:r>
+    </w:p>
+    <w:p>
+      <w:r>
+        <w:t>* “non-competition”</w:t>
+      </w:r>
+    </w:p>
+    <w:p>
+      <w:r>
+        <w:t>* “exclusive” or “exclusivity”</w:t>
+      </w:r>
+    </w:p>
+    <w:p>
+      <w:r>
+        <w:t>* “exclusive basis”</w:t>
+      </w:r>
+    </w:p>
+    <w:p>
+      <w:r>
+        <w:t>* “competition restriction”</w:t>
+      </w:r>
+    </w:p>
+    <w:p>
+      <w:r>
+        <w:t>* “restrict services” to third parties</w:t>
+      </w:r>
+    </w:p>
+    <w:p>
+      <w:r>
+        <w:t>* “cannot provide services” to competitors or other clients</w:t>
+      </w:r>
+    </w:p>
+    <w:p>
+      <w:r>
+        <w:t>* “shall not provide services” to competitors or other clients</w:t>
+      </w:r>
+    </w:p>
+    <w:p>
+      <w:r>
+        <w:t>* “shall not enter into direct competition”</w:t>
+      </w:r>
+    </w:p>
+    <w:p>
+      <w:r>
+        <w:t>* “not to enter into direct competition”</w:t>
+      </w:r>
+    </w:p>
+    <w:p>
+      <w:r>
+        <w:t>* “Client Competitor”</w:t>
+      </w:r>
+    </w:p>
+    <w:p>
+      <w:r>
+        <w:t>* “competitor” or “competing enterprise” in a clause restricting business activity</w:t>
+      </w:r>
+    </w:p>
+    <w:p>
+      <w:r>
+        <w:t>* “like industry” in a clause restricting business activity</w:t>
+      </w:r>
+    </w:p>
+    <w:p>
+      <w:r>
+        <w:t>* “offer identical or like services”</w:t>
+      </w:r>
+    </w:p>
+    <w:p>
+      <w:r>
+        <w:t>* “competitive disadvantage”</w:t>
+      </w:r>
+    </w:p>
+    <w:p>
+      <w:r>
+        <w:t>* “causing any competition”</w:t>
+      </w:r>
+    </w:p>
+    <w:p>
+      <w:r>
+        <w:t>* “deal with one another on an exclusive basis”</w:t>
+      </w:r>
+    </w:p>
+    <w:p>
+      <w:r>
+        <w:t>* “restricts future services”</w:t>
+      </w:r>
+    </w:p>
+    <w:p>
+      <w:r>
+        <w:t>* “provide future services” to other clients is restricted</w:t>
+      </w:r>
+    </w:p>
+    <w:p>
+      <w:r>
+        <w:t>* “pursuing business opportunities” is restricted</w:t>
+      </w:r>
+    </w:p>
+    <w:p>
+      <w:r>
+        <w:t>* “refrain from entering into any new business relationship”</w:t>
+      </w:r>
+    </w:p>
+    <w:p>
+      <w:r>
+        <w:t>* “not directly or indirectly contact, or negotiate with, a third party regarding a potential business relationship”</w:t>
+      </w:r>
+    </w:p>
+    <w:p>
+      <w:r>
         <w:lastRenderedPageBreak/>
-        <w:t>* “non-compete”</w:t>
-      </w:r>
-    </w:p>
-    <w:p>
-      <w:r>
-        <w:t>* “non-competition”</w:t>
-      </w:r>
-    </w:p>
-    <w:p>
-      <w:r>
-        <w:t>* “exclusive” or “exclusivity”</w:t>
-      </w:r>
-    </w:p>
-    <w:p>
-      <w:r>
-        <w:t>* “exclusive basis”</w:t>
-      </w:r>
-    </w:p>
-    <w:p>
-      <w:r>
-        <w:t>* “competition restriction”</w:t>
-      </w:r>
-    </w:p>
-    <w:p>
-      <w:r>
-        <w:t>* “restrict services” to third parties</w:t>
-      </w:r>
-    </w:p>
-    <w:p>
-      <w:r>
-        <w:t>* “cannot provide services” to competitors or other clients</w:t>
-      </w:r>
-    </w:p>
-    <w:p>
-      <w:r>
-        <w:t>* “shall not provide services” to competitors or other clients</w:t>
-      </w:r>
-    </w:p>
-    <w:p>
-      <w:r>
-        <w:t>* “shall not enter into direct competition”</w:t>
-      </w:r>
-    </w:p>
-    <w:p>
-      <w:r>
-        <w:t>* “not to enter into direct competition”</w:t>
-      </w:r>
-    </w:p>
-    <w:p>
-      <w:r>
-        <w:t>* “Client Competitor”</w:t>
-      </w:r>
-    </w:p>
-    <w:p>
-      <w:r>
-        <w:t>* “competitor” or “competing enterprise” in a clause restricting business activity</w:t>
-      </w:r>
-    </w:p>
-    <w:p>
-      <w:r>
-        <w:t>* “like industry” in a clause restricting business activity</w:t>
-      </w:r>
-    </w:p>
-    <w:p>
-      <w:r>
-        <w:t>* “offer identical or like services”</w:t>
-      </w:r>
-    </w:p>
-    <w:p>
-      <w:r>
-        <w:t>* “competitive disadvantage”</w:t>
-      </w:r>
-    </w:p>
-    <w:p>
-      <w:r>
-        <w:t>* “causing any competition”</w:t>
-      </w:r>
-    </w:p>
-    <w:p>
-      <w:r>
-        <w:t>* “deal with one another on an exclusive basis”</w:t>
-      </w:r>
-    </w:p>
-    <w:p>
-      <w:r>
-        <w:t>* “restricts future services”</w:t>
-      </w:r>
-    </w:p>
-    <w:p>
-      <w:r>
-        <w:t>* “provide future services” to other clients is restricted</w:t>
-      </w:r>
-    </w:p>
-    <w:p>
-      <w:r>
-        <w:t>* “pursuing business opportunities” is restricted</w:t>
-      </w:r>
-    </w:p>
-    <w:p>
-      <w:r>
-        <w:t>* “refrain from entering into any new business relationship”</w:t>
-      </w:r>
-    </w:p>
-    <w:p>
-      <w:r>
-        <w:t>* “not directly or indirectly contact, or negotiate with, a third party regarding a potential business relationship”</w:t>
-      </w:r>
-    </w:p>
-    <w:p>
-      <w:r>
         <w:t>* “persuade any customer” to cease, reduce, or discontinue business</w:t>
       </w:r>
     </w:p>
@@ -2462,37 +2120,122 @@
     </w:p>
     <w:p>
       <w:r>
+        <w:t>* “induce any vendor” to cease, reduce, or discontinue business</w:t>
+      </w:r>
+    </w:p>
+    <w:p>
+      <w:r>
+        <w:t>* “cease purchasing goods or services”</w:t>
+      </w:r>
+    </w:p>
+    <w:p>
+      <w:r>
+        <w:t>* “cease selling goods and services”</w:t>
+      </w:r>
+    </w:p>
+    <w:p>
+      <w:r>
+        <w:t>* “reduce or discontinue any business relationship”</w:t>
+      </w:r>
+    </w:p>
+    <w:p>
+      <w:r>
+        <w:t>* “prevented or restricted from performing services”</w:t>
+      </w:r>
+    </w:p>
+    <w:p>
+      <w:r>
+        <w:t>* “prevented or restricted from pursuing business opportunities”</w:t>
+      </w:r>
+    </w:p>
+    <w:p>
+      <w:r>
+        <w:t>* “direct competitor of the Client”</w:t>
+      </w:r>
+    </w:p>
+    <w:p>
+      <w:r>
+        <w:t>* “contracted to, working for, or consulting for”</w:t>
+      </w:r>
+    </w:p>
+    <w:p>
+      <w:r>
+        <w:t>* “working for, or consulting for any company which is a direct competitor”</w:t>
+      </w:r>
+    </w:p>
+    <w:p>
+      <w:r>
+        <w:t>* “indicate to you immediately” combined with “direct competitor”</w:t>
+      </w:r>
+    </w:p>
+    <w:p>
+      <w:r>
+        <w:t>* “notify” or “indicate” combined with “direct competitor of the Client”</w:t>
+      </w:r>
+    </w:p>
+    <w:p>
+      <w:r>
+        <w:t>* “disclose” or “report” combined with “working for” and “direct competitor”</w:t>
+      </w:r>
+    </w:p>
+    <w:p>
+      <w:r>
+        <w:t>* Clause contains BOTH:</w:t>
+      </w:r>
+    </w:p>
+    <w:p>
+      <w:r>
+        <w:t xml:space="preserve">  * “direct competitor of the Client”</w:t>
+      </w:r>
+    </w:p>
+    <w:p>
+      <w:r>
+        <w:t xml:space="preserve">  * “contracted to, working for, or consulting for”</w:t>
+      </w:r>
+    </w:p>
+    <w:p>
+      <w:r>
+        <w:t>* Clause contains BOTH:</w:t>
+      </w:r>
+    </w:p>
+    <w:p>
+      <w:r>
+        <w:t xml:space="preserve">  * “direct competitor”</w:t>
+      </w:r>
+    </w:p>
+    <w:p>
+      <w:r>
+        <w:t xml:space="preserve">  * “working for, or consulting for”</w:t>
+      </w:r>
+    </w:p>
+    <w:p>
+      <w:r>
+        <w:t>* Clause contains ALL of the following:</w:t>
+      </w:r>
+    </w:p>
+    <w:p>
+      <w:r>
+        <w:t xml:space="preserve">  * “indicate”</w:t>
+      </w:r>
+    </w:p>
+    <w:p>
+      <w:r>
+        <w:t xml:space="preserve">  * “working for”</w:t>
+      </w:r>
+    </w:p>
+    <w:p>
+      <w:r>
+        <w:t xml:space="preserve">  * “consulting for”</w:t>
+      </w:r>
+    </w:p>
+    <w:p>
+      <w:r>
+        <w:t xml:space="preserve">  * “direct competitor”</w:t>
+      </w:r>
+    </w:p>
+    <w:p>
+      <w:r>
         <w:lastRenderedPageBreak/>
-        <w:t>* “induce any vendor” to cease, reduce, or discontinue business</w:t>
-      </w:r>
-    </w:p>
-    <w:p>
-      <w:r>
-        <w:t>* “cease purchasing goods or services”</w:t>
-      </w:r>
-    </w:p>
-    <w:p>
-      <w:r>
-        <w:t>* “cease selling goods and services”</w:t>
-      </w:r>
-    </w:p>
-    <w:p>
-      <w:r>
-        <w:t>* “reduce or discontinue any business relationship”</w:t>
-      </w:r>
-    </w:p>
-    <w:p>
-      <w:r>
-        <w:t>* “prevented or restricted from performing services”</w:t>
-      </w:r>
-    </w:p>
-    <w:p>
-      <w:r>
-        <w:t>* “prevented or restricted from pursuing business opportunities”</w:t>
-      </w:r>
-    </w:p>
-    <w:p>
-      <w:r>
         <w:t xml:space="preserve"> </w:t>
       </w:r>
     </w:p>
@@ -2553,15 +2296,7 @@
     </w:p>
     <w:p>
       <w:r>
-        <w:t xml:space="preserve">* Clause only requires prior written consent before contacting customers, suppliers, vendors, or connected </w:t>
-      </w:r>
-      <w:proofErr w:type="gramStart"/>
-      <w:r>
-        <w:t>persons</w:t>
-      </w:r>
-      <w:proofErr w:type="gramEnd"/>
-      <w:r>
-        <w:t>, without restricting competition, future services, market participation, or independent business activities</w:t>
+        <w:t>* Clause only requires prior written consent before contacting customers, suppliers, vendors, or connected persons, without restricting competition, future services, market participation, or independent business activities</w:t>
       </w:r>
     </w:p>
     <w:p>
@@ -2571,36 +2306,49 @@
     </w:p>
     <w:p>
       <w:r>
+        <w:t>* Clause contains “customer” or “supplier” but does not require the customer or supplier to cease, reduce, discontinue, or refrain from doing business with the Disclosing Party</w:t>
+      </w:r>
+    </w:p>
+    <w:p>
+      <w:r>
+        <w:t>* Clause contains “customer” or “supplier” but does not restrict Accenture from providing services to third parties, competitors, or other clients</w:t>
+      </w:r>
+    </w:p>
+    <w:p>
+      <w:r>
+        <w:t>* Clause contains “customer, supplier, or any other person connected with the Disclosing Party” only in the context of appraisal, evaluation, diligence, Project review, or confidentiality protection</w:t>
+      </w:r>
+    </w:p>
+    <w:p>
+      <w:r>
         <w:lastRenderedPageBreak/>
-        <w:t>* Clause contains “customer” or “supplier” but does not require the customer or supplier to cease, reduce, discontinue, or refrain from doing business with the Disclosing Party</w:t>
-      </w:r>
-    </w:p>
-    <w:p>
-      <w:r>
-        <w:t>* Clause contains “customer” or “supplier” but does not restrict Accenture from providing services to third parties, competitors, or other clients</w:t>
-      </w:r>
-    </w:p>
-    <w:p>
-      <w:r>
-        <w:t>* Clause contains “customer, supplier, or any other person connected with the Disclosing Party” only in the context of appraisal, evaluation, diligence, Project review, or confidentiality protection</w:t>
-      </w:r>
-    </w:p>
-    <w:p>
-      <w:r>
         <w:t>* Restrictions limited to not interfering with business relationships, without a clear restriction on competitive activity, future services, market participation, or business opportunity pursuit</w:t>
       </w:r>
     </w:p>
     <w:p>
       <w:r>
-        <w:t xml:space="preserve">* General no-contact clauses related to the Project, unless they also include </w:t>
-      </w:r>
-      <w:proofErr w:type="gramStart"/>
-      <w:r>
-        <w:t>a clear</w:t>
-      </w:r>
-      <w:proofErr w:type="gramEnd"/>
-      <w:r>
-        <w:t xml:space="preserve"> non-compete, exclusivity, customer diversion, vendor diversion, or business opportunity restriction</w:t>
+        <w:t>* General no-contact clauses related to the Project, unless they also include a clear non-compete, exclusivity, customer diversion, vendor diversion, or business opportunity restriction</w:t>
+      </w:r>
+    </w:p>
+    <w:p>
+      <w:r>
+        <w:t>* Do NOT route Non-Compete / Exclusivity where “competitor” appears only to exclude competitor consultants, advisors, or representatives from receiving Confidential Information, without requiring Accenture to disclose, notify, indicate, report, limit, stop, or avoid work with a competitor.</w:t>
+      </w:r>
+    </w:p>
+    <w:p>
+      <w:r>
+        <w:t xml:space="preserve">* Do NOT route Non-Compete / Exclusivity where “competitor” appears only in a confidentiality-control provision and does not relate to Accenture </w:t>
+      </w:r>
+      <w:r>
+        <w:t>b</w:t>
+      </w:r>
+      <w:r>
+        <w:t>eing contracted to, working for, consulting for, providing services to, or pursuing work with a competitor.</w:t>
+      </w:r>
+    </w:p>
+    <w:p>
+      <w:r>
+        <w:t>* Do NOT route Non-Compete / Exclusivity where the clause merely states that Confidential Information must not be disclosed to competitors, without any obligation to disclose competitor relationships or restrict business activity.</w:t>
       </w:r>
     </w:p>
     <w:p>
@@ -2645,24 +2393,13 @@
     </w:p>
     <w:p>
       <w:r>
-        <w:t xml:space="preserve">Non-standard legal, regulatory, </w:t>
-      </w:r>
-      <w:proofErr w:type="gramStart"/>
-      <w:r>
-        <w:t>execution-formality</w:t>
-      </w:r>
-      <w:proofErr w:type="gramEnd"/>
-      <w:r>
-        <w:t>, or jurisdiction-specific obligations that do not fall under the other risk categories and require special routing under the playbook.</w:t>
-      </w:r>
-    </w:p>
-    <w:p>
-      <w:r>
-        <w:t xml:space="preserve">This includes confirmed ANZ deed execution requirements, Italy-specific insider trading / market abuse requirements, notarization, registration or regulatory filing obligations, and </w:t>
-      </w:r>
+        <w:t>Non-standard legal, regulatory, execution-formality, or jurisdiction-specific obligations that do not fall under the other risk categories and require special routing under the playbook.</w:t>
+      </w:r>
+    </w:p>
+    <w:p>
       <w:r>
         <w:lastRenderedPageBreak/>
-        <w:t>agreements where one of the contracting parties is a confirmed individual person at party-definition level.</w:t>
+        <w:t>This includes confirmed ANZ deed execution requirements, Italy-specific insider trading / market abuse requirements, notarization, registration or regulatory filing obligations, and agreements where one of the contracting parties is a confirmed individual person at party-definition level.</w:t>
       </w:r>
     </w:p>
     <w:p>
@@ -2777,6 +2514,7 @@
     </w:p>
     <w:p>
       <w:r>
+        <w:lastRenderedPageBreak/>
         <w:t>* “Market Abuse Regulation”</w:t>
       </w:r>
     </w:p>
@@ -2787,123 +2525,123 @@
     </w:p>
     <w:p>
       <w:r>
+        <w:t>* “insider list”</w:t>
+      </w:r>
+    </w:p>
+    <w:p>
+      <w:r>
+        <w:t>* “TUF”</w:t>
+      </w:r>
+    </w:p>
+    <w:p>
+      <w:r>
+        <w:t>* “Italian Legislative Decree no. 58/1998”</w:t>
+      </w:r>
+    </w:p>
+    <w:p>
+      <w:r>
+        <w:t xml:space="preserve"> </w:t>
+      </w:r>
+    </w:p>
+    <w:p>
+      <w:r>
+        <w:t>Italy nexus:</w:t>
+      </w:r>
+    </w:p>
+    <w:p>
+      <w:r>
+        <w:t>* “Italy”</w:t>
+      </w:r>
+    </w:p>
+    <w:p>
+      <w:r>
+        <w:t>* “Italian”</w:t>
+      </w:r>
+    </w:p>
+    <w:p>
+      <w:r>
+        <w:t>* “Italian Legislative Decree no. 58/1998”</w:t>
+      </w:r>
+    </w:p>
+    <w:p>
+      <w:r>
+        <w:t>* “TUF”</w:t>
+      </w:r>
+    </w:p>
+    <w:p>
+      <w:r>
+        <w:t>* “PEC”</w:t>
+      </w:r>
+    </w:p>
+    <w:p>
+      <w:r>
+        <w:t>* “Italian NDA”</w:t>
+      </w:r>
+    </w:p>
+    <w:p>
+      <w:r>
+        <w:t>* Italian governing law</w:t>
+      </w:r>
+    </w:p>
+    <w:p>
+      <w:r>
+        <w:t>* Italian party address</w:t>
+      </w:r>
+    </w:p>
+    <w:p>
+      <w:r>
+        <w:t>* Italian company form such as “S.p.A.”, “S.r.l.”, or “Società”</w:t>
+      </w:r>
+    </w:p>
+    <w:p>
+      <w:r>
+        <w:t>* Italy Market Unit indicator</w:t>
+      </w:r>
+    </w:p>
+    <w:p>
+      <w:r>
+        <w:t xml:space="preserve"> </w:t>
+      </w:r>
+    </w:p>
+    <w:p/>
+    <w:p>
+      <w:r>
+        <w:t>Route Additional Requirements for insider trading / MAR only if:</w:t>
+      </w:r>
+    </w:p>
+    <w:p>
+      <w:r>
+        <w:t>* at least one Insider / MAR signal is present; AND</w:t>
+      </w:r>
+    </w:p>
+    <w:p>
+      <w:r>
+        <w:t>* at least one Italy nexus signal is present.</w:t>
+      </w:r>
+    </w:p>
+    <w:p>
+      <w:r>
+        <w:t xml:space="preserve"> </w:t>
+      </w:r>
+    </w:p>
+    <w:p>
+      <w:r>
+        <w:t>## Do NOT Trigger</w:t>
+      </w:r>
+    </w:p>
+    <w:p>
+      <w:r>
+        <w:t>* Standard signature clauses</w:t>
+      </w:r>
+    </w:p>
+    <w:p>
+      <w:r>
+        <w:t>* Standard execution blocks</w:t>
+      </w:r>
+    </w:p>
+    <w:p>
+      <w:r>
         <w:lastRenderedPageBreak/>
-        <w:t>* “insider list”</w:t>
-      </w:r>
-    </w:p>
-    <w:p>
-      <w:r>
-        <w:t>* “TUF”</w:t>
-      </w:r>
-    </w:p>
-    <w:p>
-      <w:r>
-        <w:t>* “Italian Legislative Decree no. 58/1998”</w:t>
-      </w:r>
-    </w:p>
-    <w:p>
-      <w:r>
-        <w:t xml:space="preserve"> </w:t>
-      </w:r>
-    </w:p>
-    <w:p>
-      <w:r>
-        <w:t>Italy nexus:</w:t>
-      </w:r>
-    </w:p>
-    <w:p>
-      <w:r>
-        <w:t>* “Italy”</w:t>
-      </w:r>
-    </w:p>
-    <w:p>
-      <w:r>
-        <w:t>* “Italian”</w:t>
-      </w:r>
-    </w:p>
-    <w:p>
-      <w:r>
-        <w:t>* “Italian Legislative Decree no. 58/1998”</w:t>
-      </w:r>
-    </w:p>
-    <w:p>
-      <w:r>
-        <w:t>* “TUF”</w:t>
-      </w:r>
-    </w:p>
-    <w:p>
-      <w:r>
-        <w:t>* “PEC”</w:t>
-      </w:r>
-    </w:p>
-    <w:p>
-      <w:r>
-        <w:t>* “Italian NDA”</w:t>
-      </w:r>
-    </w:p>
-    <w:p>
-      <w:r>
-        <w:t>* Italian governing law</w:t>
-      </w:r>
-    </w:p>
-    <w:p>
-      <w:r>
-        <w:t>* Italian party address</w:t>
-      </w:r>
-    </w:p>
-    <w:p>
-      <w:r>
-        <w:t>* Italian company form such as “S.p.A.”, “S.r.l.”, or “Società”</w:t>
-      </w:r>
-    </w:p>
-    <w:p>
-      <w:r>
-        <w:t>* Italy Market Unit indicator</w:t>
-      </w:r>
-    </w:p>
-    <w:p>
-      <w:r>
-        <w:t xml:space="preserve"> </w:t>
-      </w:r>
-    </w:p>
-    <w:p/>
-    <w:p>
-      <w:r>
-        <w:t>Route Additional Requirements for insider trading / MAR only if:</w:t>
-      </w:r>
-    </w:p>
-    <w:p>
-      <w:r>
-        <w:t>* at least one Insider / MAR signal is present; AND</w:t>
-      </w:r>
-    </w:p>
-    <w:p>
-      <w:r>
-        <w:t>* at least one Italy nexus signal is present.</w:t>
-      </w:r>
-    </w:p>
-    <w:p>
-      <w:r>
-        <w:t xml:space="preserve"> </w:t>
-      </w:r>
-    </w:p>
-    <w:p>
-      <w:r>
-        <w:t>## Do NOT Trigger</w:t>
-      </w:r>
-    </w:p>
-    <w:p>
-      <w:r>
-        <w:t>* Standard signature clauses</w:t>
-      </w:r>
-    </w:p>
-    <w:p>
-      <w:r>
-        <w:t>* Standard execution blocks</w:t>
-      </w:r>
-    </w:p>
-    <w:p>
-      <w:r>
         <w:t>* Provisions already covered by other risk categories, especially Individual NDA risk</w:t>
       </w:r>
     </w:p>
@@ -2914,123 +2652,107 @@
     </w:p>
     <w:p>
       <w:r>
+        <w:t>* “UEN”</w:t>
+      </w:r>
+    </w:p>
+    <w:p>
+      <w:r>
+        <w:t>* “registered office address”</w:t>
+      </w:r>
+    </w:p>
+    <w:p>
+      <w:r>
+        <w:t>* company incorporation details</w:t>
+      </w:r>
+    </w:p>
+    <w:p>
+      <w:r>
+        <w:t>* Standard company metadata in party definitions, including name, address, jurisdiction of incorporation, registration number, tax number, or statistical number</w:t>
+      </w:r>
+    </w:p>
+    <w:p>
+      <w:r>
+        <w:t>* “file” appears only as a noun referring to documents, records, electronic files, data files, or ordinary document handling</w:t>
+      </w:r>
+    </w:p>
+    <w:p>
+      <w:r>
+        <w:t>* “filing” appears only in litigation, document-management, recordkeeping, or ordinary compliance context</w:t>
+      </w:r>
+    </w:p>
+    <w:p>
+      <w:r>
+        <w:t>* “Persons” refers only to people with access to inside information and not to an individual party to the NDA</w:t>
+      </w:r>
+    </w:p>
+    <w:p>
+      <w:r>
+        <w:t>* Individual name appears only in a signature block</w:t>
+      </w:r>
+    </w:p>
+    <w:p>
+      <w:r>
+        <w:t>* Individual name appears only as an authorized signer for a legal entity</w:t>
+      </w:r>
+    </w:p>
+    <w:p>
+      <w:r>
+        <w:t>* Individual person reference is in the signature block or relates only to who is signing the NDA for a legal entity</w:t>
+      </w:r>
+    </w:p>
+    <w:p>
+      <w:r>
+        <w:t>* “MAR Regulation No 596/2014” appears without an Italy nexus</w:t>
+      </w:r>
+    </w:p>
+    <w:p>
+      <w:r>
+        <w:t>* “Regulation (EU) No 596/2014” appears without an Italy nexus</w:t>
+      </w:r>
+    </w:p>
+    <w:p>
+      <w:r>
+        <w:t>* “Market Abuse Regulation” appears without an Italy nexus</w:t>
+      </w:r>
+    </w:p>
+    <w:p>
+      <w:r>
+        <w:t>* “inside information” appears without an Italy nexus</w:t>
+      </w:r>
+    </w:p>
+    <w:p>
+      <w:r>
+        <w:t>* “insider list” appears without an Italy nexus</w:t>
+      </w:r>
+    </w:p>
+    <w:p>
+      <w:r>
+        <w:t>* “dealing embargo” appears without an Italy nexus</w:t>
+      </w:r>
+    </w:p>
+    <w:p>
+      <w:r>
+        <w:t>* “national regulatory authority” appears without an Italy nexus</w:t>
+      </w:r>
+    </w:p>
+    <w:p>
+      <w:r>
+        <w:t>* “Commission Implementing Regulation (EU) 2022/1210” appears without an Italy nexus</w:t>
+      </w:r>
+    </w:p>
+    <w:p>
+      <w:r>
+        <w:t>* General EU, Polish, Austrian, banking, securities, or market-abuse compliance clauses with no Italy nexus</w:t>
+      </w:r>
+    </w:p>
+    <w:p>
+      <w:r>
+        <w:t>* Clause contains BOTH:</w:t>
+      </w:r>
+    </w:p>
+    <w:p>
+      <w:r>
         <w:lastRenderedPageBreak/>
-        <w:t>* “UEN”</w:t>
-      </w:r>
-    </w:p>
-    <w:p>
-      <w:r>
-        <w:t>* “registered office address”</w:t>
-      </w:r>
-    </w:p>
-    <w:p>
-      <w:r>
-        <w:t xml:space="preserve">* </w:t>
-      </w:r>
-      <w:proofErr w:type="gramStart"/>
-      <w:r>
-        <w:t>company</w:t>
-      </w:r>
-      <w:proofErr w:type="gramEnd"/>
-      <w:r>
-        <w:t xml:space="preserve"> incorporation details</w:t>
-      </w:r>
-    </w:p>
-    <w:p>
-      <w:r>
-        <w:t>* Standard company metadata in party definitions, including name, address, jurisdiction of incorporation, registration number, tax number, or statistical number</w:t>
-      </w:r>
-    </w:p>
-    <w:p>
-      <w:r>
-        <w:t>* “file” appears only as a noun referring to documents, records, electronic files, data files, or ordinary document handling</w:t>
-      </w:r>
-    </w:p>
-    <w:p>
-      <w:r>
-        <w:t>* “filing” appears only in litigation, document-management, recordkeeping, or ordinary compliance context</w:t>
-      </w:r>
-    </w:p>
-    <w:p>
-      <w:r>
-        <w:t>* “Persons” refers only to people with access to inside information and not to an individual party to the NDA</w:t>
-      </w:r>
-    </w:p>
-    <w:p>
-      <w:r>
-        <w:t>* Individual name appears only in a signature block</w:t>
-      </w:r>
-    </w:p>
-    <w:p>
-      <w:r>
-        <w:t xml:space="preserve">* Individual </w:t>
-      </w:r>
-      <w:proofErr w:type="gramStart"/>
-      <w:r>
-        <w:t>name appears</w:t>
-      </w:r>
-      <w:proofErr w:type="gramEnd"/>
-      <w:r>
-        <w:t xml:space="preserve"> only as an authorized signer for a legal entity</w:t>
-      </w:r>
-    </w:p>
-    <w:p>
-      <w:r>
-        <w:t>* Individual person reference is in the signature block or relates only to who is signing the NDA for a legal entity</w:t>
-      </w:r>
-    </w:p>
-    <w:p>
-      <w:r>
-        <w:t>* “MAR Regulation No 596/2014” appears without an Italy nexus</w:t>
-      </w:r>
-    </w:p>
-    <w:p>
-      <w:r>
-        <w:t>* “Regulation (EU) No 596/2014” appears without an Italy nexus</w:t>
-      </w:r>
-    </w:p>
-    <w:p>
-      <w:r>
-        <w:t>* “Market Abuse Regulation” appears without an Italy nexus</w:t>
-      </w:r>
-    </w:p>
-    <w:p>
-      <w:r>
-        <w:t>* “inside information” appears without an Italy nexus</w:t>
-      </w:r>
-    </w:p>
-    <w:p>
-      <w:r>
-        <w:t>* “insider list” appears without an Italy nexus</w:t>
-      </w:r>
-    </w:p>
-    <w:p>
-      <w:r>
-        <w:t>* “dealing embargo” appears without an Italy nexus</w:t>
-      </w:r>
-    </w:p>
-    <w:p>
-      <w:r>
-        <w:t>* “national regulatory authority” appears without an Italy nexus</w:t>
-      </w:r>
-    </w:p>
-    <w:p>
-      <w:r>
-        <w:t>* “Commission Implementing Regulation (EU) 2022/1210” appears without an Italy nexus</w:t>
-      </w:r>
-    </w:p>
-    <w:p>
-      <w:r>
-        <w:t>* General EU, Polish, Austrian, banking, securities, or market-abuse compliance clauses with no Italy nexus</w:t>
-      </w:r>
-    </w:p>
-    <w:p>
-      <w:r>
-        <w:t>* Clause contains BOTH:</w:t>
-      </w:r>
-    </w:p>
-    <w:p>
-      <w:r>
         <w:t xml:space="preserve">  * “MAR Regulation No 596/2014”</w:t>
       </w:r>
     </w:p>
@@ -3041,7 +2763,6 @@
     </w:p>
     <w:p>
       <w:r>
-        <w:lastRenderedPageBreak/>
         <w:t xml:space="preserve">    but does NOT contain an Italy nexus</w:t>
       </w:r>
     </w:p>
@@ -3881,6 +3602,7 @@
   <w:style w:type="character" w:default="1" w:styleId="DefaultParagraphFont">
     <w:name w:val="Default Paragraph Font"/>
     <w:uiPriority w:val="1"/>
+    <w:semiHidden/>
     <w:unhideWhenUsed/>
   </w:style>
   <w:style w:type="table" w:default="1" w:styleId="TableNormal">
@@ -28385,27 +28107,6 @@
 </file>
 
 <file path=customXml/item1.xml><?xml version="1.0" encoding="utf-8"?>
-<p:properties xmlns:p="http://schemas.microsoft.com/office/2006/metadata/properties" xmlns:xsi="http://www.w3.org/2001/XMLSchema-instance" xmlns:pc="http://schemas.microsoft.com/office/infopath/2007/PartnerControls">
-  <documentManagement>
-    <TaxCatchAll xmlns="58fb48c5-ad38-47d1-9aa6-9b4f1dc114f9" xsi:nil="true"/>
-    <lcf76f155ced4ddcb4097134ff3c332f xmlns="aba9ad68-f961-4806-8372-ded3e8039a5f">
-      <Terms xmlns="http://schemas.microsoft.com/office/infopath/2007/PartnerControls"/>
-    </lcf76f155ced4ddcb4097134ff3c332f>
-    <Reusable xmlns="aba9ad68-f961-4806-8372-ded3e8039a5f">true</Reusable>
-  </documentManagement>
-</p:properties>
-</file>
-
-<file path=customXml/item2.xml><?xml version="1.0" encoding="utf-8"?>
-<?mso-contentType ?>
-<FormTemplates xmlns="http://schemas.microsoft.com/sharepoint/v3/contenttype/forms">
-  <Display>DocumentLibraryForm</Display>
-  <Edit>DocumentLibraryForm</Edit>
-  <New>DocumentLibraryForm</New>
-</FormTemplates>
-</file>
-
-<file path=customXml/item3.xml><?xml version="1.0" encoding="utf-8"?>
 <ct:contentTypeSchema xmlns:ct="http://schemas.microsoft.com/office/2006/metadata/contentType" xmlns:ma="http://schemas.microsoft.com/office/2006/metadata/properties/metaAttributes" ct:_="" ma:_="" ma:contentTypeName="Document" ma:contentTypeID="0x010100A5AA8A3CABF36C429B74A94C24258E55" ma:contentTypeVersion="21" ma:contentTypeDescription="Create a new document." ma:contentTypeScope="" ma:versionID="9d590b9c745b5d4d086e55351edde6c7">
   <xsd:schema xmlns:xsd="http://www.w3.org/2001/XMLSchema" xmlns:xs="http://www.w3.org/2001/XMLSchema" xmlns:p="http://schemas.microsoft.com/office/2006/metadata/properties" xmlns:ns2="aba9ad68-f961-4806-8372-ded3e8039a5f" xmlns:ns3="58fb48c5-ad38-47d1-9aa6-9b4f1dc114f9" targetNamespace="http://schemas.microsoft.com/office/2006/metadata/properties" ma:root="true" ma:fieldsID="656ed3350af39d0ad06ab4725df265a1" ns2:_="" ns3:_="">
     <xsd:import namespace="aba9ad68-f961-4806-8372-ded3e8039a5f"/>
@@ -28672,26 +28373,28 @@
 </ct:contentTypeSchema>
 </file>
 
-<file path=customXml/itemProps1.xml><?xml version="1.0" encoding="utf-8"?>
-<ds:datastoreItem xmlns:ds="http://schemas.openxmlformats.org/officeDocument/2006/customXml" ds:itemID="{25BAFF0C-A05A-49CE-A308-E2413E02AFCD}">
-  <ds:schemaRefs>
-    <ds:schemaRef ds:uri="http://schemas.microsoft.com/office/2006/metadata/properties"/>
-    <ds:schemaRef ds:uri="http://schemas.microsoft.com/office/infopath/2007/PartnerControls"/>
-    <ds:schemaRef ds:uri="58fb48c5-ad38-47d1-9aa6-9b4f1dc114f9"/>
-    <ds:schemaRef ds:uri="aba9ad68-f961-4806-8372-ded3e8039a5f"/>
-  </ds:schemaRefs>
-</ds:datastoreItem>
+<file path=customXml/item2.xml><?xml version="1.0" encoding="utf-8"?>
+<?mso-contentType ?>
+<FormTemplates xmlns="http://schemas.microsoft.com/sharepoint/v3/contenttype/forms">
+  <Display>DocumentLibraryForm</Display>
+  <Edit>DocumentLibraryForm</Edit>
+  <New>DocumentLibraryForm</New>
+</FormTemplates>
 </file>
 
-<file path=customXml/itemProps2.xml><?xml version="1.0" encoding="utf-8"?>
-<ds:datastoreItem xmlns:ds="http://schemas.openxmlformats.org/officeDocument/2006/customXml" ds:itemID="{C6DFF534-1887-4C42-BC36-EDACE7DE72C0}">
-  <ds:schemaRefs>
-    <ds:schemaRef ds:uri="http://schemas.microsoft.com/sharepoint/v3/contenttype/forms"/>
-  </ds:schemaRefs>
-</ds:datastoreItem>
+<file path=customXml/item3.xml><?xml version="1.0" encoding="utf-8"?>
+<p:properties xmlns:p="http://schemas.microsoft.com/office/2006/metadata/properties" xmlns:xsi="http://www.w3.org/2001/XMLSchema-instance" xmlns:pc="http://schemas.microsoft.com/office/infopath/2007/PartnerControls">
+  <documentManagement>
+    <TaxCatchAll xmlns="58fb48c5-ad38-47d1-9aa6-9b4f1dc114f9" xsi:nil="true"/>
+    <lcf76f155ced4ddcb4097134ff3c332f xmlns="aba9ad68-f961-4806-8372-ded3e8039a5f">
+      <Terms xmlns="http://schemas.microsoft.com/office/infopath/2007/PartnerControls"/>
+    </lcf76f155ced4ddcb4097134ff3c332f>
+    <Reusable xmlns="aba9ad68-f961-4806-8372-ded3e8039a5f">true</Reusable>
+  </documentManagement>
+</p:properties>
 </file>
 
-<file path=customXml/itemProps3.xml><?xml version="1.0" encoding="utf-8"?>
+<file path=customXml/itemProps1.xml><?xml version="1.0" encoding="utf-8"?>
 <ds:datastoreItem xmlns:ds="http://schemas.openxmlformats.org/officeDocument/2006/customXml" ds:itemID="{06BBAEB0-F6D0-405B-9BC5-9D7675839774}">
   <ds:schemaRefs>
     <ds:schemaRef ds:uri="http://schemas.microsoft.com/office/2006/metadata/contentType"/>
@@ -28710,6 +28413,25 @@
 </ds:datastoreItem>
 </file>
 
+<file path=customXml/itemProps2.xml><?xml version="1.0" encoding="utf-8"?>
+<ds:datastoreItem xmlns:ds="http://schemas.openxmlformats.org/officeDocument/2006/customXml" ds:itemID="{C6DFF534-1887-4C42-BC36-EDACE7DE72C0}">
+  <ds:schemaRefs>
+    <ds:schemaRef ds:uri="http://schemas.microsoft.com/sharepoint/v3/contenttype/forms"/>
+  </ds:schemaRefs>
+</ds:datastoreItem>
+</file>
+
+<file path=customXml/itemProps3.xml><?xml version="1.0" encoding="utf-8"?>
+<ds:datastoreItem xmlns:ds="http://schemas.openxmlformats.org/officeDocument/2006/customXml" ds:itemID="{25BAFF0C-A05A-49CE-A308-E2413E02AFCD}">
+  <ds:schemaRefs>
+    <ds:schemaRef ds:uri="http://schemas.microsoft.com/office/2006/metadata/properties"/>
+    <ds:schemaRef ds:uri="http://schemas.microsoft.com/office/infopath/2007/PartnerControls"/>
+    <ds:schemaRef ds:uri="58fb48c5-ad38-47d1-9aa6-9b4f1dc114f9"/>
+    <ds:schemaRef ds:uri="aba9ad68-f961-4806-8372-ded3e8039a5f"/>
+  </ds:schemaRefs>
+</ds:datastoreItem>
+</file>
+
 <file path=docMetadata/LabelInfo.xml><?xml version="1.0" encoding="utf-8"?>
 <clbl:labelList xmlns:clbl="http://schemas.microsoft.com/office/2020/mipLabelMetadata">
   <clbl:label id="{0bfa236d-8472-42aa-9a40-ab46036c5596}" enabled="1" method="Standard" siteId="{e0793d39-0939-496d-b129-198edd916feb}" contentBits="0" removed="0"/>

</xml_diff>

<commit_message>
Adjust IP triage in orchestrator
</commit_message>
<xml_diff>
--- a/docs/orchestrator_kb.docx
+++ b/docs/orchestrator_kb.docx
@@ -1088,7 +1088,13 @@
     </w:p>
     <w:p>
       <w:r>
-        <w:t>NDA transfers, assigns, vests, conveys, waives, or gives ownership of intellectual property rights, inventions, works, work product, developed work, materials, feedback, copyrights, or deliverables to the other party.</w:t>
+        <w:t>NDA transfers, ass</w:t>
+      </w:r>
+      <w:r>
+        <w:t>i</w:t>
+      </w:r>
+      <w:r>
+        <w:t>gns, vests, conveys, waives, or gives ownership of intellectual property rights, inventions, works, work product, developed work, materials, feedback, copyrights, or deliverables to the other party.</w:t>
       </w:r>
     </w:p>
     <w:p>
@@ -1244,6 +1250,112 @@
     </w:p>
     <w:p>
       <w:r>
+        <w:t>* “deliverable”</w:t>
+      </w:r>
+    </w:p>
+    <w:p>
+      <w:r>
+        <w:t>* “deliverables”</w:t>
+      </w:r>
+    </w:p>
+    <w:p>
+      <w:r>
+        <w:t>* “project result”</w:t>
+      </w:r>
+    </w:p>
+    <w:p>
+      <w:r>
+        <w:t>* “project results”</w:t>
+      </w:r>
+    </w:p>
+    <w:p>
+      <w:r>
+        <w:t>* “result derived from the Project”</w:t>
+      </w:r>
+    </w:p>
+    <w:p>
+      <w:r>
+        <w:t>* “results derived from the Project”</w:t>
+      </w:r>
+    </w:p>
+    <w:p>
+      <w:r>
+        <w:t>* “deliverable or result derived from the Project”</w:t>
+      </w:r>
+    </w:p>
+    <w:p>
+      <w:r>
+        <w:t>* “will be property of the Company”</w:t>
+      </w:r>
+    </w:p>
+    <w:p>
+      <w:r>
+        <w:t>* “will be the property of the Company”</w:t>
+      </w:r>
+    </w:p>
+    <w:p>
+      <w:r>
+        <w:t>* “shall be property of the Company”</w:t>
+      </w:r>
+    </w:p>
+    <w:p>
+      <w:r>
+        <w:t>* “shall be the property of the Company”</w:t>
+      </w:r>
+    </w:p>
+    <w:p>
+      <w:r>
+        <w:t>* “property of the Company”</w:t>
+      </w:r>
+    </w:p>
+    <w:p>
+      <w:r>
+        <w:lastRenderedPageBreak/>
+        <w:t>* Clause contains BOTH:</w:t>
+      </w:r>
+    </w:p>
+    <w:p>
+      <w:r>
+        <w:t xml:space="preserve">  * “deliverable”</w:t>
+      </w:r>
+    </w:p>
+    <w:p>
+      <w:r>
+        <w:t xml:space="preserve">  * “property of the Company”</w:t>
+      </w:r>
+    </w:p>
+    <w:p>
+      <w:r>
+        <w:t>* Clause contains BOTH:</w:t>
+      </w:r>
+    </w:p>
+    <w:p>
+      <w:r>
+        <w:t xml:space="preserve">  * “result derived from the Project”</w:t>
+      </w:r>
+    </w:p>
+    <w:p>
+      <w:r>
+        <w:t xml:space="preserve">  * “property of the Company”</w:t>
+      </w:r>
+    </w:p>
+    <w:p>
+      <w:r>
+        <w:t>* Clause contains BOTH:</w:t>
+      </w:r>
+    </w:p>
+    <w:p>
+      <w:r>
+        <w:t xml:space="preserve">  * “deliverable or result”</w:t>
+      </w:r>
+    </w:p>
+    <w:p>
+      <w:r>
+        <w:t xml:space="preserve">  * “property of the Company”</w:t>
+      </w:r>
+    </w:p>
+    <w:p>
+      <w:r>
         <w:t xml:space="preserve"> </w:t>
       </w:r>
     </w:p>
@@ -1299,32 +1411,32 @@
     </w:p>
     <w:p>
       <w:r>
+        <w:t>* “Recipient acquires no rights”</w:t>
+      </w:r>
+    </w:p>
+    <w:p>
+      <w:r>
+        <w:t>* “Discloser retains all rights, title and interest in and to the Proprietary Information”</w:t>
+      </w:r>
+    </w:p>
+    <w:p>
+      <w:r>
+        <w:t>* Background IP definitions where each party retains pre-existing IP</w:t>
+      </w:r>
+    </w:p>
+    <w:p>
+      <w:r>
+        <w:t>* Confidentiality-only obligations with no IP transfer</w:t>
+      </w:r>
+    </w:p>
+    <w:p>
+      <w:r>
+        <w:t>* Clause only states that unauthorized use or disclosure does not grant rights</w:t>
+      </w:r>
+    </w:p>
+    <w:p>
+      <w:r>
         <w:lastRenderedPageBreak/>
-        <w:t>* “Recipient acquires no rights”</w:t>
-      </w:r>
-    </w:p>
-    <w:p>
-      <w:r>
-        <w:t>* “Discloser retains all rights, title and interest in and to the Proprietary Information”</w:t>
-      </w:r>
-    </w:p>
-    <w:p>
-      <w:r>
-        <w:t>* Background IP definitions where each party retains pre-existing IP</w:t>
-      </w:r>
-    </w:p>
-    <w:p>
-      <w:r>
-        <w:t>* Confidentiality-only obligations with no IP transfer</w:t>
-      </w:r>
-    </w:p>
-    <w:p>
-      <w:r>
-        <w:t>* Clause only states that unauthorized use or disclosure does not grant rights</w:t>
-      </w:r>
-    </w:p>
-    <w:p>
-      <w:r>
         <w:t>* Clause only confirms that Confidential Information remains owned by the Disclosing Party in a unilateral NDA</w:t>
       </w:r>
     </w:p>
@@ -1351,6 +1463,16 @@
     <w:p>
       <w:r>
         <w:t>* Do NOT route IP Ownership / Transfer if the clause only confirms ownership or retention of the Disclosing Party’s pre-existing Confidential Information or related intellectual property rights</w:t>
+      </w:r>
+    </w:p>
+    <w:p>
+      <w:r>
+        <w:t>* Do NOT route IP Ownership / Transfer where “property of the Company” or “property of the Disclosing Party” refers only to pre-existing Confidential Information and does not include deliverables, project results, work product, developed work, inventions, copyright, assignment, transfer, vesting, waiver, or feedback ownership language.</w:t>
+      </w:r>
+    </w:p>
+    <w:p>
+      <w:r>
+        <w:t>* Do NOT suppress IP Ownership / Transfer based only on a separate no-license clause if another clause expressly states that deliverables, project results, developed work, or work product will be property of the counterparty.</w:t>
       </w:r>
     </w:p>
     <w:p>
@@ -28107,6 +28229,27 @@
 </file>
 
 <file path=customXml/item1.xml><?xml version="1.0" encoding="utf-8"?>
+<p:properties xmlns:p="http://schemas.microsoft.com/office/2006/metadata/properties" xmlns:xsi="http://www.w3.org/2001/XMLSchema-instance" xmlns:pc="http://schemas.microsoft.com/office/infopath/2007/PartnerControls">
+  <documentManagement>
+    <TaxCatchAll xmlns="58fb48c5-ad38-47d1-9aa6-9b4f1dc114f9" xsi:nil="true"/>
+    <lcf76f155ced4ddcb4097134ff3c332f xmlns="aba9ad68-f961-4806-8372-ded3e8039a5f">
+      <Terms xmlns="http://schemas.microsoft.com/office/infopath/2007/PartnerControls"/>
+    </lcf76f155ced4ddcb4097134ff3c332f>
+    <Reusable xmlns="aba9ad68-f961-4806-8372-ded3e8039a5f">true</Reusable>
+  </documentManagement>
+</p:properties>
+</file>
+
+<file path=customXml/item2.xml><?xml version="1.0" encoding="utf-8"?>
+<?mso-contentType ?>
+<FormTemplates xmlns="http://schemas.microsoft.com/sharepoint/v3/contenttype/forms">
+  <Display>DocumentLibraryForm</Display>
+  <Edit>DocumentLibraryForm</Edit>
+  <New>DocumentLibraryForm</New>
+</FormTemplates>
+</file>
+
+<file path=customXml/item3.xml><?xml version="1.0" encoding="utf-8"?>
 <ct:contentTypeSchema xmlns:ct="http://schemas.microsoft.com/office/2006/metadata/contentType" xmlns:ma="http://schemas.microsoft.com/office/2006/metadata/properties/metaAttributes" ct:_="" ma:_="" ma:contentTypeName="Document" ma:contentTypeID="0x010100A5AA8A3CABF36C429B74A94C24258E55" ma:contentTypeVersion="21" ma:contentTypeDescription="Create a new document." ma:contentTypeScope="" ma:versionID="9d590b9c745b5d4d086e55351edde6c7">
   <xsd:schema xmlns:xsd="http://www.w3.org/2001/XMLSchema" xmlns:xs="http://www.w3.org/2001/XMLSchema" xmlns:p="http://schemas.microsoft.com/office/2006/metadata/properties" xmlns:ns2="aba9ad68-f961-4806-8372-ded3e8039a5f" xmlns:ns3="58fb48c5-ad38-47d1-9aa6-9b4f1dc114f9" targetNamespace="http://schemas.microsoft.com/office/2006/metadata/properties" ma:root="true" ma:fieldsID="656ed3350af39d0ad06ab4725df265a1" ns2:_="" ns3:_="">
     <xsd:import namespace="aba9ad68-f961-4806-8372-ded3e8039a5f"/>
@@ -28373,28 +28516,26 @@
 </ct:contentTypeSchema>
 </file>
 
-<file path=customXml/item2.xml><?xml version="1.0" encoding="utf-8"?>
-<?mso-contentType ?>
-<FormTemplates xmlns="http://schemas.microsoft.com/sharepoint/v3/contenttype/forms">
-  <Display>DocumentLibraryForm</Display>
-  <Edit>DocumentLibraryForm</Edit>
-  <New>DocumentLibraryForm</New>
-</FormTemplates>
+<file path=customXml/itemProps1.xml><?xml version="1.0" encoding="utf-8"?>
+<ds:datastoreItem xmlns:ds="http://schemas.openxmlformats.org/officeDocument/2006/customXml" ds:itemID="{25BAFF0C-A05A-49CE-A308-E2413E02AFCD}">
+  <ds:schemaRefs>
+    <ds:schemaRef ds:uri="http://schemas.microsoft.com/office/2006/metadata/properties"/>
+    <ds:schemaRef ds:uri="http://schemas.microsoft.com/office/infopath/2007/PartnerControls"/>
+    <ds:schemaRef ds:uri="58fb48c5-ad38-47d1-9aa6-9b4f1dc114f9"/>
+    <ds:schemaRef ds:uri="aba9ad68-f961-4806-8372-ded3e8039a5f"/>
+  </ds:schemaRefs>
+</ds:datastoreItem>
 </file>
 
-<file path=customXml/item3.xml><?xml version="1.0" encoding="utf-8"?>
-<p:properties xmlns:p="http://schemas.microsoft.com/office/2006/metadata/properties" xmlns:xsi="http://www.w3.org/2001/XMLSchema-instance" xmlns:pc="http://schemas.microsoft.com/office/infopath/2007/PartnerControls">
-  <documentManagement>
-    <TaxCatchAll xmlns="58fb48c5-ad38-47d1-9aa6-9b4f1dc114f9" xsi:nil="true"/>
-    <lcf76f155ced4ddcb4097134ff3c332f xmlns="aba9ad68-f961-4806-8372-ded3e8039a5f">
-      <Terms xmlns="http://schemas.microsoft.com/office/infopath/2007/PartnerControls"/>
-    </lcf76f155ced4ddcb4097134ff3c332f>
-    <Reusable xmlns="aba9ad68-f961-4806-8372-ded3e8039a5f">true</Reusable>
-  </documentManagement>
-</p:properties>
+<file path=customXml/itemProps2.xml><?xml version="1.0" encoding="utf-8"?>
+<ds:datastoreItem xmlns:ds="http://schemas.openxmlformats.org/officeDocument/2006/customXml" ds:itemID="{C6DFF534-1887-4C42-BC36-EDACE7DE72C0}">
+  <ds:schemaRefs>
+    <ds:schemaRef ds:uri="http://schemas.microsoft.com/sharepoint/v3/contenttype/forms"/>
+  </ds:schemaRefs>
+</ds:datastoreItem>
 </file>
 
-<file path=customXml/itemProps1.xml><?xml version="1.0" encoding="utf-8"?>
+<file path=customXml/itemProps3.xml><?xml version="1.0" encoding="utf-8"?>
 <ds:datastoreItem xmlns:ds="http://schemas.openxmlformats.org/officeDocument/2006/customXml" ds:itemID="{06BBAEB0-F6D0-405B-9BC5-9D7675839774}">
   <ds:schemaRefs>
     <ds:schemaRef ds:uri="http://schemas.microsoft.com/office/2006/metadata/contentType"/>
@@ -28413,25 +28554,6 @@
 </ds:datastoreItem>
 </file>
 
-<file path=customXml/itemProps2.xml><?xml version="1.0" encoding="utf-8"?>
-<ds:datastoreItem xmlns:ds="http://schemas.openxmlformats.org/officeDocument/2006/customXml" ds:itemID="{C6DFF534-1887-4C42-BC36-EDACE7DE72C0}">
-  <ds:schemaRefs>
-    <ds:schemaRef ds:uri="http://schemas.microsoft.com/sharepoint/v3/contenttype/forms"/>
-  </ds:schemaRefs>
-</ds:datastoreItem>
-</file>
-
-<file path=customXml/itemProps3.xml><?xml version="1.0" encoding="utf-8"?>
-<ds:datastoreItem xmlns:ds="http://schemas.openxmlformats.org/officeDocument/2006/customXml" ds:itemID="{25BAFF0C-A05A-49CE-A308-E2413E02AFCD}">
-  <ds:schemaRefs>
-    <ds:schemaRef ds:uri="http://schemas.microsoft.com/office/2006/metadata/properties"/>
-    <ds:schemaRef ds:uri="http://schemas.microsoft.com/office/infopath/2007/PartnerControls"/>
-    <ds:schemaRef ds:uri="58fb48c5-ad38-47d1-9aa6-9b4f1dc114f9"/>
-    <ds:schemaRef ds:uri="aba9ad68-f961-4806-8372-ded3e8039a5f"/>
-  </ds:schemaRefs>
-</ds:datastoreItem>
-</file>
-
 <file path=docMetadata/LabelInfo.xml><?xml version="1.0" encoding="utf-8"?>
 <clbl:labelList xmlns:clbl="http://schemas.microsoft.com/office/2020/mipLabelMetadata">
   <clbl:label id="{0bfa236d-8472-42aa-9a40-ab46036c5596}" enabled="1" method="Standard" siteId="{e0793d39-0939-496d-b129-198edd916feb}" contentBits="0" removed="0"/>

</xml_diff>

<commit_message>
Adjust Do not trigger rules for individual in orchestrator KB
</commit_message>
<xml_diff>
--- a/docs/orchestrator_kb.docx
+++ b/docs/orchestrator_kb.docx
@@ -63,7 +63,15 @@
     </w:p>
     <w:p>
       <w:r>
-        <w:t>* ALL Triage Signals must be matched using exact phrase matching, case-insensitive.</w:t>
+        <w:t xml:space="preserve">* ALL Triage Signals must be matched using exact phrase matching, </w:t>
+      </w:r>
+      <w:proofErr w:type="gramStart"/>
+      <w:r>
+        <w:t>case-insensitive</w:t>
+      </w:r>
+      <w:proofErr w:type="gramEnd"/>
+      <w:r>
+        <w:t>.</w:t>
       </w:r>
     </w:p>
     <w:p>
@@ -73,12 +81,28 @@
     </w:p>
     <w:p>
       <w:r>
-        <w:t>* Do NOT route based only on headings unless the clause body contains a matching triage signal.</w:t>
-      </w:r>
-    </w:p>
-    <w:p>
-      <w:r>
-        <w:t>* Do NOT route based only on standard NDA confidentiality language unless the clause also contains a specific triage signal below.</w:t>
+        <w:t xml:space="preserve">* Do NOT route </w:t>
+      </w:r>
+      <w:proofErr w:type="gramStart"/>
+      <w:r>
+        <w:t>based</w:t>
+      </w:r>
+      <w:proofErr w:type="gramEnd"/>
+      <w:r>
+        <w:t xml:space="preserve"> only on headings unless the clause body contains a matching triage signal.</w:t>
+      </w:r>
+    </w:p>
+    <w:p>
+      <w:r>
+        <w:t xml:space="preserve">* Do NOT route </w:t>
+      </w:r>
+      <w:proofErr w:type="gramStart"/>
+      <w:r>
+        <w:t>based</w:t>
+      </w:r>
+      <w:proofErr w:type="gramEnd"/>
+      <w:r>
+        <w:t xml:space="preserve"> only on standard NDA confidentiality language unless the clause also contains a specific triage signal below.</w:t>
       </w:r>
     </w:p>
     <w:p>
@@ -325,7 +349,15 @@
     </w:p>
     <w:p>
       <w:r>
-        <w:t>* Parties are defined as “Party/Parties” and confidentiality obligations apply to “Each Party” or “Either Party”</w:t>
+        <w:t>* Parties are defined as “Party/Parties</w:t>
+      </w:r>
+      <w:proofErr w:type="gramStart"/>
+      <w:r>
+        <w:t>”</w:t>
+      </w:r>
+      <w:proofErr w:type="gramEnd"/>
+      <w:r>
+        <w:t xml:space="preserve"> and confidentiality obligations apply to “Each Party” or “Either Party”</w:t>
       </w:r>
     </w:p>
     <w:p>
@@ -335,7 +367,15 @@
     </w:p>
     <w:p>
       <w:r>
-        <w:t>* One-way confidentiality undertaking executed “in favour of and for the benefit of Client” where the document is structured as:</w:t>
+        <w:t xml:space="preserve">* One-way confidentiality undertaking executed “in </w:t>
+      </w:r>
+      <w:proofErr w:type="spellStart"/>
+      <w:r>
+        <w:t>favour</w:t>
+      </w:r>
+      <w:proofErr w:type="spellEnd"/>
+      <w:r>
+        <w:t xml:space="preserve"> of and for the benefit of Client” where the document is structured as:</w:t>
       </w:r>
     </w:p>
     <w:p>
@@ -356,17 +396,41 @@
     </w:p>
     <w:p>
       <w:r>
-        <w:t xml:space="preserve">  * the recipient executes an “Undertaking” rather than a mutual NDA</w:t>
-      </w:r>
-    </w:p>
-    <w:p>
-      <w:r>
-        <w:t>* Confidentiality undertaking where the only clear one-way structure is caused by the format “TO: Client / FROM: Recipient” and the document also contains a separate Individual NDA triage signal requiring Permitted Users, personnel, employees, advisers, agents, representatives, or other persons to execute a non-disclosure undertaking directly in favour of Client</w:t>
-      </w:r>
-    </w:p>
-    <w:p>
-      <w:r>
-        <w:t>* Do NOT route Unilateral NDA if all of the following are present:</w:t>
+        <w:t xml:space="preserve">  * </w:t>
+      </w:r>
+      <w:proofErr w:type="gramStart"/>
+      <w:r>
+        <w:t>the</w:t>
+      </w:r>
+      <w:proofErr w:type="gramEnd"/>
+      <w:r>
+        <w:t xml:space="preserve"> recipient executes an “Undertaking” rather than a mutual NDA</w:t>
+      </w:r>
+    </w:p>
+    <w:p>
+      <w:r>
+        <w:t xml:space="preserve">* Confidentiality undertaking where the only clear one-way structure is caused by the format “TO: Client / FROM: Recipient” and the document also contains a separate Individual NDA triage signal requiring Permitted Users, personnel, employees, advisers, agents, representatives, or other persons to execute a non-disclosure undertaking directly in </w:t>
+      </w:r>
+      <w:proofErr w:type="spellStart"/>
+      <w:r>
+        <w:t>favour</w:t>
+      </w:r>
+      <w:proofErr w:type="spellEnd"/>
+      <w:r>
+        <w:t xml:space="preserve"> of Client</w:t>
+      </w:r>
+    </w:p>
+    <w:p>
+      <w:r>
+        <w:t xml:space="preserve">* Do NOT route Unilateral NDA if </w:t>
+      </w:r>
+      <w:proofErr w:type="gramStart"/>
+      <w:r>
+        <w:t>all of</w:t>
+      </w:r>
+      <w:proofErr w:type="gramEnd"/>
+      <w:r>
+        <w:t xml:space="preserve"> the following are present:</w:t>
       </w:r>
     </w:p>
     <w:p>
@@ -376,7 +440,15 @@
     </w:p>
     <w:p>
       <w:r>
-        <w:t xml:space="preserve">  * “in favour of and for the benefit of Client”</w:t>
+        <w:t xml:space="preserve">  * “in </w:t>
+      </w:r>
+      <w:proofErr w:type="spellStart"/>
+      <w:r>
+        <w:t>favour</w:t>
+      </w:r>
+      <w:proofErr w:type="spellEnd"/>
+      <w:r>
+        <w:t xml:space="preserve"> of and for the benefit of Client”</w:t>
       </w:r>
     </w:p>
     <w:p>
@@ -391,7 +463,15 @@
     </w:p>
     <w:p>
       <w:r>
-        <w:t xml:space="preserve">  * “executed a non-disclosure Undertaking in favour of Client”</w:t>
+        <w:t xml:space="preserve">  * “executed a non-disclosure Undertaking in </w:t>
+      </w:r>
+      <w:proofErr w:type="spellStart"/>
+      <w:r>
+        <w:t>favour</w:t>
+      </w:r>
+      <w:proofErr w:type="spellEnd"/>
+      <w:r>
+        <w:t xml:space="preserve"> of Client”</w:t>
       </w:r>
     </w:p>
     <w:p>
@@ -401,17 +481,41 @@
     </w:p>
     <w:p>
       <w:r>
-        <w:t xml:space="preserve">  * “Recipient executes this Undertaking in favour of and for the benefit of Client”; and</w:t>
-      </w:r>
-    </w:p>
-    <w:p>
-      <w:r>
-        <w:t xml:space="preserve">  * “Permitted User shall have executed a non-disclosure Undertaking in favour of Client”</w:t>
-      </w:r>
-    </w:p>
-    <w:p>
-      <w:r>
-        <w:t>* Do NOT route Unilateral NDA if the same extracted snippets contain all of the following:</w:t>
+        <w:t xml:space="preserve">  * “Recipient executes this Undertaking in </w:t>
+      </w:r>
+      <w:proofErr w:type="spellStart"/>
+      <w:r>
+        <w:t>favour</w:t>
+      </w:r>
+      <w:proofErr w:type="spellEnd"/>
+      <w:r>
+        <w:t xml:space="preserve"> of and for the benefit of Client”; and</w:t>
+      </w:r>
+    </w:p>
+    <w:p>
+      <w:r>
+        <w:t xml:space="preserve">  * “Permitted User shall have executed a non-disclosure Undertaking in </w:t>
+      </w:r>
+      <w:proofErr w:type="spellStart"/>
+      <w:r>
+        <w:t>favour</w:t>
+      </w:r>
+      <w:proofErr w:type="spellEnd"/>
+      <w:r>
+        <w:t xml:space="preserve"> of Client”</w:t>
+      </w:r>
+    </w:p>
+    <w:p>
+      <w:r>
+        <w:t xml:space="preserve">* Do NOT route Unilateral NDA if the same extracted snippets contain </w:t>
+      </w:r>
+      <w:proofErr w:type="gramStart"/>
+      <w:r>
+        <w:t>all of</w:t>
+      </w:r>
+      <w:proofErr w:type="gramEnd"/>
+      <w:r>
+        <w:t xml:space="preserve"> the following:</w:t>
       </w:r>
     </w:p>
     <w:p>
@@ -436,28 +540,68 @@
     </w:p>
     <w:p>
       <w:r>
-        <w:t>* Do NOT route Unilateral NDA if all of the following are present:</w:t>
-      </w:r>
-    </w:p>
-    <w:p>
-      <w:r>
-        <w:t xml:space="preserve">  * the agreement identifies one party as “Discloser”</w:t>
-      </w:r>
-    </w:p>
-    <w:p>
-      <w:r>
-        <w:t xml:space="preserve">  * the agreement identifies the other party as “Recipient”</w:t>
-      </w:r>
-    </w:p>
-    <w:p>
-      <w:r>
-        <w:t xml:space="preserve">  * the agreement references an existing “Mutual NDA”</w:t>
+        <w:t xml:space="preserve">* Do NOT route Unilateral NDA if </w:t>
+      </w:r>
+      <w:proofErr w:type="gramStart"/>
+      <w:r>
+        <w:t>all of</w:t>
+      </w:r>
+      <w:proofErr w:type="gramEnd"/>
+      <w:r>
+        <w:t xml:space="preserve"> the following are present:</w:t>
+      </w:r>
+    </w:p>
+    <w:p>
+      <w:r>
+        <w:t xml:space="preserve">  * </w:t>
+      </w:r>
+      <w:proofErr w:type="gramStart"/>
+      <w:r>
+        <w:t>the</w:t>
+      </w:r>
+      <w:proofErr w:type="gramEnd"/>
+      <w:r>
+        <w:t xml:space="preserve"> agreement identifies one party as “Discloser”</w:t>
+      </w:r>
+    </w:p>
+    <w:p>
+      <w:r>
+        <w:t xml:space="preserve">  * </w:t>
+      </w:r>
+      <w:proofErr w:type="gramStart"/>
+      <w:r>
+        <w:t>the</w:t>
+      </w:r>
+      <w:proofErr w:type="gramEnd"/>
+      <w:r>
+        <w:t xml:space="preserve"> agreement identifies the other party as “Recipient”</w:t>
+      </w:r>
+    </w:p>
+    <w:p>
+      <w:r>
+        <w:t xml:space="preserve">  * </w:t>
+      </w:r>
+      <w:proofErr w:type="gramStart"/>
+      <w:r>
+        <w:t>the</w:t>
+      </w:r>
+      <w:proofErr w:type="gramEnd"/>
+      <w:r>
+        <w:t xml:space="preserve"> agreement references an existing “Mutual NDA”</w:t>
       </w:r>
     </w:p>
     <w:p>
       <w:r>
         <w:lastRenderedPageBreak/>
-        <w:t xml:space="preserve">  * the agreement states that confidentiality protection is required in connection with, or in compliance with, the Mutual NDA</w:t>
+        <w:t xml:space="preserve">  * </w:t>
+      </w:r>
+      <w:proofErr w:type="gramStart"/>
+      <w:r>
+        <w:t>the</w:t>
+      </w:r>
+      <w:proofErr w:type="gramEnd"/>
+      <w:r>
+        <w:t xml:space="preserve"> agreement states that confidentiality protection is required in connection with, or in compliance with, the Mutual NDA</w:t>
       </w:r>
     </w:p>
     <w:p>
@@ -472,7 +616,15 @@
     </w:p>
     <w:p>
       <w:r>
-        <w:t>* If the protected information is consistently information of only one party, and the receiving obligations are imposed only on “you,” “your Representatives,” “Recipient,” or the receiving party, route Unilateral NDA unless a same-category Do NOT Trigger rule applies.</w:t>
+        <w:t xml:space="preserve">* If the protected information is consistently information of only one party, and the receiving obligations are imposed only on “you,” “your Representatives,” “Recipient,” or the receiving party, route Unilateral NDA unless a </w:t>
+      </w:r>
+      <w:proofErr w:type="gramStart"/>
+      <w:r>
+        <w:t>same-category</w:t>
+      </w:r>
+      <w:proofErr w:type="gramEnd"/>
+      <w:r>
+        <w:t xml:space="preserve"> Do NOT Trigger rule applies.</w:t>
       </w:r>
     </w:p>
     <w:p>
@@ -638,7 +790,15 @@
     </w:p>
     <w:p>
       <w:r>
-        <w:t>* “Vertragsstrafe”</w:t>
+        <w:t>* “</w:t>
+      </w:r>
+      <w:proofErr w:type="spellStart"/>
+      <w:r>
+        <w:t>Vertragsstrafe</w:t>
+      </w:r>
+      <w:proofErr w:type="spellEnd"/>
+      <w:r>
+        <w:t>”</w:t>
       </w:r>
     </w:p>
     <w:p>
@@ -775,7 +935,15 @@
     </w:p>
     <w:p>
       <w:r>
-        <w:t>Employees, contractors, consultants, Representatives, Authorised Persons, Authorized Persons, or other personnel of Accenture are required to:</w:t>
+        <w:t xml:space="preserve">Employees, contractors, consultants, Representatives, </w:t>
+      </w:r>
+      <w:proofErr w:type="spellStart"/>
+      <w:r>
+        <w:t>Authorised</w:t>
+      </w:r>
+      <w:proofErr w:type="spellEnd"/>
+      <w:r>
+        <w:t xml:space="preserve"> Persons, Authorized Persons, or other personnel of Accenture are required to:</w:t>
       </w:r>
     </w:p>
     <w:p>
@@ -786,26 +954,55 @@
     <w:p>
       <w:r>
         <w:lastRenderedPageBreak/>
-        <w:t>* sign NDAs, undertakings, acknowledgements, or similar documents directly with the counterparty; OR</w:t>
-      </w:r>
-    </w:p>
-    <w:p>
-      <w:r>
-        <w:t>* become directly bound by confidentiality obligations under the NDA itself; OR</w:t>
-      </w:r>
-    </w:p>
-    <w:p>
-      <w:r>
         <w:t xml:space="preserve">* </w:t>
       </w:r>
-      <w:r>
-        <w:t>become directly bound through a separate NDA, undertaking, acknowledgement, or written agreement with the counterparty.</w:t>
+      <w:proofErr w:type="gramStart"/>
+      <w:r>
+        <w:t>sign</w:t>
+      </w:r>
+      <w:proofErr w:type="gramEnd"/>
+      <w:r>
+        <w:t xml:space="preserve"> NDAs, undertakings, acknowledgements, or similar documents directly with the counterparty; OR</w:t>
+      </w:r>
+    </w:p>
+    <w:p>
+      <w:r>
+        <w:t xml:space="preserve">* </w:t>
+      </w:r>
+      <w:proofErr w:type="gramStart"/>
+      <w:r>
+        <w:t>become</w:t>
+      </w:r>
+      <w:proofErr w:type="gramEnd"/>
+      <w:r>
+        <w:t xml:space="preserve"> directly bound through a separate NDA, undertaking, acknowledgement letter, written agreement, or direct counterparty-facing document; OR</w:t>
+      </w:r>
+    </w:p>
+    <w:p>
+      <w:r>
+        <w:t xml:space="preserve">* </w:t>
+      </w:r>
+      <w:proofErr w:type="gramStart"/>
+      <w:r>
+        <w:t>become</w:t>
+      </w:r>
+      <w:proofErr w:type="gramEnd"/>
+      <w:r>
+        <w:t xml:space="preserve"> directly bound through a separate NDA, undertaking, acknowledgement, or written agreement with the counterparty.</w:t>
       </w:r>
     </w:p>
     <w:p/>
     <w:p>
       <w:r>
-        <w:t>This risk applies where the NDA creates, or appears to create, direct contractual-style obligations on Accenture personnel or representatives, rather than confidentiality obligations remaining solely between Accenture and the counterparty as legal entities.</w:t>
+        <w:t xml:space="preserve">This risk applies where the NDA creates, or appears to </w:t>
+      </w:r>
+      <w:proofErr w:type="gramStart"/>
+      <w:r>
+        <w:t>create,</w:t>
+      </w:r>
+      <w:proofErr w:type="gramEnd"/>
+      <w:r>
+        <w:t xml:space="preserve"> direct contractual-style obligations on Accenture personnel or representatives, rather than confidentiality obligations remaining solely between Accenture and the counterparty as legal entities.</w:t>
       </w:r>
     </w:p>
     <w:p>
@@ -855,7 +1052,15 @@
     </w:p>
     <w:p>
       <w:r>
-        <w:t>* “execute a non-disclosure undertaking in favour of Client”</w:t>
+        <w:t xml:space="preserve">* “execute a non-disclosure undertaking in </w:t>
+      </w:r>
+      <w:proofErr w:type="spellStart"/>
+      <w:r>
+        <w:t>favour</w:t>
+      </w:r>
+      <w:proofErr w:type="spellEnd"/>
+      <w:r>
+        <w:t xml:space="preserve"> of Client”</w:t>
       </w:r>
     </w:p>
     <w:p>
@@ -886,193 +1091,306 @@
     </w:p>
     <w:p>
       <w:r>
+        <w:lastRenderedPageBreak/>
         <w:t>* NDA only requires Accenture to ensure personnel are bound via employment agreements, internal policies, or agreements with Accenture</w:t>
       </w:r>
     </w:p>
     <w:p>
       <w:r>
+        <w:t>* Internal compliance management obligations only</w:t>
+      </w:r>
+    </w:p>
+    <w:p>
+      <w:r>
+        <w:t>* Personnel are merely required to be aware of confidentiality obligations</w:t>
+      </w:r>
+    </w:p>
+    <w:p>
+      <w:r>
+        <w:t xml:space="preserve">* Personnel are bound by confidentiality obligations substantially </w:t>
+      </w:r>
+      <w:proofErr w:type="gramStart"/>
+      <w:r>
+        <w:t>similar to</w:t>
+      </w:r>
+      <w:proofErr w:type="gramEnd"/>
+      <w:r>
+        <w:t xml:space="preserve"> the NDA</w:t>
+      </w:r>
+    </w:p>
+    <w:p>
+      <w:r>
+        <w:t>* Personnel are bound by confidentiality obligations at least as stringent as the NDA</w:t>
+      </w:r>
+    </w:p>
+    <w:p>
+      <w:r>
+        <w:t xml:space="preserve">* Personnel are under </w:t>
+      </w:r>
+      <w:proofErr w:type="gramStart"/>
+      <w:r>
+        <w:t>a duty</w:t>
+      </w:r>
+      <w:proofErr w:type="gramEnd"/>
+      <w:r>
+        <w:t xml:space="preserve"> of non-disclosure</w:t>
+      </w:r>
+    </w:p>
+    <w:p>
+      <w:r>
+        <w:t xml:space="preserve">* Personnel are under </w:t>
+      </w:r>
+      <w:proofErr w:type="gramStart"/>
+      <w:r>
+        <w:t>a duty</w:t>
+      </w:r>
+      <w:proofErr w:type="gramEnd"/>
+      <w:r>
+        <w:t xml:space="preserve"> to maintain confidentiality, security, or integrity</w:t>
+      </w:r>
+    </w:p>
+    <w:p>
+      <w:r>
+        <w:t>* Generic procurement or ensuring compliance language without direct extension of NDA obligations</w:t>
+      </w:r>
+    </w:p>
+    <w:p>
+      <w:r>
+        <w:t>* Confidentiality agreements between Accenture and its own subcontractors</w:t>
+      </w:r>
+    </w:p>
+    <w:p>
+      <w:r>
+        <w:t>* “appropriate written agreements with employees or contractors” without direct counterparty signing</w:t>
+      </w:r>
+    </w:p>
+    <w:p>
+      <w:r>
+        <w:t>* “signed a non-use and non-disclosure agreement or are otherwise legally obligated” where the agreement may be internal or employment-based</w:t>
+      </w:r>
+    </w:p>
+    <w:p>
+      <w:r>
+        <w:t>* “agreed to be bound by terms and conditions substantially similar to those of this agreement” without direct counterparty signing</w:t>
+      </w:r>
+    </w:p>
+    <w:p>
+      <w:r>
+        <w:t>* “bound by confidentiality obligations substantially similar to this Agreement” without direct counterparty signing</w:t>
+      </w:r>
+    </w:p>
+    <w:p>
+      <w:r>
+        <w:t>* Accenture remains responsible for personnel or Representatives, but the personnel or Representatives are not directly bound by the NDA itself</w:t>
+      </w:r>
+    </w:p>
+    <w:p>
+      <w:r>
+        <w:t>* Clause only requires the Receiving Party / Recipient to inform Representatives of the confidential nature of the information and the terms of the Agreement, without requiring Representatives to sign, execute, or deliver a separate NDA, undertaking, acknowledgement, or written agreement directly to the counterparty</w:t>
+      </w:r>
+    </w:p>
+    <w:p>
+      <w:r>
+        <w:t>* Clause states that Representatives are required to comply with the terms of the Agreement, but the Receiving Party / Recipient remains responsible for any action, failure to act, breach, or violation by those Representatives</w:t>
+      </w:r>
+    </w:p>
+    <w:p>
+      <w:r>
         <w:lastRenderedPageBreak/>
-        <w:t>* Internal compliance management obligations only</w:t>
-      </w:r>
-    </w:p>
-    <w:p>
-      <w:r>
-        <w:t>* Personnel are merely required to be aware of confidentiality obligations</w:t>
-      </w:r>
-    </w:p>
-    <w:p>
-      <w:r>
-        <w:t>* Personnel are bound by confidentiality obligations substantially similar to the NDA</w:t>
-      </w:r>
-    </w:p>
-    <w:p>
-      <w:r>
-        <w:t>* Personnel are bound by confidentiality obligations at least as stringent as the NDA</w:t>
-      </w:r>
-    </w:p>
-    <w:p>
-      <w:r>
-        <w:t>* Personnel are under a duty of non-disclosure</w:t>
-      </w:r>
-    </w:p>
-    <w:p>
-      <w:r>
-        <w:t>* Personnel are under a duty to maintain confidentiality, security, or integrity</w:t>
-      </w:r>
-    </w:p>
-    <w:p>
-      <w:r>
-        <w:t>* Generic procurement or ensuring compliance language without direct extension of NDA obligations</w:t>
-      </w:r>
-    </w:p>
-    <w:p>
-      <w:r>
-        <w:t>* Confidentiality agreements between Accenture and its own subcontractors</w:t>
-      </w:r>
-    </w:p>
-    <w:p>
-      <w:r>
-        <w:t>* “appropriate written agreements with employees or contractors” without direct counterparty signing</w:t>
-      </w:r>
-    </w:p>
-    <w:p>
-      <w:r>
-        <w:t>* “signed a non-use and non-disclosure agreement or are otherwise legally obligated” where the agreement may be internal or employment-based</w:t>
-      </w:r>
-    </w:p>
-    <w:p>
-      <w:r>
-        <w:t>* “agreed to be bound by terms and conditions substantially similar to those of this agreement” without direct counterparty signing</w:t>
-      </w:r>
-    </w:p>
-    <w:p>
-      <w:r>
-        <w:t>* “bound by confidentiality obligations substantially similar to this Agreement” without direct counterparty signing</w:t>
-      </w:r>
-    </w:p>
-    <w:p>
-      <w:r>
-        <w:t>* Accenture remains responsible for personnel or Representatives, but the personnel or Representatives are not directly bound by the NDA itself</w:t>
-      </w:r>
-    </w:p>
-    <w:p>
-      <w:r>
-        <w:t>* Clause only requires the Receiving Party / Recipient to inform Representatives of the confidential nature of the information and the terms of the Agreement, without requiring Representatives to sign, execute, or deliver a separate NDA, undertaking, acknowledgement, or written agreement directly to the counterparty</w:t>
-      </w:r>
-    </w:p>
-    <w:p>
-      <w:r>
-        <w:t>* Clause states that Representatives are required to comply with the terms of the Agreement, but the Receiving Party / Recipient remains responsible for any action, failure to act, breach, or violation by those Representatives</w:t>
-      </w:r>
-    </w:p>
-    <w:p>
-      <w:r>
         <w:t>* Clause contains “required to comply with the terms of this Agreement” and “You shall be responsible to the Company” but does not require Representatives to sign or execute a separate NDA, undertaking, acknowledgement, or written agreement</w:t>
       </w:r>
     </w:p>
     <w:p>
       <w:r>
+        <w:t>* Clause contains “as if such Representative were a party hereto” only for purposes of making the Receiving Party / Recipient responsible for Representative conduct, and does not require the Representative to sign, execute, deliver, or provide a separate NDA, undertaking, acknowledgement, or written agreement directly to the counterparty</w:t>
+      </w:r>
+    </w:p>
+    <w:p>
+      <w:r>
+        <w:t xml:space="preserve">* Clause contains </w:t>
+      </w:r>
+      <w:proofErr w:type="gramStart"/>
+      <w:r>
+        <w:t>all of</w:t>
+      </w:r>
+      <w:proofErr w:type="gramEnd"/>
+      <w:r>
+        <w:t xml:space="preserve"> the following:</w:t>
+      </w:r>
+    </w:p>
+    <w:p>
+      <w:r>
+        <w:t xml:space="preserve">  * “inform any Representatives”</w:t>
+      </w:r>
+    </w:p>
+    <w:p>
+      <w:r>
+        <w:t xml:space="preserve">  * “required to comply with the terms of this Agreement”</w:t>
+      </w:r>
+    </w:p>
+    <w:p>
+      <w:r>
+        <w:t xml:space="preserve">  * “You shall be responsible to the Company”</w:t>
+      </w:r>
+    </w:p>
+    <w:p>
+      <w:r>
+        <w:t xml:space="preserve">  * “as if such Representative were a party hereto”</w:t>
+      </w:r>
+    </w:p>
+    <w:p>
+      <w:r>
+        <w:t>Do NOT route Individual NDA where the only matched Individual NDA signal is Representative compliance language and the clause does not contain any of the following:</w:t>
+      </w:r>
+    </w:p>
+    <w:p>
+      <w:r>
+        <w:t xml:space="preserve">  * “sign”</w:t>
+      </w:r>
+    </w:p>
+    <w:p>
+      <w:r>
+        <w:t xml:space="preserve">  * “execute”</w:t>
+      </w:r>
+    </w:p>
+    <w:p>
+      <w:r>
+        <w:t xml:space="preserve">  * “written undertaking”</w:t>
+      </w:r>
+    </w:p>
+    <w:p>
+      <w:r>
+        <w:t xml:space="preserve">  * “individual undertaking”</w:t>
+      </w:r>
+    </w:p>
+    <w:p>
+      <w:r>
+        <w:t xml:space="preserve">  * “acknowledgement”</w:t>
+      </w:r>
+    </w:p>
+    <w:p>
+      <w:r>
+        <w:t xml:space="preserve">  * “non-disclosure undertaking”</w:t>
+      </w:r>
+    </w:p>
+    <w:p>
+      <w:r>
+        <w:t xml:space="preserve">  * “non-disclosure agreement”</w:t>
+      </w:r>
+    </w:p>
+    <w:p>
+      <w:r>
+        <w:t xml:space="preserve">  * “in </w:t>
+      </w:r>
+      <w:proofErr w:type="spellStart"/>
+      <w:r>
+        <w:t>favour</w:t>
+      </w:r>
+      <w:proofErr w:type="spellEnd"/>
+      <w:r>
+        <w:t xml:space="preserve"> of Client”</w:t>
+      </w:r>
+    </w:p>
+    <w:p>
+      <w:r>
+        <w:t xml:space="preserve">  * “provide Client with a copy”</w:t>
+      </w:r>
+    </w:p>
+    <w:p>
+      <w:r>
+        <w:t>* Do NOT route Individual NDA where the clause only requires the Receiving Party / Recipient / Advisor to ensure, procure, require, or cause its Representatives to comply with confidentiality obligations under the Agreement, without requiring those Representatives to sign, execute, deliver, or provide a separate NDA, undertaking, acknowledgement, or written agreement directly to the counterparty.</w:t>
+      </w:r>
+      <w:r>
+        <w:br/>
+      </w:r>
+      <w:r>
+        <w:br/>
+        <w:t xml:space="preserve">* Do NOT route Individual NDA where Representatives are bound by confidentiality </w:t>
+      </w:r>
+      <w:r>
         <w:lastRenderedPageBreak/>
-        <w:t>* Clause contains “as if such Representative were a party hereto” only for purposes of making the Receiving Party / Recipient responsible for Representative conduct, and does not require the Representative to sign, execute, deliver, or provide a separate NDA, undertaking, acknowledgement, or written agreement directly to the counterparty</w:t>
-      </w:r>
-    </w:p>
-    <w:p>
-      <w:r>
-        <w:t>* Clause contains all of the following:</w:t>
-      </w:r>
-    </w:p>
-    <w:p>
-      <w:r>
-        <w:t xml:space="preserve">  * “inform any Representatives”</w:t>
-      </w:r>
-    </w:p>
-    <w:p>
-      <w:r>
-        <w:t xml:space="preserve">  * “required to comply with the terms of this Agreement”</w:t>
-      </w:r>
-    </w:p>
-    <w:p>
-      <w:r>
-        <w:t xml:space="preserve">  * “You shall be responsible to the Company”</w:t>
-      </w:r>
-    </w:p>
-    <w:p>
-      <w:r>
-        <w:t xml:space="preserve">  * “as if such Representative were a party hereto”</w:t>
-      </w:r>
-    </w:p>
-    <w:p>
-      <w:r>
-        <w:t>Do NOT route Individual NDA where the only matched Individual NDA signal is Representative compliance language and the clause does not contain any of the following:</w:t>
-      </w:r>
-    </w:p>
-    <w:p>
-      <w:r>
-        <w:t xml:space="preserve">  * “sign”</w:t>
-      </w:r>
-    </w:p>
-    <w:p>
-      <w:r>
-        <w:t xml:space="preserve">  * “execute”</w:t>
-      </w:r>
-    </w:p>
-    <w:p>
-      <w:r>
-        <w:t xml:space="preserve">  * “written undertaking”</w:t>
-      </w:r>
-    </w:p>
-    <w:p>
-      <w:r>
-        <w:t xml:space="preserve">  * “individual undertaking”</w:t>
-      </w:r>
-    </w:p>
-    <w:p>
-      <w:r>
-        <w:t xml:space="preserve">  * “acknowledgement”</w:t>
-      </w:r>
-    </w:p>
-    <w:p>
-      <w:r>
-        <w:t xml:space="preserve">  * “non-disclosure undertaking”</w:t>
-      </w:r>
-    </w:p>
-    <w:p>
-      <w:r>
-        <w:t xml:space="preserve">  * “non-disclosure agreement”</w:t>
-      </w:r>
-    </w:p>
-    <w:p>
-      <w:r>
-        <w:t xml:space="preserve">  * “in favour of Client”</w:t>
-      </w:r>
-    </w:p>
-    <w:p>
-      <w:r>
-        <w:t xml:space="preserve">  * “provide Client with a copy”</w:t>
-      </w:r>
-    </w:p>
-    <w:p>
-      <w:r>
-        <w:t>* Do NOT route Individual NDA where the clause only requires the Receiving Party / Recipient / Advisor to ensure, procure, require, or cause its Representatives to comply with confidentiality obligations under the Agreement, without requiring those Representatives to sign, execute, deliver, or provide a separate NDA, undertaking, acknowledgement, or written agreement directly to the counterparty.</w:t>
+        <w:t>obligations substantially similar to, equivalent to, no less stringent than, or at least as restrictive as the NDA, unless the clause also requires direct signing, direct undertaking, direct acknowledgement, or delivery of a document to the counterparty.</w:t>
       </w:r>
       <w:r>
         <w:br/>
       </w:r>
       <w:r>
-        <w:br/>
-        <w:t>* Do NOT route Individual NDA where Representatives are bound by confidentiality obligations substantially similar to, equivalent to, no less stringent than, or at least as restrictive as the NDA, unless the clause also requires direct signing, direct undertaking, direct acknowledgement, or delivery of a document to the counterparty.</w:t>
-      </w:r>
-      <w:r>
-        <w:br/>
-      </w:r>
-      <w:r>
-        <w:lastRenderedPageBreak/>
         <w:br/>
         <w:t>* Do NOT route Individual NDA where the receiving party remains responsible or solely responsible for Representative conduct and there is no direct signing, direct undertaking, direct acknowledgement, or document delivery obligation imposed on the Representatives in favor of the counterparty.</w:t>
       </w:r>
     </w:p>
     <w:p>
       <w:r>
+        <w:t xml:space="preserve">* Do NOT route Individual NDA where Authorized Recipients, permitted recipients, representatives, personnel, employees, officers, contractors, or similar </w:t>
+      </w:r>
+      <w:proofErr w:type="gramStart"/>
+      <w:r>
+        <w:t>persons</w:t>
+      </w:r>
+      <w:proofErr w:type="gramEnd"/>
+      <w:r>
+        <w:t xml:space="preserve"> merely acknowledge, confirm, consent to, or sign at the foot / bottom / end of the same NDA or agreement, provided that:</w:t>
+      </w:r>
+    </w:p>
+    <w:p>
+      <w:r>
+        <w:t xml:space="preserve">  * </w:t>
+      </w:r>
+      <w:proofErr w:type="gramStart"/>
+      <w:r>
+        <w:t>no</w:t>
+      </w:r>
+      <w:proofErr w:type="gramEnd"/>
+      <w:r>
+        <w:t xml:space="preserve"> separate NDA, undertaking, acknowledgement letter, or written agreement is required;</w:t>
+      </w:r>
+    </w:p>
+    <w:p>
+      <w:r>
+        <w:t xml:space="preserve">  * </w:t>
+      </w:r>
+      <w:proofErr w:type="gramStart"/>
+      <w:r>
+        <w:t>no</w:t>
+      </w:r>
+      <w:proofErr w:type="gramEnd"/>
+      <w:r>
+        <w:t xml:space="preserve"> copy of a separate document must be delivered to the counterparty; and</w:t>
+      </w:r>
+    </w:p>
+    <w:p>
+      <w:r>
+        <w:t xml:space="preserve">  * </w:t>
+      </w:r>
+      <w:proofErr w:type="gramStart"/>
+      <w:r>
+        <w:t>the</w:t>
+      </w:r>
+      <w:proofErr w:type="gramEnd"/>
+      <w:r>
+        <w:t xml:space="preserve"> Receiving Party / Recipient / Provider remains responsible for those </w:t>
+      </w:r>
+      <w:proofErr w:type="gramStart"/>
+      <w:r>
+        <w:t>persons’</w:t>
+      </w:r>
+      <w:proofErr w:type="gramEnd"/>
+      <w:r>
+        <w:t xml:space="preserve"> conduct.</w:t>
+      </w:r>
+    </w:p>
+    <w:p>
+      <w:r>
+        <w:t>* Do NOT route Individual NDA where the clause only states that Authorized Recipients, permitted recipients, representatives, personnel, employees, officers, contractors, or similar persons are aware of, informed of, or agree to observe the NDA terms by signing the same agreement, without requiring a separate document directly with the counterparty.</w:t>
+      </w:r>
+    </w:p>
+    <w:p>
+      <w:r>
+        <w:t>* Do NOT route Individual NDA where the clause contains acknowledgement or conformity language, but the same clause confirms that the Receiving Party / Recipient / Provider remains responsible for the conduct or breach of those persons.</w:t>
+      </w:r>
+    </w:p>
+    <w:p>
+      <w:r>
         <w:t># 4. IP Ownership / Transfer</w:t>
       </w:r>
     </w:p>
@@ -1104,6 +1422,7 @@
     </w:p>
     <w:p>
       <w:r>
+        <w:lastRenderedPageBreak/>
         <w:t>Route only if one or more of the following appears in an IP transfer, ownership, work product, or rights assignment context:</w:t>
       </w:r>
     </w:p>
@@ -1179,57 +1498,57 @@
     </w:p>
     <w:p>
       <w:r>
+        <w:t>* “works made for hire”</w:t>
+      </w:r>
+    </w:p>
+    <w:p>
+      <w:r>
+        <w:t>* “moral rights”</w:t>
+      </w:r>
+    </w:p>
+    <w:p>
+      <w:r>
+        <w:t>* “waive all of their moral rights”</w:t>
+      </w:r>
+    </w:p>
+    <w:p>
+      <w:r>
+        <w:t>* “Intellectual Property Rights in the Works”</w:t>
+      </w:r>
+    </w:p>
+    <w:p>
+      <w:r>
+        <w:t>* “inventions assigned”</w:t>
+      </w:r>
+    </w:p>
+    <w:p>
+      <w:r>
+        <w:t>* “feedback becomes the sole property”</w:t>
+      </w:r>
+    </w:p>
+    <w:p>
+      <w:r>
+        <w:t>* “feedback becomes property”</w:t>
+      </w:r>
+    </w:p>
+    <w:p>
+      <w:r>
+        <w:t>* “modifications, updates, derivative works”</w:t>
+      </w:r>
+    </w:p>
+    <w:p>
+      <w:r>
+        <w:t>* “right, title and interest”</w:t>
+      </w:r>
+    </w:p>
+    <w:p>
+      <w:r>
+        <w:t>* “execute any and all documents required”</w:t>
+      </w:r>
+    </w:p>
+    <w:p>
+      <w:r>
         <w:lastRenderedPageBreak/>
-        <w:t>* “works made for hire”</w:t>
-      </w:r>
-    </w:p>
-    <w:p>
-      <w:r>
-        <w:t>* “moral rights”</w:t>
-      </w:r>
-    </w:p>
-    <w:p>
-      <w:r>
-        <w:t>* “waive all of their moral rights”</w:t>
-      </w:r>
-    </w:p>
-    <w:p>
-      <w:r>
-        <w:t>* “Intellectual Property Rights in the Works”</w:t>
-      </w:r>
-    </w:p>
-    <w:p>
-      <w:r>
-        <w:t>* “inventions assigned”</w:t>
-      </w:r>
-    </w:p>
-    <w:p>
-      <w:r>
-        <w:t>* “feedback becomes the sole property”</w:t>
-      </w:r>
-    </w:p>
-    <w:p>
-      <w:r>
-        <w:t>* “feedback becomes property”</w:t>
-      </w:r>
-    </w:p>
-    <w:p>
-      <w:r>
-        <w:t>* “modifications, updates, derivative works”</w:t>
-      </w:r>
-    </w:p>
-    <w:p>
-      <w:r>
-        <w:t>* “right, title and interest”</w:t>
-      </w:r>
-    </w:p>
-    <w:p>
-      <w:r>
-        <w:t>* “execute any and all documents required”</w:t>
-      </w:r>
-    </w:p>
-    <w:p>
-      <w:r>
         <w:t>* “secure the vesting of the Intellectual Property Rights”</w:t>
       </w:r>
     </w:p>
@@ -1310,18 +1629,1182 @@
     </w:p>
     <w:p>
       <w:r>
+        <w:t>* Clause contains BOTH:</w:t>
+      </w:r>
+    </w:p>
+    <w:p>
+      <w:r>
+        <w:t xml:space="preserve">  * “deliverable”</w:t>
+      </w:r>
+    </w:p>
+    <w:p>
+      <w:r>
+        <w:t xml:space="preserve">  * “property of the Company”</w:t>
+      </w:r>
+    </w:p>
+    <w:p>
+      <w:r>
+        <w:t>* Clause contains BOTH:</w:t>
+      </w:r>
+    </w:p>
+    <w:p>
+      <w:r>
+        <w:t xml:space="preserve">  * “result derived from the Project”</w:t>
+      </w:r>
+    </w:p>
+    <w:p>
+      <w:r>
+        <w:t xml:space="preserve">  * “property of the Company”</w:t>
+      </w:r>
+    </w:p>
+    <w:p>
+      <w:r>
+        <w:t>* Clause contains BOTH:</w:t>
+      </w:r>
+    </w:p>
+    <w:p>
+      <w:r>
+        <w:t xml:space="preserve">  * “deliverable or result”</w:t>
+      </w:r>
+    </w:p>
+    <w:p>
+      <w:r>
+        <w:t xml:space="preserve">  * “property of the Company”</w:t>
+      </w:r>
+    </w:p>
+    <w:p>
+      <w:r>
+        <w:t xml:space="preserve"> </w:t>
+      </w:r>
+    </w:p>
+    <w:p>
+      <w:r>
         <w:lastRenderedPageBreak/>
+        <w:t>## Do NOT Trigger</w:t>
+      </w:r>
+    </w:p>
+    <w:p>
+      <w:r>
+        <w:t>* Each party retains its existing IP</w:t>
+      </w:r>
+    </w:p>
+    <w:p>
+      <w:r>
+        <w:t>* No IP rights are transferred</w:t>
+      </w:r>
+    </w:p>
+    <w:p>
+      <w:r>
+        <w:t>* No license is granted</w:t>
+      </w:r>
+    </w:p>
+    <w:p>
+      <w:r>
+        <w:t>* No rights are granted by implication, estoppel, or otherwise</w:t>
+      </w:r>
+    </w:p>
+    <w:p>
+      <w:r>
+        <w:t>* Confidential Information remains the exclusive property of the Disclosing Party without transferring Accenture-created materials or work product</w:t>
+      </w:r>
+    </w:p>
+    <w:p>
+      <w:r>
+        <w:t>* IP use is limited solely to use of confidential information for the stated purpose</w:t>
+      </w:r>
+    </w:p>
+    <w:p>
+      <w:r>
+        <w:t>* Standard “no license granted” language</w:t>
+      </w:r>
+    </w:p>
+    <w:p>
+      <w:r>
+        <w:t>* “Nothing shall be construed as transferring ownership”</w:t>
+      </w:r>
+    </w:p>
+    <w:p>
+      <w:r>
+        <w:t>* “Company acknowledges it acquires no rights”</w:t>
+      </w:r>
+    </w:p>
+    <w:p>
+      <w:r>
+        <w:t>* “Recipient acquires no rights”</w:t>
+      </w:r>
+    </w:p>
+    <w:p>
+      <w:r>
+        <w:t>* “Discloser retains all rights, title and interest in and to the Proprietary Information”</w:t>
+      </w:r>
+    </w:p>
+    <w:p>
+      <w:r>
+        <w:t>* Background IP definitions where each party retains pre-existing IP</w:t>
+      </w:r>
+    </w:p>
+    <w:p>
+      <w:r>
+        <w:t>* Confidentiality-only obligations with no IP transfer</w:t>
+      </w:r>
+    </w:p>
+    <w:p>
+      <w:r>
+        <w:t>* Clause only states that unauthorized use or disclosure does not grant rights</w:t>
+      </w:r>
+    </w:p>
+    <w:p>
+      <w:r>
+        <w:t>* Clause only confirms that Confidential Information remains owned by the Disclosing Party in a unilateral NDA</w:t>
+      </w:r>
+    </w:p>
+    <w:p>
+      <w:r>
+        <w:t>* Clause only states that intellectual property rights in, emanating from, derived from, or related to Confidential Information belong to the Disclosing Party</w:t>
+      </w:r>
+    </w:p>
+    <w:p>
+      <w:r>
+        <w:t>* Clause only confirms that the Receiving Party / Receiver / Recipient has no rights in respect of Confidential Information except rights expressly granted under the Agreement</w:t>
+      </w:r>
+    </w:p>
+    <w:p>
+      <w:r>
+        <w:t>* Clause only confirms that Confidential Information and related intellectual property rights remain owned by the Disclosing Party</w:t>
+      </w:r>
+    </w:p>
+    <w:p>
+      <w:r>
+        <w:t>* Clause contains ownership-retention language related only to Confidential Information, and does not contain assignment, transfer, vesting, waiver, work product, developed work, works made for hire, inventions assigned, moral rights waiver, deliverables, or feedback ownership language</w:t>
+      </w:r>
+    </w:p>
+    <w:p>
+      <w:r>
+        <w:lastRenderedPageBreak/>
+        <w:t>* Do NOT route IP Ownership / Transfer if the clause only confirms ownership or retention of the Disclosing Party’s pre-existing Confidential Information or related intellectual property rights</w:t>
+      </w:r>
+    </w:p>
+    <w:p>
+      <w:r>
+        <w:t>* Do NOT route IP Ownership / Transfer where “property of the Company” or “property of the Disclosing Party” refers only to pre-existing Confidential Information and does not include deliverables, project results, work product, developed work, inventions, copyright, assignment, transfer, vesting, waiver, or feedback ownership language.</w:t>
+      </w:r>
+    </w:p>
+    <w:p>
+      <w:r>
+        <w:t>* Do NOT suppress IP Ownership / Transfer based only on a separate no-license clause if another clause expressly states that deliverables, project results, developed work, or work product will be property of the counterparty.</w:t>
+      </w:r>
+    </w:p>
+    <w:p>
+      <w:r>
+        <w:t xml:space="preserve"> </w:t>
+      </w:r>
+    </w:p>
+    <w:p>
+      <w:r>
+        <w:t>---</w:t>
+      </w:r>
+    </w:p>
+    <w:p>
+      <w:r>
+        <w:t xml:space="preserve"> </w:t>
+      </w:r>
+    </w:p>
+    <w:p>
+      <w:r>
+        <w:t># 5. Non-Solicitation Obligations</w:t>
+      </w:r>
+    </w:p>
+    <w:p>
+      <w:r>
+        <w:t>Type: COMMERCIAL / OPERATIONAL</w:t>
+      </w:r>
+    </w:p>
+    <w:p>
+      <w:r>
+        <w:t>## Definition</w:t>
+      </w:r>
+    </w:p>
+    <w:p>
+      <w:r>
+        <w:t>Restricts the solicitation, recruitment, hiring, employment, engagement, or retention of the other party’s employees, contractors, consultants, directors, officers, agents, or personnel.</w:t>
+      </w:r>
+    </w:p>
+    <w:p>
+      <w:r>
+        <w:t>## Non-Solicitation Snippet Extraction Rule</w:t>
+      </w:r>
+    </w:p>
+    <w:p>
+      <w:r>
+        <w:t xml:space="preserve">For </w:t>
+      </w:r>
+      <w:proofErr w:type="gramStart"/>
+      <w:r>
+        <w:t>Non-Solicitation</w:t>
+      </w:r>
+      <w:proofErr w:type="gramEnd"/>
+      <w:r>
+        <w:t xml:space="preserve"> triage only, if any Non-Solicitation Triage Signal is detected, the extracted snippet MUST include:</w:t>
+      </w:r>
+    </w:p>
+    <w:p>
+      <w:r>
+        <w:t xml:space="preserve">* </w:t>
+      </w:r>
+      <w:proofErr w:type="gramStart"/>
+      <w:r>
+        <w:t>the</w:t>
+      </w:r>
+      <w:proofErr w:type="gramEnd"/>
+      <w:r>
+        <w:t xml:space="preserve"> full sentence containing the matched Triage Signal;</w:t>
+      </w:r>
+    </w:p>
+    <w:p>
+      <w:r>
+        <w:t xml:space="preserve">* </w:t>
+      </w:r>
+      <w:proofErr w:type="gramStart"/>
+      <w:r>
+        <w:t>the</w:t>
+      </w:r>
+      <w:proofErr w:type="gramEnd"/>
+      <w:r>
+        <w:t xml:space="preserve"> immediately preceding sentence, if any;</w:t>
+      </w:r>
+    </w:p>
+    <w:p>
+      <w:r>
+        <w:t xml:space="preserve">* </w:t>
+      </w:r>
+      <w:proofErr w:type="gramStart"/>
+      <w:r>
+        <w:t>the</w:t>
+      </w:r>
+      <w:proofErr w:type="gramEnd"/>
+      <w:r>
+        <w:t xml:space="preserve"> immediately following sentence, if any; and</w:t>
+      </w:r>
+    </w:p>
+    <w:p>
+      <w:r>
+        <w:t xml:space="preserve">* </w:t>
+      </w:r>
+      <w:proofErr w:type="gramStart"/>
+      <w:r>
+        <w:t>any</w:t>
+      </w:r>
+      <w:proofErr w:type="gramEnd"/>
+      <w:r>
+        <w:t xml:space="preserve"> carve-out sentence in the same clause beginning with “However,” “Provided,” “provided, however,” “Such restrictions shall not apply,” “This shall not prohibit,” or similar carve-out wording.</w:t>
+      </w:r>
+    </w:p>
+    <w:p>
+      <w:r>
+        <w:t>* “</w:t>
+      </w:r>
+      <w:proofErr w:type="gramStart"/>
+      <w:r>
+        <w:t>However</w:t>
+      </w:r>
+      <w:proofErr w:type="gramEnd"/>
+      <w:r>
+        <w:t>”</w:t>
+      </w:r>
+    </w:p>
+    <w:p>
+      <w:r>
+        <w:t>* “advertisements in the media”</w:t>
+      </w:r>
+    </w:p>
+    <w:p>
+      <w:r>
+        <w:lastRenderedPageBreak/>
+        <w:t>* “own initiative”</w:t>
+      </w:r>
+    </w:p>
+    <w:p>
+      <w:r>
+        <w:t>* “burden of proof”</w:t>
+      </w:r>
+    </w:p>
+    <w:p>
+      <w:r>
+        <w:t xml:space="preserve">For </w:t>
+      </w:r>
+      <w:proofErr w:type="gramStart"/>
+      <w:r>
+        <w:t>Non-Solicitation</w:t>
+      </w:r>
+      <w:proofErr w:type="gramEnd"/>
+      <w:r>
+        <w:t xml:space="preserve"> triage only, if the snippet contains “solicit for employment or engagement,” the extracted snippet MUST include any same-clause carve-out sentence containing:</w:t>
+      </w:r>
+    </w:p>
+    <w:p>
+      <w:r>
+        <w:t>* “generalized searches for employees”</w:t>
+      </w:r>
+    </w:p>
+    <w:p>
+      <w:r>
+        <w:t>* “bona fide public advertisements in the media”</w:t>
+      </w:r>
+    </w:p>
+    <w:p>
+      <w:r>
+        <w:t>* “not targeted specifically”</w:t>
+      </w:r>
+    </w:p>
+    <w:p>
+      <w:r>
+        <w:t xml:space="preserve"> </w:t>
+      </w:r>
+    </w:p>
+    <w:p>
+      <w:r>
+        <w:t xml:space="preserve">If the carve-out sentence is not included in the extracted snippet, DO NOT finalize routing for </w:t>
+      </w:r>
+      <w:proofErr w:type="gramStart"/>
+      <w:r>
+        <w:t>Non-Solicitation</w:t>
+      </w:r>
+      <w:proofErr w:type="gramEnd"/>
+      <w:r>
+        <w:t xml:space="preserve"> until the full clause-level snippet has been captured.</w:t>
+      </w:r>
+    </w:p>
+    <w:p>
+      <w:r>
+        <w:t>## Triage Signals</w:t>
+      </w:r>
+    </w:p>
+    <w:p>
+      <w:r>
+        <w:t>Route only if one or more of the following appears in an employee/personnel restriction context:</w:t>
+      </w:r>
+    </w:p>
+    <w:p>
+      <w:r>
+        <w:t>* “non-solicitation”</w:t>
+      </w:r>
+    </w:p>
+    <w:p>
+      <w:r>
+        <w:t>* “non-solicitation of employees”</w:t>
+      </w:r>
+    </w:p>
+    <w:p>
+      <w:r>
+        <w:t>* “solicit employees”</w:t>
+      </w:r>
+    </w:p>
+    <w:p>
+      <w:r>
+        <w:t>* “solicit for employment”</w:t>
+      </w:r>
+    </w:p>
+    <w:p>
+      <w:r>
+        <w:t>* “seek to employ”</w:t>
+      </w:r>
+    </w:p>
+    <w:p>
+      <w:r>
+        <w:t>* “seek to retain the services”</w:t>
+      </w:r>
+    </w:p>
+    <w:p>
+      <w:r>
+        <w:t>* “hire any employee”</w:t>
+      </w:r>
+    </w:p>
+    <w:p>
+      <w:r>
+        <w:t>* “employ any employee”</w:t>
+      </w:r>
+    </w:p>
+    <w:p>
+      <w:r>
+        <w:t>* “recruit any employee”</w:t>
+      </w:r>
+    </w:p>
+    <w:p>
+      <w:r>
+        <w:t>* “engage any employee”</w:t>
+      </w:r>
+    </w:p>
+    <w:p>
+      <w:r>
+        <w:t>* “employ, hire, or engage”</w:t>
+      </w:r>
+    </w:p>
+    <w:p>
+      <w:r>
+        <w:t>* “consultant of the Disclosing Party”</w:t>
+      </w:r>
+    </w:p>
+    <w:p>
+      <w:r>
+        <w:t>* “employee of the Disclosing Party”</w:t>
+      </w:r>
+    </w:p>
+    <w:p>
+      <w:r>
+        <w:lastRenderedPageBreak/>
+        <w:t>* “other party’s personnel”</w:t>
+      </w:r>
+    </w:p>
+    <w:p>
+      <w:r>
+        <w:t>* “other party’s staff”</w:t>
+      </w:r>
+    </w:p>
+    <w:p>
+      <w:r>
+        <w:t>* “induce any employee to leave”</w:t>
+      </w:r>
+    </w:p>
+    <w:p>
+      <w:r>
+        <w:t>* “persuade any employee to leave”</w:t>
+      </w:r>
+    </w:p>
+    <w:p>
+      <w:r>
+        <w:t>* “encourage any employee to leave”</w:t>
+      </w:r>
+    </w:p>
+    <w:p>
+      <w:r>
+        <w:t>* “entice away”</w:t>
+      </w:r>
+    </w:p>
+    <w:p>
+      <w:r>
+        <w:t>* “Restricted Person”</w:t>
+      </w:r>
+    </w:p>
+    <w:p>
+      <w:r>
+        <w:t>* “solicit, engage, employ”</w:t>
+      </w:r>
+    </w:p>
+    <w:p>
+      <w:r>
+        <w:t>* “contractor of the other party”</w:t>
+      </w:r>
+    </w:p>
+    <w:p>
+      <w:r>
+        <w:t>* “consultant of the other party”</w:t>
+      </w:r>
+    </w:p>
+    <w:p>
+      <w:r>
+        <w:t>* “director, officer and/or employee”</w:t>
+      </w:r>
+    </w:p>
+    <w:p>
+      <w:r>
+        <w:t>* “employee or independent contractor”</w:t>
+      </w:r>
+    </w:p>
+    <w:p>
+      <w:r>
+        <w:t xml:space="preserve"> </w:t>
+      </w:r>
+    </w:p>
+    <w:p>
+      <w:r>
+        <w:t>## Do NOT Trigger</w:t>
+      </w:r>
+    </w:p>
+    <w:p>
+      <w:r>
+        <w:t>* Customer-only solicitation restrictions</w:t>
+      </w:r>
+    </w:p>
+    <w:p>
+      <w:r>
+        <w:t>* Vendor-only solicitation restrictions</w:t>
+      </w:r>
+    </w:p>
+    <w:p>
+      <w:r>
+        <w:t>* Supplier-only solicitation restrictions</w:t>
+      </w:r>
+    </w:p>
+    <w:p>
+      <w:r>
+        <w:t>* Restrictions limited to not interfering with business relationships without employee hiring or solicitation restrictions</w:t>
+      </w:r>
+    </w:p>
+    <w:p>
+      <w:r>
+        <w:t>* Restrictions limited to prospects or clients only</w:t>
+      </w:r>
+    </w:p>
+    <w:p>
+      <w:r>
+        <w:t>* Mutual non-solicitation clause is limited to employees/personnel, includes standard recruitment carve-outs, applies equally to both Parties, and duration is 24 months or less</w:t>
+      </w:r>
+    </w:p>
+    <w:p>
+      <w:r>
+        <w:t>* Clause contains both “advertisements in the media” and “own initiative”</w:t>
+      </w:r>
+    </w:p>
+    <w:p>
+      <w:r>
+        <w:t>* Clause contains both “general advertisement” and “unsolicited contact”</w:t>
+      </w:r>
+    </w:p>
+    <w:p>
+      <w:r>
+        <w:t>* Clause contains both “generalized solicitations” and “not specifically targeted”</w:t>
+      </w:r>
+    </w:p>
+    <w:p>
+      <w:r>
+        <w:t>* Clause contains both “public job postings” and “unsolicited applicants”</w:t>
+      </w:r>
+    </w:p>
+    <w:p>
+      <w:r>
+        <w:t>* Clause contains both “bona fide recruitment advertisement” and “employment agency”</w:t>
+      </w:r>
+    </w:p>
+    <w:p>
+      <w:r>
+        <w:lastRenderedPageBreak/>
+        <w:t>* Clause contains both “application for employment submitted on an unsolicited basis” and “general advertisement”</w:t>
+      </w:r>
+    </w:p>
+    <w:p>
+      <w:r>
+        <w:t xml:space="preserve">* Clause is acceptable employee non-solicitation language under the playbook and does not contain a </w:t>
+      </w:r>
+      <w:proofErr w:type="gramStart"/>
+      <w:r>
+        <w:t>liquidated damages</w:t>
+      </w:r>
+      <w:proofErr w:type="gramEnd"/>
+      <w:r>
+        <w:t>, non-compete, or country supplement trigger</w:t>
+      </w:r>
+    </w:p>
+    <w:p>
+      <w:r>
+        <w:t xml:space="preserve">* Clause contains </w:t>
+      </w:r>
+      <w:proofErr w:type="gramStart"/>
+      <w:r>
+        <w:t>all of</w:t>
+      </w:r>
+      <w:proofErr w:type="gramEnd"/>
+      <w:r>
+        <w:t xml:space="preserve"> the following:</w:t>
+      </w:r>
+    </w:p>
+    <w:p>
+      <w:r>
+        <w:t xml:space="preserve">  * “during the term of this Agreement”</w:t>
+      </w:r>
+    </w:p>
+    <w:p>
+      <w:r>
+        <w:t xml:space="preserve">  * “actively seeks employment”</w:t>
+      </w:r>
+    </w:p>
+    <w:p>
+      <w:r>
+        <w:t xml:space="preserve">  * “general advertisement”</w:t>
+      </w:r>
+    </w:p>
+    <w:p>
+      <w:r>
+        <w:t xml:space="preserve">  * “without direct solicitation”</w:t>
+      </w:r>
+    </w:p>
+    <w:p>
+      <w:r>
+        <w:t xml:space="preserve">* Clause contains </w:t>
+      </w:r>
+      <w:proofErr w:type="gramStart"/>
+      <w:r>
+        <w:t>all of</w:t>
+      </w:r>
+      <w:proofErr w:type="gramEnd"/>
+      <w:r>
+        <w:t xml:space="preserve"> the following:</w:t>
+      </w:r>
+    </w:p>
+    <w:p>
+      <w:r>
+        <w:t xml:space="preserve">  * “Both Parties agree not to solicit”</w:t>
+      </w:r>
+    </w:p>
+    <w:p>
+      <w:r>
+        <w:t xml:space="preserve">  * “employee or independent contractor of the other Party”</w:t>
+      </w:r>
+    </w:p>
+    <w:p>
+      <w:r>
+        <w:t xml:space="preserve">  * “actively seeks employment”</w:t>
+      </w:r>
+    </w:p>
+    <w:p>
+      <w:r>
+        <w:t xml:space="preserve">  * “general advertisement”</w:t>
+      </w:r>
+    </w:p>
+    <w:p>
+      <w:r>
+        <w:t xml:space="preserve">* Clause contains </w:t>
+      </w:r>
+      <w:proofErr w:type="gramStart"/>
+      <w:r>
+        <w:t>all of</w:t>
+      </w:r>
+      <w:proofErr w:type="gramEnd"/>
+      <w:r>
+        <w:t xml:space="preserve"> the following:</w:t>
+      </w:r>
+    </w:p>
+    <w:p>
+      <w:r>
+        <w:t xml:space="preserve">  * “not to solicit any employee or independent contractor”</w:t>
+      </w:r>
+    </w:p>
+    <w:p>
+      <w:r>
+        <w:t xml:space="preserve">  * “during the term of this Agreement”</w:t>
+      </w:r>
+    </w:p>
+    <w:p>
+      <w:r>
+        <w:t xml:space="preserve">  * “Such restrictions shall not apply”</w:t>
+      </w:r>
+    </w:p>
+    <w:p>
+      <w:r>
+        <w:t xml:space="preserve">  * “without direct solicitation”</w:t>
+      </w:r>
+    </w:p>
+    <w:p>
+      <w:r>
+        <w:t xml:space="preserve">* Clause contains </w:t>
+      </w:r>
+      <w:proofErr w:type="gramStart"/>
+      <w:r>
+        <w:t>all of</w:t>
+      </w:r>
+      <w:proofErr w:type="gramEnd"/>
+      <w:r>
+        <w:t xml:space="preserve"> the following:</w:t>
+      </w:r>
+    </w:p>
+    <w:p>
+      <w:r>
+        <w:t xml:space="preserve">  * “employee or independent contractor of either Party actively seeks employment”</w:t>
+      </w:r>
+    </w:p>
+    <w:p>
+      <w:r>
+        <w:t xml:space="preserve">  * “whether in response to a general advertisement or otherwise”</w:t>
+      </w:r>
+    </w:p>
+    <w:p>
+      <w:r>
+        <w:t xml:space="preserve">  * “without direct solicitation by such employing Party”</w:t>
+      </w:r>
+    </w:p>
+    <w:p>
+      <w:r>
+        <w:t xml:space="preserve">* Clause contains </w:t>
+      </w:r>
+      <w:proofErr w:type="gramStart"/>
+      <w:r>
+        <w:t>all of</w:t>
+      </w:r>
+      <w:proofErr w:type="gramEnd"/>
+      <w:r>
+        <w:t xml:space="preserve"> the following:</w:t>
+      </w:r>
+    </w:p>
+    <w:p>
+      <w:r>
+        <w:t xml:space="preserve">  * “on behalf of any other business enterprise”</w:t>
+      </w:r>
+    </w:p>
+    <w:p>
+      <w:r>
+        <w:t xml:space="preserve">  * “during the term of this Agreement”</w:t>
+      </w:r>
+    </w:p>
+    <w:p>
+      <w:r>
+        <w:t xml:space="preserve">  * “general advertisement”</w:t>
+      </w:r>
+    </w:p>
+    <w:p>
+      <w:r>
+        <w:lastRenderedPageBreak/>
+        <w:t xml:space="preserve">  * “without direct solicitation”</w:t>
+      </w:r>
+    </w:p>
+    <w:p>
+      <w:r>
+        <w:t xml:space="preserve">* Do NOT route </w:t>
+      </w:r>
+      <w:proofErr w:type="gramStart"/>
+      <w:r>
+        <w:t>Non-Solicitation</w:t>
+      </w:r>
+      <w:proofErr w:type="gramEnd"/>
+      <w:r>
+        <w:t xml:space="preserve"> if the only matched non-solicitation language is a mutual employee or independent contractor restriction and the same clause contains:</w:t>
+      </w:r>
+    </w:p>
+    <w:p>
+      <w:r>
+        <w:t xml:space="preserve">  * “during the term of this Agreement”</w:t>
+      </w:r>
+    </w:p>
+    <w:p>
+      <w:r>
+        <w:t xml:space="preserve">  * “Such restrictions shall not apply”</w:t>
+      </w:r>
+    </w:p>
+    <w:p>
+      <w:r>
+        <w:t xml:space="preserve">  * “actively seeks employment”</w:t>
+      </w:r>
+    </w:p>
+    <w:p>
+      <w:r>
+        <w:t xml:space="preserve">  * “general advertisement”</w:t>
+      </w:r>
+    </w:p>
+    <w:p>
+      <w:r>
+        <w:t xml:space="preserve">  * “without direct solicitation”</w:t>
+      </w:r>
+    </w:p>
+    <w:p>
+      <w:r>
+        <w:t xml:space="preserve">* Do NOT route </w:t>
+      </w:r>
+      <w:proofErr w:type="gramStart"/>
+      <w:r>
+        <w:t>Non-Solicitation</w:t>
+      </w:r>
+      <w:proofErr w:type="gramEnd"/>
+      <w:r>
+        <w:t xml:space="preserve"> if the same </w:t>
+      </w:r>
+      <w:proofErr w:type="gramStart"/>
+      <w:r>
+        <w:t>Non-Solicitation</w:t>
+      </w:r>
+      <w:proofErr w:type="gramEnd"/>
+      <w:r>
+        <w:t xml:space="preserve"> clause contains BOTH:</w:t>
+      </w:r>
+    </w:p>
+    <w:p>
+      <w:r>
+        <w:t xml:space="preserve">  * “advertisements in the media”</w:t>
+      </w:r>
+    </w:p>
+    <w:p>
+      <w:r>
+        <w:t xml:space="preserve">  * “own initiative”</w:t>
+      </w:r>
+    </w:p>
+    <w:p>
+      <w:r>
+        <w:t xml:space="preserve">* Do NOT route </w:t>
+      </w:r>
+      <w:proofErr w:type="gramStart"/>
+      <w:r>
+        <w:t>Non-Solicitation</w:t>
+      </w:r>
+      <w:proofErr w:type="gramEnd"/>
+      <w:r>
+        <w:t xml:space="preserve"> if the clause is limited to officers only and contains standard public-recruitment carve-outs.</w:t>
+      </w:r>
+    </w:p>
+    <w:p>
+      <w:r>
+        <w:t xml:space="preserve">* Clause contains </w:t>
+      </w:r>
+      <w:proofErr w:type="gramStart"/>
+      <w:r>
+        <w:t>all of</w:t>
+      </w:r>
+      <w:proofErr w:type="gramEnd"/>
+      <w:r>
+        <w:t xml:space="preserve"> the following:</w:t>
+      </w:r>
+    </w:p>
+    <w:p>
+      <w:r>
+        <w:t xml:space="preserve">  * “any officer of the Company”</w:t>
+      </w:r>
+    </w:p>
+    <w:p>
+      <w:r>
+        <w:t xml:space="preserve">  * “generalized searches for employees”</w:t>
+      </w:r>
+    </w:p>
+    <w:p>
+      <w:r>
+        <w:t xml:space="preserve">  * “bona fide public advertisements in the media”</w:t>
+      </w:r>
+    </w:p>
+    <w:p>
+      <w:r>
+        <w:t xml:space="preserve">  * “not targeted specifically at employees of the Company”</w:t>
+      </w:r>
+    </w:p>
+    <w:p>
+      <w:r>
+        <w:t xml:space="preserve">* Clause contains </w:t>
+      </w:r>
+      <w:proofErr w:type="gramStart"/>
+      <w:r>
+        <w:t>all of</w:t>
+      </w:r>
+      <w:proofErr w:type="gramEnd"/>
+      <w:r>
+        <w:t xml:space="preserve"> the following:</w:t>
+      </w:r>
+    </w:p>
+    <w:p>
+      <w:r>
+        <w:t xml:space="preserve">  * “solicitation of any such person”</w:t>
+      </w:r>
+    </w:p>
+    <w:p>
+      <w:r>
+        <w:t xml:space="preserve">  * “generalized searches for employees”</w:t>
+      </w:r>
+    </w:p>
+    <w:p>
+      <w:r>
+        <w:t xml:space="preserve">  * “bona fide public advertisements in the media”</w:t>
+      </w:r>
+    </w:p>
+    <w:p>
+      <w:r>
+        <w:t xml:space="preserve">  * “not targeted specifically”</w:t>
+      </w:r>
+    </w:p>
+    <w:p>
+      <w:r>
+        <w:t xml:space="preserve">* Clause contains </w:t>
+      </w:r>
+      <w:proofErr w:type="gramStart"/>
+      <w:r>
+        <w:t>all of</w:t>
+      </w:r>
+      <w:proofErr w:type="gramEnd"/>
+      <w:r>
+        <w:t xml:space="preserve"> the following:</w:t>
+      </w:r>
+    </w:p>
+    <w:p>
+      <w:r>
+        <w:t xml:space="preserve">  * “employ or engage, or solicit for employment or engagement”</w:t>
+      </w:r>
+    </w:p>
+    <w:p>
+      <w:r>
+        <w:t xml:space="preserve">  * “any officer of the Company”</w:t>
+      </w:r>
+    </w:p>
+    <w:p>
+      <w:r>
+        <w:t xml:space="preserve">  * “bona fide public advertisements in the media”</w:t>
+      </w:r>
+    </w:p>
+    <w:p>
+      <w:r>
+        <w:lastRenderedPageBreak/>
+        <w:t xml:space="preserve">  * “not targeted specifically”</w:t>
+      </w:r>
+    </w:p>
+    <w:p>
+      <w:r>
+        <w:t xml:space="preserve"> </w:t>
+      </w:r>
+    </w:p>
+    <w:p>
+      <w:r>
+        <w:t>## Country Supplement Override</w:t>
+      </w:r>
+    </w:p>
+    <w:p>
+      <w:r>
+        <w:t xml:space="preserve">* If the NDA is connected to the Nordics Market Unit and contains any non-solicitation clause, route to </w:t>
+      </w:r>
+      <w:proofErr w:type="gramStart"/>
+      <w:r>
+        <w:t>Non-Solicitation</w:t>
+      </w:r>
+      <w:proofErr w:type="gramEnd"/>
+      <w:r>
+        <w:t xml:space="preserve"> even if standard carve-outs are present.</w:t>
+      </w:r>
+    </w:p>
+    <w:p>
+      <w:r>
+        <w:t>* Nordics non-solicitation must be routed because the playbook states it should be removed in all cases.</w:t>
+      </w:r>
+    </w:p>
+    <w:p>
+      <w:r>
+        <w:t># 6. Non-Compete / Exclusivity</w:t>
+      </w:r>
+    </w:p>
+    <w:p>
+      <w:r>
+        <w:t>Type: STRATEGIC / COMMERCIAL</w:t>
+      </w:r>
+    </w:p>
+    <w:p>
+      <w:r>
+        <w:t>## Definition</w:t>
+      </w:r>
+    </w:p>
+    <w:p>
+      <w:r>
+        <w:t>Restricts competitive business activities, market participation, provision of services to third parties, provision of services to competitors or other clients, exclusive dealing, pursuit of business opportunities, or engagement with competing enterprises.</w:t>
+      </w:r>
+    </w:p>
+    <w:p>
+      <w:r>
+        <w:t>This risk applies where the NDA clearly limits Accenture’s ability to compete, serve other clients, work with competitors, pursue future business, participate in a market, or conduct business independently.</w:t>
+      </w:r>
+    </w:p>
+    <w:p>
+      <w:r>
+        <w:t>This risk also includes obligations requiring Accenture to disclose, notify, indicate, or report existing or potential work, contracts, consulting relationships, or service relationships with competitors of the client where the obligation is tied to competitor status and may constrain Accenture’s ability to serve other clients or competitors.</w:t>
+      </w:r>
+    </w:p>
+    <w:p>
+      <w:r>
+        <w:t xml:space="preserve"> </w:t>
+      </w:r>
+    </w:p>
+    <w:p>
+      <w:r>
+        <w:t>## Triage Signals</w:t>
+      </w:r>
+    </w:p>
+    <w:p>
+      <w:r>
+        <w:t>* “non-compete”</w:t>
+      </w:r>
+    </w:p>
+    <w:p>
+      <w:r>
+        <w:t>* “non-competition”</w:t>
+      </w:r>
+    </w:p>
+    <w:p>
+      <w:r>
+        <w:t>* “exclusive” or “exclusivity”</w:t>
+      </w:r>
+    </w:p>
+    <w:p>
+      <w:r>
+        <w:t>* “exclusive basis”</w:t>
+      </w:r>
+    </w:p>
+    <w:p>
+      <w:r>
+        <w:t>* “competition restriction”</w:t>
+      </w:r>
+    </w:p>
+    <w:p>
+      <w:r>
+        <w:t>* “restrict services” to third parties</w:t>
+      </w:r>
+    </w:p>
+    <w:p>
+      <w:r>
+        <w:t>* “cannot provide services” to competitors or other clients</w:t>
+      </w:r>
+    </w:p>
+    <w:p>
+      <w:r>
+        <w:lastRenderedPageBreak/>
+        <w:t>* “shall not provide services” to competitors or other clients</w:t>
+      </w:r>
+    </w:p>
+    <w:p>
+      <w:r>
+        <w:t>* “shall not enter into direct competition”</w:t>
+      </w:r>
+    </w:p>
+    <w:p>
+      <w:r>
+        <w:t>* “not to enter into direct competition”</w:t>
+      </w:r>
+    </w:p>
+    <w:p>
+      <w:r>
+        <w:t>* “Client Competitor”</w:t>
+      </w:r>
+    </w:p>
+    <w:p>
+      <w:r>
+        <w:t>* “competitor” or “competing enterprise” in a clause restricting business activity</w:t>
+      </w:r>
+    </w:p>
+    <w:p>
+      <w:r>
+        <w:t>* “like industry” in a clause restricting business activity</w:t>
+      </w:r>
+    </w:p>
+    <w:p>
+      <w:r>
+        <w:t>* “offer identical or like services”</w:t>
+      </w:r>
+    </w:p>
+    <w:p>
+      <w:r>
+        <w:t>* “competitive disadvantage”</w:t>
+      </w:r>
+    </w:p>
+    <w:p>
+      <w:r>
+        <w:t>* “causing any competition”</w:t>
+      </w:r>
+    </w:p>
+    <w:p>
+      <w:r>
+        <w:t>* “deal with one another on an exclusive basis”</w:t>
+      </w:r>
+    </w:p>
+    <w:p>
+      <w:r>
+        <w:t>* “restricts future services”</w:t>
+      </w:r>
+    </w:p>
+    <w:p>
+      <w:r>
+        <w:t>* “provide future services” to other clients is restricted</w:t>
+      </w:r>
+    </w:p>
+    <w:p>
+      <w:r>
+        <w:t>* “pursuing business opportunities” is restricted</w:t>
+      </w:r>
+    </w:p>
+    <w:p>
+      <w:r>
+        <w:t>* “refrain from entering into any new business relationship”</w:t>
+      </w:r>
+    </w:p>
+    <w:p>
+      <w:r>
+        <w:t>* “not directly or indirectly contact, or negotiate with, a third party regarding a potential business relationship”</w:t>
+      </w:r>
+    </w:p>
+    <w:p>
+      <w:r>
+        <w:t>* “persuade any customer” to cease, reduce, or discontinue business</w:t>
+      </w:r>
+    </w:p>
+    <w:p>
+      <w:r>
+        <w:t>* “induce any customer” to cease, reduce, or discontinue business</w:t>
+      </w:r>
+    </w:p>
+    <w:p>
+      <w:r>
+        <w:t>* “persuade any vendor” to cease, reduce, or discontinue business</w:t>
+      </w:r>
+    </w:p>
+    <w:p>
+      <w:r>
+        <w:t>* “induce any vendor” to cease, reduce, or discontinue business</w:t>
+      </w:r>
+    </w:p>
+    <w:p>
+      <w:r>
+        <w:t>* “cease purchasing goods or services”</w:t>
+      </w:r>
+    </w:p>
+    <w:p>
+      <w:r>
+        <w:t>* “cease selling goods and services”</w:t>
+      </w:r>
+    </w:p>
+    <w:p>
+      <w:r>
+        <w:t>* “reduce or discontinue any business relationship”</w:t>
+      </w:r>
+    </w:p>
+    <w:p>
+      <w:r>
+        <w:t>* “prevented or restricted from performing services”</w:t>
+      </w:r>
+    </w:p>
+    <w:p>
+      <w:r>
+        <w:t>* “prevented or restricted from pursuing business opportunities”</w:t>
+      </w:r>
+    </w:p>
+    <w:p>
+      <w:r>
+        <w:t>* “direct competitor of the Client”</w:t>
+      </w:r>
+    </w:p>
+    <w:p>
+      <w:r>
+        <w:lastRenderedPageBreak/>
+        <w:t>* “contracted to, working for, or consulting for”</w:t>
+      </w:r>
+    </w:p>
+    <w:p>
+      <w:r>
+        <w:t>* “working for, or consulting for any company which is a direct competitor”</w:t>
+      </w:r>
+    </w:p>
+    <w:p>
+      <w:r>
+        <w:t>* “indicate to you immediately” combined with “direct competitor”</w:t>
+      </w:r>
+    </w:p>
+    <w:p>
+      <w:r>
+        <w:t>* “notify” or “indicate” combined with “direct competitor of the Client”</w:t>
+      </w:r>
+    </w:p>
+    <w:p>
+      <w:r>
+        <w:t>* “disclose” or “report” combined with “working for” and “direct competitor”</w:t>
+      </w:r>
+    </w:p>
+    <w:p>
+      <w:r>
         <w:t>* Clause contains BOTH:</w:t>
       </w:r>
     </w:p>
     <w:p>
       <w:r>
-        <w:t xml:space="preserve">  * “deliverable”</w:t>
-      </w:r>
-    </w:p>
-    <w:p>
-      <w:r>
-        <w:t xml:space="preserve">  * “property of the Company”</w:t>
+        <w:t xml:space="preserve">  * “direct competitor of the Client”</w:t>
+      </w:r>
+    </w:p>
+    <w:p>
+      <w:r>
+        <w:t xml:space="preserve">  * “contracted to, working for, or consulting for”</w:t>
       </w:r>
     </w:p>
     <w:p>
@@ -1331,12 +2814,605 @@
     </w:p>
     <w:p>
       <w:r>
-        <w:t xml:space="preserve">  * “result derived from the Project”</w:t>
-      </w:r>
-    </w:p>
-    <w:p>
-      <w:r>
-        <w:t xml:space="preserve">  * “property of the Company”</w:t>
+        <w:t xml:space="preserve">  * “direct competitor”</w:t>
+      </w:r>
+    </w:p>
+    <w:p>
+      <w:r>
+        <w:t xml:space="preserve">  * “working for, or consulting for”</w:t>
+      </w:r>
+    </w:p>
+    <w:p>
+      <w:r>
+        <w:t xml:space="preserve">* Clause contains </w:t>
+      </w:r>
+      <w:proofErr w:type="gramStart"/>
+      <w:r>
+        <w:t>ALL of</w:t>
+      </w:r>
+      <w:proofErr w:type="gramEnd"/>
+      <w:r>
+        <w:t xml:space="preserve"> the following:</w:t>
+      </w:r>
+    </w:p>
+    <w:p>
+      <w:r>
+        <w:t xml:space="preserve">  * “indicate”</w:t>
+      </w:r>
+    </w:p>
+    <w:p>
+      <w:r>
+        <w:t xml:space="preserve">  * “working for”</w:t>
+      </w:r>
+    </w:p>
+    <w:p>
+      <w:r>
+        <w:t xml:space="preserve">  * “consulting for”</w:t>
+      </w:r>
+    </w:p>
+    <w:p>
+      <w:r>
+        <w:t xml:space="preserve">  * “direct competitor”</w:t>
+      </w:r>
+    </w:p>
+    <w:p>
+      <w:r>
+        <w:t xml:space="preserve"> </w:t>
+      </w:r>
+    </w:p>
+    <w:p>
+      <w:r>
+        <w:t>## Do NOT Trigger</w:t>
+      </w:r>
+    </w:p>
+    <w:p>
+      <w:r>
+        <w:t>* Restrictions solely prevent misuse of confidential information for competitive purposes</w:t>
+      </w:r>
+    </w:p>
+    <w:p>
+      <w:r>
+        <w:t>* Standard confidentiality obligations that do not restrict business activities</w:t>
+      </w:r>
+    </w:p>
+    <w:p>
+      <w:r>
+        <w:t>* Provisions explicitly confirming parties may compete freely</w:t>
+      </w:r>
+    </w:p>
+    <w:p>
+      <w:r>
+        <w:t>* “exclusive jurisdiction” / “submit to the exclusive jurisdiction”</w:t>
+      </w:r>
+    </w:p>
+    <w:p>
+      <w:r>
+        <w:t>* “exclusive right to” in the context of court remedies or legal proceedings</w:t>
+      </w:r>
+    </w:p>
+    <w:p>
+      <w:r>
+        <w:t>* “exclusive property of the Disclosing Party” in a Confidential Information ownership clause</w:t>
+      </w:r>
+    </w:p>
+    <w:p>
+      <w:r>
+        <w:t>* “sole and exclusive property” in an IP ownership context</w:t>
+      </w:r>
+    </w:p>
+    <w:p>
+      <w:r>
+        <w:lastRenderedPageBreak/>
+        <w:t>* Clause only limits use of Confidential Information to the Purpose or Project</w:t>
+      </w:r>
+    </w:p>
+    <w:p>
+      <w:r>
+        <w:t>* Clause only prohibits use of Confidential Information for purposes outside the NDA purpose</w:t>
+      </w:r>
+    </w:p>
+    <w:p>
+      <w:r>
+        <w:t>* Clause only prohibits contacting customers, suppliers, vendors, or connected persons for appraisal, evaluation, due diligence, Project review, or confidentiality-control purposes</w:t>
+      </w:r>
+    </w:p>
+    <w:p>
+      <w:r>
+        <w:t xml:space="preserve">* Clause only requires prior written consent before contacting customers, suppliers, vendors, or connected </w:t>
+      </w:r>
+      <w:proofErr w:type="gramStart"/>
+      <w:r>
+        <w:t>persons</w:t>
+      </w:r>
+      <w:proofErr w:type="gramEnd"/>
+      <w:r>
+        <w:t>, without restricting competition, future services, market participation, or independent business activities</w:t>
+      </w:r>
+    </w:p>
+    <w:p>
+      <w:r>
+        <w:t>* Clause contains “make contact, directly or indirectly” but does not contain a clear competition, exclusivity, future-services, market-participation, customer-diversion, vendor-diversion, or business-opportunity restriction</w:t>
+      </w:r>
+    </w:p>
+    <w:p>
+      <w:r>
+        <w:t>* Clause contains “customer” or “supplier” but does not require the customer or supplier to cease, reduce, discontinue, or refrain from doing business with the Disclosing Party</w:t>
+      </w:r>
+    </w:p>
+    <w:p>
+      <w:r>
+        <w:t>* Clause contains “customer” or “supplier” but does not restrict Accenture from providing services to third parties, competitors, or other clients</w:t>
+      </w:r>
+    </w:p>
+    <w:p>
+      <w:r>
+        <w:t>* Clause contains “customer, supplier, or any other person connected with the Disclosing Party” only in the context of appraisal, evaluation, diligence, Project review, or confidentiality protection</w:t>
+      </w:r>
+    </w:p>
+    <w:p>
+      <w:r>
+        <w:t>* Restrictions limited to not interfering with business relationships, without a clear restriction on competitive activity, future services, market participation, or business opportunity pursuit</w:t>
+      </w:r>
+    </w:p>
+    <w:p>
+      <w:r>
+        <w:t xml:space="preserve">* General no-contact clauses related to the Project, unless they also include </w:t>
+      </w:r>
+      <w:proofErr w:type="gramStart"/>
+      <w:r>
+        <w:t>a clear</w:t>
+      </w:r>
+      <w:proofErr w:type="gramEnd"/>
+      <w:r>
+        <w:t xml:space="preserve"> non-compete, exclusivity, customer diversion, vendor diversion, or business opportunity restriction</w:t>
+      </w:r>
+    </w:p>
+    <w:p>
+      <w:r>
+        <w:t>* Do NOT route Non-Compete / Exclusivity where “competitor” appears only to exclude competitor consultants, advisors, or representatives from receiving Confidential Information, without requiring Accenture to disclose, notify, indicate, report, limit, stop, or avoid work with a competitor.</w:t>
+      </w:r>
+    </w:p>
+    <w:p>
+      <w:r>
+        <w:t xml:space="preserve">* Do NOT route Non-Compete / Exclusivity where “competitor” appears only in a confidentiality-control provision and does not relate to Accenture </w:t>
+      </w:r>
+      <w:r>
+        <w:t>b</w:t>
+      </w:r>
+      <w:r>
+        <w:t>eing contracted to, working for, consulting for, providing services to, or pursuing work with a competitor.</w:t>
+      </w:r>
+    </w:p>
+    <w:p>
+      <w:r>
+        <w:lastRenderedPageBreak/>
+        <w:t>* Do NOT route Non-Compete / Exclusivity where the clause merely states that Confidential Information must not be disclosed to competitors, without any obligation to disclose competitor relationships or restrict business activity.</w:t>
+      </w:r>
+    </w:p>
+    <w:p>
+      <w:r>
+        <w:t xml:space="preserve"> </w:t>
+      </w:r>
+    </w:p>
+    <w:p>
+      <w:r>
+        <w:t>## Conflict Resolution Rule</w:t>
+      </w:r>
+    </w:p>
+    <w:p>
+      <w:r>
+        <w:t>If a clause contains customer, supplier, vendor, or business relationship language, route Non-Compete / Exclusivity only if the clause clearly restricts competitive activity, future services, market participation, independent business opportunities, or causes customers/vendors to cease, reduce, discontinue, or refrain from business with the other party.</w:t>
+      </w:r>
+    </w:p>
+    <w:p>
+      <w:r>
+        <w:t xml:space="preserve"> </w:t>
+      </w:r>
+    </w:p>
+    <w:p>
+      <w:r>
+        <w:t>If the clause is only a project-related no-contact or consent-before-contact restriction, DO NOT route Non-Compete / Exclusivity.</w:t>
+      </w:r>
+    </w:p>
+    <w:p>
+      <w:r>
+        <w:t># 7. Additional Requirements</w:t>
+      </w:r>
+    </w:p>
+    <w:p>
+      <w:r>
+        <w:t>Type: JURISDICTIONAL / REGULATORY</w:t>
+      </w:r>
+    </w:p>
+    <w:p>
+      <w:r>
+        <w:t>## Definition</w:t>
+      </w:r>
+    </w:p>
+    <w:p>
+      <w:r>
+        <w:t xml:space="preserve">Non-standard legal, regulatory, </w:t>
+      </w:r>
+      <w:proofErr w:type="gramStart"/>
+      <w:r>
+        <w:t>execution-formality</w:t>
+      </w:r>
+      <w:proofErr w:type="gramEnd"/>
+      <w:r>
+        <w:t>, or jurisdiction-specific obligations that do not fall under the other risk categories and require special routing under the playbook.</w:t>
+      </w:r>
+    </w:p>
+    <w:p>
+      <w:r>
+        <w:t>This includes confirmed ANZ deed execution requirements, Italy-specific insider trading / market abuse requirements, notarization, registration or regulatory filing obligations, and agreements where one of the contracting parties is a confirmed individual person at party-definition level.</w:t>
+      </w:r>
+    </w:p>
+    <w:p>
+      <w:r>
+        <w:t>## Triage Signals</w:t>
+      </w:r>
+    </w:p>
+    <w:p>
+      <w:r>
+        <w:t>* “deed” or “executed as a deed” in an ANZ MU context</w:t>
+      </w:r>
+    </w:p>
+    <w:p>
+      <w:r>
+        <w:t>* “signature by deed” in an ANZ MU context</w:t>
+      </w:r>
+    </w:p>
+    <w:p>
+      <w:r>
+        <w:t>* “signed as a deed” in an ANZ MU context</w:t>
+      </w:r>
+    </w:p>
+    <w:p>
+      <w:r>
+        <w:t>* “notarized”</w:t>
+      </w:r>
+    </w:p>
+    <w:p>
+      <w:r>
+        <w:t>* “notarization”</w:t>
+      </w:r>
+    </w:p>
+    <w:p>
+      <w:r>
+        <w:t>* “registration of this agreement”</w:t>
+      </w:r>
+    </w:p>
+    <w:p>
+      <w:r>
+        <w:lastRenderedPageBreak/>
+        <w:t>* “register this agreement”</w:t>
+      </w:r>
+    </w:p>
+    <w:p>
+      <w:r>
+        <w:t>* “file this agreement” with regulator</w:t>
+      </w:r>
+    </w:p>
+    <w:p>
+      <w:r>
+        <w:t>* “filing with regulator”</w:t>
+      </w:r>
+    </w:p>
+    <w:p>
+      <w:r>
+        <w:t>* “regulatory filing”</w:t>
+      </w:r>
+    </w:p>
+    <w:p>
+      <w:r>
+        <w:t>* “filed with regulator”</w:t>
+      </w:r>
+    </w:p>
+    <w:p>
+      <w:r>
+        <w:t>* One of the parties is a confirmed individual person at party-definition level</w:t>
+      </w:r>
+    </w:p>
+    <w:p>
+      <w:r>
+        <w:t>Italy-specific insider trading / market abuse signals require BOTH an Insider / MAR signal AND an Italy nexus.</w:t>
+      </w:r>
+    </w:p>
+    <w:p>
+      <w:r>
+        <w:t xml:space="preserve"> </w:t>
+      </w:r>
+    </w:p>
+    <w:p>
+      <w:r>
+        <w:t>Insider / MAR signal:</w:t>
+      </w:r>
+    </w:p>
+    <w:p>
+      <w:r>
+        <w:t>* “insider trading”</w:t>
+      </w:r>
+    </w:p>
+    <w:p>
+      <w:r>
+        <w:t>* “inside information”</w:t>
+      </w:r>
+    </w:p>
+    <w:p>
+      <w:r>
+        <w:t>* “market abuse”</w:t>
+      </w:r>
+    </w:p>
+    <w:p>
+      <w:r>
+        <w:t>* “market sensitive information”</w:t>
+      </w:r>
+    </w:p>
+    <w:p>
+      <w:r>
+        <w:t>* “MAR Regulation No 596/2014”</w:t>
+      </w:r>
+    </w:p>
+    <w:p>
+      <w:r>
+        <w:t>* “Regulation (EU) No 596/2014”</w:t>
+      </w:r>
+    </w:p>
+    <w:p>
+      <w:r>
+        <w:t>* “Market Abuse Regulation”</w:t>
+      </w:r>
+    </w:p>
+    <w:p>
+      <w:r>
+        <w:t>* “Insider Register”</w:t>
+      </w:r>
+    </w:p>
+    <w:p>
+      <w:r>
+        <w:t>* “insider list”</w:t>
+      </w:r>
+    </w:p>
+    <w:p>
+      <w:r>
+        <w:t>* “TUF”</w:t>
+      </w:r>
+    </w:p>
+    <w:p>
+      <w:r>
+        <w:t>* “Italian Legislative Decree no. 58/1998”</w:t>
+      </w:r>
+    </w:p>
+    <w:p>
+      <w:r>
+        <w:t xml:space="preserve"> </w:t>
+      </w:r>
+    </w:p>
+    <w:p>
+      <w:r>
+        <w:t>Italy nexus:</w:t>
+      </w:r>
+    </w:p>
+    <w:p>
+      <w:r>
+        <w:t>* “Italy”</w:t>
+      </w:r>
+    </w:p>
+    <w:p>
+      <w:r>
+        <w:t>* “Italian”</w:t>
+      </w:r>
+    </w:p>
+    <w:p>
+      <w:r>
+        <w:t>* “Italian Legislative Decree no. 58/1998”</w:t>
+      </w:r>
+    </w:p>
+    <w:p>
+      <w:r>
+        <w:lastRenderedPageBreak/>
+        <w:t>* “TUF”</w:t>
+      </w:r>
+    </w:p>
+    <w:p>
+      <w:r>
+        <w:t>* “PEC”</w:t>
+      </w:r>
+    </w:p>
+    <w:p>
+      <w:r>
+        <w:t>* “Italian NDA”</w:t>
+      </w:r>
+    </w:p>
+    <w:p>
+      <w:r>
+        <w:t>* Italian governing law</w:t>
+      </w:r>
+    </w:p>
+    <w:p>
+      <w:r>
+        <w:t>* Italian party address</w:t>
+      </w:r>
+    </w:p>
+    <w:p>
+      <w:r>
+        <w:t>* Italian company form such as “S.p.A.”, “</w:t>
+      </w:r>
+      <w:proofErr w:type="spellStart"/>
+      <w:r>
+        <w:t>S.r.l</w:t>
+      </w:r>
+      <w:proofErr w:type="spellEnd"/>
+      <w:r>
+        <w:t>.”, or “Società”</w:t>
+      </w:r>
+    </w:p>
+    <w:p>
+      <w:r>
+        <w:t>* Italy Market Unit indicator</w:t>
+      </w:r>
+    </w:p>
+    <w:p>
+      <w:r>
+        <w:t xml:space="preserve"> </w:t>
+      </w:r>
+    </w:p>
+    <w:p/>
+    <w:p>
+      <w:r>
+        <w:t>Route Additional Requirements for insider trading / MAR only if:</w:t>
+      </w:r>
+    </w:p>
+    <w:p>
+      <w:r>
+        <w:t>* at least one Insider / MAR signal is present; AND</w:t>
+      </w:r>
+    </w:p>
+    <w:p>
+      <w:r>
+        <w:t>* at least one Italy nexus signal is present.</w:t>
+      </w:r>
+    </w:p>
+    <w:p>
+      <w:r>
+        <w:t xml:space="preserve"> </w:t>
+      </w:r>
+    </w:p>
+    <w:p>
+      <w:r>
+        <w:t>## Do NOT Trigger</w:t>
+      </w:r>
+    </w:p>
+    <w:p>
+      <w:r>
+        <w:t>* Standard signature clauses</w:t>
+      </w:r>
+    </w:p>
+    <w:p>
+      <w:r>
+        <w:t>* Standard execution blocks</w:t>
+      </w:r>
+    </w:p>
+    <w:p>
+      <w:r>
+        <w:t>* Provisions already covered by other risk categories, especially Individual NDA risk</w:t>
+      </w:r>
+    </w:p>
+    <w:p>
+      <w:r>
+        <w:t>* “Company Registration No.”</w:t>
+      </w:r>
+    </w:p>
+    <w:p>
+      <w:r>
+        <w:t>* “UEN”</w:t>
+      </w:r>
+    </w:p>
+    <w:p>
+      <w:r>
+        <w:t>* “registered office address”</w:t>
+      </w:r>
+    </w:p>
+    <w:p>
+      <w:r>
+        <w:t xml:space="preserve">* </w:t>
+      </w:r>
+      <w:proofErr w:type="gramStart"/>
+      <w:r>
+        <w:t>company</w:t>
+      </w:r>
+      <w:proofErr w:type="gramEnd"/>
+      <w:r>
+        <w:t xml:space="preserve"> incorporation details</w:t>
+      </w:r>
+    </w:p>
+    <w:p>
+      <w:r>
+        <w:t>* Standard company metadata in party definitions, including name, address, jurisdiction of incorporation, registration number, tax number, or statistical number</w:t>
+      </w:r>
+    </w:p>
+    <w:p>
+      <w:r>
+        <w:t>* “file” appears only as a noun referring to documents, records, electronic files, data files, or ordinary document handling</w:t>
+      </w:r>
+    </w:p>
+    <w:p>
+      <w:r>
+        <w:t>* “filing” appears only in litigation, document-management, recordkeeping, or ordinary compliance context</w:t>
+      </w:r>
+    </w:p>
+    <w:p>
+      <w:r>
+        <w:lastRenderedPageBreak/>
+        <w:t>* “Persons” refers only to people with access to inside information and not to an individual party to the NDA</w:t>
+      </w:r>
+    </w:p>
+    <w:p>
+      <w:r>
+        <w:t>* Individual name appears only in a signature block</w:t>
+      </w:r>
+    </w:p>
+    <w:p>
+      <w:r>
+        <w:t xml:space="preserve">* Individual </w:t>
+      </w:r>
+      <w:proofErr w:type="gramStart"/>
+      <w:r>
+        <w:t>name appears</w:t>
+      </w:r>
+      <w:proofErr w:type="gramEnd"/>
+      <w:r>
+        <w:t xml:space="preserve"> only as an authorized signer for a legal entity</w:t>
+      </w:r>
+    </w:p>
+    <w:p>
+      <w:r>
+        <w:t>* Individual person reference is in the signature block or relates only to who is signing the NDA for a legal entity</w:t>
+      </w:r>
+    </w:p>
+    <w:p>
+      <w:r>
+        <w:t>* “MAR Regulation No 596/2014” appears without an Italy nexus</w:t>
+      </w:r>
+    </w:p>
+    <w:p>
+      <w:r>
+        <w:t>* “Regulation (EU) No 596/2014” appears without an Italy nexus</w:t>
+      </w:r>
+    </w:p>
+    <w:p>
+      <w:r>
+        <w:t>* “Market Abuse Regulation” appears without an Italy nexus</w:t>
+      </w:r>
+    </w:p>
+    <w:p>
+      <w:r>
+        <w:t>* “inside information” appears without an Italy nexus</w:t>
+      </w:r>
+    </w:p>
+    <w:p>
+      <w:r>
+        <w:t>* “insider list” appears without an Italy nexus</w:t>
+      </w:r>
+    </w:p>
+    <w:p>
+      <w:r>
+        <w:t>* “dealing embargo” appears without an Italy nexus</w:t>
+      </w:r>
+    </w:p>
+    <w:p>
+      <w:r>
+        <w:t>* “national regulatory authority” appears without an Italy nexus</w:t>
+      </w:r>
+    </w:p>
+    <w:p>
+      <w:r>
+        <w:t>* “Commission Implementing Regulation (EU) 2022/1210” appears without an Italy nexus</w:t>
+      </w:r>
+    </w:p>
+    <w:p>
+      <w:r>
+        <w:t>* General EU, Polish, Austrian, banking, securities, or market-abuse compliance clauses with no Italy nexus</w:t>
       </w:r>
     </w:p>
     <w:p>
@@ -1346,1535 +3422,6 @@
     </w:p>
     <w:p>
       <w:r>
-        <w:t xml:space="preserve">  * “deliverable or result”</w:t>
-      </w:r>
-    </w:p>
-    <w:p>
-      <w:r>
-        <w:t xml:space="preserve">  * “property of the Company”</w:t>
-      </w:r>
-    </w:p>
-    <w:p>
-      <w:r>
-        <w:t xml:space="preserve"> </w:t>
-      </w:r>
-    </w:p>
-    <w:p>
-      <w:r>
-        <w:t>## Do NOT Trigger</w:t>
-      </w:r>
-    </w:p>
-    <w:p>
-      <w:r>
-        <w:t>* Each party retains its existing IP</w:t>
-      </w:r>
-    </w:p>
-    <w:p>
-      <w:r>
-        <w:t>* No IP rights are transferred</w:t>
-      </w:r>
-    </w:p>
-    <w:p>
-      <w:r>
-        <w:t>* No license is granted</w:t>
-      </w:r>
-    </w:p>
-    <w:p>
-      <w:r>
-        <w:t>* No rights are granted by implication, estoppel, or otherwise</w:t>
-      </w:r>
-    </w:p>
-    <w:p>
-      <w:r>
-        <w:t>* Confidential Information remains the exclusive property of the Disclosing Party without transferring Accenture-created materials or work product</w:t>
-      </w:r>
-    </w:p>
-    <w:p>
-      <w:r>
-        <w:t>* IP use is limited solely to use of confidential information for the stated purpose</w:t>
-      </w:r>
-    </w:p>
-    <w:p>
-      <w:r>
-        <w:t>* Standard “no license granted” language</w:t>
-      </w:r>
-    </w:p>
-    <w:p>
-      <w:r>
-        <w:t>* “Nothing shall be construed as transferring ownership”</w:t>
-      </w:r>
-    </w:p>
-    <w:p>
-      <w:r>
-        <w:t>* “Company acknowledges it acquires no rights”</w:t>
-      </w:r>
-    </w:p>
-    <w:p>
-      <w:r>
-        <w:t>* “Recipient acquires no rights”</w:t>
-      </w:r>
-    </w:p>
-    <w:p>
-      <w:r>
-        <w:t>* “Discloser retains all rights, title and interest in and to the Proprietary Information”</w:t>
-      </w:r>
-    </w:p>
-    <w:p>
-      <w:r>
-        <w:t>* Background IP definitions where each party retains pre-existing IP</w:t>
-      </w:r>
-    </w:p>
-    <w:p>
-      <w:r>
-        <w:t>* Confidentiality-only obligations with no IP transfer</w:t>
-      </w:r>
-    </w:p>
-    <w:p>
-      <w:r>
-        <w:t>* Clause only states that unauthorized use or disclosure does not grant rights</w:t>
-      </w:r>
-    </w:p>
-    <w:p>
-      <w:r>
-        <w:lastRenderedPageBreak/>
-        <w:t>* Clause only confirms that Confidential Information remains owned by the Disclosing Party in a unilateral NDA</w:t>
-      </w:r>
-    </w:p>
-    <w:p>
-      <w:r>
-        <w:t>* Clause only states that intellectual property rights in, emanating from, derived from, or related to Confidential Information belong to the Disclosing Party</w:t>
-      </w:r>
-    </w:p>
-    <w:p>
-      <w:r>
-        <w:t>* Clause only confirms that the Receiving Party / Receiver / Recipient has no rights in respect of Confidential Information except rights expressly granted under the Agreement</w:t>
-      </w:r>
-    </w:p>
-    <w:p>
-      <w:r>
-        <w:t>* Clause only confirms that Confidential Information and related intellectual property rights remain owned by the Disclosing Party</w:t>
-      </w:r>
-    </w:p>
-    <w:p>
-      <w:r>
-        <w:t>* Clause contains ownership-retention language related only to Confidential Information, and does not contain assignment, transfer, vesting, waiver, work product, developed work, works made for hire, inventions assigned, moral rights waiver, deliverables, or feedback ownership language</w:t>
-      </w:r>
-    </w:p>
-    <w:p>
-      <w:r>
-        <w:t>* Do NOT route IP Ownership / Transfer if the clause only confirms ownership or retention of the Disclosing Party’s pre-existing Confidential Information or related intellectual property rights</w:t>
-      </w:r>
-    </w:p>
-    <w:p>
-      <w:r>
-        <w:t>* Do NOT route IP Ownership / Transfer where “property of the Company” or “property of the Disclosing Party” refers only to pre-existing Confidential Information and does not include deliverables, project results, work product, developed work, inventions, copyright, assignment, transfer, vesting, waiver, or feedback ownership language.</w:t>
-      </w:r>
-    </w:p>
-    <w:p>
-      <w:r>
-        <w:t>* Do NOT suppress IP Ownership / Transfer based only on a separate no-license clause if another clause expressly states that deliverables, project results, developed work, or work product will be property of the counterparty.</w:t>
-      </w:r>
-    </w:p>
-    <w:p>
-      <w:r>
-        <w:t xml:space="preserve"> </w:t>
-      </w:r>
-    </w:p>
-    <w:p>
-      <w:r>
-        <w:t>---</w:t>
-      </w:r>
-    </w:p>
-    <w:p>
-      <w:r>
-        <w:t xml:space="preserve"> </w:t>
-      </w:r>
-    </w:p>
-    <w:p>
-      <w:r>
-        <w:t># 5. Non-Solicitation Obligations</w:t>
-      </w:r>
-    </w:p>
-    <w:p>
-      <w:r>
-        <w:t>Type: COMMERCIAL / OPERATIONAL</w:t>
-      </w:r>
-    </w:p>
-    <w:p>
-      <w:r>
-        <w:t>## Definition</w:t>
-      </w:r>
-    </w:p>
-    <w:p>
-      <w:r>
-        <w:t>Restricts the solicitation, recruitment, hiring, employment, engagement, or retention of the other party’s employees, contractors, consultants, directors, officers, agents, or personnel.</w:t>
-      </w:r>
-    </w:p>
-    <w:p>
-      <w:r>
-        <w:t>## Non-Solicitation Snippet Extraction Rule</w:t>
-      </w:r>
-    </w:p>
-    <w:p>
-      <w:r>
-        <w:lastRenderedPageBreak/>
-        <w:t>For Non-Solicitation triage only, if any Non-Solicitation Triage Signal is detected, the extracted snippet MUST include:</w:t>
-      </w:r>
-    </w:p>
-    <w:p>
-      <w:r>
-        <w:t>* the full sentence containing the matched Triage Signal;</w:t>
-      </w:r>
-    </w:p>
-    <w:p>
-      <w:r>
-        <w:t>* the immediately preceding sentence, if any;</w:t>
-      </w:r>
-    </w:p>
-    <w:p>
-      <w:r>
-        <w:t>* the immediately following sentence, if any; and</w:t>
-      </w:r>
-    </w:p>
-    <w:p>
-      <w:r>
-        <w:t>* any carve-out sentence in the same clause beginning with “However,” “Provided,” “provided, however,” “Such restrictions shall not apply,” “This shall not prohibit,” or similar carve-out wording.</w:t>
-      </w:r>
-    </w:p>
-    <w:p>
-      <w:r>
-        <w:t>* “However”</w:t>
-      </w:r>
-    </w:p>
-    <w:p>
-      <w:r>
-        <w:t>* “advertisements in the media”</w:t>
-      </w:r>
-    </w:p>
-    <w:p>
-      <w:r>
-        <w:t>* “own initiative”</w:t>
-      </w:r>
-    </w:p>
-    <w:p>
-      <w:r>
-        <w:t>* “burden of proof”</w:t>
-      </w:r>
-    </w:p>
-    <w:p>
-      <w:r>
-        <w:t>For Non-Solicitation triage only, if the snippet contains “solicit for employment or engagement,” the extracted snippet MUST include any same-clause carve-out sentence containing:</w:t>
-      </w:r>
-    </w:p>
-    <w:p>
-      <w:r>
-        <w:t>* “generalized searches for employees”</w:t>
-      </w:r>
-    </w:p>
-    <w:p>
-      <w:r>
-        <w:t>* “bona fide public advertisements in the media”</w:t>
-      </w:r>
-    </w:p>
-    <w:p>
-      <w:r>
-        <w:t>* “not targeted specifically”</w:t>
-      </w:r>
-    </w:p>
-    <w:p>
-      <w:r>
-        <w:t xml:space="preserve"> </w:t>
-      </w:r>
-    </w:p>
-    <w:p>
-      <w:r>
-        <w:t>If the carve-out sentence is not included in the extracted snippet, DO NOT finalize routing for Non-Solicitation until the full clause-level snippet has been captured.</w:t>
-      </w:r>
-    </w:p>
-    <w:p>
-      <w:r>
-        <w:t>## Triage Signals</w:t>
-      </w:r>
-    </w:p>
-    <w:p>
-      <w:r>
-        <w:t>Route only if one or more of the following appears in an employee/personnel restriction context:</w:t>
-      </w:r>
-    </w:p>
-    <w:p>
-      <w:r>
-        <w:t>* “non-solicitation”</w:t>
-      </w:r>
-    </w:p>
-    <w:p>
-      <w:r>
-        <w:t>* “non-solicitation of employees”</w:t>
-      </w:r>
-    </w:p>
-    <w:p>
-      <w:r>
-        <w:t>* “solicit employees”</w:t>
-      </w:r>
-    </w:p>
-    <w:p>
-      <w:r>
-        <w:t>* “solicit for employment”</w:t>
-      </w:r>
-    </w:p>
-    <w:p>
-      <w:r>
-        <w:lastRenderedPageBreak/>
-        <w:t>* “seek to employ”</w:t>
-      </w:r>
-    </w:p>
-    <w:p>
-      <w:r>
-        <w:t>* “seek to retain the services”</w:t>
-      </w:r>
-    </w:p>
-    <w:p>
-      <w:r>
-        <w:t>* “hire any employee”</w:t>
-      </w:r>
-    </w:p>
-    <w:p>
-      <w:r>
-        <w:t>* “employ any employee”</w:t>
-      </w:r>
-    </w:p>
-    <w:p>
-      <w:r>
-        <w:t>* “recruit any employee”</w:t>
-      </w:r>
-    </w:p>
-    <w:p>
-      <w:r>
-        <w:t>* “engage any employee”</w:t>
-      </w:r>
-    </w:p>
-    <w:p>
-      <w:r>
-        <w:t>* “employ, hire, or engage”</w:t>
-      </w:r>
-    </w:p>
-    <w:p>
-      <w:r>
-        <w:t>* “consultant of the Disclosing Party”</w:t>
-      </w:r>
-    </w:p>
-    <w:p>
-      <w:r>
-        <w:t>* “employee of the Disclosing Party”</w:t>
-      </w:r>
-    </w:p>
-    <w:p>
-      <w:r>
-        <w:t>* “other party’s personnel”</w:t>
-      </w:r>
-    </w:p>
-    <w:p>
-      <w:r>
-        <w:t>* “other party’s staff”</w:t>
-      </w:r>
-    </w:p>
-    <w:p>
-      <w:r>
-        <w:t>* “induce any employee to leave”</w:t>
-      </w:r>
-    </w:p>
-    <w:p>
-      <w:r>
-        <w:t>* “persuade any employee to leave”</w:t>
-      </w:r>
-    </w:p>
-    <w:p>
-      <w:r>
-        <w:t>* “encourage any employee to leave”</w:t>
-      </w:r>
-    </w:p>
-    <w:p>
-      <w:r>
-        <w:t>* “entice away”</w:t>
-      </w:r>
-    </w:p>
-    <w:p>
-      <w:r>
-        <w:t>* “Restricted Person”</w:t>
-      </w:r>
-    </w:p>
-    <w:p>
-      <w:r>
-        <w:t>* “solicit, engage, employ”</w:t>
-      </w:r>
-    </w:p>
-    <w:p>
-      <w:r>
-        <w:t>* “contractor of the other party”</w:t>
-      </w:r>
-    </w:p>
-    <w:p>
-      <w:r>
-        <w:t>* “consultant of the other party”</w:t>
-      </w:r>
-    </w:p>
-    <w:p>
-      <w:r>
-        <w:t>* “director, officer and/or employee”</w:t>
-      </w:r>
-    </w:p>
-    <w:p>
-      <w:r>
-        <w:t>* “employee or independent contractor”</w:t>
-      </w:r>
-    </w:p>
-    <w:p>
-      <w:r>
-        <w:t xml:space="preserve"> </w:t>
-      </w:r>
-    </w:p>
-    <w:p>
-      <w:r>
-        <w:t>## Do NOT Trigger</w:t>
-      </w:r>
-    </w:p>
-    <w:p>
-      <w:r>
-        <w:t>* Customer-only solicitation restrictions</w:t>
-      </w:r>
-    </w:p>
-    <w:p>
-      <w:r>
-        <w:t>* Vendor-only solicitation restrictions</w:t>
-      </w:r>
-    </w:p>
-    <w:p>
-      <w:r>
-        <w:t>* Supplier-only solicitation restrictions</w:t>
-      </w:r>
-    </w:p>
-    <w:p>
-      <w:r>
-        <w:lastRenderedPageBreak/>
-        <w:t>* Restrictions limited to not interfering with business relationships without employee hiring or solicitation restrictions</w:t>
-      </w:r>
-    </w:p>
-    <w:p>
-      <w:r>
-        <w:t>* Restrictions limited to prospects or clients only</w:t>
-      </w:r>
-    </w:p>
-    <w:p>
-      <w:r>
-        <w:t>* Mutual non-solicitation clause is limited to employees/personnel, includes standard recruitment carve-outs, applies equally to both Parties, and duration is 24 months or less</w:t>
-      </w:r>
-    </w:p>
-    <w:p>
-      <w:r>
-        <w:t>* Clause contains both “advertisements in the media” and “own initiative”</w:t>
-      </w:r>
-    </w:p>
-    <w:p>
-      <w:r>
-        <w:t>* Clause contains both “general advertisement” and “unsolicited contact”</w:t>
-      </w:r>
-    </w:p>
-    <w:p>
-      <w:r>
-        <w:t>* Clause contains both “generalized solicitations” and “not specifically targeted”</w:t>
-      </w:r>
-    </w:p>
-    <w:p>
-      <w:r>
-        <w:t>* Clause contains both “public job postings” and “unsolicited applicants”</w:t>
-      </w:r>
-    </w:p>
-    <w:p>
-      <w:r>
-        <w:t>* Clause contains both “bona fide recruitment advertisement” and “employment agency”</w:t>
-      </w:r>
-    </w:p>
-    <w:p>
-      <w:r>
-        <w:t>* Clause contains both “application for employment submitted on an unsolicited basis” and “general advertisement”</w:t>
-      </w:r>
-    </w:p>
-    <w:p>
-      <w:r>
-        <w:t>* Clause is acceptable employee non-solicitation language under the playbook and does not contain a liquidated damages, non-compete, or country supplement trigger</w:t>
-      </w:r>
-    </w:p>
-    <w:p>
-      <w:r>
-        <w:t>* Clause contains all of the following:</w:t>
-      </w:r>
-    </w:p>
-    <w:p>
-      <w:r>
-        <w:t xml:space="preserve">  * “during the term of this Agreement”</w:t>
-      </w:r>
-    </w:p>
-    <w:p>
-      <w:r>
-        <w:t xml:space="preserve">  * “actively seeks employment”</w:t>
-      </w:r>
-    </w:p>
-    <w:p>
-      <w:r>
-        <w:t xml:space="preserve">  * “general advertisement”</w:t>
-      </w:r>
-    </w:p>
-    <w:p>
-      <w:r>
-        <w:t xml:space="preserve">  * “without direct solicitation”</w:t>
-      </w:r>
-    </w:p>
-    <w:p>
-      <w:r>
-        <w:t>* Clause contains all of the following:</w:t>
-      </w:r>
-    </w:p>
-    <w:p>
-      <w:r>
-        <w:t xml:space="preserve">  * “Both Parties agree not to solicit”</w:t>
-      </w:r>
-    </w:p>
-    <w:p>
-      <w:r>
-        <w:t xml:space="preserve">  * “employee or independent contractor of the other Party”</w:t>
-      </w:r>
-    </w:p>
-    <w:p>
-      <w:r>
-        <w:t xml:space="preserve">  * “actively seeks employment”</w:t>
-      </w:r>
-    </w:p>
-    <w:p>
-      <w:r>
-        <w:t xml:space="preserve">  * “general advertisement”</w:t>
-      </w:r>
-    </w:p>
-    <w:p>
-      <w:r>
-        <w:t>* Clause contains all of the following:</w:t>
-      </w:r>
-    </w:p>
-    <w:p>
-      <w:r>
-        <w:t xml:space="preserve">  * “not to solicit any employee or independent contractor”</w:t>
-      </w:r>
-    </w:p>
-    <w:p>
-      <w:r>
-        <w:t xml:space="preserve">  * “during the term of this Agreement”</w:t>
-      </w:r>
-    </w:p>
-    <w:p>
-      <w:r>
-        <w:lastRenderedPageBreak/>
-        <w:t xml:space="preserve">  * “Such restrictions shall not apply”</w:t>
-      </w:r>
-    </w:p>
-    <w:p>
-      <w:r>
-        <w:t xml:space="preserve">  * “without direct solicitation”</w:t>
-      </w:r>
-    </w:p>
-    <w:p>
-      <w:r>
-        <w:t>* Clause contains all of the following:</w:t>
-      </w:r>
-    </w:p>
-    <w:p>
-      <w:r>
-        <w:t xml:space="preserve">  * “employee or independent contractor of either Party actively seeks employment”</w:t>
-      </w:r>
-    </w:p>
-    <w:p>
-      <w:r>
-        <w:t xml:space="preserve">  * “whether in response to a general advertisement or otherwise”</w:t>
-      </w:r>
-    </w:p>
-    <w:p>
-      <w:r>
-        <w:t xml:space="preserve">  * “without direct solicitation by such employing Party”</w:t>
-      </w:r>
-    </w:p>
-    <w:p>
-      <w:r>
-        <w:t>* Clause contains all of the following:</w:t>
-      </w:r>
-    </w:p>
-    <w:p>
-      <w:r>
-        <w:t xml:space="preserve">  * “on behalf of any other business enterprise”</w:t>
-      </w:r>
-    </w:p>
-    <w:p>
-      <w:r>
-        <w:t xml:space="preserve">  * “during the term of this Agreement”</w:t>
-      </w:r>
-    </w:p>
-    <w:p>
-      <w:r>
-        <w:t xml:space="preserve">  * “general advertisement”</w:t>
-      </w:r>
-    </w:p>
-    <w:p>
-      <w:r>
-        <w:t xml:space="preserve">  * “without direct solicitation”</w:t>
-      </w:r>
-    </w:p>
-    <w:p>
-      <w:r>
-        <w:t>* Do NOT route Non-Solicitation if the only matched non-solicitation language is a mutual employee or independent contractor restriction and the same clause contains:</w:t>
-      </w:r>
-    </w:p>
-    <w:p>
-      <w:r>
-        <w:t xml:space="preserve">  * “during the term of this Agreement”</w:t>
-      </w:r>
-    </w:p>
-    <w:p>
-      <w:r>
-        <w:t xml:space="preserve">  * “Such restrictions shall not apply”</w:t>
-      </w:r>
-    </w:p>
-    <w:p>
-      <w:r>
-        <w:t xml:space="preserve">  * “actively seeks employment”</w:t>
-      </w:r>
-    </w:p>
-    <w:p>
-      <w:r>
-        <w:t xml:space="preserve">  * “general advertisement”</w:t>
-      </w:r>
-    </w:p>
-    <w:p>
-      <w:r>
-        <w:t xml:space="preserve">  * “without direct solicitation”</w:t>
-      </w:r>
-    </w:p>
-    <w:p>
-      <w:r>
-        <w:t>* Do NOT route Non-Solicitation if the same Non-Solicitation clause contains BOTH:</w:t>
-      </w:r>
-    </w:p>
-    <w:p>
-      <w:r>
-        <w:t xml:space="preserve">  * “advertisements in the media”</w:t>
-      </w:r>
-    </w:p>
-    <w:p>
-      <w:r>
-        <w:t xml:space="preserve">  * “own initiative”</w:t>
-      </w:r>
-    </w:p>
-    <w:p>
-      <w:r>
-        <w:t>* Do NOT route Non-Solicitation if the clause is limited to officers only and contains standard public-recruitment carve-outs.</w:t>
-      </w:r>
-    </w:p>
-    <w:p>
-      <w:r>
-        <w:t>* Clause contains all of the following:</w:t>
-      </w:r>
-    </w:p>
-    <w:p>
-      <w:r>
-        <w:t xml:space="preserve">  * “any officer of the Company”</w:t>
-      </w:r>
-    </w:p>
-    <w:p>
-      <w:r>
-        <w:t xml:space="preserve">  * “generalized searches for employees”</w:t>
-      </w:r>
-    </w:p>
-    <w:p>
-      <w:r>
-        <w:t xml:space="preserve">  * “bona fide public advertisements in the media”</w:t>
-      </w:r>
-    </w:p>
-    <w:p>
-      <w:r>
-        <w:lastRenderedPageBreak/>
-        <w:t xml:space="preserve">  * “not targeted specifically at employees of the Company”</w:t>
-      </w:r>
-    </w:p>
-    <w:p>
-      <w:r>
-        <w:t>* Clause contains all of the following:</w:t>
-      </w:r>
-    </w:p>
-    <w:p>
-      <w:r>
-        <w:t xml:space="preserve">  * “solicitation of any such person”</w:t>
-      </w:r>
-    </w:p>
-    <w:p>
-      <w:r>
-        <w:t xml:space="preserve">  * “generalized searches for employees”</w:t>
-      </w:r>
-    </w:p>
-    <w:p>
-      <w:r>
-        <w:t xml:space="preserve">  * “bona fide public advertisements in the media”</w:t>
-      </w:r>
-    </w:p>
-    <w:p>
-      <w:r>
-        <w:t xml:space="preserve">  * “not targeted specifically”</w:t>
-      </w:r>
-    </w:p>
-    <w:p>
-      <w:r>
-        <w:t>* Clause contains all of the following:</w:t>
-      </w:r>
-    </w:p>
-    <w:p>
-      <w:r>
-        <w:t xml:space="preserve">  * “employ or engage, or solicit for employment or engagement”</w:t>
-      </w:r>
-    </w:p>
-    <w:p>
-      <w:r>
-        <w:t xml:space="preserve">  * “any officer of the Company”</w:t>
-      </w:r>
-    </w:p>
-    <w:p>
-      <w:r>
-        <w:t xml:space="preserve">  * “bona fide public advertisements in the media”</w:t>
-      </w:r>
-    </w:p>
-    <w:p>
-      <w:r>
-        <w:t xml:space="preserve">  * “not targeted specifically”</w:t>
-      </w:r>
-    </w:p>
-    <w:p>
-      <w:r>
-        <w:t xml:space="preserve"> </w:t>
-      </w:r>
-    </w:p>
-    <w:p>
-      <w:r>
-        <w:t>## Country Supplement Override</w:t>
-      </w:r>
-    </w:p>
-    <w:p>
-      <w:r>
-        <w:t>* If the NDA is connected to the Nordics Market Unit and contains any non-solicitation clause, route to Non-Solicitation even if standard carve-outs are present.</w:t>
-      </w:r>
-    </w:p>
-    <w:p>
-      <w:r>
-        <w:t>* Nordics non-solicitation must be routed because the playbook states it should be removed in all cases.</w:t>
-      </w:r>
-    </w:p>
-    <w:p>
-      <w:r>
-        <w:t># 6. Non-Compete / Exclusivity</w:t>
-      </w:r>
-    </w:p>
-    <w:p>
-      <w:r>
-        <w:t>Type: STRATEGIC / COMMERCIAL</w:t>
-      </w:r>
-    </w:p>
-    <w:p>
-      <w:r>
-        <w:t>## Definition</w:t>
-      </w:r>
-    </w:p>
-    <w:p>
-      <w:r>
-        <w:t>Restricts competitive business activities, market participation, provision of services to third parties, provision of services to competitors or other clients, exclusive dealing, pursuit of business opportunities, or engagement with competing enterprises.</w:t>
-      </w:r>
-    </w:p>
-    <w:p>
-      <w:r>
-        <w:t>This risk applies where the NDA clearly limits Accenture’s ability to compete, serve other clients, work with competitors, pursue future business, participate in a market, or conduct business independently.</w:t>
-      </w:r>
-    </w:p>
-    <w:p>
-      <w:r>
-        <w:t xml:space="preserve">This risk also includes obligations requiring Accenture to disclose, notify, indicate, or report existing or potential work, contracts, consulting relationships, or service relationships with </w:t>
-      </w:r>
-      <w:r>
-        <w:lastRenderedPageBreak/>
-        <w:t>competitors of the client where the obligation is tied to competitor status and may constrain Accenture’s ability to serve other clients or competitors.</w:t>
-      </w:r>
-    </w:p>
-    <w:p>
-      <w:r>
-        <w:t xml:space="preserve"> </w:t>
-      </w:r>
-    </w:p>
-    <w:p>
-      <w:r>
-        <w:t>## Triage Signals</w:t>
-      </w:r>
-    </w:p>
-    <w:p>
-      <w:r>
-        <w:t>* “non-compete”</w:t>
-      </w:r>
-    </w:p>
-    <w:p>
-      <w:r>
-        <w:t>* “non-competition”</w:t>
-      </w:r>
-    </w:p>
-    <w:p>
-      <w:r>
-        <w:t>* “exclusive” or “exclusivity”</w:t>
-      </w:r>
-    </w:p>
-    <w:p>
-      <w:r>
-        <w:t>* “exclusive basis”</w:t>
-      </w:r>
-    </w:p>
-    <w:p>
-      <w:r>
-        <w:t>* “competition restriction”</w:t>
-      </w:r>
-    </w:p>
-    <w:p>
-      <w:r>
-        <w:t>* “restrict services” to third parties</w:t>
-      </w:r>
-    </w:p>
-    <w:p>
-      <w:r>
-        <w:t>* “cannot provide services” to competitors or other clients</w:t>
-      </w:r>
-    </w:p>
-    <w:p>
-      <w:r>
-        <w:t>* “shall not provide services” to competitors or other clients</w:t>
-      </w:r>
-    </w:p>
-    <w:p>
-      <w:r>
-        <w:t>* “shall not enter into direct competition”</w:t>
-      </w:r>
-    </w:p>
-    <w:p>
-      <w:r>
-        <w:t>* “not to enter into direct competition”</w:t>
-      </w:r>
-    </w:p>
-    <w:p>
-      <w:r>
-        <w:t>* “Client Competitor”</w:t>
-      </w:r>
-    </w:p>
-    <w:p>
-      <w:r>
-        <w:t>* “competitor” or “competing enterprise” in a clause restricting business activity</w:t>
-      </w:r>
-    </w:p>
-    <w:p>
-      <w:r>
-        <w:t>* “like industry” in a clause restricting business activity</w:t>
-      </w:r>
-    </w:p>
-    <w:p>
-      <w:r>
-        <w:t>* “offer identical or like services”</w:t>
-      </w:r>
-    </w:p>
-    <w:p>
-      <w:r>
-        <w:t>* “competitive disadvantage”</w:t>
-      </w:r>
-    </w:p>
-    <w:p>
-      <w:r>
-        <w:t>* “causing any competition”</w:t>
-      </w:r>
-    </w:p>
-    <w:p>
-      <w:r>
-        <w:t>* “deal with one another on an exclusive basis”</w:t>
-      </w:r>
-    </w:p>
-    <w:p>
-      <w:r>
-        <w:t>* “restricts future services”</w:t>
-      </w:r>
-    </w:p>
-    <w:p>
-      <w:r>
-        <w:t>* “provide future services” to other clients is restricted</w:t>
-      </w:r>
-    </w:p>
-    <w:p>
-      <w:r>
-        <w:t>* “pursuing business opportunities” is restricted</w:t>
-      </w:r>
-    </w:p>
-    <w:p>
-      <w:r>
-        <w:t>* “refrain from entering into any new business relationship”</w:t>
-      </w:r>
-    </w:p>
-    <w:p>
-      <w:r>
-        <w:t>* “not directly or indirectly contact, or negotiate with, a third party regarding a potential business relationship”</w:t>
-      </w:r>
-    </w:p>
-    <w:p>
-      <w:r>
-        <w:lastRenderedPageBreak/>
-        <w:t>* “persuade any customer” to cease, reduce, or discontinue business</w:t>
-      </w:r>
-    </w:p>
-    <w:p>
-      <w:r>
-        <w:t>* “induce any customer” to cease, reduce, or discontinue business</w:t>
-      </w:r>
-    </w:p>
-    <w:p>
-      <w:r>
-        <w:t>* “persuade any vendor” to cease, reduce, or discontinue business</w:t>
-      </w:r>
-    </w:p>
-    <w:p>
-      <w:r>
-        <w:t>* “induce any vendor” to cease, reduce, or discontinue business</w:t>
-      </w:r>
-    </w:p>
-    <w:p>
-      <w:r>
-        <w:t>* “cease purchasing goods or services”</w:t>
-      </w:r>
-    </w:p>
-    <w:p>
-      <w:r>
-        <w:t>* “cease selling goods and services”</w:t>
-      </w:r>
-    </w:p>
-    <w:p>
-      <w:r>
-        <w:t>* “reduce or discontinue any business relationship”</w:t>
-      </w:r>
-    </w:p>
-    <w:p>
-      <w:r>
-        <w:t>* “prevented or restricted from performing services”</w:t>
-      </w:r>
-    </w:p>
-    <w:p>
-      <w:r>
-        <w:t>* “prevented or restricted from pursuing business opportunities”</w:t>
-      </w:r>
-    </w:p>
-    <w:p>
-      <w:r>
-        <w:t>* “direct competitor of the Client”</w:t>
-      </w:r>
-    </w:p>
-    <w:p>
-      <w:r>
-        <w:t>* “contracted to, working for, or consulting for”</w:t>
-      </w:r>
-    </w:p>
-    <w:p>
-      <w:r>
-        <w:t>* “working for, or consulting for any company which is a direct competitor”</w:t>
-      </w:r>
-    </w:p>
-    <w:p>
-      <w:r>
-        <w:t>* “indicate to you immediately” combined with “direct competitor”</w:t>
-      </w:r>
-    </w:p>
-    <w:p>
-      <w:r>
-        <w:t>* “notify” or “indicate” combined with “direct competitor of the Client”</w:t>
-      </w:r>
-    </w:p>
-    <w:p>
-      <w:r>
-        <w:t>* “disclose” or “report” combined with “working for” and “direct competitor”</w:t>
-      </w:r>
-    </w:p>
-    <w:p>
-      <w:r>
-        <w:t>* Clause contains BOTH:</w:t>
-      </w:r>
-    </w:p>
-    <w:p>
-      <w:r>
-        <w:t xml:space="preserve">  * “direct competitor of the Client”</w:t>
-      </w:r>
-    </w:p>
-    <w:p>
-      <w:r>
-        <w:t xml:space="preserve">  * “contracted to, working for, or consulting for”</w:t>
-      </w:r>
-    </w:p>
-    <w:p>
-      <w:r>
-        <w:t>* Clause contains BOTH:</w:t>
-      </w:r>
-    </w:p>
-    <w:p>
-      <w:r>
-        <w:t xml:space="preserve">  * “direct competitor”</w:t>
-      </w:r>
-    </w:p>
-    <w:p>
-      <w:r>
-        <w:t xml:space="preserve">  * “working for, or consulting for”</w:t>
-      </w:r>
-    </w:p>
-    <w:p>
-      <w:r>
-        <w:t>* Clause contains ALL of the following:</w:t>
-      </w:r>
-    </w:p>
-    <w:p>
-      <w:r>
-        <w:t xml:space="preserve">  * “indicate”</w:t>
-      </w:r>
-    </w:p>
-    <w:p>
-      <w:r>
-        <w:t xml:space="preserve">  * “working for”</w:t>
-      </w:r>
-    </w:p>
-    <w:p>
-      <w:r>
-        <w:t xml:space="preserve">  * “consulting for”</w:t>
-      </w:r>
-    </w:p>
-    <w:p>
-      <w:r>
-        <w:t xml:space="preserve">  * “direct competitor”</w:t>
-      </w:r>
-    </w:p>
-    <w:p>
-      <w:r>
-        <w:lastRenderedPageBreak/>
-        <w:t xml:space="preserve"> </w:t>
-      </w:r>
-    </w:p>
-    <w:p>
-      <w:r>
-        <w:t>## Do NOT Trigger</w:t>
-      </w:r>
-    </w:p>
-    <w:p>
-      <w:r>
-        <w:t>* Restrictions solely prevent misuse of confidential information for competitive purposes</w:t>
-      </w:r>
-    </w:p>
-    <w:p>
-      <w:r>
-        <w:t>* Standard confidentiality obligations that do not restrict business activities</w:t>
-      </w:r>
-    </w:p>
-    <w:p>
-      <w:r>
-        <w:t>* Provisions explicitly confirming parties may compete freely</w:t>
-      </w:r>
-    </w:p>
-    <w:p>
-      <w:r>
-        <w:t>* “exclusive jurisdiction” / “submit to the exclusive jurisdiction”</w:t>
-      </w:r>
-    </w:p>
-    <w:p>
-      <w:r>
-        <w:t>* “exclusive right to” in the context of court remedies or legal proceedings</w:t>
-      </w:r>
-    </w:p>
-    <w:p>
-      <w:r>
-        <w:t>* “exclusive property of the Disclosing Party” in a Confidential Information ownership clause</w:t>
-      </w:r>
-    </w:p>
-    <w:p>
-      <w:r>
-        <w:t>* “sole and exclusive property” in an IP ownership context</w:t>
-      </w:r>
-    </w:p>
-    <w:p>
-      <w:r>
-        <w:t>* Clause only limits use of Confidential Information to the Purpose or Project</w:t>
-      </w:r>
-    </w:p>
-    <w:p>
-      <w:r>
-        <w:t>* Clause only prohibits use of Confidential Information for purposes outside the NDA purpose</w:t>
-      </w:r>
-    </w:p>
-    <w:p>
-      <w:r>
-        <w:t>* Clause only prohibits contacting customers, suppliers, vendors, or connected persons for appraisal, evaluation, due diligence, Project review, or confidentiality-control purposes</w:t>
-      </w:r>
-    </w:p>
-    <w:p>
-      <w:r>
-        <w:t>* Clause only requires prior written consent before contacting customers, suppliers, vendors, or connected persons, without restricting competition, future services, market participation, or independent business activities</w:t>
-      </w:r>
-    </w:p>
-    <w:p>
-      <w:r>
-        <w:t>* Clause contains “make contact, directly or indirectly” but does not contain a clear competition, exclusivity, future-services, market-participation, customer-diversion, vendor-diversion, or business-opportunity restriction</w:t>
-      </w:r>
-    </w:p>
-    <w:p>
-      <w:r>
-        <w:t>* Clause contains “customer” or “supplier” but does not require the customer or supplier to cease, reduce, discontinue, or refrain from doing business with the Disclosing Party</w:t>
-      </w:r>
-    </w:p>
-    <w:p>
-      <w:r>
-        <w:t>* Clause contains “customer” or “supplier” but does not restrict Accenture from providing services to third parties, competitors, or other clients</w:t>
-      </w:r>
-    </w:p>
-    <w:p>
-      <w:r>
-        <w:t>* Clause contains “customer, supplier, or any other person connected with the Disclosing Party” only in the context of appraisal, evaluation, diligence, Project review, or confidentiality protection</w:t>
-      </w:r>
-    </w:p>
-    <w:p>
-      <w:r>
-        <w:lastRenderedPageBreak/>
-        <w:t>* Restrictions limited to not interfering with business relationships, without a clear restriction on competitive activity, future services, market participation, or business opportunity pursuit</w:t>
-      </w:r>
-    </w:p>
-    <w:p>
-      <w:r>
-        <w:t>* General no-contact clauses related to the Project, unless they also include a clear non-compete, exclusivity, customer diversion, vendor diversion, or business opportunity restriction</w:t>
-      </w:r>
-    </w:p>
-    <w:p>
-      <w:r>
-        <w:t>* Do NOT route Non-Compete / Exclusivity where “competitor” appears only to exclude competitor consultants, advisors, or representatives from receiving Confidential Information, without requiring Accenture to disclose, notify, indicate, report, limit, stop, or avoid work with a competitor.</w:t>
-      </w:r>
-    </w:p>
-    <w:p>
-      <w:r>
-        <w:t xml:space="preserve">* Do NOT route Non-Compete / Exclusivity where “competitor” appears only in a confidentiality-control provision and does not relate to Accenture </w:t>
-      </w:r>
-      <w:r>
-        <w:t>b</w:t>
-      </w:r>
-      <w:r>
-        <w:t>eing contracted to, working for, consulting for, providing services to, or pursuing work with a competitor.</w:t>
-      </w:r>
-    </w:p>
-    <w:p>
-      <w:r>
-        <w:t>* Do NOT route Non-Compete / Exclusivity where the clause merely states that Confidential Information must not be disclosed to competitors, without any obligation to disclose competitor relationships or restrict business activity.</w:t>
-      </w:r>
-    </w:p>
-    <w:p>
-      <w:r>
-        <w:t xml:space="preserve"> </w:t>
-      </w:r>
-    </w:p>
-    <w:p>
-      <w:r>
-        <w:t>## Conflict Resolution Rule</w:t>
-      </w:r>
-    </w:p>
-    <w:p>
-      <w:r>
-        <w:t>If a clause contains customer, supplier, vendor, or business relationship language, route Non-Compete / Exclusivity only if the clause clearly restricts competitive activity, future services, market participation, independent business opportunities, or causes customers/vendors to cease, reduce, discontinue, or refrain from business with the other party.</w:t>
-      </w:r>
-    </w:p>
-    <w:p>
-      <w:r>
-        <w:t xml:space="preserve"> </w:t>
-      </w:r>
-    </w:p>
-    <w:p>
-      <w:r>
-        <w:t>If the clause is only a project-related no-contact or consent-before-contact restriction, DO NOT route Non-Compete / Exclusivity.</w:t>
-      </w:r>
-    </w:p>
-    <w:p>
-      <w:r>
-        <w:t># 7. Additional Requirements</w:t>
-      </w:r>
-    </w:p>
-    <w:p>
-      <w:r>
-        <w:t>Type: JURISDICTIONAL / REGULATORY</w:t>
-      </w:r>
-    </w:p>
-    <w:p>
-      <w:r>
-        <w:t>## Definition</w:t>
-      </w:r>
-    </w:p>
-    <w:p>
-      <w:r>
-        <w:t>Non-standard legal, regulatory, execution-formality, or jurisdiction-specific obligations that do not fall under the other risk categories and require special routing under the playbook.</w:t>
-      </w:r>
-    </w:p>
-    <w:p>
-      <w:r>
-        <w:lastRenderedPageBreak/>
-        <w:t>This includes confirmed ANZ deed execution requirements, Italy-specific insider trading / market abuse requirements, notarization, registration or regulatory filing obligations, and agreements where one of the contracting parties is a confirmed individual person at party-definition level.</w:t>
-      </w:r>
-    </w:p>
-    <w:p>
-      <w:r>
-        <w:t>## Triage Signals</w:t>
-      </w:r>
-    </w:p>
-    <w:p>
-      <w:r>
-        <w:t>* “deed” or “executed as a deed” in an ANZ MU context</w:t>
-      </w:r>
-    </w:p>
-    <w:p>
-      <w:r>
-        <w:t>* “signature by deed” in an ANZ MU context</w:t>
-      </w:r>
-    </w:p>
-    <w:p>
-      <w:r>
-        <w:t>* “signed as a deed” in an ANZ MU context</w:t>
-      </w:r>
-    </w:p>
-    <w:p>
-      <w:r>
-        <w:t>* “notarized”</w:t>
-      </w:r>
-    </w:p>
-    <w:p>
-      <w:r>
-        <w:t>* “notarization”</w:t>
-      </w:r>
-    </w:p>
-    <w:p>
-      <w:r>
-        <w:t>* “registration of this agreement”</w:t>
-      </w:r>
-    </w:p>
-    <w:p>
-      <w:r>
-        <w:t>* “register this agreement”</w:t>
-      </w:r>
-    </w:p>
-    <w:p>
-      <w:r>
-        <w:t>* “file this agreement” with regulator</w:t>
-      </w:r>
-    </w:p>
-    <w:p>
-      <w:r>
-        <w:t>* “filing with regulator”</w:t>
-      </w:r>
-    </w:p>
-    <w:p>
-      <w:r>
-        <w:t>* “regulatory filing”</w:t>
-      </w:r>
-    </w:p>
-    <w:p>
-      <w:r>
-        <w:t>* “filed with regulator”</w:t>
-      </w:r>
-    </w:p>
-    <w:p>
-      <w:r>
-        <w:t>* One of the parties is a confirmed individual person at party-definition level</w:t>
-      </w:r>
-    </w:p>
-    <w:p>
-      <w:r>
-        <w:t>Italy-specific insider trading / market abuse signals require BOTH an Insider / MAR signal AND an Italy nexus.</w:t>
-      </w:r>
-    </w:p>
-    <w:p>
-      <w:r>
-        <w:t xml:space="preserve"> </w:t>
-      </w:r>
-    </w:p>
-    <w:p>
-      <w:r>
-        <w:t>Insider / MAR signal:</w:t>
-      </w:r>
-    </w:p>
-    <w:p>
-      <w:r>
-        <w:t>* “insider trading”</w:t>
-      </w:r>
-    </w:p>
-    <w:p>
-      <w:r>
-        <w:t>* “inside information”</w:t>
-      </w:r>
-    </w:p>
-    <w:p>
-      <w:r>
-        <w:t>* “market abuse”</w:t>
-      </w:r>
-    </w:p>
-    <w:p>
-      <w:r>
-        <w:t>* “market sensitive information”</w:t>
-      </w:r>
-    </w:p>
-    <w:p>
-      <w:r>
-        <w:t>* “MAR Regulation No 596/2014”</w:t>
-      </w:r>
-    </w:p>
-    <w:p>
-      <w:r>
-        <w:t>* “Regulation (EU) No 596/2014”</w:t>
-      </w:r>
-    </w:p>
-    <w:p>
-      <w:r>
-        <w:lastRenderedPageBreak/>
-        <w:t>* “Market Abuse Regulation”</w:t>
-      </w:r>
-    </w:p>
-    <w:p>
-      <w:r>
-        <w:t>* “Insider Register”</w:t>
-      </w:r>
-    </w:p>
-    <w:p>
-      <w:r>
-        <w:t>* “insider list”</w:t>
-      </w:r>
-    </w:p>
-    <w:p>
-      <w:r>
-        <w:t>* “TUF”</w:t>
-      </w:r>
-    </w:p>
-    <w:p>
-      <w:r>
-        <w:t>* “Italian Legislative Decree no. 58/1998”</w:t>
-      </w:r>
-    </w:p>
-    <w:p>
-      <w:r>
-        <w:t xml:space="preserve"> </w:t>
-      </w:r>
-    </w:p>
-    <w:p>
-      <w:r>
-        <w:t>Italy nexus:</w:t>
-      </w:r>
-    </w:p>
-    <w:p>
-      <w:r>
-        <w:t>* “Italy”</w:t>
-      </w:r>
-    </w:p>
-    <w:p>
-      <w:r>
-        <w:t>* “Italian”</w:t>
-      </w:r>
-    </w:p>
-    <w:p>
-      <w:r>
-        <w:t>* “Italian Legislative Decree no. 58/1998”</w:t>
-      </w:r>
-    </w:p>
-    <w:p>
-      <w:r>
-        <w:t>* “TUF”</w:t>
-      </w:r>
-    </w:p>
-    <w:p>
-      <w:r>
-        <w:t>* “PEC”</w:t>
-      </w:r>
-    </w:p>
-    <w:p>
-      <w:r>
-        <w:t>* “Italian NDA”</w:t>
-      </w:r>
-    </w:p>
-    <w:p>
-      <w:r>
-        <w:t>* Italian governing law</w:t>
-      </w:r>
-    </w:p>
-    <w:p>
-      <w:r>
-        <w:t>* Italian party address</w:t>
-      </w:r>
-    </w:p>
-    <w:p>
-      <w:r>
-        <w:t>* Italian company form such as “S.p.A.”, “S.r.l.”, or “Società”</w:t>
-      </w:r>
-    </w:p>
-    <w:p>
-      <w:r>
-        <w:t>* Italy Market Unit indicator</w:t>
-      </w:r>
-    </w:p>
-    <w:p>
-      <w:r>
-        <w:t xml:space="preserve"> </w:t>
-      </w:r>
-    </w:p>
-    <w:p/>
-    <w:p>
-      <w:r>
-        <w:t>Route Additional Requirements for insider trading / MAR only if:</w:t>
-      </w:r>
-    </w:p>
-    <w:p>
-      <w:r>
-        <w:t>* at least one Insider / MAR signal is present; AND</w:t>
-      </w:r>
-    </w:p>
-    <w:p>
-      <w:r>
-        <w:t>* at least one Italy nexus signal is present.</w:t>
-      </w:r>
-    </w:p>
-    <w:p>
-      <w:r>
-        <w:t xml:space="preserve"> </w:t>
-      </w:r>
-    </w:p>
-    <w:p>
-      <w:r>
-        <w:t>## Do NOT Trigger</w:t>
-      </w:r>
-    </w:p>
-    <w:p>
-      <w:r>
-        <w:t>* Standard signature clauses</w:t>
-      </w:r>
-    </w:p>
-    <w:p>
-      <w:r>
-        <w:t>* Standard execution blocks</w:t>
-      </w:r>
-    </w:p>
-    <w:p>
-      <w:r>
-        <w:lastRenderedPageBreak/>
-        <w:t>* Provisions already covered by other risk categories, especially Individual NDA risk</w:t>
-      </w:r>
-    </w:p>
-    <w:p>
-      <w:r>
-        <w:t>* “Company Registration No.”</w:t>
-      </w:r>
-    </w:p>
-    <w:p>
-      <w:r>
-        <w:t>* “UEN”</w:t>
-      </w:r>
-    </w:p>
-    <w:p>
-      <w:r>
-        <w:t>* “registered office address”</w:t>
-      </w:r>
-    </w:p>
-    <w:p>
-      <w:r>
-        <w:t>* company incorporation details</w:t>
-      </w:r>
-    </w:p>
-    <w:p>
-      <w:r>
-        <w:t>* Standard company metadata in party definitions, including name, address, jurisdiction of incorporation, registration number, tax number, or statistical number</w:t>
-      </w:r>
-    </w:p>
-    <w:p>
-      <w:r>
-        <w:t>* “file” appears only as a noun referring to documents, records, electronic files, data files, or ordinary document handling</w:t>
-      </w:r>
-    </w:p>
-    <w:p>
-      <w:r>
-        <w:t>* “filing” appears only in litigation, document-management, recordkeeping, or ordinary compliance context</w:t>
-      </w:r>
-    </w:p>
-    <w:p>
-      <w:r>
-        <w:t>* “Persons” refers only to people with access to inside information and not to an individual party to the NDA</w:t>
-      </w:r>
-    </w:p>
-    <w:p>
-      <w:r>
-        <w:t>* Individual name appears only in a signature block</w:t>
-      </w:r>
-    </w:p>
-    <w:p>
-      <w:r>
-        <w:t>* Individual name appears only as an authorized signer for a legal entity</w:t>
-      </w:r>
-    </w:p>
-    <w:p>
-      <w:r>
-        <w:t>* Individual person reference is in the signature block or relates only to who is signing the NDA for a legal entity</w:t>
-      </w:r>
-    </w:p>
-    <w:p>
-      <w:r>
-        <w:t>* “MAR Regulation No 596/2014” appears without an Italy nexus</w:t>
-      </w:r>
-    </w:p>
-    <w:p>
-      <w:r>
-        <w:t>* “Regulation (EU) No 596/2014” appears without an Italy nexus</w:t>
-      </w:r>
-    </w:p>
-    <w:p>
-      <w:r>
-        <w:t>* “Market Abuse Regulation” appears without an Italy nexus</w:t>
-      </w:r>
-    </w:p>
-    <w:p>
-      <w:r>
-        <w:t>* “inside information” appears without an Italy nexus</w:t>
-      </w:r>
-    </w:p>
-    <w:p>
-      <w:r>
-        <w:t>* “insider list” appears without an Italy nexus</w:t>
-      </w:r>
-    </w:p>
-    <w:p>
-      <w:r>
-        <w:t>* “dealing embargo” appears without an Italy nexus</w:t>
-      </w:r>
-    </w:p>
-    <w:p>
-      <w:r>
-        <w:t>* “national regulatory authority” appears without an Italy nexus</w:t>
-      </w:r>
-    </w:p>
-    <w:p>
-      <w:r>
-        <w:t>* “Commission Implementing Regulation (EU) 2022/1210” appears without an Italy nexus</w:t>
-      </w:r>
-    </w:p>
-    <w:p>
-      <w:r>
-        <w:t>* General EU, Polish, Austrian, banking, securities, or market-abuse compliance clauses with no Italy nexus</w:t>
-      </w:r>
-    </w:p>
-    <w:p>
-      <w:r>
-        <w:t>* Clause contains BOTH:</w:t>
-      </w:r>
-    </w:p>
-    <w:p>
-      <w:r>
-        <w:lastRenderedPageBreak/>
         <w:t xml:space="preserve">  * “MAR Regulation No 596/2014”</w:t>
       </w:r>
     </w:p>
@@ -28229,6 +28776,15 @@
 </file>
 
 <file path=customXml/item1.xml><?xml version="1.0" encoding="utf-8"?>
+<?mso-contentType ?>
+<FormTemplates xmlns="http://schemas.microsoft.com/sharepoint/v3/contenttype/forms">
+  <Display>DocumentLibraryForm</Display>
+  <Edit>DocumentLibraryForm</Edit>
+  <New>DocumentLibraryForm</New>
+</FormTemplates>
+</file>
+
+<file path=customXml/item2.xml><?xml version="1.0" encoding="utf-8"?>
 <p:properties xmlns:p="http://schemas.microsoft.com/office/2006/metadata/properties" xmlns:xsi="http://www.w3.org/2001/XMLSchema-instance" xmlns:pc="http://schemas.microsoft.com/office/infopath/2007/PartnerControls">
   <documentManagement>
     <TaxCatchAll xmlns="58fb48c5-ad38-47d1-9aa6-9b4f1dc114f9" xsi:nil="true"/>
@@ -28238,15 +28794,6 @@
     <Reusable xmlns="aba9ad68-f961-4806-8372-ded3e8039a5f">true</Reusable>
   </documentManagement>
 </p:properties>
-</file>
-
-<file path=customXml/item2.xml><?xml version="1.0" encoding="utf-8"?>
-<?mso-contentType ?>
-<FormTemplates xmlns="http://schemas.microsoft.com/sharepoint/v3/contenttype/forms">
-  <Display>DocumentLibraryForm</Display>
-  <Edit>DocumentLibraryForm</Edit>
-  <New>DocumentLibraryForm</New>
-</FormTemplates>
 </file>
 
 <file path=customXml/item3.xml><?xml version="1.0" encoding="utf-8"?>
@@ -28517,20 +29064,20 @@
 </file>
 
 <file path=customXml/itemProps1.xml><?xml version="1.0" encoding="utf-8"?>
+<ds:datastoreItem xmlns:ds="http://schemas.openxmlformats.org/officeDocument/2006/customXml" ds:itemID="{C6DFF534-1887-4C42-BC36-EDACE7DE72C0}">
+  <ds:schemaRefs>
+    <ds:schemaRef ds:uri="http://schemas.microsoft.com/sharepoint/v3/contenttype/forms"/>
+  </ds:schemaRefs>
+</ds:datastoreItem>
+</file>
+
+<file path=customXml/itemProps2.xml><?xml version="1.0" encoding="utf-8"?>
 <ds:datastoreItem xmlns:ds="http://schemas.openxmlformats.org/officeDocument/2006/customXml" ds:itemID="{25BAFF0C-A05A-49CE-A308-E2413E02AFCD}">
   <ds:schemaRefs>
     <ds:schemaRef ds:uri="http://schemas.microsoft.com/office/2006/metadata/properties"/>
     <ds:schemaRef ds:uri="http://schemas.microsoft.com/office/infopath/2007/PartnerControls"/>
     <ds:schemaRef ds:uri="58fb48c5-ad38-47d1-9aa6-9b4f1dc114f9"/>
     <ds:schemaRef ds:uri="aba9ad68-f961-4806-8372-ded3e8039a5f"/>
-  </ds:schemaRefs>
-</ds:datastoreItem>
-</file>
-
-<file path=customXml/itemProps2.xml><?xml version="1.0" encoding="utf-8"?>
-<ds:datastoreItem xmlns:ds="http://schemas.openxmlformats.org/officeDocument/2006/customXml" ds:itemID="{C6DFF534-1887-4C42-BC36-EDACE7DE72C0}">
-  <ds:schemaRefs>
-    <ds:schemaRef ds:uri="http://schemas.microsoft.com/sharepoint/v3/contenttype/forms"/>
   </ds:schemaRefs>
 </ds:datastoreItem>
 </file>

</xml_diff>

<commit_message>
Adjust orchestrator triage for non-solicitation
</commit_message>
<xml_diff>
--- a/docs/orchestrator_kb.docx
+++ b/docs/orchestrator_kb.docx
@@ -1958,20 +1958,745 @@
     </w:p>
     <w:p>
       <w:r>
+        <w:t>* “voluntarily seeks employment”</w:t>
+      </w:r>
+      <w:r>
+        <w:br/>
+        <w:t>* “own initiative”</w:t>
+      </w:r>
+      <w:r>
+        <w:br/>
+        <w:t>* “employment advertisements”</w:t>
+      </w:r>
+      <w:r>
+        <w:br/>
+        <w:t>* “newspaper”</w:t>
+      </w:r>
+      <w:r>
+        <w:br/>
+        <w:t>* “trade publication”</w:t>
+      </w:r>
+      <w:r>
+        <w:br/>
+        <w:t>* “public commercial media”</w:t>
+      </w:r>
+    </w:p>
+    <w:p>
+      <w:r>
+        <w:t xml:space="preserve">If the carve-out sentence is not included in the extracted snippet, DO NOT finalize routing for </w:t>
+      </w:r>
+      <w:proofErr w:type="gramStart"/>
+      <w:r>
+        <w:t>Non-Solicitation</w:t>
+      </w:r>
+      <w:proofErr w:type="gramEnd"/>
+      <w:r>
+        <w:t xml:space="preserve"> until the full clause-level snippet has been captured.</w:t>
+      </w:r>
+    </w:p>
+    <w:p>
+      <w:r>
+        <w:t>## Triage Signals</w:t>
+      </w:r>
+    </w:p>
+    <w:p>
+      <w:r>
+        <w:t>Route only if one or more of the following appears in an employee/personnel restriction context:</w:t>
+      </w:r>
+    </w:p>
+    <w:p>
+      <w:r>
+        <w:t>* “non-solicitation”</w:t>
+      </w:r>
+    </w:p>
+    <w:p>
+      <w:r>
+        <w:t>* “non-solicitation of employees”</w:t>
+      </w:r>
+    </w:p>
+    <w:p>
+      <w:r>
+        <w:t>* “solicit employees”</w:t>
+      </w:r>
+    </w:p>
+    <w:p>
+      <w:r>
+        <w:t>* “solicit for employment”</w:t>
+      </w:r>
+    </w:p>
+    <w:p>
+      <w:r>
+        <w:t>* “seek to employ”</w:t>
+      </w:r>
+    </w:p>
+    <w:p>
+      <w:r>
+        <w:t>* “seek to retain the services”</w:t>
+      </w:r>
+    </w:p>
+    <w:p>
+      <w:r>
+        <w:t>* “hire any employee”</w:t>
+      </w:r>
+    </w:p>
+    <w:p>
+      <w:r>
+        <w:t>* “employ any employee”</w:t>
+      </w:r>
+    </w:p>
+    <w:p>
+      <w:r>
+        <w:t>* “recruit any employee”</w:t>
+      </w:r>
+    </w:p>
+    <w:p>
+      <w:r>
+        <w:t>* “engage any employee”</w:t>
+      </w:r>
+    </w:p>
+    <w:p>
+      <w:r>
+        <w:lastRenderedPageBreak/>
+        <w:t>* “employ, hire, or engage”</w:t>
+      </w:r>
+    </w:p>
+    <w:p>
+      <w:r>
+        <w:t>* “consultant of the Disclosing Party”</w:t>
+      </w:r>
+    </w:p>
+    <w:p>
+      <w:r>
+        <w:t>* “employee of the Disclosing Party”</w:t>
+      </w:r>
+    </w:p>
+    <w:p>
+      <w:r>
+        <w:t>* “other party’s personnel”</w:t>
+      </w:r>
+    </w:p>
+    <w:p>
+      <w:r>
+        <w:t>* “other party’s staff”</w:t>
+      </w:r>
+    </w:p>
+    <w:p>
+      <w:r>
+        <w:t>* “induce any employee to leave”</w:t>
+      </w:r>
+    </w:p>
+    <w:p>
+      <w:r>
+        <w:t>* “persuade any employee to leave”</w:t>
+      </w:r>
+    </w:p>
+    <w:p>
+      <w:r>
+        <w:t>* “encourage any employee to leave”</w:t>
+      </w:r>
+    </w:p>
+    <w:p>
+      <w:r>
+        <w:t>* “entice away”</w:t>
+      </w:r>
+    </w:p>
+    <w:p>
+      <w:r>
+        <w:t>* “Restricted Person”</w:t>
+      </w:r>
+    </w:p>
+    <w:p>
+      <w:r>
+        <w:t>* “solicit, engage, employ”</w:t>
+      </w:r>
+    </w:p>
+    <w:p>
+      <w:r>
+        <w:t>* “contractor of the other party”</w:t>
+      </w:r>
+    </w:p>
+    <w:p>
+      <w:r>
+        <w:t>* “consultant of the other party”</w:t>
+      </w:r>
+    </w:p>
+    <w:p>
+      <w:r>
+        <w:t>* “director, officer and/or employee”</w:t>
+      </w:r>
+    </w:p>
+    <w:p>
+      <w:r>
+        <w:t>* “employee or independent contractor”</w:t>
+      </w:r>
+    </w:p>
+    <w:p>
+      <w:r>
+        <w:t>* “solicit personnel”</w:t>
+      </w:r>
+    </w:p>
+    <w:p>
+      <w:r>
+        <w:t>* “solicit personnel of the other party”</w:t>
+      </w:r>
+    </w:p>
+    <w:p>
+      <w:r>
+        <w:t>* “personnel of the other party”</w:t>
+      </w:r>
+    </w:p>
+    <w:p>
+      <w:r>
+        <w:t>* “inducing them to join such other party’s employ”</w:t>
+      </w:r>
+    </w:p>
+    <w:p>
+      <w:r>
+        <w:t>* Clause contains BOTH:</w:t>
+      </w:r>
+    </w:p>
+    <w:p>
+      <w:r>
+        <w:t xml:space="preserve">  * “solicit personnel”</w:t>
+      </w:r>
+    </w:p>
+    <w:p>
+      <w:r>
+        <w:t xml:space="preserve">  * “other party”</w:t>
+      </w:r>
+    </w:p>
+    <w:p>
+      <w:r>
+        <w:t>* Clause contains BOTH:</w:t>
+      </w:r>
+    </w:p>
+    <w:p>
+      <w:r>
+        <w:t xml:space="preserve">  * “solicit personnel”</w:t>
+      </w:r>
+    </w:p>
+    <w:p>
+      <w:r>
+        <w:t xml:space="preserve">  * “inducing them to join”</w:t>
+      </w:r>
+    </w:p>
+    <w:p>
+      <w:r>
+        <w:t xml:space="preserve">* Clause contains </w:t>
+      </w:r>
+      <w:proofErr w:type="gramStart"/>
+      <w:r>
+        <w:t>ALL of</w:t>
+      </w:r>
+      <w:proofErr w:type="gramEnd"/>
+      <w:r>
+        <w:t xml:space="preserve"> the following:</w:t>
+      </w:r>
+    </w:p>
+    <w:p>
+      <w:r>
+        <w:lastRenderedPageBreak/>
+        <w:t xml:space="preserve">  * “solicit personnel”</w:t>
+      </w:r>
+    </w:p>
+    <w:p>
+      <w:r>
+        <w:t xml:space="preserve">  * “engaged in the work contemplated”</w:t>
+      </w:r>
+    </w:p>
+    <w:p>
+      <w:r>
+        <w:t xml:space="preserve">  * “join such other party’s employ”</w:t>
+      </w:r>
+    </w:p>
+    <w:p>
+      <w:r>
         <w:t xml:space="preserve"> </w:t>
       </w:r>
     </w:p>
     <w:p>
       <w:r>
-        <w:t xml:space="preserve">If the carve-out sentence is not included in the extracted snippet, DO NOT finalize routing for </w:t>
+        <w:t>## Do NOT Trigger</w:t>
+      </w:r>
+    </w:p>
+    <w:p>
+      <w:r>
+        <w:t>* Customer-only solicitation restrictions</w:t>
+      </w:r>
+    </w:p>
+    <w:p>
+      <w:r>
+        <w:t>* Vendor-only solicitation restrictions</w:t>
+      </w:r>
+    </w:p>
+    <w:p>
+      <w:r>
+        <w:t>* Supplier-only solicitation restrictions</w:t>
+      </w:r>
+    </w:p>
+    <w:p>
+      <w:r>
+        <w:t>* Restrictions limited to not interfering with business relationships without employee hiring or solicitation restrictions</w:t>
+      </w:r>
+    </w:p>
+    <w:p>
+      <w:r>
+        <w:t>* Restrictions limited to prospects or clients only</w:t>
+      </w:r>
+    </w:p>
+    <w:p>
+      <w:r>
+        <w:t>* Mutual non-solicitation clause is limited to employees/personnel, includes standard recruitment carve-outs, applies equally to both Parties, and duration is 24 months or less</w:t>
+      </w:r>
+    </w:p>
+    <w:p>
+      <w:r>
+        <w:t>* Clause contains both “advertisements in the media” and “own initiative”</w:t>
+      </w:r>
+    </w:p>
+    <w:p>
+      <w:r>
+        <w:t>* Clause contains both “general advertisement” and “unsolicited contact”</w:t>
+      </w:r>
+    </w:p>
+    <w:p>
+      <w:r>
+        <w:t>* Clause contains both “generalized solicitations” and “not specifically targeted”</w:t>
+      </w:r>
+    </w:p>
+    <w:p>
+      <w:r>
+        <w:t>* Clause contains both “public job postings” and “unsolicited applicants”</w:t>
+      </w:r>
+    </w:p>
+    <w:p>
+      <w:r>
+        <w:t>* Clause contains both “bona fide recruitment advertisement” and “employment agency”</w:t>
+      </w:r>
+    </w:p>
+    <w:p>
+      <w:r>
+        <w:t>* Clause contains both “application for employment submitted on an unsolicited basis” and “general advertisement”</w:t>
+      </w:r>
+    </w:p>
+    <w:p>
+      <w:r>
+        <w:t xml:space="preserve">* Clause is acceptable employee non-solicitation language under the playbook and does not contain a </w:t>
       </w:r>
       <w:proofErr w:type="gramStart"/>
       <w:r>
+        <w:t>liquidated damages</w:t>
+      </w:r>
+      <w:proofErr w:type="gramEnd"/>
+      <w:r>
+        <w:t>, non-compete, or country supplement trigger</w:t>
+      </w:r>
+    </w:p>
+    <w:p>
+      <w:r>
+        <w:t xml:space="preserve">* Clause contains </w:t>
+      </w:r>
+      <w:proofErr w:type="gramStart"/>
+      <w:r>
+        <w:t>all of</w:t>
+      </w:r>
+      <w:proofErr w:type="gramEnd"/>
+      <w:r>
+        <w:t xml:space="preserve"> the following:</w:t>
+      </w:r>
+    </w:p>
+    <w:p>
+      <w:r>
+        <w:t xml:space="preserve">  * “during the term of this Agreement”</w:t>
+      </w:r>
+    </w:p>
+    <w:p>
+      <w:r>
+        <w:t xml:space="preserve">  * “actively seeks employment”</w:t>
+      </w:r>
+    </w:p>
+    <w:p>
+      <w:r>
+        <w:t xml:space="preserve">  * “general advertisement”</w:t>
+      </w:r>
+    </w:p>
+    <w:p>
+      <w:r>
+        <w:t xml:space="preserve">  * “without direct solicitation”</w:t>
+      </w:r>
+    </w:p>
+    <w:p>
+      <w:r>
+        <w:lastRenderedPageBreak/>
+        <w:t xml:space="preserve">* Clause contains </w:t>
+      </w:r>
+      <w:proofErr w:type="gramStart"/>
+      <w:r>
+        <w:t>all of</w:t>
+      </w:r>
+      <w:proofErr w:type="gramEnd"/>
+      <w:r>
+        <w:t xml:space="preserve"> the following:</w:t>
+      </w:r>
+    </w:p>
+    <w:p>
+      <w:r>
+        <w:t xml:space="preserve">  * “Both Parties agree not to solicit”</w:t>
+      </w:r>
+    </w:p>
+    <w:p>
+      <w:r>
+        <w:t xml:space="preserve">  * “employee or independent contractor of the other Party”</w:t>
+      </w:r>
+    </w:p>
+    <w:p>
+      <w:r>
+        <w:t xml:space="preserve">  * “actively seeks employment”</w:t>
+      </w:r>
+    </w:p>
+    <w:p>
+      <w:r>
+        <w:t xml:space="preserve">  * “general advertisement”</w:t>
+      </w:r>
+    </w:p>
+    <w:p>
+      <w:r>
+        <w:t xml:space="preserve">* Clause contains </w:t>
+      </w:r>
+      <w:proofErr w:type="gramStart"/>
+      <w:r>
+        <w:t>all of</w:t>
+      </w:r>
+      <w:proofErr w:type="gramEnd"/>
+      <w:r>
+        <w:t xml:space="preserve"> the following:</w:t>
+      </w:r>
+    </w:p>
+    <w:p>
+      <w:r>
+        <w:t xml:space="preserve">  * “not to solicit any employee or independent contractor”</w:t>
+      </w:r>
+    </w:p>
+    <w:p>
+      <w:r>
+        <w:t xml:space="preserve">  * “during the term of this Agreement”</w:t>
+      </w:r>
+    </w:p>
+    <w:p>
+      <w:r>
+        <w:t xml:space="preserve">  * “Such restrictions shall not apply”</w:t>
+      </w:r>
+    </w:p>
+    <w:p>
+      <w:r>
+        <w:t xml:space="preserve">  * “without direct solicitation”</w:t>
+      </w:r>
+    </w:p>
+    <w:p>
+      <w:r>
+        <w:t xml:space="preserve">* Clause contains </w:t>
+      </w:r>
+      <w:proofErr w:type="gramStart"/>
+      <w:r>
+        <w:t>all of</w:t>
+      </w:r>
+      <w:proofErr w:type="gramEnd"/>
+      <w:r>
+        <w:t xml:space="preserve"> the following:</w:t>
+      </w:r>
+    </w:p>
+    <w:p>
+      <w:r>
+        <w:t xml:space="preserve">  * “employee or independent contractor of either Party actively seeks employment”</w:t>
+      </w:r>
+    </w:p>
+    <w:p>
+      <w:r>
+        <w:t xml:space="preserve">  * “whether in response to a general advertisement or otherwise”</w:t>
+      </w:r>
+    </w:p>
+    <w:p>
+      <w:r>
+        <w:t xml:space="preserve">  * “without direct solicitation by such employing Party”</w:t>
+      </w:r>
+    </w:p>
+    <w:p>
+      <w:r>
+        <w:t xml:space="preserve">* Clause contains </w:t>
+      </w:r>
+      <w:proofErr w:type="gramStart"/>
+      <w:r>
+        <w:t>all of</w:t>
+      </w:r>
+      <w:proofErr w:type="gramEnd"/>
+      <w:r>
+        <w:t xml:space="preserve"> the following:</w:t>
+      </w:r>
+    </w:p>
+    <w:p>
+      <w:r>
+        <w:t xml:space="preserve">  * “on behalf of any other business enterprise”</w:t>
+      </w:r>
+    </w:p>
+    <w:p>
+      <w:r>
+        <w:t xml:space="preserve">  * “during the term of this Agreement”</w:t>
+      </w:r>
+    </w:p>
+    <w:p>
+      <w:r>
+        <w:t xml:space="preserve">  * “general advertisement”</w:t>
+      </w:r>
+    </w:p>
+    <w:p>
+      <w:r>
+        <w:t xml:space="preserve">  * “without direct solicitation”</w:t>
+      </w:r>
+    </w:p>
+    <w:p>
+      <w:r>
+        <w:t xml:space="preserve">* Do NOT route </w:t>
+      </w:r>
+      <w:proofErr w:type="gramStart"/>
+      <w:r>
         <w:t>Non-Solicitation</w:t>
       </w:r>
       <w:proofErr w:type="gramEnd"/>
       <w:r>
-        <w:t xml:space="preserve"> until the full clause-level snippet has been captured.</w:t>
+        <w:t xml:space="preserve"> if the only matched non-solicitation language is a mutual employee or independent contractor restriction and the same clause contains:</w:t>
+      </w:r>
+    </w:p>
+    <w:p>
+      <w:r>
+        <w:t xml:space="preserve">  * “during the term of this Agreement”</w:t>
+      </w:r>
+    </w:p>
+    <w:p>
+      <w:r>
+        <w:t xml:space="preserve">  * “Such restrictions shall not apply”</w:t>
+      </w:r>
+    </w:p>
+    <w:p>
+      <w:r>
+        <w:t xml:space="preserve">  * “actively seeks employment”</w:t>
+      </w:r>
+    </w:p>
+    <w:p>
+      <w:r>
+        <w:t xml:space="preserve">  * “general advertisement”</w:t>
+      </w:r>
+    </w:p>
+    <w:p>
+      <w:r>
+        <w:t xml:space="preserve">  * “without direct solicitation”</w:t>
+      </w:r>
+    </w:p>
+    <w:p>
+      <w:r>
+        <w:lastRenderedPageBreak/>
+        <w:t xml:space="preserve">* Do NOT route </w:t>
+      </w:r>
+      <w:proofErr w:type="gramStart"/>
+      <w:r>
+        <w:t>Non-Solicitation</w:t>
+      </w:r>
+      <w:proofErr w:type="gramEnd"/>
+      <w:r>
+        <w:t xml:space="preserve"> if the same </w:t>
+      </w:r>
+      <w:proofErr w:type="gramStart"/>
+      <w:r>
+        <w:t>Non-Solicitation</w:t>
+      </w:r>
+      <w:proofErr w:type="gramEnd"/>
+      <w:r>
+        <w:t xml:space="preserve"> clause contains BOTH:</w:t>
+      </w:r>
+    </w:p>
+    <w:p>
+      <w:r>
+        <w:t xml:space="preserve">  * “advertisements in the media”</w:t>
+      </w:r>
+    </w:p>
+    <w:p>
+      <w:r>
+        <w:t xml:space="preserve">  * “own initiative”</w:t>
+      </w:r>
+    </w:p>
+    <w:p>
+      <w:r>
+        <w:t xml:space="preserve">* Do NOT route </w:t>
+      </w:r>
+      <w:proofErr w:type="gramStart"/>
+      <w:r>
+        <w:t>Non-Solicitation</w:t>
+      </w:r>
+      <w:proofErr w:type="gramEnd"/>
+      <w:r>
+        <w:t xml:space="preserve"> if the clause is limited to officers only and contains standard public-recruitment carve-outs.</w:t>
+      </w:r>
+    </w:p>
+    <w:p>
+      <w:r>
+        <w:t xml:space="preserve">* Clause contains </w:t>
+      </w:r>
+      <w:proofErr w:type="gramStart"/>
+      <w:r>
+        <w:t>all of</w:t>
+      </w:r>
+      <w:proofErr w:type="gramEnd"/>
+      <w:r>
+        <w:t xml:space="preserve"> the following:</w:t>
+      </w:r>
+    </w:p>
+    <w:p>
+      <w:r>
+        <w:t xml:space="preserve">  * “any officer of the Company”</w:t>
+      </w:r>
+    </w:p>
+    <w:p>
+      <w:r>
+        <w:t xml:space="preserve">  * “generalized searches for employees”</w:t>
+      </w:r>
+    </w:p>
+    <w:p>
+      <w:r>
+        <w:t xml:space="preserve">  * “bona fide public advertisements in the media”</w:t>
+      </w:r>
+    </w:p>
+    <w:p>
+      <w:r>
+        <w:t xml:space="preserve">  * “not targeted specifically at employees of the Company”</w:t>
+      </w:r>
+    </w:p>
+    <w:p>
+      <w:r>
+        <w:t xml:space="preserve">* Clause contains </w:t>
+      </w:r>
+      <w:proofErr w:type="gramStart"/>
+      <w:r>
+        <w:t>all of</w:t>
+      </w:r>
+      <w:proofErr w:type="gramEnd"/>
+      <w:r>
+        <w:t xml:space="preserve"> the following:</w:t>
+      </w:r>
+    </w:p>
+    <w:p>
+      <w:r>
+        <w:t xml:space="preserve">  * “solicitation of any such person”</w:t>
+      </w:r>
+    </w:p>
+    <w:p>
+      <w:r>
+        <w:t xml:space="preserve">  * “generalized searches for employees”</w:t>
+      </w:r>
+    </w:p>
+    <w:p>
+      <w:r>
+        <w:t xml:space="preserve">  * “bona fide public advertisements in the media”</w:t>
+      </w:r>
+    </w:p>
+    <w:p>
+      <w:r>
+        <w:t xml:space="preserve">  * “not targeted specifically”</w:t>
+      </w:r>
+    </w:p>
+    <w:p>
+      <w:r>
+        <w:t xml:space="preserve">* Clause contains </w:t>
+      </w:r>
+      <w:proofErr w:type="gramStart"/>
+      <w:r>
+        <w:t>all of</w:t>
+      </w:r>
+      <w:proofErr w:type="gramEnd"/>
+      <w:r>
+        <w:t xml:space="preserve"> the following:</w:t>
+      </w:r>
+    </w:p>
+    <w:p>
+      <w:r>
+        <w:t xml:space="preserve">  * “employ or engage, or solicit for employment or engagement”</w:t>
+      </w:r>
+    </w:p>
+    <w:p>
+      <w:r>
+        <w:t xml:space="preserve">  * “any officer of the Company”</w:t>
+      </w:r>
+    </w:p>
+    <w:p>
+      <w:r>
+        <w:t xml:space="preserve">  * “bona fide public advertisements in the media”</w:t>
+      </w:r>
+    </w:p>
+    <w:p>
+      <w:r>
+        <w:t xml:space="preserve">  * “not targeted specifically”</w:t>
+      </w:r>
+    </w:p>
+    <w:p>
+      <w:r>
+        <w:t xml:space="preserve"> </w:t>
+      </w:r>
+    </w:p>
+    <w:p>
+      <w:r>
+        <w:t>## Country Supplement Override</w:t>
+      </w:r>
+    </w:p>
+    <w:p>
+      <w:r>
+        <w:t xml:space="preserve">* If the NDA is connected to the Nordics Market Unit and contains any non-solicitation clause, route to </w:t>
+      </w:r>
+      <w:proofErr w:type="gramStart"/>
+      <w:r>
+        <w:t>Non-Solicitation</w:t>
+      </w:r>
+      <w:proofErr w:type="gramEnd"/>
+      <w:r>
+        <w:t xml:space="preserve"> even if standard carve-outs are present.</w:t>
+      </w:r>
+    </w:p>
+    <w:p>
+      <w:r>
+        <w:t>* Nordics non-solicitation must be routed because the playbook states it should be removed in all cases.</w:t>
+      </w:r>
+    </w:p>
+    <w:p>
+      <w:r>
+        <w:t># 6. Non-Compete / Exclusivity</w:t>
+      </w:r>
+    </w:p>
+    <w:p>
+      <w:r>
+        <w:lastRenderedPageBreak/>
+        <w:t>Type: STRATEGIC / COMMERCIAL</w:t>
+      </w:r>
+    </w:p>
+    <w:p>
+      <w:r>
+        <w:t>## Definition</w:t>
+      </w:r>
+    </w:p>
+    <w:p>
+      <w:r>
+        <w:t>Restricts competitive business activities, market participation, provision of services to third parties, provision of services to competitors or other clients, exclusive dealing, pursuit of business opportunities, or engagement with competing enterprises.</w:t>
+      </w:r>
+    </w:p>
+    <w:p>
+      <w:r>
+        <w:t>This risk applies where the NDA clearly limits Accenture’s ability to compete, serve other clients, work with competitors, pursue future business, participate in a market, or conduct business independently.</w:t>
+      </w:r>
+    </w:p>
+    <w:p>
+      <w:r>
+        <w:t>This risk also includes obligations requiring Accenture to disclose, notify, indicate, or report existing or potential work, contracts, consulting relationships, or service relationships with competitors of the client where the obligation is tied to competitor status and may constrain Accenture’s ability to serve other clients or competitors.</w:t>
+      </w:r>
+    </w:p>
+    <w:p>
+      <w:r>
+        <w:t xml:space="preserve"> </w:t>
       </w:r>
     </w:p>
     <w:p>
@@ -1981,133 +2706,252 @@
     </w:p>
     <w:p>
       <w:r>
-        <w:t>Route only if one or more of the following appears in an employee/personnel restriction context:</w:t>
-      </w:r>
-    </w:p>
-    <w:p>
-      <w:r>
-        <w:t>* “non-solicitation”</w:t>
-      </w:r>
-    </w:p>
-    <w:p>
-      <w:r>
-        <w:t>* “non-solicitation of employees”</w:t>
-      </w:r>
-    </w:p>
-    <w:p>
-      <w:r>
-        <w:t>* “solicit employees”</w:t>
-      </w:r>
-    </w:p>
-    <w:p>
-      <w:r>
-        <w:t>* “solicit for employment”</w:t>
-      </w:r>
-    </w:p>
-    <w:p>
-      <w:r>
-        <w:t>* “seek to employ”</w:t>
-      </w:r>
-    </w:p>
-    <w:p>
-      <w:r>
-        <w:t>* “seek to retain the services”</w:t>
-      </w:r>
-    </w:p>
-    <w:p>
-      <w:r>
-        <w:t>* “hire any employee”</w:t>
-      </w:r>
-    </w:p>
-    <w:p>
-      <w:r>
-        <w:t>* “employ any employee”</w:t>
-      </w:r>
-    </w:p>
-    <w:p>
-      <w:r>
-        <w:t>* “recruit any employee”</w:t>
-      </w:r>
-    </w:p>
-    <w:p>
-      <w:r>
-        <w:t>* “engage any employee”</w:t>
-      </w:r>
-    </w:p>
-    <w:p>
-      <w:r>
-        <w:t>* “employ, hire, or engage”</w:t>
-      </w:r>
-    </w:p>
-    <w:p>
-      <w:r>
-        <w:t>* “consultant of the Disclosing Party”</w:t>
-      </w:r>
-    </w:p>
-    <w:p>
-      <w:r>
-        <w:t>* “employee of the Disclosing Party”</w:t>
+        <w:t>* “non-compete”</w:t>
+      </w:r>
+    </w:p>
+    <w:p>
+      <w:r>
+        <w:t>* “non-competition”</w:t>
+      </w:r>
+    </w:p>
+    <w:p>
+      <w:r>
+        <w:t>* “exclusive” or “exclusivity”</w:t>
+      </w:r>
+    </w:p>
+    <w:p>
+      <w:r>
+        <w:t>* “exclusive basis”</w:t>
+      </w:r>
+    </w:p>
+    <w:p>
+      <w:r>
+        <w:t>* “competition restriction”</w:t>
+      </w:r>
+    </w:p>
+    <w:p>
+      <w:r>
+        <w:t>* “restrict services” to third parties</w:t>
+      </w:r>
+    </w:p>
+    <w:p>
+      <w:r>
+        <w:t>* “cannot provide services” to competitors or other clients</w:t>
+      </w:r>
+    </w:p>
+    <w:p>
+      <w:r>
+        <w:t>* “shall not provide services” to competitors or other clients</w:t>
+      </w:r>
+    </w:p>
+    <w:p>
+      <w:r>
+        <w:t>* “shall not enter into direct competition”</w:t>
+      </w:r>
+    </w:p>
+    <w:p>
+      <w:r>
+        <w:t>* “not to enter into direct competition”</w:t>
+      </w:r>
+    </w:p>
+    <w:p>
+      <w:r>
+        <w:t>* “Client Competitor”</w:t>
+      </w:r>
+    </w:p>
+    <w:p>
+      <w:r>
+        <w:t>* “competitor” or “competing enterprise” in a clause restricting business activity</w:t>
+      </w:r>
+    </w:p>
+    <w:p>
+      <w:r>
+        <w:t>* “like industry” in a clause restricting business activity</w:t>
+      </w:r>
+    </w:p>
+    <w:p>
+      <w:r>
+        <w:t>* “offer identical or like services”</w:t>
       </w:r>
     </w:p>
     <w:p>
       <w:r>
         <w:lastRenderedPageBreak/>
-        <w:t>* “other party’s personnel”</w:t>
-      </w:r>
-    </w:p>
-    <w:p>
-      <w:r>
-        <w:t>* “other party’s staff”</w:t>
-      </w:r>
-    </w:p>
-    <w:p>
-      <w:r>
-        <w:t>* “induce any employee to leave”</w:t>
-      </w:r>
-    </w:p>
-    <w:p>
-      <w:r>
-        <w:t>* “persuade any employee to leave”</w:t>
-      </w:r>
-    </w:p>
-    <w:p>
-      <w:r>
-        <w:t>* “encourage any employee to leave”</w:t>
-      </w:r>
-    </w:p>
-    <w:p>
-      <w:r>
-        <w:t>* “entice away”</w:t>
-      </w:r>
-    </w:p>
-    <w:p>
-      <w:r>
-        <w:t>* “Restricted Person”</w:t>
-      </w:r>
-    </w:p>
-    <w:p>
-      <w:r>
-        <w:t>* “solicit, engage, employ”</w:t>
-      </w:r>
-    </w:p>
-    <w:p>
-      <w:r>
-        <w:t>* “contractor of the other party”</w:t>
-      </w:r>
-    </w:p>
-    <w:p>
-      <w:r>
-        <w:t>* “consultant of the other party”</w:t>
-      </w:r>
-    </w:p>
-    <w:p>
-      <w:r>
-        <w:t>* “director, officer and/or employee”</w:t>
-      </w:r>
-    </w:p>
-    <w:p>
-      <w:r>
-        <w:t>* “employee or independent contractor”</w:t>
+        <w:t>* “competitive disadvantage”</w:t>
+      </w:r>
+    </w:p>
+    <w:p>
+      <w:r>
+        <w:t>* “causing any competition”</w:t>
+      </w:r>
+    </w:p>
+    <w:p>
+      <w:r>
+        <w:t>* “deal with one another on an exclusive basis”</w:t>
+      </w:r>
+    </w:p>
+    <w:p>
+      <w:r>
+        <w:t>* “restricts future services”</w:t>
+      </w:r>
+    </w:p>
+    <w:p>
+      <w:r>
+        <w:t>* “provide future services” to other clients is restricted</w:t>
+      </w:r>
+    </w:p>
+    <w:p>
+      <w:r>
+        <w:t>* “pursuing business opportunities” is restricted</w:t>
+      </w:r>
+    </w:p>
+    <w:p>
+      <w:r>
+        <w:t>* “refrain from entering into any new business relationship”</w:t>
+      </w:r>
+    </w:p>
+    <w:p>
+      <w:r>
+        <w:t>* “not directly or indirectly contact, or negotiate with, a third party regarding a potential business relationship”</w:t>
+      </w:r>
+    </w:p>
+    <w:p>
+      <w:r>
+        <w:t>* “persuade any customer” to cease, reduce, or discontinue business</w:t>
+      </w:r>
+    </w:p>
+    <w:p>
+      <w:r>
+        <w:t>* “induce any customer” to cease, reduce, or discontinue business</w:t>
+      </w:r>
+    </w:p>
+    <w:p>
+      <w:r>
+        <w:t>* “persuade any vendor” to cease, reduce, or discontinue business</w:t>
+      </w:r>
+    </w:p>
+    <w:p>
+      <w:r>
+        <w:t>* “induce any vendor” to cease, reduce, or discontinue business</w:t>
+      </w:r>
+    </w:p>
+    <w:p>
+      <w:r>
+        <w:t>* “cease purchasing goods or services”</w:t>
+      </w:r>
+    </w:p>
+    <w:p>
+      <w:r>
+        <w:t>* “cease selling goods and services”</w:t>
+      </w:r>
+    </w:p>
+    <w:p>
+      <w:r>
+        <w:t>* “reduce or discontinue any business relationship”</w:t>
+      </w:r>
+    </w:p>
+    <w:p>
+      <w:r>
+        <w:t>* “prevented or restricted from performing services”</w:t>
+      </w:r>
+    </w:p>
+    <w:p>
+      <w:r>
+        <w:t>* “prevented or restricted from pursuing business opportunities”</w:t>
+      </w:r>
+    </w:p>
+    <w:p>
+      <w:r>
+        <w:t>* “direct competitor of the Client”</w:t>
+      </w:r>
+    </w:p>
+    <w:p>
+      <w:r>
+        <w:t>* “contracted to, working for, or consulting for”</w:t>
+      </w:r>
+    </w:p>
+    <w:p>
+      <w:r>
+        <w:t>* “working for, or consulting for any company which is a direct competitor”</w:t>
+      </w:r>
+    </w:p>
+    <w:p>
+      <w:r>
+        <w:t>* “indicate to you immediately” combined with “direct competitor”</w:t>
+      </w:r>
+    </w:p>
+    <w:p>
+      <w:r>
+        <w:t>* “notify” or “indicate” combined with “direct competitor of the Client”</w:t>
+      </w:r>
+    </w:p>
+    <w:p>
+      <w:r>
+        <w:t>* “disclose” or “report” combined with “working for” and “direct competitor”</w:t>
+      </w:r>
+    </w:p>
+    <w:p>
+      <w:r>
+        <w:t>* Clause contains BOTH:</w:t>
+      </w:r>
+    </w:p>
+    <w:p>
+      <w:r>
+        <w:t xml:space="preserve">  * “direct competitor of the Client”</w:t>
+      </w:r>
+    </w:p>
+    <w:p>
+      <w:r>
+        <w:lastRenderedPageBreak/>
+        <w:t xml:space="preserve">  * “contracted to, working for, or consulting for”</w:t>
+      </w:r>
+    </w:p>
+    <w:p>
+      <w:r>
+        <w:t>* Clause contains BOTH:</w:t>
+      </w:r>
+    </w:p>
+    <w:p>
+      <w:r>
+        <w:t xml:space="preserve">  * “direct competitor”</w:t>
+      </w:r>
+    </w:p>
+    <w:p>
+      <w:r>
+        <w:t xml:space="preserve">  * “working for, or consulting for”</w:t>
+      </w:r>
+    </w:p>
+    <w:p>
+      <w:r>
+        <w:t xml:space="preserve">* Clause contains </w:t>
+      </w:r>
+      <w:proofErr w:type="gramStart"/>
+      <w:r>
+        <w:t>ALL of</w:t>
+      </w:r>
+      <w:proofErr w:type="gramEnd"/>
+      <w:r>
+        <w:t xml:space="preserve"> the following:</w:t>
+      </w:r>
+    </w:p>
+    <w:p>
+      <w:r>
+        <w:t xml:space="preserve">  * “indicate”</w:t>
+      </w:r>
+    </w:p>
+    <w:p>
+      <w:r>
+        <w:t xml:space="preserve">  * “working for”</w:t>
+      </w:r>
+    </w:p>
+    <w:p>
+      <w:r>
+        <w:t xml:space="preserve">  * “consulting for”</w:t>
+      </w:r>
+    </w:p>
+    <w:p>
+      <w:r>
+        <w:t xml:space="preserve">  * “direct competitor”</w:t>
       </w:r>
     </w:p>
     <w:p>
@@ -2122,1271 +2966,526 @@
     </w:p>
     <w:p>
       <w:r>
-        <w:t>* Customer-only solicitation restrictions</w:t>
-      </w:r>
-    </w:p>
-    <w:p>
-      <w:r>
-        <w:t>* Vendor-only solicitation restrictions</w:t>
-      </w:r>
-    </w:p>
-    <w:p>
-      <w:r>
-        <w:t>* Supplier-only solicitation restrictions</w:t>
-      </w:r>
-    </w:p>
-    <w:p>
-      <w:r>
-        <w:t>* Restrictions limited to not interfering with business relationships without employee hiring or solicitation restrictions</w:t>
-      </w:r>
-    </w:p>
-    <w:p>
-      <w:r>
-        <w:t>* Restrictions limited to prospects or clients only</w:t>
-      </w:r>
-    </w:p>
-    <w:p>
-      <w:r>
-        <w:t>* Mutual non-solicitation clause is limited to employees/personnel, includes standard recruitment carve-outs, applies equally to both Parties, and duration is 24 months or less</w:t>
-      </w:r>
-    </w:p>
-    <w:p>
-      <w:r>
-        <w:t>* Clause contains both “advertisements in the media” and “own initiative”</w:t>
-      </w:r>
-    </w:p>
-    <w:p>
-      <w:r>
-        <w:t>* Clause contains both “general advertisement” and “unsolicited contact”</w:t>
-      </w:r>
-    </w:p>
-    <w:p>
-      <w:r>
-        <w:t>* Clause contains both “generalized solicitations” and “not specifically targeted”</w:t>
-      </w:r>
-    </w:p>
-    <w:p>
-      <w:r>
-        <w:t>* Clause contains both “public job postings” and “unsolicited applicants”</w:t>
-      </w:r>
-    </w:p>
-    <w:p>
-      <w:r>
-        <w:t>* Clause contains both “bona fide recruitment advertisement” and “employment agency”</w:t>
+        <w:t>* Restrictions solely prevent misuse of confidential information for competitive purposes</w:t>
+      </w:r>
+    </w:p>
+    <w:p>
+      <w:r>
+        <w:t>* Standard confidentiality obligations that do not restrict business activities</w:t>
+      </w:r>
+    </w:p>
+    <w:p>
+      <w:r>
+        <w:t>* Provisions explicitly confirming parties may compete freely</w:t>
+      </w:r>
+    </w:p>
+    <w:p>
+      <w:r>
+        <w:t>* “exclusive jurisdiction” / “submit to the exclusive jurisdiction”</w:t>
+      </w:r>
+    </w:p>
+    <w:p>
+      <w:r>
+        <w:t>* “exclusive right to” in the context of court remedies or legal proceedings</w:t>
+      </w:r>
+    </w:p>
+    <w:p>
+      <w:r>
+        <w:t>* “exclusive property of the Disclosing Party” in a Confidential Information ownership clause</w:t>
+      </w:r>
+    </w:p>
+    <w:p>
+      <w:r>
+        <w:t>* “sole and exclusive property” in an IP ownership context</w:t>
+      </w:r>
+    </w:p>
+    <w:p>
+      <w:r>
+        <w:t>* Clause only limits use of Confidential Information to the Purpose or Project</w:t>
+      </w:r>
+    </w:p>
+    <w:p>
+      <w:r>
+        <w:t>* Clause only prohibits use of Confidential Information for purposes outside the NDA purpose</w:t>
+      </w:r>
+    </w:p>
+    <w:p>
+      <w:r>
+        <w:t>* Clause only prohibits contacting customers, suppliers, vendors, or connected persons for appraisal, evaluation, due diligence, Project review, or confidentiality-control purposes</w:t>
+      </w:r>
+    </w:p>
+    <w:p>
+      <w:r>
+        <w:t xml:space="preserve">* Clause only requires prior written consent before contacting customers, suppliers, vendors, or connected </w:t>
+      </w:r>
+      <w:proofErr w:type="gramStart"/>
+      <w:r>
+        <w:t>persons</w:t>
+      </w:r>
+      <w:proofErr w:type="gramEnd"/>
+      <w:r>
+        <w:t>, without restricting competition, future services, market participation, or independent business activities</w:t>
       </w:r>
     </w:p>
     <w:p>
       <w:r>
         <w:lastRenderedPageBreak/>
-        <w:t>* Clause contains both “application for employment submitted on an unsolicited basis” and “general advertisement”</w:t>
-      </w:r>
-    </w:p>
-    <w:p>
-      <w:r>
-        <w:t xml:space="preserve">* Clause is acceptable employee non-solicitation language under the playbook and does not contain a </w:t>
+        <w:t>* Clause contains “make contact, directly or indirectly” but does not contain a clear competition, exclusivity, future-services, market-participation, customer-diversion, vendor-diversion, or business-opportunity restriction</w:t>
+      </w:r>
+    </w:p>
+    <w:p>
+      <w:r>
+        <w:t>* Clause contains “customer” or “supplier” but does not require the customer or supplier to cease, reduce, discontinue, or refrain from doing business with the Disclosing Party</w:t>
+      </w:r>
+    </w:p>
+    <w:p>
+      <w:r>
+        <w:t>* Clause contains “customer” or “supplier” but does not restrict Accenture from providing services to third parties, competitors, or other clients</w:t>
+      </w:r>
+    </w:p>
+    <w:p>
+      <w:r>
+        <w:t>* Clause contains “customer, supplier, or any other person connected with the Disclosing Party” only in the context of appraisal, evaluation, diligence, Project review, or confidentiality protection</w:t>
+      </w:r>
+    </w:p>
+    <w:p>
+      <w:r>
+        <w:t>* Restrictions limited to not interfering with business relationships, without a clear restriction on competitive activity, future services, market participation, or business opportunity pursuit</w:t>
+      </w:r>
+    </w:p>
+    <w:p>
+      <w:r>
+        <w:t xml:space="preserve">* General no-contact clauses related to the Project, unless they also include </w:t>
       </w:r>
       <w:proofErr w:type="gramStart"/>
       <w:r>
-        <w:t>liquidated damages</w:t>
+        <w:t>a clear</w:t>
       </w:r>
       <w:proofErr w:type="gramEnd"/>
       <w:r>
-        <w:t>, non-compete, or country supplement trigger</w:t>
-      </w:r>
-    </w:p>
-    <w:p>
-      <w:r>
-        <w:t xml:space="preserve">* Clause contains </w:t>
+        <w:t xml:space="preserve"> non-compete, exclusivity, customer diversion, vendor diversion, or business opportunity restriction</w:t>
+      </w:r>
+    </w:p>
+    <w:p>
+      <w:r>
+        <w:t>* Do NOT route Non-Compete / Exclusivity where “competitor” appears only to exclude competitor consultants, advisors, or representatives from receiving Confidential Information, without requiring Accenture to disclose, notify, indicate, report, limit, stop, or avoid work with a competitor.</w:t>
+      </w:r>
+    </w:p>
+    <w:p>
+      <w:r>
+        <w:t xml:space="preserve">* Do NOT route Non-Compete / Exclusivity where “competitor” appears only in a confidentiality-control provision and does not relate to Accenture </w:t>
+      </w:r>
+      <w:r>
+        <w:t>b</w:t>
+      </w:r>
+      <w:r>
+        <w:t>eing contracted to, working for, consulting for, providing services to, or pursuing work with a competitor.</w:t>
+      </w:r>
+    </w:p>
+    <w:p>
+      <w:r>
+        <w:t>* Do NOT route Non-Compete / Exclusivity where the clause merely states that Confidential Information must not be disclosed to competitors, without any obligation to disclose competitor relationships or restrict business activity.</w:t>
+      </w:r>
+    </w:p>
+    <w:p>
+      <w:r>
+        <w:t xml:space="preserve"> </w:t>
+      </w:r>
+    </w:p>
+    <w:p>
+      <w:r>
+        <w:t>## Conflict Resolution Rule</w:t>
+      </w:r>
+    </w:p>
+    <w:p>
+      <w:r>
+        <w:t>If a clause contains customer, supplier, vendor, or business relationship language, route Non-Compete / Exclusivity only if the clause clearly restricts competitive activity, future services, market participation, independent business opportunities, or causes customers/vendors to cease, reduce, discontinue, or refrain from business with the other party.</w:t>
+      </w:r>
+    </w:p>
+    <w:p>
+      <w:r>
+        <w:lastRenderedPageBreak/>
+        <w:t xml:space="preserve"> </w:t>
+      </w:r>
+    </w:p>
+    <w:p>
+      <w:r>
+        <w:t>If the clause is only a project-related no-contact or consent-before-contact restriction, DO NOT route Non-Compete / Exclusivity.</w:t>
+      </w:r>
+    </w:p>
+    <w:p>
+      <w:r>
+        <w:t># 7. Additional Requirements</w:t>
+      </w:r>
+    </w:p>
+    <w:p>
+      <w:r>
+        <w:t>Type: JURISDICTIONAL / REGULATORY</w:t>
+      </w:r>
+    </w:p>
+    <w:p>
+      <w:r>
+        <w:t>## Definition</w:t>
+      </w:r>
+    </w:p>
+    <w:p>
+      <w:r>
+        <w:t xml:space="preserve">Non-standard legal, regulatory, </w:t>
       </w:r>
       <w:proofErr w:type="gramStart"/>
       <w:r>
-        <w:t>all of</w:t>
+        <w:t>execution-formality</w:t>
       </w:r>
       <w:proofErr w:type="gramEnd"/>
       <w:r>
-        <w:t xml:space="preserve"> the following:</w:t>
-      </w:r>
-    </w:p>
-    <w:p>
-      <w:r>
-        <w:t xml:space="preserve">  * “during the term of this Agreement”</w:t>
-      </w:r>
-    </w:p>
-    <w:p>
-      <w:r>
-        <w:t xml:space="preserve">  * “actively seeks employment”</w:t>
-      </w:r>
-    </w:p>
-    <w:p>
-      <w:r>
-        <w:t xml:space="preserve">  * “general advertisement”</w:t>
-      </w:r>
-    </w:p>
-    <w:p>
-      <w:r>
-        <w:t xml:space="preserve">  * “without direct solicitation”</w:t>
-      </w:r>
-    </w:p>
-    <w:p>
-      <w:r>
-        <w:t xml:space="preserve">* Clause contains </w:t>
+        <w:t>, or jurisdiction-specific obligations that do not fall under the other risk categories and require special routing under the playbook.</w:t>
+      </w:r>
+    </w:p>
+    <w:p>
+      <w:r>
+        <w:t>This includes confirmed ANZ deed execution requirements, Italy-specific insider trading / market abuse requirements, notarization, registration or regulatory filing obligations, and agreements where one of the contracting parties is a confirmed individual person at party-definition level.</w:t>
+      </w:r>
+    </w:p>
+    <w:p>
+      <w:r>
+        <w:t>## Triage Signals</w:t>
+      </w:r>
+    </w:p>
+    <w:p>
+      <w:r>
+        <w:t>* “deed” or “executed as a deed” in an ANZ MU context</w:t>
+      </w:r>
+    </w:p>
+    <w:p>
+      <w:r>
+        <w:t>* “signature by deed” in an ANZ MU context</w:t>
+      </w:r>
+    </w:p>
+    <w:p>
+      <w:r>
+        <w:t>* “signed as a deed” in an ANZ MU context</w:t>
+      </w:r>
+    </w:p>
+    <w:p>
+      <w:r>
+        <w:t>* “notarized”</w:t>
+      </w:r>
+    </w:p>
+    <w:p>
+      <w:r>
+        <w:t>* “notarization”</w:t>
+      </w:r>
+    </w:p>
+    <w:p>
+      <w:r>
+        <w:t>* “registration of this agreement”</w:t>
+      </w:r>
+    </w:p>
+    <w:p>
+      <w:r>
+        <w:t>* “register this agreement”</w:t>
+      </w:r>
+    </w:p>
+    <w:p>
+      <w:r>
+        <w:t>* “file this agreement” with regulator</w:t>
+      </w:r>
+    </w:p>
+    <w:p>
+      <w:r>
+        <w:t>* “filing with regulator”</w:t>
+      </w:r>
+    </w:p>
+    <w:p>
+      <w:r>
+        <w:t>* “regulatory filing”</w:t>
+      </w:r>
+    </w:p>
+    <w:p>
+      <w:r>
+        <w:t>* “filed with regulator”</w:t>
+      </w:r>
+    </w:p>
+    <w:p>
+      <w:r>
+        <w:t>* One of the parties is a confirmed individual person at party-definition level</w:t>
+      </w:r>
+    </w:p>
+    <w:p>
+      <w:r>
+        <w:t>Italy-specific insider trading / market abuse signals require BOTH an Insider / MAR signal AND an Italy nexus.</w:t>
+      </w:r>
+    </w:p>
+    <w:p>
+      <w:r>
+        <w:t xml:space="preserve"> </w:t>
+      </w:r>
+    </w:p>
+    <w:p>
+      <w:r>
+        <w:lastRenderedPageBreak/>
+        <w:t>Insider / MAR signal:</w:t>
+      </w:r>
+    </w:p>
+    <w:p>
+      <w:r>
+        <w:t>* “insider trading”</w:t>
+      </w:r>
+    </w:p>
+    <w:p>
+      <w:r>
+        <w:t>* “inside information”</w:t>
+      </w:r>
+    </w:p>
+    <w:p>
+      <w:r>
+        <w:t>* “market abuse”</w:t>
+      </w:r>
+    </w:p>
+    <w:p>
+      <w:r>
+        <w:t>* “market sensitive information”</w:t>
+      </w:r>
+    </w:p>
+    <w:p>
+      <w:r>
+        <w:t>* “MAR Regulation No 596/2014”</w:t>
+      </w:r>
+    </w:p>
+    <w:p>
+      <w:r>
+        <w:t>* “Regulation (EU) No 596/2014”</w:t>
+      </w:r>
+    </w:p>
+    <w:p>
+      <w:r>
+        <w:t>* “Market Abuse Regulation”</w:t>
+      </w:r>
+    </w:p>
+    <w:p>
+      <w:r>
+        <w:t>* “Insider Register”</w:t>
+      </w:r>
+    </w:p>
+    <w:p>
+      <w:r>
+        <w:t>* “insider list”</w:t>
+      </w:r>
+    </w:p>
+    <w:p>
+      <w:r>
+        <w:t>* “TUF”</w:t>
+      </w:r>
+    </w:p>
+    <w:p>
+      <w:r>
+        <w:t>* “Italian Legislative Decree no. 58/1998”</w:t>
+      </w:r>
+    </w:p>
+    <w:p>
+      <w:r>
+        <w:t xml:space="preserve"> </w:t>
+      </w:r>
+    </w:p>
+    <w:p>
+      <w:r>
+        <w:t>Italy nexus:</w:t>
+      </w:r>
+    </w:p>
+    <w:p>
+      <w:r>
+        <w:t>* “Italy”</w:t>
+      </w:r>
+    </w:p>
+    <w:p>
+      <w:r>
+        <w:t>* “Italian”</w:t>
+      </w:r>
+    </w:p>
+    <w:p>
+      <w:r>
+        <w:t>* “Italian Legislative Decree no. 58/1998”</w:t>
+      </w:r>
+    </w:p>
+    <w:p>
+      <w:r>
+        <w:t>* “TUF”</w:t>
+      </w:r>
+    </w:p>
+    <w:p>
+      <w:r>
+        <w:t>* “PEC”</w:t>
+      </w:r>
+    </w:p>
+    <w:p>
+      <w:r>
+        <w:t>* “Italian NDA”</w:t>
+      </w:r>
+    </w:p>
+    <w:p>
+      <w:r>
+        <w:t>* Italian governing law</w:t>
+      </w:r>
+    </w:p>
+    <w:p>
+      <w:r>
+        <w:t>* Italian party address</w:t>
+      </w:r>
+    </w:p>
+    <w:p>
+      <w:r>
+        <w:t>* Italian company form such as “S.p.A.”, “</w:t>
+      </w:r>
+      <w:proofErr w:type="spellStart"/>
+      <w:r>
+        <w:t>S.r.l</w:t>
+      </w:r>
+      <w:proofErr w:type="spellEnd"/>
+      <w:r>
+        <w:t>.”, or “Società”</w:t>
+      </w:r>
+    </w:p>
+    <w:p>
+      <w:r>
+        <w:t>* Italy Market Unit indicator</w:t>
+      </w:r>
+    </w:p>
+    <w:p>
+      <w:r>
+        <w:t xml:space="preserve"> </w:t>
+      </w:r>
+    </w:p>
+    <w:p/>
+    <w:p>
+      <w:r>
+        <w:lastRenderedPageBreak/>
+        <w:t>Route Additional Requirements for insider trading / MAR only if:</w:t>
+      </w:r>
+    </w:p>
+    <w:p>
+      <w:r>
+        <w:t>* at least one Insider / MAR signal is present; AND</w:t>
+      </w:r>
+    </w:p>
+    <w:p>
+      <w:r>
+        <w:t>* at least one Italy nexus signal is present.</w:t>
+      </w:r>
+    </w:p>
+    <w:p>
+      <w:r>
+        <w:t xml:space="preserve"> </w:t>
+      </w:r>
+    </w:p>
+    <w:p>
+      <w:r>
+        <w:t>## Do NOT Trigger</w:t>
+      </w:r>
+    </w:p>
+    <w:p>
+      <w:r>
+        <w:t>* Standard signature clauses</w:t>
+      </w:r>
+    </w:p>
+    <w:p>
+      <w:r>
+        <w:t>* Standard execution blocks</w:t>
+      </w:r>
+    </w:p>
+    <w:p>
+      <w:r>
+        <w:t>* Provisions already covered by other risk categories, especially Individual NDA risk</w:t>
+      </w:r>
+    </w:p>
+    <w:p>
+      <w:r>
+        <w:t>* “Company Registration No.”</w:t>
+      </w:r>
+    </w:p>
+    <w:p>
+      <w:r>
+        <w:t>* “UEN”</w:t>
+      </w:r>
+    </w:p>
+    <w:p>
+      <w:r>
+        <w:t>* “registered office address”</w:t>
+      </w:r>
+    </w:p>
+    <w:p>
+      <w:r>
+        <w:t xml:space="preserve">* </w:t>
       </w:r>
       <w:proofErr w:type="gramStart"/>
       <w:r>
-        <w:t>all of</w:t>
+        <w:t>company</w:t>
       </w:r>
       <w:proofErr w:type="gramEnd"/>
       <w:r>
-        <w:t xml:space="preserve"> the following:</w:t>
-      </w:r>
-    </w:p>
-    <w:p>
-      <w:r>
-        <w:t xml:space="preserve">  * “Both Parties agree not to solicit”</w:t>
-      </w:r>
-    </w:p>
-    <w:p>
-      <w:r>
-        <w:t xml:space="preserve">  * “employee or independent contractor of the other Party”</w:t>
-      </w:r>
-    </w:p>
-    <w:p>
-      <w:r>
-        <w:t xml:space="preserve">  * “actively seeks employment”</w:t>
-      </w:r>
-    </w:p>
-    <w:p>
-      <w:r>
-        <w:t xml:space="preserve">  * “general advertisement”</w:t>
-      </w:r>
-    </w:p>
-    <w:p>
-      <w:r>
-        <w:t xml:space="preserve">* Clause contains </w:t>
+        <w:t xml:space="preserve"> incorporation details</w:t>
+      </w:r>
+    </w:p>
+    <w:p>
+      <w:r>
+        <w:t>* Standard company metadata in party definitions, including name, address, jurisdiction of incorporation, registration number, tax number, or statistical number</w:t>
+      </w:r>
+    </w:p>
+    <w:p>
+      <w:r>
+        <w:t>* “file” appears only as a noun referring to documents, records, electronic files, data files, or ordinary document handling</w:t>
+      </w:r>
+    </w:p>
+    <w:p>
+      <w:r>
+        <w:t>* “filing” appears only in litigation, document-management, recordkeeping, or ordinary compliance context</w:t>
+      </w:r>
+    </w:p>
+    <w:p>
+      <w:r>
+        <w:t>* “Persons” refers only to people with access to inside information and not to an individual party to the NDA</w:t>
+      </w:r>
+    </w:p>
+    <w:p>
+      <w:r>
+        <w:t>* Individual name appears only in a signature block</w:t>
+      </w:r>
+    </w:p>
+    <w:p>
+      <w:r>
+        <w:t xml:space="preserve">* Individual </w:t>
       </w:r>
       <w:proofErr w:type="gramStart"/>
       <w:r>
-        <w:t>all of</w:t>
+        <w:t>name appears</w:t>
       </w:r>
       <w:proofErr w:type="gramEnd"/>
       <w:r>
-        <w:t xml:space="preserve"> the following:</w:t>
-      </w:r>
-    </w:p>
-    <w:p>
-      <w:r>
-        <w:t xml:space="preserve">  * “not to solicit any employee or independent contractor”</w:t>
-      </w:r>
-    </w:p>
-    <w:p>
-      <w:r>
-        <w:t xml:space="preserve">  * “during the term of this Agreement”</w:t>
-      </w:r>
-    </w:p>
-    <w:p>
-      <w:r>
-        <w:t xml:space="preserve">  * “Such restrictions shall not apply”</w:t>
-      </w:r>
-    </w:p>
-    <w:p>
-      <w:r>
-        <w:t xml:space="preserve">  * “without direct solicitation”</w:t>
-      </w:r>
-    </w:p>
-    <w:p>
-      <w:r>
-        <w:t xml:space="preserve">* Clause contains </w:t>
-      </w:r>
-      <w:proofErr w:type="gramStart"/>
-      <w:r>
-        <w:t>all of</w:t>
-      </w:r>
-      <w:proofErr w:type="gramEnd"/>
-      <w:r>
-        <w:t xml:space="preserve"> the following:</w:t>
-      </w:r>
-    </w:p>
-    <w:p>
-      <w:r>
-        <w:t xml:space="preserve">  * “employee or independent contractor of either Party actively seeks employment”</w:t>
-      </w:r>
-    </w:p>
-    <w:p>
-      <w:r>
-        <w:t xml:space="preserve">  * “whether in response to a general advertisement or otherwise”</w:t>
-      </w:r>
-    </w:p>
-    <w:p>
-      <w:r>
-        <w:t xml:space="preserve">  * “without direct solicitation by such employing Party”</w:t>
-      </w:r>
-    </w:p>
-    <w:p>
-      <w:r>
-        <w:t xml:space="preserve">* Clause contains </w:t>
-      </w:r>
-      <w:proofErr w:type="gramStart"/>
-      <w:r>
-        <w:t>all of</w:t>
-      </w:r>
-      <w:proofErr w:type="gramEnd"/>
-      <w:r>
-        <w:t xml:space="preserve"> the following:</w:t>
-      </w:r>
-    </w:p>
-    <w:p>
-      <w:r>
-        <w:t xml:space="preserve">  * “on behalf of any other business enterprise”</w:t>
-      </w:r>
-    </w:p>
-    <w:p>
-      <w:r>
-        <w:t xml:space="preserve">  * “during the term of this Agreement”</w:t>
-      </w:r>
-    </w:p>
-    <w:p>
-      <w:r>
-        <w:t xml:space="preserve">  * “general advertisement”</w:t>
+        <w:t xml:space="preserve"> only as an authorized signer for a legal entity</w:t>
+      </w:r>
+    </w:p>
+    <w:p>
+      <w:r>
+        <w:t>* Individual person reference is in the signature block or relates only to who is signing the NDA for a legal entity</w:t>
+      </w:r>
+    </w:p>
+    <w:p>
+      <w:r>
+        <w:t>* “MAR Regulation No 596/2014” appears without an Italy nexus</w:t>
+      </w:r>
+    </w:p>
+    <w:p>
+      <w:r>
+        <w:t>* “Regulation (EU) No 596/2014” appears without an Italy nexus</w:t>
+      </w:r>
+    </w:p>
+    <w:p>
+      <w:r>
+        <w:t>* “Market Abuse Regulation” appears without an Italy nexus</w:t>
       </w:r>
     </w:p>
     <w:p>
       <w:r>
         <w:lastRenderedPageBreak/>
-        <w:t xml:space="preserve">  * “without direct solicitation”</w:t>
-      </w:r>
-    </w:p>
-    <w:p>
-      <w:r>
-        <w:t xml:space="preserve">* Do NOT route </w:t>
-      </w:r>
-      <w:proofErr w:type="gramStart"/>
-      <w:r>
-        <w:t>Non-Solicitation</w:t>
-      </w:r>
-      <w:proofErr w:type="gramEnd"/>
-      <w:r>
-        <w:t xml:space="preserve"> if the only matched non-solicitation language is a mutual employee or independent contractor restriction and the same clause contains:</w:t>
-      </w:r>
-    </w:p>
-    <w:p>
-      <w:r>
-        <w:t xml:space="preserve">  * “during the term of this Agreement”</w:t>
-      </w:r>
-    </w:p>
-    <w:p>
-      <w:r>
-        <w:t xml:space="preserve">  * “Such restrictions shall not apply”</w:t>
-      </w:r>
-    </w:p>
-    <w:p>
-      <w:r>
-        <w:t xml:space="preserve">  * “actively seeks employment”</w:t>
-      </w:r>
-    </w:p>
-    <w:p>
-      <w:r>
-        <w:t xml:space="preserve">  * “general advertisement”</w:t>
-      </w:r>
-    </w:p>
-    <w:p>
-      <w:r>
-        <w:t xml:space="preserve">  * “without direct solicitation”</w:t>
-      </w:r>
-    </w:p>
-    <w:p>
-      <w:r>
-        <w:t xml:space="preserve">* Do NOT route </w:t>
-      </w:r>
-      <w:proofErr w:type="gramStart"/>
-      <w:r>
-        <w:t>Non-Solicitation</w:t>
-      </w:r>
-      <w:proofErr w:type="gramEnd"/>
-      <w:r>
-        <w:t xml:space="preserve"> if the same </w:t>
-      </w:r>
-      <w:proofErr w:type="gramStart"/>
-      <w:r>
-        <w:t>Non-Solicitation</w:t>
-      </w:r>
-      <w:proofErr w:type="gramEnd"/>
-      <w:r>
-        <w:t xml:space="preserve"> clause contains BOTH:</w:t>
-      </w:r>
-    </w:p>
-    <w:p>
-      <w:r>
-        <w:t xml:space="preserve">  * “advertisements in the media”</w:t>
-      </w:r>
-    </w:p>
-    <w:p>
-      <w:r>
-        <w:t xml:space="preserve">  * “own initiative”</w:t>
-      </w:r>
-    </w:p>
-    <w:p>
-      <w:r>
-        <w:t xml:space="preserve">* Do NOT route </w:t>
-      </w:r>
-      <w:proofErr w:type="gramStart"/>
-      <w:r>
-        <w:t>Non-Solicitation</w:t>
-      </w:r>
-      <w:proofErr w:type="gramEnd"/>
-      <w:r>
-        <w:t xml:space="preserve"> if the clause is limited to officers only and contains standard public-recruitment carve-outs.</w:t>
-      </w:r>
-    </w:p>
-    <w:p>
-      <w:r>
-        <w:t xml:space="preserve">* Clause contains </w:t>
-      </w:r>
-      <w:proofErr w:type="gramStart"/>
-      <w:r>
-        <w:t>all of</w:t>
-      </w:r>
-      <w:proofErr w:type="gramEnd"/>
-      <w:r>
-        <w:t xml:space="preserve"> the following:</w:t>
-      </w:r>
-    </w:p>
-    <w:p>
-      <w:r>
-        <w:t xml:space="preserve">  * “any officer of the Company”</w:t>
-      </w:r>
-    </w:p>
-    <w:p>
-      <w:r>
-        <w:t xml:space="preserve">  * “generalized searches for employees”</w:t>
-      </w:r>
-    </w:p>
-    <w:p>
-      <w:r>
-        <w:t xml:space="preserve">  * “bona fide public advertisements in the media”</w:t>
-      </w:r>
-    </w:p>
-    <w:p>
-      <w:r>
-        <w:t xml:space="preserve">  * “not targeted specifically at employees of the Company”</w:t>
-      </w:r>
-    </w:p>
-    <w:p>
-      <w:r>
-        <w:t xml:space="preserve">* Clause contains </w:t>
-      </w:r>
-      <w:proofErr w:type="gramStart"/>
-      <w:r>
-        <w:t>all of</w:t>
-      </w:r>
-      <w:proofErr w:type="gramEnd"/>
-      <w:r>
-        <w:t xml:space="preserve"> the following:</w:t>
-      </w:r>
-    </w:p>
-    <w:p>
-      <w:r>
-        <w:t xml:space="preserve">  * “solicitation of any such person”</w:t>
-      </w:r>
-    </w:p>
-    <w:p>
-      <w:r>
-        <w:t xml:space="preserve">  * “generalized searches for employees”</w:t>
-      </w:r>
-    </w:p>
-    <w:p>
-      <w:r>
-        <w:t xml:space="preserve">  * “bona fide public advertisements in the media”</w:t>
-      </w:r>
-    </w:p>
-    <w:p>
-      <w:r>
-        <w:t xml:space="preserve">  * “not targeted specifically”</w:t>
-      </w:r>
-    </w:p>
-    <w:p>
-      <w:r>
-        <w:t xml:space="preserve">* Clause contains </w:t>
-      </w:r>
-      <w:proofErr w:type="gramStart"/>
-      <w:r>
-        <w:t>all of</w:t>
-      </w:r>
-      <w:proofErr w:type="gramEnd"/>
-      <w:r>
-        <w:t xml:space="preserve"> the following:</w:t>
-      </w:r>
-    </w:p>
-    <w:p>
-      <w:r>
-        <w:t xml:space="preserve">  * “employ or engage, or solicit for employment or engagement”</w:t>
-      </w:r>
-    </w:p>
-    <w:p>
-      <w:r>
-        <w:t xml:space="preserve">  * “any officer of the Company”</w:t>
-      </w:r>
-    </w:p>
-    <w:p>
-      <w:r>
-        <w:t xml:space="preserve">  * “bona fide public advertisements in the media”</w:t>
-      </w:r>
-    </w:p>
-    <w:p>
-      <w:r>
-        <w:lastRenderedPageBreak/>
-        <w:t xml:space="preserve">  * “not targeted specifically”</w:t>
-      </w:r>
-    </w:p>
-    <w:p>
-      <w:r>
-        <w:t xml:space="preserve"> </w:t>
-      </w:r>
-    </w:p>
-    <w:p>
-      <w:r>
-        <w:t>## Country Supplement Override</w:t>
-      </w:r>
-    </w:p>
-    <w:p>
-      <w:r>
-        <w:t xml:space="preserve">* If the NDA is connected to the Nordics Market Unit and contains any non-solicitation clause, route to </w:t>
-      </w:r>
-      <w:proofErr w:type="gramStart"/>
-      <w:r>
-        <w:t>Non-Solicitation</w:t>
-      </w:r>
-      <w:proofErr w:type="gramEnd"/>
-      <w:r>
-        <w:t xml:space="preserve"> even if standard carve-outs are present.</w:t>
-      </w:r>
-    </w:p>
-    <w:p>
-      <w:r>
-        <w:t>* Nordics non-solicitation must be routed because the playbook states it should be removed in all cases.</w:t>
-      </w:r>
-    </w:p>
-    <w:p>
-      <w:r>
-        <w:t># 6. Non-Compete / Exclusivity</w:t>
-      </w:r>
-    </w:p>
-    <w:p>
-      <w:r>
-        <w:t>Type: STRATEGIC / COMMERCIAL</w:t>
-      </w:r>
-    </w:p>
-    <w:p>
-      <w:r>
-        <w:t>## Definition</w:t>
-      </w:r>
-    </w:p>
-    <w:p>
-      <w:r>
-        <w:t>Restricts competitive business activities, market participation, provision of services to third parties, provision of services to competitors or other clients, exclusive dealing, pursuit of business opportunities, or engagement with competing enterprises.</w:t>
-      </w:r>
-    </w:p>
-    <w:p>
-      <w:r>
-        <w:t>This risk applies where the NDA clearly limits Accenture’s ability to compete, serve other clients, work with competitors, pursue future business, participate in a market, or conduct business independently.</w:t>
-      </w:r>
-    </w:p>
-    <w:p>
-      <w:r>
-        <w:t>This risk also includes obligations requiring Accenture to disclose, notify, indicate, or report existing or potential work, contracts, consulting relationships, or service relationships with competitors of the client where the obligation is tied to competitor status and may constrain Accenture’s ability to serve other clients or competitors.</w:t>
-      </w:r>
-    </w:p>
-    <w:p>
-      <w:r>
-        <w:t xml:space="preserve"> </w:t>
-      </w:r>
-    </w:p>
-    <w:p>
-      <w:r>
-        <w:t>## Triage Signals</w:t>
-      </w:r>
-    </w:p>
-    <w:p>
-      <w:r>
-        <w:t>* “non-compete”</w:t>
-      </w:r>
-    </w:p>
-    <w:p>
-      <w:r>
-        <w:t>* “non-competition”</w:t>
-      </w:r>
-    </w:p>
-    <w:p>
-      <w:r>
-        <w:t>* “exclusive” or “exclusivity”</w:t>
-      </w:r>
-    </w:p>
-    <w:p>
-      <w:r>
-        <w:t>* “exclusive basis”</w:t>
-      </w:r>
-    </w:p>
-    <w:p>
-      <w:r>
-        <w:t>* “competition restriction”</w:t>
-      </w:r>
-    </w:p>
-    <w:p>
-      <w:r>
-        <w:t>* “restrict services” to third parties</w:t>
-      </w:r>
-    </w:p>
-    <w:p>
-      <w:r>
-        <w:t>* “cannot provide services” to competitors or other clients</w:t>
-      </w:r>
-    </w:p>
-    <w:p>
-      <w:r>
-        <w:lastRenderedPageBreak/>
-        <w:t>* “shall not provide services” to competitors or other clients</w:t>
-      </w:r>
-    </w:p>
-    <w:p>
-      <w:r>
-        <w:t>* “shall not enter into direct competition”</w:t>
-      </w:r>
-    </w:p>
-    <w:p>
-      <w:r>
-        <w:t>* “not to enter into direct competition”</w:t>
-      </w:r>
-    </w:p>
-    <w:p>
-      <w:r>
-        <w:t>* “Client Competitor”</w:t>
-      </w:r>
-    </w:p>
-    <w:p>
-      <w:r>
-        <w:t>* “competitor” or “competing enterprise” in a clause restricting business activity</w:t>
-      </w:r>
-    </w:p>
-    <w:p>
-      <w:r>
-        <w:t>* “like industry” in a clause restricting business activity</w:t>
-      </w:r>
-    </w:p>
-    <w:p>
-      <w:r>
-        <w:t>* “offer identical or like services”</w:t>
-      </w:r>
-    </w:p>
-    <w:p>
-      <w:r>
-        <w:t>* “competitive disadvantage”</w:t>
-      </w:r>
-    </w:p>
-    <w:p>
-      <w:r>
-        <w:t>* “causing any competition”</w:t>
-      </w:r>
-    </w:p>
-    <w:p>
-      <w:r>
-        <w:t>* “deal with one another on an exclusive basis”</w:t>
-      </w:r>
-    </w:p>
-    <w:p>
-      <w:r>
-        <w:t>* “restricts future services”</w:t>
-      </w:r>
-    </w:p>
-    <w:p>
-      <w:r>
-        <w:t>* “provide future services” to other clients is restricted</w:t>
-      </w:r>
-    </w:p>
-    <w:p>
-      <w:r>
-        <w:t>* “pursuing business opportunities” is restricted</w:t>
-      </w:r>
-    </w:p>
-    <w:p>
-      <w:r>
-        <w:t>* “refrain from entering into any new business relationship”</w:t>
-      </w:r>
-    </w:p>
-    <w:p>
-      <w:r>
-        <w:t>* “not directly or indirectly contact, or negotiate with, a third party regarding a potential business relationship”</w:t>
-      </w:r>
-    </w:p>
-    <w:p>
-      <w:r>
-        <w:t>* “persuade any customer” to cease, reduce, or discontinue business</w:t>
-      </w:r>
-    </w:p>
-    <w:p>
-      <w:r>
-        <w:t>* “induce any customer” to cease, reduce, or discontinue business</w:t>
-      </w:r>
-    </w:p>
-    <w:p>
-      <w:r>
-        <w:t>* “persuade any vendor” to cease, reduce, or discontinue business</w:t>
-      </w:r>
-    </w:p>
-    <w:p>
-      <w:r>
-        <w:t>* “induce any vendor” to cease, reduce, or discontinue business</w:t>
-      </w:r>
-    </w:p>
-    <w:p>
-      <w:r>
-        <w:t>* “cease purchasing goods or services”</w:t>
-      </w:r>
-    </w:p>
-    <w:p>
-      <w:r>
-        <w:t>* “cease selling goods and services”</w:t>
-      </w:r>
-    </w:p>
-    <w:p>
-      <w:r>
-        <w:t>* “reduce or discontinue any business relationship”</w:t>
-      </w:r>
-    </w:p>
-    <w:p>
-      <w:r>
-        <w:t>* “prevented or restricted from performing services”</w:t>
-      </w:r>
-    </w:p>
-    <w:p>
-      <w:r>
-        <w:t>* “prevented or restricted from pursuing business opportunities”</w:t>
-      </w:r>
-    </w:p>
-    <w:p>
-      <w:r>
-        <w:t>* “direct competitor of the Client”</w:t>
-      </w:r>
-    </w:p>
-    <w:p>
-      <w:r>
-        <w:lastRenderedPageBreak/>
-        <w:t>* “contracted to, working for, or consulting for”</w:t>
-      </w:r>
-    </w:p>
-    <w:p>
-      <w:r>
-        <w:t>* “working for, or consulting for any company which is a direct competitor”</w:t>
-      </w:r>
-    </w:p>
-    <w:p>
-      <w:r>
-        <w:t>* “indicate to you immediately” combined with “direct competitor”</w:t>
-      </w:r>
-    </w:p>
-    <w:p>
-      <w:r>
-        <w:t>* “notify” or “indicate” combined with “direct competitor of the Client”</w:t>
-      </w:r>
-    </w:p>
-    <w:p>
-      <w:r>
-        <w:t>* “disclose” or “report” combined with “working for” and “direct competitor”</w:t>
-      </w:r>
-    </w:p>
-    <w:p>
-      <w:r>
-        <w:t>* Clause contains BOTH:</w:t>
-      </w:r>
-    </w:p>
-    <w:p>
-      <w:r>
-        <w:t xml:space="preserve">  * “direct competitor of the Client”</w:t>
-      </w:r>
-    </w:p>
-    <w:p>
-      <w:r>
-        <w:t xml:space="preserve">  * “contracted to, working for, or consulting for”</w:t>
-      </w:r>
-    </w:p>
-    <w:p>
-      <w:r>
-        <w:t>* Clause contains BOTH:</w:t>
-      </w:r>
-    </w:p>
-    <w:p>
-      <w:r>
-        <w:t xml:space="preserve">  * “direct competitor”</w:t>
-      </w:r>
-    </w:p>
-    <w:p>
-      <w:r>
-        <w:t xml:space="preserve">  * “working for, or consulting for”</w:t>
-      </w:r>
-    </w:p>
-    <w:p>
-      <w:r>
-        <w:t xml:space="preserve">* Clause contains </w:t>
-      </w:r>
-      <w:proofErr w:type="gramStart"/>
-      <w:r>
-        <w:t>ALL of</w:t>
-      </w:r>
-      <w:proofErr w:type="gramEnd"/>
-      <w:r>
-        <w:t xml:space="preserve"> the following:</w:t>
-      </w:r>
-    </w:p>
-    <w:p>
-      <w:r>
-        <w:t xml:space="preserve">  * “indicate”</w:t>
-      </w:r>
-    </w:p>
-    <w:p>
-      <w:r>
-        <w:t xml:space="preserve">  * “working for”</w:t>
-      </w:r>
-    </w:p>
-    <w:p>
-      <w:r>
-        <w:t xml:space="preserve">  * “consulting for”</w:t>
-      </w:r>
-    </w:p>
-    <w:p>
-      <w:r>
-        <w:t xml:space="preserve">  * “direct competitor”</w:t>
-      </w:r>
-    </w:p>
-    <w:p>
-      <w:r>
-        <w:t xml:space="preserve"> </w:t>
-      </w:r>
-    </w:p>
-    <w:p>
-      <w:r>
-        <w:t>## Do NOT Trigger</w:t>
-      </w:r>
-    </w:p>
-    <w:p>
-      <w:r>
-        <w:t>* Restrictions solely prevent misuse of confidential information for competitive purposes</w:t>
-      </w:r>
-    </w:p>
-    <w:p>
-      <w:r>
-        <w:t>* Standard confidentiality obligations that do not restrict business activities</w:t>
-      </w:r>
-    </w:p>
-    <w:p>
-      <w:r>
-        <w:t>* Provisions explicitly confirming parties may compete freely</w:t>
-      </w:r>
-    </w:p>
-    <w:p>
-      <w:r>
-        <w:t>* “exclusive jurisdiction” / “submit to the exclusive jurisdiction”</w:t>
-      </w:r>
-    </w:p>
-    <w:p>
-      <w:r>
-        <w:t>* “exclusive right to” in the context of court remedies or legal proceedings</w:t>
-      </w:r>
-    </w:p>
-    <w:p>
-      <w:r>
-        <w:t>* “exclusive property of the Disclosing Party” in a Confidential Information ownership clause</w:t>
-      </w:r>
-    </w:p>
-    <w:p>
-      <w:r>
-        <w:t>* “sole and exclusive property” in an IP ownership context</w:t>
-      </w:r>
-    </w:p>
-    <w:p>
-      <w:r>
-        <w:lastRenderedPageBreak/>
-        <w:t>* Clause only limits use of Confidential Information to the Purpose or Project</w:t>
-      </w:r>
-    </w:p>
-    <w:p>
-      <w:r>
-        <w:t>* Clause only prohibits use of Confidential Information for purposes outside the NDA purpose</w:t>
-      </w:r>
-    </w:p>
-    <w:p>
-      <w:r>
-        <w:t>* Clause only prohibits contacting customers, suppliers, vendors, or connected persons for appraisal, evaluation, due diligence, Project review, or confidentiality-control purposes</w:t>
-      </w:r>
-    </w:p>
-    <w:p>
-      <w:r>
-        <w:t xml:space="preserve">* Clause only requires prior written consent before contacting customers, suppliers, vendors, or connected </w:t>
-      </w:r>
-      <w:proofErr w:type="gramStart"/>
-      <w:r>
-        <w:t>persons</w:t>
-      </w:r>
-      <w:proofErr w:type="gramEnd"/>
-      <w:r>
-        <w:t>, without restricting competition, future services, market participation, or independent business activities</w:t>
-      </w:r>
-    </w:p>
-    <w:p>
-      <w:r>
-        <w:t>* Clause contains “make contact, directly or indirectly” but does not contain a clear competition, exclusivity, future-services, market-participation, customer-diversion, vendor-diversion, or business-opportunity restriction</w:t>
-      </w:r>
-    </w:p>
-    <w:p>
-      <w:r>
-        <w:t>* Clause contains “customer” or “supplier” but does not require the customer or supplier to cease, reduce, discontinue, or refrain from doing business with the Disclosing Party</w:t>
-      </w:r>
-    </w:p>
-    <w:p>
-      <w:r>
-        <w:t>* Clause contains “customer” or “supplier” but does not restrict Accenture from providing services to third parties, competitors, or other clients</w:t>
-      </w:r>
-    </w:p>
-    <w:p>
-      <w:r>
-        <w:t>* Clause contains “customer, supplier, or any other person connected with the Disclosing Party” only in the context of appraisal, evaluation, diligence, Project review, or confidentiality protection</w:t>
-      </w:r>
-    </w:p>
-    <w:p>
-      <w:r>
-        <w:t>* Restrictions limited to not interfering with business relationships, without a clear restriction on competitive activity, future services, market participation, or business opportunity pursuit</w:t>
-      </w:r>
-    </w:p>
-    <w:p>
-      <w:r>
-        <w:t xml:space="preserve">* General no-contact clauses related to the Project, unless they also include </w:t>
-      </w:r>
-      <w:proofErr w:type="gramStart"/>
-      <w:r>
-        <w:t>a clear</w:t>
-      </w:r>
-      <w:proofErr w:type="gramEnd"/>
-      <w:r>
-        <w:t xml:space="preserve"> non-compete, exclusivity, customer diversion, vendor diversion, or business opportunity restriction</w:t>
-      </w:r>
-    </w:p>
-    <w:p>
-      <w:r>
-        <w:t>* Do NOT route Non-Compete / Exclusivity where “competitor” appears only to exclude competitor consultants, advisors, or representatives from receiving Confidential Information, without requiring Accenture to disclose, notify, indicate, report, limit, stop, or avoid work with a competitor.</w:t>
-      </w:r>
-    </w:p>
-    <w:p>
-      <w:r>
-        <w:t xml:space="preserve">* Do NOT route Non-Compete / Exclusivity where “competitor” appears only in a confidentiality-control provision and does not relate to Accenture </w:t>
-      </w:r>
-      <w:r>
-        <w:t>b</w:t>
-      </w:r>
-      <w:r>
-        <w:t>eing contracted to, working for, consulting for, providing services to, or pursuing work with a competitor.</w:t>
-      </w:r>
-    </w:p>
-    <w:p>
-      <w:r>
-        <w:lastRenderedPageBreak/>
-        <w:t>* Do NOT route Non-Compete / Exclusivity where the clause merely states that Confidential Information must not be disclosed to competitors, without any obligation to disclose competitor relationships or restrict business activity.</w:t>
-      </w:r>
-    </w:p>
-    <w:p>
-      <w:r>
-        <w:t xml:space="preserve"> </w:t>
-      </w:r>
-    </w:p>
-    <w:p>
-      <w:r>
-        <w:t>## Conflict Resolution Rule</w:t>
-      </w:r>
-    </w:p>
-    <w:p>
-      <w:r>
-        <w:t>If a clause contains customer, supplier, vendor, or business relationship language, route Non-Compete / Exclusivity only if the clause clearly restricts competitive activity, future services, market participation, independent business opportunities, or causes customers/vendors to cease, reduce, discontinue, or refrain from business with the other party.</w:t>
-      </w:r>
-    </w:p>
-    <w:p>
-      <w:r>
-        <w:t xml:space="preserve"> </w:t>
-      </w:r>
-    </w:p>
-    <w:p>
-      <w:r>
-        <w:t>If the clause is only a project-related no-contact or consent-before-contact restriction, DO NOT route Non-Compete / Exclusivity.</w:t>
-      </w:r>
-    </w:p>
-    <w:p>
-      <w:r>
-        <w:t># 7. Additional Requirements</w:t>
-      </w:r>
-    </w:p>
-    <w:p>
-      <w:r>
-        <w:t>Type: JURISDICTIONAL / REGULATORY</w:t>
-      </w:r>
-    </w:p>
-    <w:p>
-      <w:r>
-        <w:t>## Definition</w:t>
-      </w:r>
-    </w:p>
-    <w:p>
-      <w:r>
-        <w:t xml:space="preserve">Non-standard legal, regulatory, </w:t>
-      </w:r>
-      <w:proofErr w:type="gramStart"/>
-      <w:r>
-        <w:t>execution-formality</w:t>
-      </w:r>
-      <w:proofErr w:type="gramEnd"/>
-      <w:r>
-        <w:t>, or jurisdiction-specific obligations that do not fall under the other risk categories and require special routing under the playbook.</w:t>
-      </w:r>
-    </w:p>
-    <w:p>
-      <w:r>
-        <w:t>This includes confirmed ANZ deed execution requirements, Italy-specific insider trading / market abuse requirements, notarization, registration or regulatory filing obligations, and agreements where one of the contracting parties is a confirmed individual person at party-definition level.</w:t>
-      </w:r>
-    </w:p>
-    <w:p>
-      <w:r>
-        <w:t>## Triage Signals</w:t>
-      </w:r>
-    </w:p>
-    <w:p>
-      <w:r>
-        <w:t>* “deed” or “executed as a deed” in an ANZ MU context</w:t>
-      </w:r>
-    </w:p>
-    <w:p>
-      <w:r>
-        <w:t>* “signature by deed” in an ANZ MU context</w:t>
-      </w:r>
-    </w:p>
-    <w:p>
-      <w:r>
-        <w:t>* “signed as a deed” in an ANZ MU context</w:t>
-      </w:r>
-    </w:p>
-    <w:p>
-      <w:r>
-        <w:t>* “notarized”</w:t>
-      </w:r>
-    </w:p>
-    <w:p>
-      <w:r>
-        <w:t>* “notarization”</w:t>
-      </w:r>
-    </w:p>
-    <w:p>
-      <w:r>
-        <w:t>* “registration of this agreement”</w:t>
-      </w:r>
-    </w:p>
-    <w:p>
-      <w:r>
-        <w:lastRenderedPageBreak/>
-        <w:t>* “register this agreement”</w:t>
-      </w:r>
-    </w:p>
-    <w:p>
-      <w:r>
-        <w:t>* “file this agreement” with regulator</w:t>
-      </w:r>
-    </w:p>
-    <w:p>
-      <w:r>
-        <w:t>* “filing with regulator”</w:t>
-      </w:r>
-    </w:p>
-    <w:p>
-      <w:r>
-        <w:t>* “regulatory filing”</w:t>
-      </w:r>
-    </w:p>
-    <w:p>
-      <w:r>
-        <w:t>* “filed with regulator”</w:t>
-      </w:r>
-    </w:p>
-    <w:p>
-      <w:r>
-        <w:t>* One of the parties is a confirmed individual person at party-definition level</w:t>
-      </w:r>
-    </w:p>
-    <w:p>
-      <w:r>
-        <w:t>Italy-specific insider trading / market abuse signals require BOTH an Insider / MAR signal AND an Italy nexus.</w:t>
-      </w:r>
-    </w:p>
-    <w:p>
-      <w:r>
-        <w:t xml:space="preserve"> </w:t>
-      </w:r>
-    </w:p>
-    <w:p>
-      <w:r>
-        <w:t>Insider / MAR signal:</w:t>
-      </w:r>
-    </w:p>
-    <w:p>
-      <w:r>
-        <w:t>* “insider trading”</w:t>
-      </w:r>
-    </w:p>
-    <w:p>
-      <w:r>
-        <w:t>* “inside information”</w:t>
-      </w:r>
-    </w:p>
-    <w:p>
-      <w:r>
-        <w:t>* “market abuse”</w:t>
-      </w:r>
-    </w:p>
-    <w:p>
-      <w:r>
-        <w:t>* “market sensitive information”</w:t>
-      </w:r>
-    </w:p>
-    <w:p>
-      <w:r>
-        <w:t>* “MAR Regulation No 596/2014”</w:t>
-      </w:r>
-    </w:p>
-    <w:p>
-      <w:r>
-        <w:t>* “Regulation (EU) No 596/2014”</w:t>
-      </w:r>
-    </w:p>
-    <w:p>
-      <w:r>
-        <w:t>* “Market Abuse Regulation”</w:t>
-      </w:r>
-    </w:p>
-    <w:p>
-      <w:r>
-        <w:t>* “Insider Register”</w:t>
-      </w:r>
-    </w:p>
-    <w:p>
-      <w:r>
-        <w:t>* “insider list”</w:t>
-      </w:r>
-    </w:p>
-    <w:p>
-      <w:r>
-        <w:t>* “TUF”</w:t>
-      </w:r>
-    </w:p>
-    <w:p>
-      <w:r>
-        <w:t>* “Italian Legislative Decree no. 58/1998”</w:t>
-      </w:r>
-    </w:p>
-    <w:p>
-      <w:r>
-        <w:t xml:space="preserve"> </w:t>
-      </w:r>
-    </w:p>
-    <w:p>
-      <w:r>
-        <w:t>Italy nexus:</w:t>
-      </w:r>
-    </w:p>
-    <w:p>
-      <w:r>
-        <w:t>* “Italy”</w:t>
-      </w:r>
-    </w:p>
-    <w:p>
-      <w:r>
-        <w:t>* “Italian”</w:t>
-      </w:r>
-    </w:p>
-    <w:p>
-      <w:r>
-        <w:t>* “Italian Legislative Decree no. 58/1998”</w:t>
-      </w:r>
-    </w:p>
-    <w:p>
-      <w:r>
-        <w:lastRenderedPageBreak/>
-        <w:t>* “TUF”</w:t>
-      </w:r>
-    </w:p>
-    <w:p>
-      <w:r>
-        <w:t>* “PEC”</w:t>
-      </w:r>
-    </w:p>
-    <w:p>
-      <w:r>
-        <w:t>* “Italian NDA”</w:t>
-      </w:r>
-    </w:p>
-    <w:p>
-      <w:r>
-        <w:t>* Italian governing law</w:t>
-      </w:r>
-    </w:p>
-    <w:p>
-      <w:r>
-        <w:t>* Italian party address</w:t>
-      </w:r>
-    </w:p>
-    <w:p>
-      <w:r>
-        <w:t>* Italian company form such as “S.p.A.”, “</w:t>
-      </w:r>
-      <w:proofErr w:type="spellStart"/>
-      <w:r>
-        <w:t>S.r.l</w:t>
-      </w:r>
-      <w:proofErr w:type="spellEnd"/>
-      <w:r>
-        <w:t>.”, or “Società”</w:t>
-      </w:r>
-    </w:p>
-    <w:p>
-      <w:r>
-        <w:t>* Italy Market Unit indicator</w:t>
-      </w:r>
-    </w:p>
-    <w:p>
-      <w:r>
-        <w:t xml:space="preserve"> </w:t>
-      </w:r>
-    </w:p>
-    <w:p/>
-    <w:p>
-      <w:r>
-        <w:t>Route Additional Requirements for insider trading / MAR only if:</w:t>
-      </w:r>
-    </w:p>
-    <w:p>
-      <w:r>
-        <w:t>* at least one Insider / MAR signal is present; AND</w:t>
-      </w:r>
-    </w:p>
-    <w:p>
-      <w:r>
-        <w:t>* at least one Italy nexus signal is present.</w:t>
-      </w:r>
-    </w:p>
-    <w:p>
-      <w:r>
-        <w:t xml:space="preserve"> </w:t>
-      </w:r>
-    </w:p>
-    <w:p>
-      <w:r>
-        <w:t>## Do NOT Trigger</w:t>
-      </w:r>
-    </w:p>
-    <w:p>
-      <w:r>
-        <w:t>* Standard signature clauses</w:t>
-      </w:r>
-    </w:p>
-    <w:p>
-      <w:r>
-        <w:t>* Standard execution blocks</w:t>
-      </w:r>
-    </w:p>
-    <w:p>
-      <w:r>
-        <w:t>* Provisions already covered by other risk categories, especially Individual NDA risk</w:t>
-      </w:r>
-    </w:p>
-    <w:p>
-      <w:r>
-        <w:t>* “Company Registration No.”</w:t>
-      </w:r>
-    </w:p>
-    <w:p>
-      <w:r>
-        <w:t>* “UEN”</w:t>
-      </w:r>
-    </w:p>
-    <w:p>
-      <w:r>
-        <w:t>* “registered office address”</w:t>
-      </w:r>
-    </w:p>
-    <w:p>
-      <w:r>
-        <w:t xml:space="preserve">* </w:t>
-      </w:r>
-      <w:proofErr w:type="gramStart"/>
-      <w:r>
-        <w:t>company</w:t>
-      </w:r>
-      <w:proofErr w:type="gramEnd"/>
-      <w:r>
-        <w:t xml:space="preserve"> incorporation details</w:t>
-      </w:r>
-    </w:p>
-    <w:p>
-      <w:r>
-        <w:t>* Standard company metadata in party definitions, including name, address, jurisdiction of incorporation, registration number, tax number, or statistical number</w:t>
-      </w:r>
-    </w:p>
-    <w:p>
-      <w:r>
-        <w:t>* “file” appears only as a noun referring to documents, records, electronic files, data files, or ordinary document handling</w:t>
-      </w:r>
-    </w:p>
-    <w:p>
-      <w:r>
-        <w:t>* “filing” appears only in litigation, document-management, recordkeeping, or ordinary compliance context</w:t>
-      </w:r>
-    </w:p>
-    <w:p>
-      <w:r>
-        <w:lastRenderedPageBreak/>
-        <w:t>* “Persons” refers only to people with access to inside information and not to an individual party to the NDA</w:t>
-      </w:r>
-    </w:p>
-    <w:p>
-      <w:r>
-        <w:t>* Individual name appears only in a signature block</w:t>
-      </w:r>
-    </w:p>
-    <w:p>
-      <w:r>
-        <w:t xml:space="preserve">* Individual </w:t>
-      </w:r>
-      <w:proofErr w:type="gramStart"/>
-      <w:r>
-        <w:t>name appears</w:t>
-      </w:r>
-      <w:proofErr w:type="gramEnd"/>
-      <w:r>
-        <w:t xml:space="preserve"> only as an authorized signer for a legal entity</w:t>
-      </w:r>
-    </w:p>
-    <w:p>
-      <w:r>
-        <w:t>* Individual person reference is in the signature block or relates only to who is signing the NDA for a legal entity</w:t>
-      </w:r>
-    </w:p>
-    <w:p>
-      <w:r>
-        <w:t>* “MAR Regulation No 596/2014” appears without an Italy nexus</w:t>
-      </w:r>
-    </w:p>
-    <w:p>
-      <w:r>
-        <w:t>* “Regulation (EU) No 596/2014” appears without an Italy nexus</w:t>
-      </w:r>
-    </w:p>
-    <w:p>
-      <w:r>
-        <w:t>* “Market Abuse Regulation” appears without an Italy nexus</w:t>
-      </w:r>
-    </w:p>
-    <w:p>
-      <w:r>
         <w:t>* “inside information” appears without an Italy nexus</w:t>
       </w:r>
     </w:p>
@@ -4271,7 +4370,6 @@
   <w:style w:type="character" w:default="1" w:styleId="DefaultParagraphFont">
     <w:name w:val="Default Paragraph Font"/>
     <w:uiPriority w:val="1"/>
-    <w:semiHidden/>
     <w:unhideWhenUsed/>
   </w:style>
   <w:style w:type="table" w:default="1" w:styleId="TableNormal">
@@ -28776,27 +28874,6 @@
 </file>
 
 <file path=customXml/item1.xml><?xml version="1.0" encoding="utf-8"?>
-<?mso-contentType ?>
-<FormTemplates xmlns="http://schemas.microsoft.com/sharepoint/v3/contenttype/forms">
-  <Display>DocumentLibraryForm</Display>
-  <Edit>DocumentLibraryForm</Edit>
-  <New>DocumentLibraryForm</New>
-</FormTemplates>
-</file>
-
-<file path=customXml/item2.xml><?xml version="1.0" encoding="utf-8"?>
-<p:properties xmlns:p="http://schemas.microsoft.com/office/2006/metadata/properties" xmlns:xsi="http://www.w3.org/2001/XMLSchema-instance" xmlns:pc="http://schemas.microsoft.com/office/infopath/2007/PartnerControls">
-  <documentManagement>
-    <TaxCatchAll xmlns="58fb48c5-ad38-47d1-9aa6-9b4f1dc114f9" xsi:nil="true"/>
-    <lcf76f155ced4ddcb4097134ff3c332f xmlns="aba9ad68-f961-4806-8372-ded3e8039a5f">
-      <Terms xmlns="http://schemas.microsoft.com/office/infopath/2007/PartnerControls"/>
-    </lcf76f155ced4ddcb4097134ff3c332f>
-    <Reusable xmlns="aba9ad68-f961-4806-8372-ded3e8039a5f">true</Reusable>
-  </documentManagement>
-</p:properties>
-</file>
-
-<file path=customXml/item3.xml><?xml version="1.0" encoding="utf-8"?>
 <ct:contentTypeSchema xmlns:ct="http://schemas.microsoft.com/office/2006/metadata/contentType" xmlns:ma="http://schemas.microsoft.com/office/2006/metadata/properties/metaAttributes" ct:_="" ma:_="" ma:contentTypeName="Document" ma:contentTypeID="0x010100A5AA8A3CABF36C429B74A94C24258E55" ma:contentTypeVersion="21" ma:contentTypeDescription="Create a new document." ma:contentTypeScope="" ma:versionID="9d590b9c745b5d4d086e55351edde6c7">
   <xsd:schema xmlns:xsd="http://www.w3.org/2001/XMLSchema" xmlns:xs="http://www.w3.org/2001/XMLSchema" xmlns:p="http://schemas.microsoft.com/office/2006/metadata/properties" xmlns:ns2="aba9ad68-f961-4806-8372-ded3e8039a5f" xmlns:ns3="58fb48c5-ad38-47d1-9aa6-9b4f1dc114f9" targetNamespace="http://schemas.microsoft.com/office/2006/metadata/properties" ma:root="true" ma:fieldsID="656ed3350af39d0ad06ab4725df265a1" ns2:_="" ns3:_="">
     <xsd:import namespace="aba9ad68-f961-4806-8372-ded3e8039a5f"/>
@@ -29063,26 +29140,28 @@
 </ct:contentTypeSchema>
 </file>
 
-<file path=customXml/itemProps1.xml><?xml version="1.0" encoding="utf-8"?>
-<ds:datastoreItem xmlns:ds="http://schemas.openxmlformats.org/officeDocument/2006/customXml" ds:itemID="{C6DFF534-1887-4C42-BC36-EDACE7DE72C0}">
-  <ds:schemaRefs>
-    <ds:schemaRef ds:uri="http://schemas.microsoft.com/sharepoint/v3/contenttype/forms"/>
-  </ds:schemaRefs>
-</ds:datastoreItem>
+<file path=customXml/item2.xml><?xml version="1.0" encoding="utf-8"?>
+<p:properties xmlns:p="http://schemas.microsoft.com/office/2006/metadata/properties" xmlns:xsi="http://www.w3.org/2001/XMLSchema-instance" xmlns:pc="http://schemas.microsoft.com/office/infopath/2007/PartnerControls">
+  <documentManagement>
+    <TaxCatchAll xmlns="58fb48c5-ad38-47d1-9aa6-9b4f1dc114f9" xsi:nil="true"/>
+    <lcf76f155ced4ddcb4097134ff3c332f xmlns="aba9ad68-f961-4806-8372-ded3e8039a5f">
+      <Terms xmlns="http://schemas.microsoft.com/office/infopath/2007/PartnerControls"/>
+    </lcf76f155ced4ddcb4097134ff3c332f>
+    <Reusable xmlns="aba9ad68-f961-4806-8372-ded3e8039a5f">true</Reusable>
+  </documentManagement>
+</p:properties>
 </file>
 
-<file path=customXml/itemProps2.xml><?xml version="1.0" encoding="utf-8"?>
-<ds:datastoreItem xmlns:ds="http://schemas.openxmlformats.org/officeDocument/2006/customXml" ds:itemID="{25BAFF0C-A05A-49CE-A308-E2413E02AFCD}">
-  <ds:schemaRefs>
-    <ds:schemaRef ds:uri="http://schemas.microsoft.com/office/2006/metadata/properties"/>
-    <ds:schemaRef ds:uri="http://schemas.microsoft.com/office/infopath/2007/PartnerControls"/>
-    <ds:schemaRef ds:uri="58fb48c5-ad38-47d1-9aa6-9b4f1dc114f9"/>
-    <ds:schemaRef ds:uri="aba9ad68-f961-4806-8372-ded3e8039a5f"/>
-  </ds:schemaRefs>
-</ds:datastoreItem>
+<file path=customXml/item3.xml><?xml version="1.0" encoding="utf-8"?>
+<?mso-contentType ?>
+<FormTemplates xmlns="http://schemas.microsoft.com/sharepoint/v3/contenttype/forms">
+  <Display>DocumentLibraryForm</Display>
+  <Edit>DocumentLibraryForm</Edit>
+  <New>DocumentLibraryForm</New>
+</FormTemplates>
 </file>
 
-<file path=customXml/itemProps3.xml><?xml version="1.0" encoding="utf-8"?>
+<file path=customXml/itemProps1.xml><?xml version="1.0" encoding="utf-8"?>
 <ds:datastoreItem xmlns:ds="http://schemas.openxmlformats.org/officeDocument/2006/customXml" ds:itemID="{06BBAEB0-F6D0-405B-9BC5-9D7675839774}">
   <ds:schemaRefs>
     <ds:schemaRef ds:uri="http://schemas.microsoft.com/office/2006/metadata/contentType"/>
@@ -29101,6 +29180,25 @@
 </ds:datastoreItem>
 </file>
 
+<file path=customXml/itemProps2.xml><?xml version="1.0" encoding="utf-8"?>
+<ds:datastoreItem xmlns:ds="http://schemas.openxmlformats.org/officeDocument/2006/customXml" ds:itemID="{25BAFF0C-A05A-49CE-A308-E2413E02AFCD}">
+  <ds:schemaRefs>
+    <ds:schemaRef ds:uri="http://schemas.microsoft.com/office/2006/metadata/properties"/>
+    <ds:schemaRef ds:uri="http://schemas.microsoft.com/office/infopath/2007/PartnerControls"/>
+    <ds:schemaRef ds:uri="58fb48c5-ad38-47d1-9aa6-9b4f1dc114f9"/>
+    <ds:schemaRef ds:uri="aba9ad68-f961-4806-8372-ded3e8039a5f"/>
+  </ds:schemaRefs>
+</ds:datastoreItem>
+</file>
+
+<file path=customXml/itemProps3.xml><?xml version="1.0" encoding="utf-8"?>
+<ds:datastoreItem xmlns:ds="http://schemas.openxmlformats.org/officeDocument/2006/customXml" ds:itemID="{C6DFF534-1887-4C42-BC36-EDACE7DE72C0}">
+  <ds:schemaRefs>
+    <ds:schemaRef ds:uri="http://schemas.microsoft.com/sharepoint/v3/contenttype/forms"/>
+  </ds:schemaRefs>
+</ds:datastoreItem>
+</file>
+
 <file path=docMetadata/LabelInfo.xml><?xml version="1.0" encoding="utf-8"?>
 <clbl:labelList xmlns:clbl="http://schemas.microsoft.com/office/2020/mipLabelMetadata">
   <clbl:label id="{0bfa236d-8472-42aa-9a40-ab46036c5596}" enabled="1" method="Standard" siteId="{e0793d39-0939-496d-b129-198edd916feb}" contentBits="0" removed="0"/>

</xml_diff>

<commit_message>
Adjust Orchestrator Signal for Non-Solicitation
</commit_message>
<xml_diff>
--- a/docs/orchestrator_kb.docx
+++ b/docs/orchestrator_kb.docx
@@ -63,15 +63,7 @@
     </w:p>
     <w:p>
       <w:r>
-        <w:t xml:space="preserve">* ALL Triage Signals must be matched using exact phrase matching, </w:t>
-      </w:r>
-      <w:proofErr w:type="gramStart"/>
-      <w:r>
-        <w:t>case-insensitive</w:t>
-      </w:r>
-      <w:proofErr w:type="gramEnd"/>
-      <w:r>
-        <w:t>.</w:t>
+        <w:t>* ALL Triage Signals must be matched using exact phrase matching, case-insensitive.</w:t>
       </w:r>
     </w:p>
     <w:p>
@@ -81,28 +73,12 @@
     </w:p>
     <w:p>
       <w:r>
-        <w:t xml:space="preserve">* Do NOT route </w:t>
-      </w:r>
-      <w:proofErr w:type="gramStart"/>
-      <w:r>
-        <w:t>based</w:t>
-      </w:r>
-      <w:proofErr w:type="gramEnd"/>
-      <w:r>
-        <w:t xml:space="preserve"> only on headings unless the clause body contains a matching triage signal.</w:t>
-      </w:r>
-    </w:p>
-    <w:p>
-      <w:r>
-        <w:t xml:space="preserve">* Do NOT route </w:t>
-      </w:r>
-      <w:proofErr w:type="gramStart"/>
-      <w:r>
-        <w:t>based</w:t>
-      </w:r>
-      <w:proofErr w:type="gramEnd"/>
-      <w:r>
-        <w:t xml:space="preserve"> only on standard NDA confidentiality language unless the clause also contains a specific triage signal below.</w:t>
+        <w:t>* Do NOT route based only on headings unless the clause body contains a matching triage signal.</w:t>
+      </w:r>
+    </w:p>
+    <w:p>
+      <w:r>
+        <w:t>* Do NOT route based only on standard NDA confidentiality language unless the clause also contains a specific triage signal below.</w:t>
       </w:r>
     </w:p>
     <w:p>
@@ -349,15 +325,7 @@
     </w:p>
     <w:p>
       <w:r>
-        <w:t>* Parties are defined as “Party/Parties</w:t>
-      </w:r>
-      <w:proofErr w:type="gramStart"/>
-      <w:r>
-        <w:t>”</w:t>
-      </w:r>
-      <w:proofErr w:type="gramEnd"/>
-      <w:r>
-        <w:t xml:space="preserve"> and confidentiality obligations apply to “Each Party” or “Either Party”</w:t>
+        <w:t>* Parties are defined as “Party/Parties” and confidentiality obligations apply to “Each Party” or “Either Party”</w:t>
       </w:r>
     </w:p>
     <w:p>
@@ -367,15 +335,7 @@
     </w:p>
     <w:p>
       <w:r>
-        <w:t xml:space="preserve">* One-way confidentiality undertaking executed “in </w:t>
-      </w:r>
-      <w:proofErr w:type="spellStart"/>
-      <w:r>
-        <w:t>favour</w:t>
-      </w:r>
-      <w:proofErr w:type="spellEnd"/>
-      <w:r>
-        <w:t xml:space="preserve"> of and for the benefit of Client” where the document is structured as:</w:t>
+        <w:t>* One-way confidentiality undertaking executed “in favour of and for the benefit of Client” where the document is structured as:</w:t>
       </w:r>
     </w:p>
     <w:p>
@@ -396,41 +356,17 @@
     </w:p>
     <w:p>
       <w:r>
-        <w:t xml:space="preserve">  * </w:t>
-      </w:r>
-      <w:proofErr w:type="gramStart"/>
-      <w:r>
-        <w:t>the</w:t>
-      </w:r>
-      <w:proofErr w:type="gramEnd"/>
-      <w:r>
-        <w:t xml:space="preserve"> recipient executes an “Undertaking” rather than a mutual NDA</w:t>
-      </w:r>
-    </w:p>
-    <w:p>
-      <w:r>
-        <w:t xml:space="preserve">* Confidentiality undertaking where the only clear one-way structure is caused by the format “TO: Client / FROM: Recipient” and the document also contains a separate Individual NDA triage signal requiring Permitted Users, personnel, employees, advisers, agents, representatives, or other persons to execute a non-disclosure undertaking directly in </w:t>
-      </w:r>
-      <w:proofErr w:type="spellStart"/>
-      <w:r>
-        <w:t>favour</w:t>
-      </w:r>
-      <w:proofErr w:type="spellEnd"/>
-      <w:r>
-        <w:t xml:space="preserve"> of Client</w:t>
-      </w:r>
-    </w:p>
-    <w:p>
-      <w:r>
-        <w:t xml:space="preserve">* Do NOT route Unilateral NDA if </w:t>
-      </w:r>
-      <w:proofErr w:type="gramStart"/>
-      <w:r>
-        <w:t>all of</w:t>
-      </w:r>
-      <w:proofErr w:type="gramEnd"/>
-      <w:r>
-        <w:t xml:space="preserve"> the following are present:</w:t>
+        <w:t xml:space="preserve">  * the recipient executes an “Undertaking” rather than a mutual NDA</w:t>
+      </w:r>
+    </w:p>
+    <w:p>
+      <w:r>
+        <w:t>* Confidentiality undertaking where the only clear one-way structure is caused by the format “TO: Client / FROM: Recipient” and the document also contains a separate Individual NDA triage signal requiring Permitted Users, personnel, employees, advisers, agents, representatives, or other persons to execute a non-disclosure undertaking directly in favour of Client</w:t>
+      </w:r>
+    </w:p>
+    <w:p>
+      <w:r>
+        <w:t>* Do NOT route Unilateral NDA if all of the following are present:</w:t>
       </w:r>
     </w:p>
     <w:p>
@@ -440,15 +376,7 @@
     </w:p>
     <w:p>
       <w:r>
-        <w:t xml:space="preserve">  * “in </w:t>
-      </w:r>
-      <w:proofErr w:type="spellStart"/>
-      <w:r>
-        <w:t>favour</w:t>
-      </w:r>
-      <w:proofErr w:type="spellEnd"/>
-      <w:r>
-        <w:t xml:space="preserve"> of and for the benefit of Client”</w:t>
+        <w:t xml:space="preserve">  * “in favour of and for the benefit of Client”</w:t>
       </w:r>
     </w:p>
     <w:p>
@@ -463,15 +391,7 @@
     </w:p>
     <w:p>
       <w:r>
-        <w:t xml:space="preserve">  * “executed a non-disclosure Undertaking in </w:t>
-      </w:r>
-      <w:proofErr w:type="spellStart"/>
-      <w:r>
-        <w:t>favour</w:t>
-      </w:r>
-      <w:proofErr w:type="spellEnd"/>
-      <w:r>
-        <w:t xml:space="preserve"> of Client”</w:t>
+        <w:t xml:space="preserve">  * “executed a non-disclosure Undertaking in favour of Client”</w:t>
       </w:r>
     </w:p>
     <w:p>
@@ -481,41 +401,17 @@
     </w:p>
     <w:p>
       <w:r>
-        <w:t xml:space="preserve">  * “Recipient executes this Undertaking in </w:t>
-      </w:r>
-      <w:proofErr w:type="spellStart"/>
-      <w:r>
-        <w:t>favour</w:t>
-      </w:r>
-      <w:proofErr w:type="spellEnd"/>
-      <w:r>
-        <w:t xml:space="preserve"> of and for the benefit of Client”; and</w:t>
-      </w:r>
-    </w:p>
-    <w:p>
-      <w:r>
-        <w:t xml:space="preserve">  * “Permitted User shall have executed a non-disclosure Undertaking in </w:t>
-      </w:r>
-      <w:proofErr w:type="spellStart"/>
-      <w:r>
-        <w:t>favour</w:t>
-      </w:r>
-      <w:proofErr w:type="spellEnd"/>
-      <w:r>
-        <w:t xml:space="preserve"> of Client”</w:t>
-      </w:r>
-    </w:p>
-    <w:p>
-      <w:r>
-        <w:t xml:space="preserve">* Do NOT route Unilateral NDA if the same extracted snippets contain </w:t>
-      </w:r>
-      <w:proofErr w:type="gramStart"/>
-      <w:r>
-        <w:t>all of</w:t>
-      </w:r>
-      <w:proofErr w:type="gramEnd"/>
-      <w:r>
-        <w:t xml:space="preserve"> the following:</w:t>
+        <w:t xml:space="preserve">  * “Recipient executes this Undertaking in favour of and for the benefit of Client”; and</w:t>
+      </w:r>
+    </w:p>
+    <w:p>
+      <w:r>
+        <w:t xml:space="preserve">  * “Permitted User shall have executed a non-disclosure Undertaking in favour of Client”</w:t>
+      </w:r>
+    </w:p>
+    <w:p>
+      <w:r>
+        <w:t>* Do NOT route Unilateral NDA if the same extracted snippets contain all of the following:</w:t>
       </w:r>
     </w:p>
     <w:p>
@@ -540,68 +436,28 @@
     </w:p>
     <w:p>
       <w:r>
-        <w:t xml:space="preserve">* Do NOT route Unilateral NDA if </w:t>
-      </w:r>
-      <w:proofErr w:type="gramStart"/>
-      <w:r>
-        <w:t>all of</w:t>
-      </w:r>
-      <w:proofErr w:type="gramEnd"/>
-      <w:r>
-        <w:t xml:space="preserve"> the following are present:</w:t>
-      </w:r>
-    </w:p>
-    <w:p>
-      <w:r>
-        <w:t xml:space="preserve">  * </w:t>
-      </w:r>
-      <w:proofErr w:type="gramStart"/>
-      <w:r>
-        <w:t>the</w:t>
-      </w:r>
-      <w:proofErr w:type="gramEnd"/>
-      <w:r>
-        <w:t xml:space="preserve"> agreement identifies one party as “Discloser”</w:t>
-      </w:r>
-    </w:p>
-    <w:p>
-      <w:r>
-        <w:t xml:space="preserve">  * </w:t>
-      </w:r>
-      <w:proofErr w:type="gramStart"/>
-      <w:r>
-        <w:t>the</w:t>
-      </w:r>
-      <w:proofErr w:type="gramEnd"/>
-      <w:r>
-        <w:t xml:space="preserve"> agreement identifies the other party as “Recipient”</w:t>
-      </w:r>
-    </w:p>
-    <w:p>
-      <w:r>
-        <w:t xml:space="preserve">  * </w:t>
-      </w:r>
-      <w:proofErr w:type="gramStart"/>
-      <w:r>
-        <w:t>the</w:t>
-      </w:r>
-      <w:proofErr w:type="gramEnd"/>
-      <w:r>
-        <w:t xml:space="preserve"> agreement references an existing “Mutual NDA”</w:t>
+        <w:t>* Do NOT route Unilateral NDA if all of the following are present:</w:t>
+      </w:r>
+    </w:p>
+    <w:p>
+      <w:r>
+        <w:t xml:space="preserve">  * the agreement identifies one party as “Discloser”</w:t>
+      </w:r>
+    </w:p>
+    <w:p>
+      <w:r>
+        <w:t xml:space="preserve">  * the agreement identifies the other party as “Recipient”</w:t>
+      </w:r>
+    </w:p>
+    <w:p>
+      <w:r>
+        <w:t xml:space="preserve">  * the agreement references an existing “Mutual NDA”</w:t>
       </w:r>
     </w:p>
     <w:p>
       <w:r>
         <w:lastRenderedPageBreak/>
-        <w:t xml:space="preserve">  * </w:t>
-      </w:r>
-      <w:proofErr w:type="gramStart"/>
-      <w:r>
-        <w:t>the</w:t>
-      </w:r>
-      <w:proofErr w:type="gramEnd"/>
-      <w:r>
-        <w:t xml:space="preserve"> agreement states that confidentiality protection is required in connection with, or in compliance with, the Mutual NDA</w:t>
+        <w:t xml:space="preserve">  * the agreement states that confidentiality protection is required in connection with, or in compliance with, the Mutual NDA</w:t>
       </w:r>
     </w:p>
     <w:p>
@@ -616,15 +472,7 @@
     </w:p>
     <w:p>
       <w:r>
-        <w:t xml:space="preserve">* If the protected information is consistently information of only one party, and the receiving obligations are imposed only on “you,” “your Representatives,” “Recipient,” or the receiving party, route Unilateral NDA unless a </w:t>
-      </w:r>
-      <w:proofErr w:type="gramStart"/>
-      <w:r>
-        <w:t>same-category</w:t>
-      </w:r>
-      <w:proofErr w:type="gramEnd"/>
-      <w:r>
-        <w:t xml:space="preserve"> Do NOT Trigger rule applies.</w:t>
+        <w:t>* If the protected information is consistently information of only one party, and the receiving obligations are imposed only on “you,” “your Representatives,” “Recipient,” or the receiving party, route Unilateral NDA unless a same-category Do NOT Trigger rule applies.</w:t>
       </w:r>
     </w:p>
     <w:p>
@@ -790,15 +638,7 @@
     </w:p>
     <w:p>
       <w:r>
-        <w:t>* “</w:t>
-      </w:r>
-      <w:proofErr w:type="spellStart"/>
-      <w:r>
-        <w:t>Vertragsstrafe</w:t>
-      </w:r>
-      <w:proofErr w:type="spellEnd"/>
-      <w:r>
-        <w:t>”</w:t>
+        <w:t>* “Vertragsstrafe”</w:t>
       </w:r>
     </w:p>
     <w:p>
@@ -935,15 +775,7 @@
     </w:p>
     <w:p>
       <w:r>
-        <w:t xml:space="preserve">Employees, contractors, consultants, Representatives, </w:t>
-      </w:r>
-      <w:proofErr w:type="spellStart"/>
-      <w:r>
-        <w:t>Authorised</w:t>
-      </w:r>
-      <w:proofErr w:type="spellEnd"/>
-      <w:r>
-        <w:t xml:space="preserve"> Persons, Authorized Persons, or other personnel of Accenture are required to:</w:t>
+        <w:t>Employees, contractors, consultants, Representatives, Authorised Persons, Authorized Persons, or other personnel of Accenture are required to:</w:t>
       </w:r>
     </w:p>
     <w:p>
@@ -954,55 +786,26 @@
     <w:p>
       <w:r>
         <w:lastRenderedPageBreak/>
+        <w:t>* sign NDAs, undertakings, acknowledgements, or similar documents directly with the counterparty; OR</w:t>
+      </w:r>
+    </w:p>
+    <w:p>
+      <w:r>
+        <w:t>* become directly bound through a separate NDA, undertaking, acknowledgement letter, written agreement, or direct counterparty-facing document; OR</w:t>
+      </w:r>
+    </w:p>
+    <w:p>
+      <w:r>
         <w:t xml:space="preserve">* </w:t>
       </w:r>
-      <w:proofErr w:type="gramStart"/>
-      <w:r>
-        <w:t>sign</w:t>
-      </w:r>
-      <w:proofErr w:type="gramEnd"/>
-      <w:r>
-        <w:t xml:space="preserve"> NDAs, undertakings, acknowledgements, or similar documents directly with the counterparty; OR</w:t>
-      </w:r>
-    </w:p>
-    <w:p>
-      <w:r>
-        <w:t xml:space="preserve">* </w:t>
-      </w:r>
-      <w:proofErr w:type="gramStart"/>
-      <w:r>
-        <w:t>become</w:t>
-      </w:r>
-      <w:proofErr w:type="gramEnd"/>
-      <w:r>
-        <w:t xml:space="preserve"> directly bound through a separate NDA, undertaking, acknowledgement letter, written agreement, or direct counterparty-facing document; OR</w:t>
-      </w:r>
-    </w:p>
-    <w:p>
-      <w:r>
-        <w:t xml:space="preserve">* </w:t>
-      </w:r>
-      <w:proofErr w:type="gramStart"/>
-      <w:r>
-        <w:t>become</w:t>
-      </w:r>
-      <w:proofErr w:type="gramEnd"/>
-      <w:r>
-        <w:t xml:space="preserve"> directly bound through a separate NDA, undertaking, acknowledgement, or written agreement with the counterparty.</w:t>
+      <w:r>
+        <w:t>become directly bound through a separate NDA, undertaking, acknowledgement, or written agreement with the counterparty.</w:t>
       </w:r>
     </w:p>
     <w:p/>
     <w:p>
       <w:r>
-        <w:t xml:space="preserve">This risk applies where the NDA creates, or appears to </w:t>
-      </w:r>
-      <w:proofErr w:type="gramStart"/>
-      <w:r>
-        <w:t>create,</w:t>
-      </w:r>
-      <w:proofErr w:type="gramEnd"/>
-      <w:r>
-        <w:t xml:space="preserve"> direct contractual-style obligations on Accenture personnel or representatives, rather than confidentiality obligations remaining solely between Accenture and the counterparty as legal entities.</w:t>
+        <w:t>This risk applies where the NDA creates, or appears to create, direct contractual-style obligations on Accenture personnel or representatives, rather than confidentiality obligations remaining solely between Accenture and the counterparty as legal entities.</w:t>
       </w:r>
     </w:p>
     <w:p>
@@ -1052,15 +855,7 @@
     </w:p>
     <w:p>
       <w:r>
-        <w:t xml:space="preserve">* “execute a non-disclosure undertaking in </w:t>
-      </w:r>
-      <w:proofErr w:type="spellStart"/>
-      <w:r>
-        <w:t>favour</w:t>
-      </w:r>
-      <w:proofErr w:type="spellEnd"/>
-      <w:r>
-        <w:t xml:space="preserve"> of Client”</w:t>
+        <w:t>* “execute a non-disclosure undertaking in favour of Client”</w:t>
       </w:r>
     </w:p>
     <w:p>
@@ -1107,15 +902,7 @@
     </w:p>
     <w:p>
       <w:r>
-        <w:t xml:space="preserve">* Personnel are bound by confidentiality obligations substantially </w:t>
-      </w:r>
-      <w:proofErr w:type="gramStart"/>
-      <w:r>
-        <w:t>similar to</w:t>
-      </w:r>
-      <w:proofErr w:type="gramEnd"/>
-      <w:r>
-        <w:t xml:space="preserve"> the NDA</w:t>
+        <w:t>* Personnel are bound by confidentiality obligations substantially similar to the NDA</w:t>
       </w:r>
     </w:p>
     <w:p>
@@ -1125,28 +912,12 @@
     </w:p>
     <w:p>
       <w:r>
-        <w:t xml:space="preserve">* Personnel are under </w:t>
-      </w:r>
-      <w:proofErr w:type="gramStart"/>
-      <w:r>
-        <w:t>a duty</w:t>
-      </w:r>
-      <w:proofErr w:type="gramEnd"/>
-      <w:r>
-        <w:t xml:space="preserve"> of non-disclosure</w:t>
-      </w:r>
-    </w:p>
-    <w:p>
-      <w:r>
-        <w:t xml:space="preserve">* Personnel are under </w:t>
-      </w:r>
-      <w:proofErr w:type="gramStart"/>
-      <w:r>
-        <w:t>a duty</w:t>
-      </w:r>
-      <w:proofErr w:type="gramEnd"/>
-      <w:r>
-        <w:t xml:space="preserve"> to maintain confidentiality, security, or integrity</w:t>
+        <w:t>* Personnel are under a duty of non-disclosure</w:t>
+      </w:r>
+    </w:p>
+    <w:p>
+      <w:r>
+        <w:t>* Personnel are under a duty to maintain confidentiality, security, or integrity</w:t>
       </w:r>
     </w:p>
     <w:p>
@@ -1207,15 +978,7 @@
     </w:p>
     <w:p>
       <w:r>
-        <w:t xml:space="preserve">* Clause contains </w:t>
-      </w:r>
-      <w:proofErr w:type="gramStart"/>
-      <w:r>
-        <w:t>all of</w:t>
-      </w:r>
-      <w:proofErr w:type="gramEnd"/>
-      <w:r>
-        <w:t xml:space="preserve"> the following:</w:t>
+        <w:t>* Clause contains all of the following:</w:t>
       </w:r>
     </w:p>
     <w:p>
@@ -1280,15 +1043,7 @@
     </w:p>
     <w:p>
       <w:r>
-        <w:t xml:space="preserve">  * “in </w:t>
-      </w:r>
-      <w:proofErr w:type="spellStart"/>
-      <w:r>
-        <w:t>favour</w:t>
-      </w:r>
-      <w:proofErr w:type="spellEnd"/>
-      <w:r>
-        <w:t xml:space="preserve"> of Client”</w:t>
+        <w:t xml:space="preserve">  * “in favour of Client”</w:t>
       </w:r>
     </w:p>
     <w:p>
@@ -1321,62 +1076,22 @@
     </w:p>
     <w:p>
       <w:r>
-        <w:t xml:space="preserve">* Do NOT route Individual NDA where Authorized Recipients, permitted recipients, representatives, personnel, employees, officers, contractors, or similar </w:t>
-      </w:r>
-      <w:proofErr w:type="gramStart"/>
-      <w:r>
-        <w:t>persons</w:t>
-      </w:r>
-      <w:proofErr w:type="gramEnd"/>
-      <w:r>
-        <w:t xml:space="preserve"> merely acknowledge, confirm, consent to, or sign at the foot / bottom / end of the same NDA or agreement, provided that:</w:t>
-      </w:r>
-    </w:p>
-    <w:p>
-      <w:r>
-        <w:t xml:space="preserve">  * </w:t>
-      </w:r>
-      <w:proofErr w:type="gramStart"/>
-      <w:r>
-        <w:t>no</w:t>
-      </w:r>
-      <w:proofErr w:type="gramEnd"/>
-      <w:r>
-        <w:t xml:space="preserve"> separate NDA, undertaking, acknowledgement letter, or written agreement is required;</w:t>
-      </w:r>
-    </w:p>
-    <w:p>
-      <w:r>
-        <w:t xml:space="preserve">  * </w:t>
-      </w:r>
-      <w:proofErr w:type="gramStart"/>
-      <w:r>
-        <w:t>no</w:t>
-      </w:r>
-      <w:proofErr w:type="gramEnd"/>
-      <w:r>
-        <w:t xml:space="preserve"> copy of a separate document must be delivered to the counterparty; and</w:t>
-      </w:r>
-    </w:p>
-    <w:p>
-      <w:r>
-        <w:t xml:space="preserve">  * </w:t>
-      </w:r>
-      <w:proofErr w:type="gramStart"/>
-      <w:r>
-        <w:t>the</w:t>
-      </w:r>
-      <w:proofErr w:type="gramEnd"/>
-      <w:r>
-        <w:t xml:space="preserve"> Receiving Party / Recipient / Provider remains responsible for those </w:t>
-      </w:r>
-      <w:proofErr w:type="gramStart"/>
-      <w:r>
-        <w:t>persons’</w:t>
-      </w:r>
-      <w:proofErr w:type="gramEnd"/>
-      <w:r>
-        <w:t xml:space="preserve"> conduct.</w:t>
+        <w:t>* Do NOT route Individual NDA where Authorized Recipients, permitted recipients, representatives, personnel, employees, officers, contractors, or similar persons merely acknowledge, confirm, consent to, or sign at the foot / bottom / end of the same NDA or agreement, provided that:</w:t>
+      </w:r>
+    </w:p>
+    <w:p>
+      <w:r>
+        <w:t xml:space="preserve">  * no separate NDA, undertaking, acknowledgement letter, or written agreement is required;</w:t>
+      </w:r>
+    </w:p>
+    <w:p>
+      <w:r>
+        <w:t xml:space="preserve">  * no copy of a separate document must be delivered to the counterparty; and</w:t>
+      </w:r>
+    </w:p>
+    <w:p>
+      <w:r>
+        <w:t xml:space="preserve">  * the Receiving Party / Recipient / Provider remains responsible for those persons’ conduct.</w:t>
       </w:r>
     </w:p>
     <w:p>
@@ -1836,80 +1551,32 @@
     </w:p>
     <w:p>
       <w:r>
-        <w:t xml:space="preserve">For </w:t>
-      </w:r>
-      <w:proofErr w:type="gramStart"/>
-      <w:r>
-        <w:t>Non-Solicitation</w:t>
-      </w:r>
-      <w:proofErr w:type="gramEnd"/>
-      <w:r>
-        <w:t xml:space="preserve"> triage only, if any Non-Solicitation Triage Signal is detected, the extracted snippet MUST include:</w:t>
-      </w:r>
-    </w:p>
-    <w:p>
-      <w:r>
-        <w:t xml:space="preserve">* </w:t>
-      </w:r>
-      <w:proofErr w:type="gramStart"/>
-      <w:r>
-        <w:t>the</w:t>
-      </w:r>
-      <w:proofErr w:type="gramEnd"/>
-      <w:r>
-        <w:t xml:space="preserve"> full sentence containing the matched Triage Signal;</w:t>
-      </w:r>
-    </w:p>
-    <w:p>
-      <w:r>
-        <w:t xml:space="preserve">* </w:t>
-      </w:r>
-      <w:proofErr w:type="gramStart"/>
-      <w:r>
-        <w:t>the</w:t>
-      </w:r>
-      <w:proofErr w:type="gramEnd"/>
-      <w:r>
-        <w:t xml:space="preserve"> immediately preceding sentence, if any;</w:t>
-      </w:r>
-    </w:p>
-    <w:p>
-      <w:r>
-        <w:t xml:space="preserve">* </w:t>
-      </w:r>
-      <w:proofErr w:type="gramStart"/>
-      <w:r>
-        <w:t>the</w:t>
-      </w:r>
-      <w:proofErr w:type="gramEnd"/>
-      <w:r>
-        <w:t xml:space="preserve"> immediately following sentence, if any; and</w:t>
-      </w:r>
-    </w:p>
-    <w:p>
-      <w:r>
-        <w:t xml:space="preserve">* </w:t>
-      </w:r>
-      <w:proofErr w:type="gramStart"/>
-      <w:r>
-        <w:t>any</w:t>
-      </w:r>
-      <w:proofErr w:type="gramEnd"/>
-      <w:r>
-        <w:t xml:space="preserve"> carve-out sentence in the same clause beginning with “However,” “Provided,” “provided, however,” “Such restrictions shall not apply,” “This shall not prohibit,” or similar carve-out wording.</w:t>
-      </w:r>
-    </w:p>
-    <w:p>
-      <w:r>
-        <w:t>* “</w:t>
-      </w:r>
-      <w:proofErr w:type="gramStart"/>
-      <w:r>
-        <w:t>However</w:t>
-      </w:r>
-      <w:proofErr w:type="gramEnd"/>
-      <w:r>
-        <w:t>”</w:t>
+        <w:t>For Non-Solicitation triage only, if any Non-Solicitation Triage Signal is detected, the extracted snippet MUST include:</w:t>
+      </w:r>
+    </w:p>
+    <w:p>
+      <w:r>
+        <w:t>* the full sentence containing the matched Triage Signal;</w:t>
+      </w:r>
+    </w:p>
+    <w:p>
+      <w:r>
+        <w:t>* the immediately preceding sentence, if any;</w:t>
+      </w:r>
+    </w:p>
+    <w:p>
+      <w:r>
+        <w:t>* the immediately following sentence, if any; and</w:t>
+      </w:r>
+    </w:p>
+    <w:p>
+      <w:r>
+        <w:t>* any carve-out sentence in the same clause beginning with “However,” “Provided,” “provided, however,” “Such restrictions shall not apply,” “This shall not prohibit,” or similar carve-out wording.</w:t>
+      </w:r>
+    </w:p>
+    <w:p>
+      <w:r>
+        <w:t>* “However”</w:t>
       </w:r>
     </w:p>
     <w:p>
@@ -1930,15 +1597,22 @@
     </w:p>
     <w:p>
       <w:r>
-        <w:t xml:space="preserve">For </w:t>
-      </w:r>
-      <w:proofErr w:type="gramStart"/>
-      <w:r>
-        <w:t>Non-Solicitation</w:t>
-      </w:r>
-      <w:proofErr w:type="gramEnd"/>
-      <w:r>
-        <w:t xml:space="preserve"> triage only, if the snippet contains “solicit for employment or engagement,” the extracted snippet MUST include any same-clause carve-out sentence containing:</w:t>
+        <w:t>For Non-Solicitation triage only, if the snippet contains either:</w:t>
+      </w:r>
+    </w:p>
+    <w:p>
+      <w:r>
+        <w:t>* “solicit for employment or engagement”; or</w:t>
+      </w:r>
+    </w:p>
+    <w:p>
+      <w:r>
+        <w:t>* “solicit personnel”</w:t>
+      </w:r>
+    </w:p>
+    <w:p>
+      <w:r>
+        <w:t>the extracted snippet MUST include any same-clause carve-out sentence containing:</w:t>
       </w:r>
     </w:p>
     <w:p>
@@ -1960,38 +1634,50 @@
       <w:r>
         <w:t>* “voluntarily seeks employment”</w:t>
       </w:r>
-      <w:r>
-        <w:br/>
+    </w:p>
+    <w:p>
+      <w:r>
         <w:t>* “own initiative”</w:t>
       </w:r>
-      <w:r>
-        <w:br/>
+    </w:p>
+    <w:p>
+      <w:r>
         <w:t>* “employment advertisements”</w:t>
       </w:r>
-      <w:r>
-        <w:br/>
+    </w:p>
+    <w:p>
+      <w:r>
         <w:t>* “newspaper”</w:t>
       </w:r>
-      <w:r>
-        <w:br/>
+    </w:p>
+    <w:p>
+      <w:r>
         <w:t>* “trade publication”</w:t>
       </w:r>
-      <w:r>
-        <w:br/>
+    </w:p>
+    <w:p>
+      <w:r>
         <w:t>* “public commercial media”</w:t>
       </w:r>
     </w:p>
     <w:p>
       <w:r>
-        <w:t xml:space="preserve">If the carve-out sentence is not included in the extracted snippet, DO NOT finalize routing for </w:t>
-      </w:r>
-      <w:proofErr w:type="gramStart"/>
-      <w:r>
-        <w:t>Non-Solicitation</w:t>
-      </w:r>
-      <w:proofErr w:type="gramEnd"/>
-      <w:r>
-        <w:t xml:space="preserve"> until the full clause-level snippet has been captured.</w:t>
+        <w:t>* “general advertisement”</w:t>
+      </w:r>
+    </w:p>
+    <w:p>
+      <w:r>
+        <w:t>* “unsolicited applicants”</w:t>
+      </w:r>
+    </w:p>
+    <w:p>
+      <w:r>
+        <w:t>If the carve-out sentence is not included in the extracted snippet, DO NOT finalize routing for Non-Solicitation until the full clause-level snippet has been captured.</w:t>
+      </w:r>
+    </w:p>
+    <w:p>
+      <w:r>
+        <w:t>* For Non-Solicitation triage, capture any duration language contained in the same clause or expressly incorporated by that clause. Do not use a separate general agreement-term provision to suppress routing unless the Non-Solicitation clause expressly refers to it.</w:t>
       </w:r>
     </w:p>
     <w:p>
@@ -2016,6 +1702,7 @@
     </w:p>
     <w:p>
       <w:r>
+        <w:lastRenderedPageBreak/>
         <w:t>* “solicit employees”</w:t>
       </w:r>
     </w:p>
@@ -2056,102 +1743,97 @@
     </w:p>
     <w:p>
       <w:r>
+        <w:t>* “employ, hire, or engage”</w:t>
+      </w:r>
+    </w:p>
+    <w:p>
+      <w:r>
+        <w:t>* “consultant of the Disclosing Party”</w:t>
+      </w:r>
+    </w:p>
+    <w:p>
+      <w:r>
+        <w:t>* “employee of the Disclosing Party”</w:t>
+      </w:r>
+    </w:p>
+    <w:p>
+      <w:r>
+        <w:t>* “other party’s personnel”</w:t>
+      </w:r>
+    </w:p>
+    <w:p>
+      <w:r>
+        <w:t>* “other party’s staff”</w:t>
+      </w:r>
+    </w:p>
+    <w:p>
+      <w:r>
+        <w:t>* “induce any employee to leave”</w:t>
+      </w:r>
+    </w:p>
+    <w:p>
+      <w:r>
+        <w:t>* “persuade any employee to leave”</w:t>
+      </w:r>
+    </w:p>
+    <w:p>
+      <w:r>
+        <w:t>* “encourage any employee to leave”</w:t>
+      </w:r>
+    </w:p>
+    <w:p>
+      <w:r>
+        <w:t>* “entice away”</w:t>
+      </w:r>
+    </w:p>
+    <w:p>
+      <w:r>
+        <w:t>* “Restricted Person”</w:t>
+      </w:r>
+    </w:p>
+    <w:p>
+      <w:r>
+        <w:t>* “solicit, engage, employ”</w:t>
+      </w:r>
+    </w:p>
+    <w:p>
+      <w:r>
+        <w:t>* “contractor of the other party”</w:t>
+      </w:r>
+    </w:p>
+    <w:p>
+      <w:r>
+        <w:t>* “consultant of the other party”</w:t>
+      </w:r>
+    </w:p>
+    <w:p>
+      <w:r>
+        <w:t>* “director, officer and/or employee”</w:t>
+      </w:r>
+    </w:p>
+    <w:p>
+      <w:r>
+        <w:t>* “employee or independent contractor”</w:t>
+      </w:r>
+    </w:p>
+    <w:p>
+      <w:r>
+        <w:t>* “solicit personnel”</w:t>
+      </w:r>
+    </w:p>
+    <w:p>
+      <w:r>
+        <w:t>* “solicit personnel of the other party”</w:t>
+      </w:r>
+    </w:p>
+    <w:p>
+      <w:r>
+        <w:t>* “inducing them to join such other party’s employ”</w:t>
+      </w:r>
+    </w:p>
+    <w:p>
+      <w:r>
         <w:lastRenderedPageBreak/>
-        <w:t>* “employ, hire, or engage”</w:t>
-      </w:r>
-    </w:p>
-    <w:p>
-      <w:r>
-        <w:t>* “consultant of the Disclosing Party”</w:t>
-      </w:r>
-    </w:p>
-    <w:p>
-      <w:r>
-        <w:t>* “employee of the Disclosing Party”</w:t>
-      </w:r>
-    </w:p>
-    <w:p>
-      <w:r>
-        <w:t>* “other party’s personnel”</w:t>
-      </w:r>
-    </w:p>
-    <w:p>
-      <w:r>
-        <w:t>* “other party’s staff”</w:t>
-      </w:r>
-    </w:p>
-    <w:p>
-      <w:r>
-        <w:t>* “induce any employee to leave”</w:t>
-      </w:r>
-    </w:p>
-    <w:p>
-      <w:r>
-        <w:t>* “persuade any employee to leave”</w:t>
-      </w:r>
-    </w:p>
-    <w:p>
-      <w:r>
-        <w:t>* “encourage any employee to leave”</w:t>
-      </w:r>
-    </w:p>
-    <w:p>
-      <w:r>
-        <w:t>* “entice away”</w:t>
-      </w:r>
-    </w:p>
-    <w:p>
-      <w:r>
-        <w:t>* “Restricted Person”</w:t>
-      </w:r>
-    </w:p>
-    <w:p>
-      <w:r>
-        <w:t>* “solicit, engage, employ”</w:t>
-      </w:r>
-    </w:p>
-    <w:p>
-      <w:r>
-        <w:t>* “contractor of the other party”</w:t>
-      </w:r>
-    </w:p>
-    <w:p>
-      <w:r>
-        <w:t>* “consultant of the other party”</w:t>
-      </w:r>
-    </w:p>
-    <w:p>
-      <w:r>
-        <w:t>* “director, officer and/or employee”</w:t>
-      </w:r>
-    </w:p>
-    <w:p>
-      <w:r>
-        <w:t>* “employee or independent contractor”</w:t>
-      </w:r>
-    </w:p>
-    <w:p>
-      <w:r>
-        <w:t>* “solicit personnel”</w:t>
-      </w:r>
-    </w:p>
-    <w:p>
-      <w:r>
-        <w:t>* “solicit personnel of the other party”</w:t>
-      </w:r>
-    </w:p>
-    <w:p>
-      <w:r>
-        <w:t>* “personnel of the other party”</w:t>
-      </w:r>
-    </w:p>
-    <w:p>
-      <w:r>
-        <w:t>* “inducing them to join such other party’s employ”</w:t>
-      </w:r>
-    </w:p>
-    <w:p>
-      <w:r>
         <w:t>* Clause contains BOTH:</w:t>
       </w:r>
     </w:p>
@@ -2182,31 +1864,356 @@
     </w:p>
     <w:p>
       <w:r>
-        <w:t xml:space="preserve">* Clause contains </w:t>
-      </w:r>
-      <w:proofErr w:type="gramStart"/>
-      <w:r>
-        <w:t>ALL of</w:t>
-      </w:r>
-      <w:proofErr w:type="gramEnd"/>
-      <w:r>
-        <w:t xml:space="preserve"> the following:</w:t>
+        <w:t>* Clause contains ALL of the following:</w:t>
+      </w:r>
+    </w:p>
+    <w:p>
+      <w:r>
+        <w:t xml:space="preserve">  * “solicit personnel”</w:t>
+      </w:r>
+    </w:p>
+    <w:p>
+      <w:r>
+        <w:t xml:space="preserve">  * “engaged in the work contemplated”</w:t>
+      </w:r>
+    </w:p>
+    <w:p>
+      <w:r>
+        <w:t xml:space="preserve">  * “join such other party’s employ”</w:t>
+      </w:r>
+    </w:p>
+    <w:p>
+      <w:r>
+        <w:t xml:space="preserve"> </w:t>
+      </w:r>
+    </w:p>
+    <w:p>
+      <w:r>
+        <w:t>## Do NOT Trigger</w:t>
+      </w:r>
+    </w:p>
+    <w:p>
+      <w:r>
+        <w:t>* Customer-only solicitation restrictions</w:t>
+      </w:r>
+    </w:p>
+    <w:p>
+      <w:r>
+        <w:t>* Vendor-only solicitation restrictions</w:t>
+      </w:r>
+    </w:p>
+    <w:p>
+      <w:r>
+        <w:t>* Supplier-only solicitation restrictions</w:t>
+      </w:r>
+    </w:p>
+    <w:p>
+      <w:r>
+        <w:t>* Restrictions limited to not interfering with business relationships without employee hiring or solicitation restrictions</w:t>
+      </w:r>
+    </w:p>
+    <w:p>
+      <w:r>
+        <w:t>* Restrictions limited to prospects or clients only</w:t>
+      </w:r>
+    </w:p>
+    <w:p>
+      <w:r>
+        <w:t>* Mutual non-solicitation clause is limited to employees/personnel, includes standard recruitment carve-outs, applies equally to both Parties, and expressly states within the same clause that the non-solicitation restriction lasts 24 months or less</w:t>
+      </w:r>
+    </w:p>
+    <w:p>
+      <w:r>
+        <w:t>* Clause contains both “advertisements in the media” and “own initiative”</w:t>
+      </w:r>
+    </w:p>
+    <w:p>
+      <w:r>
+        <w:t>* Clause contains both “general advertisement” and “unsolicited contact”</w:t>
+      </w:r>
+    </w:p>
+    <w:p>
+      <w:r>
+        <w:t>* Clause contains both “generalized solicitations” and “not specifically targeted”</w:t>
+      </w:r>
+    </w:p>
+    <w:p>
+      <w:r>
+        <w:t>* Clause contains both “public job postings” and “unsolicited applicants”</w:t>
+      </w:r>
+    </w:p>
+    <w:p>
+      <w:r>
+        <w:t>* Clause contains both “bona fide recruitment advertisement” and “employment agency”</w:t>
       </w:r>
     </w:p>
     <w:p>
       <w:r>
         <w:lastRenderedPageBreak/>
-        <w:t xml:space="preserve">  * “solicit personnel”</w:t>
-      </w:r>
-    </w:p>
-    <w:p>
-      <w:r>
-        <w:t xml:space="preserve">  * “engaged in the work contemplated”</w:t>
-      </w:r>
-    </w:p>
-    <w:p>
-      <w:r>
-        <w:t xml:space="preserve">  * “join such other party’s employ”</w:t>
+        <w:t>* Clause contains both “application for employment submitted on an unsolicited basis” and “general advertisement”</w:t>
+      </w:r>
+    </w:p>
+    <w:p>
+      <w:r>
+        <w:t>* Clause is acceptable employee non-solicitation language under the playbook and does not contain a liquidated damages, non-compete, or country supplement trigger</w:t>
+      </w:r>
+    </w:p>
+    <w:p>
+      <w:r>
+        <w:t>* Clause contains all of the following:</w:t>
+      </w:r>
+    </w:p>
+    <w:p>
+      <w:r>
+        <w:t xml:space="preserve">  * “during the term of this Agreement”</w:t>
+      </w:r>
+    </w:p>
+    <w:p>
+      <w:r>
+        <w:t xml:space="preserve">  * “actively seeks employment”</w:t>
+      </w:r>
+    </w:p>
+    <w:p>
+      <w:r>
+        <w:t xml:space="preserve">  * “general advertisement”</w:t>
+      </w:r>
+    </w:p>
+    <w:p>
+      <w:r>
+        <w:t xml:space="preserve">  * “without direct solicitation”</w:t>
+      </w:r>
+    </w:p>
+    <w:p>
+      <w:r>
+        <w:t>* Clause contains all of the following:</w:t>
+      </w:r>
+    </w:p>
+    <w:p>
+      <w:r>
+        <w:t xml:space="preserve">  * “Both Parties agree not to solicit”</w:t>
+      </w:r>
+    </w:p>
+    <w:p>
+      <w:r>
+        <w:t xml:space="preserve">  * “employee or independent contractor of the other Party”</w:t>
+      </w:r>
+    </w:p>
+    <w:p>
+      <w:r>
+        <w:t xml:space="preserve">  * “actively seeks employment”</w:t>
+      </w:r>
+    </w:p>
+    <w:p>
+      <w:r>
+        <w:t xml:space="preserve">  * “general advertisement”</w:t>
+      </w:r>
+    </w:p>
+    <w:p>
+      <w:r>
+        <w:t>* Clause contains all of the following:</w:t>
+      </w:r>
+    </w:p>
+    <w:p>
+      <w:r>
+        <w:t xml:space="preserve">  * “not to solicit any employee or independent contractor”</w:t>
+      </w:r>
+    </w:p>
+    <w:p>
+      <w:r>
+        <w:t xml:space="preserve">  * “during the term of this Agreement”</w:t>
+      </w:r>
+    </w:p>
+    <w:p>
+      <w:r>
+        <w:t xml:space="preserve">  * “Such restrictions shall not apply”</w:t>
+      </w:r>
+    </w:p>
+    <w:p>
+      <w:r>
+        <w:t xml:space="preserve">  * “without direct solicitation”</w:t>
+      </w:r>
+    </w:p>
+    <w:p>
+      <w:r>
+        <w:t>* Clause contains all of the following:</w:t>
+      </w:r>
+    </w:p>
+    <w:p>
+      <w:r>
+        <w:t xml:space="preserve">  * “employee or independent contractor of either Party actively seeks employment”</w:t>
+      </w:r>
+    </w:p>
+    <w:p>
+      <w:r>
+        <w:t xml:space="preserve">  * “whether in response to a general advertisement or otherwise”</w:t>
+      </w:r>
+    </w:p>
+    <w:p>
+      <w:r>
+        <w:t xml:space="preserve">  * “without direct solicitation by such employing Party”</w:t>
+      </w:r>
+    </w:p>
+    <w:p>
+      <w:r>
+        <w:t>* Clause contains all of the following:</w:t>
+      </w:r>
+    </w:p>
+    <w:p>
+      <w:r>
+        <w:t xml:space="preserve">  * “on behalf of any other business enterprise”</w:t>
+      </w:r>
+    </w:p>
+    <w:p>
+      <w:r>
+        <w:t xml:space="preserve">  * “during the term of this Agreement”</w:t>
+      </w:r>
+    </w:p>
+    <w:p>
+      <w:r>
+        <w:t xml:space="preserve">  * “general advertisement”</w:t>
+      </w:r>
+    </w:p>
+    <w:p>
+      <w:r>
+        <w:lastRenderedPageBreak/>
+        <w:t xml:space="preserve">  * “without direct solicitation”</w:t>
+      </w:r>
+    </w:p>
+    <w:p>
+      <w:r>
+        <w:t>* Do NOT route Non-Solicitation if the only matched non-solicitation language is a mutual employee or independent contractor restriction and the same clause contains:</w:t>
+      </w:r>
+    </w:p>
+    <w:p>
+      <w:r>
+        <w:t xml:space="preserve">  * “during the term of this Agreement”</w:t>
+      </w:r>
+    </w:p>
+    <w:p>
+      <w:r>
+        <w:t xml:space="preserve">  * “Such restrictions shall not apply”</w:t>
+      </w:r>
+    </w:p>
+    <w:p>
+      <w:r>
+        <w:t xml:space="preserve">  * “actively seeks employment”</w:t>
+      </w:r>
+    </w:p>
+    <w:p>
+      <w:r>
+        <w:t xml:space="preserve">  * “general advertisement”</w:t>
+      </w:r>
+    </w:p>
+    <w:p>
+      <w:r>
+        <w:t xml:space="preserve">  * “without direct solicitation”</w:t>
+      </w:r>
+    </w:p>
+    <w:p>
+      <w:r>
+        <w:t>* Do NOT route Non-Solicitation if the same Non-Solicitation clause contains BOTH:</w:t>
+      </w:r>
+    </w:p>
+    <w:p>
+      <w:r>
+        <w:t xml:space="preserve">  * “advertisements in the media”</w:t>
+      </w:r>
+    </w:p>
+    <w:p>
+      <w:r>
+        <w:t xml:space="preserve">  * “own initiative”</w:t>
+      </w:r>
+    </w:p>
+    <w:p>
+      <w:r>
+        <w:t>* Do NOT route Non-Solicitation if the clause is limited to officers only and contains standard public-recruitment carve-outs.</w:t>
+      </w:r>
+    </w:p>
+    <w:p>
+      <w:r>
+        <w:t>* Clause contains all of the following:</w:t>
+      </w:r>
+    </w:p>
+    <w:p>
+      <w:r>
+        <w:t xml:space="preserve">  * “any officer of the Company”</w:t>
+      </w:r>
+    </w:p>
+    <w:p>
+      <w:r>
+        <w:t xml:space="preserve">  * “generalized searches for employees”</w:t>
+      </w:r>
+    </w:p>
+    <w:p>
+      <w:r>
+        <w:t xml:space="preserve">  * “bona fide public advertisements in the media”</w:t>
+      </w:r>
+    </w:p>
+    <w:p>
+      <w:r>
+        <w:t xml:space="preserve">  * “not targeted specifically at employees of the Company”</w:t>
+      </w:r>
+    </w:p>
+    <w:p>
+      <w:r>
+        <w:t>* Clause contains all of the following:</w:t>
+      </w:r>
+    </w:p>
+    <w:p>
+      <w:r>
+        <w:t xml:space="preserve">  * “solicitation of any such person”</w:t>
+      </w:r>
+    </w:p>
+    <w:p>
+      <w:r>
+        <w:t xml:space="preserve">  * “generalized searches for employees”</w:t>
+      </w:r>
+    </w:p>
+    <w:p>
+      <w:r>
+        <w:t xml:space="preserve">  * “bona fide public advertisements in the media”</w:t>
+      </w:r>
+    </w:p>
+    <w:p>
+      <w:r>
+        <w:t xml:space="preserve">  * “not targeted specifically”</w:t>
+      </w:r>
+    </w:p>
+    <w:p>
+      <w:r>
+        <w:t>* Clause contains all of the following:</w:t>
+      </w:r>
+    </w:p>
+    <w:p>
+      <w:r>
+        <w:t xml:space="preserve">  * “employ or engage, or solicit for employment or engagement”</w:t>
+      </w:r>
+    </w:p>
+    <w:p>
+      <w:r>
+        <w:t xml:space="preserve">  * “any officer of the Company”</w:t>
+      </w:r>
+    </w:p>
+    <w:p>
+      <w:r>
+        <w:t xml:space="preserve">  * “bona fide public advertisements in the media”</w:t>
+      </w:r>
+    </w:p>
+    <w:p>
+      <w:r>
+        <w:lastRenderedPageBreak/>
+        <w:t xml:space="preserve">  * “not targeted specifically”</w:t>
+      </w:r>
+    </w:p>
+    <w:p>
+      <w:r>
+        <w:t>* Do NOT infer the duration of a Non-Solicitation restriction from the general term, expiration, or termination provision of the Agreement unless the Non-Solicitation clause expressly states that it applies only during that term or expressly cross-references that provision.</w:t>
+      </w:r>
+    </w:p>
+    <w:p/>
+    <w:p>
+      <w:r>
+        <w:t>* If the Non-Solicitation clause does not contain an express duration and does not expressly incorporate the Agreement term, the “24 months or less” Do NOT Trigger rule does not apply.</w:t>
       </w:r>
     </w:p>
     <w:p>
@@ -2216,423 +2223,417 @@
     </w:p>
     <w:p>
       <w:r>
+        <w:t>## Country Supplement Override</w:t>
+      </w:r>
+    </w:p>
+    <w:p>
+      <w:r>
+        <w:t>* If the NDA is connected to the Nordics Market Unit and contains any non-solicitation clause, route to Non-Solicitation even if standard carve-outs are present.</w:t>
+      </w:r>
+    </w:p>
+    <w:p>
+      <w:r>
+        <w:t>* Nordics non-solicitation must be routed because the playbook states it should be removed in all cases.</w:t>
+      </w:r>
+    </w:p>
+    <w:p>
+      <w:r>
+        <w:t># 6. Non-Compete / Exclusivity</w:t>
+      </w:r>
+    </w:p>
+    <w:p>
+      <w:r>
+        <w:t>Type: STRATEGIC / COMMERCIAL</w:t>
+      </w:r>
+    </w:p>
+    <w:p>
+      <w:r>
+        <w:t>## Definition</w:t>
+      </w:r>
+    </w:p>
+    <w:p>
+      <w:r>
+        <w:t>Restricts competitive business activities, market participation, provision of services to third parties, provision of services to competitors or other clients, exclusive dealing, pursuit of business opportunities, or engagement with competing enterprises.</w:t>
+      </w:r>
+    </w:p>
+    <w:p>
+      <w:r>
+        <w:t>This risk applies where the NDA clearly limits Accenture’s ability to compete, serve other clients, work with competitors, pursue future business, participate in a market, or conduct business independently.</w:t>
+      </w:r>
+    </w:p>
+    <w:p>
+      <w:r>
+        <w:t>This risk also includes obligations requiring Accenture to disclose, notify, indicate, or report existing or potential work, contracts, consulting relationships, or service relationships with competitors of the client where the obligation is tied to competitor status and may constrain Accenture’s ability to serve other clients or competitors.</w:t>
+      </w:r>
+    </w:p>
+    <w:p>
+      <w:r>
+        <w:t xml:space="preserve"> </w:t>
+      </w:r>
+    </w:p>
+    <w:p>
+      <w:r>
+        <w:t>## Triage Signals</w:t>
+      </w:r>
+    </w:p>
+    <w:p>
+      <w:r>
+        <w:lastRenderedPageBreak/>
+        <w:t>* “non-compete”</w:t>
+      </w:r>
+    </w:p>
+    <w:p>
+      <w:r>
+        <w:t>* “non-competition”</w:t>
+      </w:r>
+    </w:p>
+    <w:p>
+      <w:r>
+        <w:t>* “exclusive” or “exclusivity”</w:t>
+      </w:r>
+    </w:p>
+    <w:p>
+      <w:r>
+        <w:t>* “exclusive basis”</w:t>
+      </w:r>
+    </w:p>
+    <w:p>
+      <w:r>
+        <w:t>* “competition restriction”</w:t>
+      </w:r>
+    </w:p>
+    <w:p>
+      <w:r>
+        <w:t>* “restrict services” to third parties</w:t>
+      </w:r>
+    </w:p>
+    <w:p>
+      <w:r>
+        <w:t>* “cannot provide services” to competitors or other clients</w:t>
+      </w:r>
+    </w:p>
+    <w:p>
+      <w:r>
+        <w:t>* “shall not provide services” to competitors or other clients</w:t>
+      </w:r>
+    </w:p>
+    <w:p>
+      <w:r>
+        <w:t>* “shall not enter into direct competition”</w:t>
+      </w:r>
+    </w:p>
+    <w:p>
+      <w:r>
+        <w:t>* “not to enter into direct competition”</w:t>
+      </w:r>
+    </w:p>
+    <w:p>
+      <w:r>
+        <w:t>* “Client Competitor”</w:t>
+      </w:r>
+    </w:p>
+    <w:p>
+      <w:r>
+        <w:t>* “competitor” or “competing enterprise” in a clause restricting business activity</w:t>
+      </w:r>
+    </w:p>
+    <w:p>
+      <w:r>
+        <w:t>* “like industry” in a clause restricting business activity</w:t>
+      </w:r>
+    </w:p>
+    <w:p>
+      <w:r>
+        <w:t>* “offer identical or like services”</w:t>
+      </w:r>
+    </w:p>
+    <w:p>
+      <w:r>
+        <w:t>* “competitive disadvantage”</w:t>
+      </w:r>
+    </w:p>
+    <w:p>
+      <w:r>
+        <w:t>* “causing any competition”</w:t>
+      </w:r>
+    </w:p>
+    <w:p>
+      <w:r>
+        <w:t>* “deal with one another on an exclusive basis”</w:t>
+      </w:r>
+    </w:p>
+    <w:p>
+      <w:r>
+        <w:t>* “restricts future services”</w:t>
+      </w:r>
+    </w:p>
+    <w:p>
+      <w:r>
+        <w:t>* “provide future services” to other clients is restricted</w:t>
+      </w:r>
+    </w:p>
+    <w:p>
+      <w:r>
+        <w:t>* “pursuing business opportunities” is restricted</w:t>
+      </w:r>
+    </w:p>
+    <w:p>
+      <w:r>
+        <w:t>* “refrain from entering into any new business relationship”</w:t>
+      </w:r>
+    </w:p>
+    <w:p>
+      <w:r>
+        <w:t>* “not directly or indirectly contact, or negotiate with, a third party regarding a potential business relationship”</w:t>
+      </w:r>
+    </w:p>
+    <w:p>
+      <w:r>
+        <w:t>* “persuade any customer” to cease, reduce, or discontinue business</w:t>
+      </w:r>
+    </w:p>
+    <w:p>
+      <w:r>
+        <w:t>* “induce any customer” to cease, reduce, or discontinue business</w:t>
+      </w:r>
+    </w:p>
+    <w:p>
+      <w:r>
+        <w:t>* “persuade any vendor” to cease, reduce, or discontinue business</w:t>
+      </w:r>
+    </w:p>
+    <w:p>
+      <w:r>
+        <w:lastRenderedPageBreak/>
+        <w:t>* “induce any vendor” to cease, reduce, or discontinue business</w:t>
+      </w:r>
+    </w:p>
+    <w:p>
+      <w:r>
+        <w:t>* “cease purchasing goods or services”</w:t>
+      </w:r>
+    </w:p>
+    <w:p>
+      <w:r>
+        <w:t>* “cease selling goods and services”</w:t>
+      </w:r>
+    </w:p>
+    <w:p>
+      <w:r>
+        <w:t>* “reduce or discontinue any business relationship”</w:t>
+      </w:r>
+    </w:p>
+    <w:p>
+      <w:r>
+        <w:t>* “prevented or restricted from performing services”</w:t>
+      </w:r>
+    </w:p>
+    <w:p>
+      <w:r>
+        <w:t>* “prevented or restricted from pursuing business opportunities”</w:t>
+      </w:r>
+    </w:p>
+    <w:p>
+      <w:r>
+        <w:t>* “direct competitor of the Client”</w:t>
+      </w:r>
+    </w:p>
+    <w:p>
+      <w:r>
+        <w:t>* “contracted to, working for, or consulting for”</w:t>
+      </w:r>
+    </w:p>
+    <w:p>
+      <w:r>
+        <w:t>* “working for, or consulting for any company which is a direct competitor”</w:t>
+      </w:r>
+    </w:p>
+    <w:p>
+      <w:r>
+        <w:t>* “indicate to you immediately” combined with “direct competitor”</w:t>
+      </w:r>
+    </w:p>
+    <w:p>
+      <w:r>
+        <w:t>* “notify” or “indicate” combined with “direct competitor of the Client”</w:t>
+      </w:r>
+    </w:p>
+    <w:p>
+      <w:r>
+        <w:t>* “disclose” or “report” combined with “working for” and “direct competitor”</w:t>
+      </w:r>
+    </w:p>
+    <w:p>
+      <w:r>
+        <w:t>* Clause contains BOTH:</w:t>
+      </w:r>
+    </w:p>
+    <w:p>
+      <w:r>
+        <w:t xml:space="preserve">  * “direct competitor of the Client”</w:t>
+      </w:r>
+    </w:p>
+    <w:p>
+      <w:r>
+        <w:t xml:space="preserve">  * “contracted to, working for, or consulting for”</w:t>
+      </w:r>
+    </w:p>
+    <w:p>
+      <w:r>
+        <w:t>* Clause contains BOTH:</w:t>
+      </w:r>
+    </w:p>
+    <w:p>
+      <w:r>
+        <w:t xml:space="preserve">  * “direct competitor”</w:t>
+      </w:r>
+    </w:p>
+    <w:p>
+      <w:r>
+        <w:t xml:space="preserve">  * “working for, or consulting for”</w:t>
+      </w:r>
+    </w:p>
+    <w:p>
+      <w:r>
+        <w:t>* Clause contains ALL of the following:</w:t>
+      </w:r>
+    </w:p>
+    <w:p>
+      <w:r>
+        <w:t xml:space="preserve">  * “indicate”</w:t>
+      </w:r>
+    </w:p>
+    <w:p>
+      <w:r>
+        <w:t xml:space="preserve">  * “working for”</w:t>
+      </w:r>
+    </w:p>
+    <w:p>
+      <w:r>
+        <w:t xml:space="preserve">  * “consulting for”</w:t>
+      </w:r>
+    </w:p>
+    <w:p>
+      <w:r>
+        <w:t xml:space="preserve">  * “direct competitor”</w:t>
+      </w:r>
+    </w:p>
+    <w:p>
+      <w:r>
+        <w:t xml:space="preserve"> </w:t>
+      </w:r>
+    </w:p>
+    <w:p>
+      <w:r>
         <w:t>## Do NOT Trigger</w:t>
       </w:r>
     </w:p>
     <w:p>
       <w:r>
-        <w:t>* Customer-only solicitation restrictions</w:t>
-      </w:r>
-    </w:p>
-    <w:p>
-      <w:r>
-        <w:t>* Vendor-only solicitation restrictions</w:t>
-      </w:r>
-    </w:p>
-    <w:p>
-      <w:r>
-        <w:t>* Supplier-only solicitation restrictions</w:t>
-      </w:r>
-    </w:p>
-    <w:p>
-      <w:r>
-        <w:t>* Restrictions limited to not interfering with business relationships without employee hiring or solicitation restrictions</w:t>
-      </w:r>
-    </w:p>
-    <w:p>
-      <w:r>
-        <w:t>* Restrictions limited to prospects or clients only</w:t>
-      </w:r>
-    </w:p>
-    <w:p>
-      <w:r>
-        <w:t>* Mutual non-solicitation clause is limited to employees/personnel, includes standard recruitment carve-outs, applies equally to both Parties, and duration is 24 months or less</w:t>
-      </w:r>
-    </w:p>
-    <w:p>
-      <w:r>
-        <w:t>* Clause contains both “advertisements in the media” and “own initiative”</w:t>
-      </w:r>
-    </w:p>
-    <w:p>
-      <w:r>
-        <w:t>* Clause contains both “general advertisement” and “unsolicited contact”</w:t>
-      </w:r>
-    </w:p>
-    <w:p>
-      <w:r>
-        <w:t>* Clause contains both “generalized solicitations” and “not specifically targeted”</w:t>
-      </w:r>
-    </w:p>
-    <w:p>
-      <w:r>
-        <w:t>* Clause contains both “public job postings” and “unsolicited applicants”</w:t>
-      </w:r>
-    </w:p>
-    <w:p>
-      <w:r>
-        <w:t>* Clause contains both “bona fide recruitment advertisement” and “employment agency”</w:t>
-      </w:r>
-    </w:p>
-    <w:p>
-      <w:r>
-        <w:t>* Clause contains both “application for employment submitted on an unsolicited basis” and “general advertisement”</w:t>
-      </w:r>
-    </w:p>
-    <w:p>
-      <w:r>
-        <w:t xml:space="preserve">* Clause is acceptable employee non-solicitation language under the playbook and does not contain a </w:t>
-      </w:r>
-      <w:proofErr w:type="gramStart"/>
-      <w:r>
-        <w:t>liquidated damages</w:t>
-      </w:r>
-      <w:proofErr w:type="gramEnd"/>
-      <w:r>
-        <w:t>, non-compete, or country supplement trigger</w:t>
-      </w:r>
-    </w:p>
-    <w:p>
-      <w:r>
-        <w:t xml:space="preserve">* Clause contains </w:t>
-      </w:r>
-      <w:proofErr w:type="gramStart"/>
-      <w:r>
-        <w:t>all of</w:t>
-      </w:r>
-      <w:proofErr w:type="gramEnd"/>
-      <w:r>
-        <w:t xml:space="preserve"> the following:</w:t>
-      </w:r>
-    </w:p>
-    <w:p>
-      <w:r>
-        <w:t xml:space="preserve">  * “during the term of this Agreement”</w:t>
-      </w:r>
-    </w:p>
-    <w:p>
-      <w:r>
-        <w:t xml:space="preserve">  * “actively seeks employment”</w:t>
-      </w:r>
-    </w:p>
-    <w:p>
-      <w:r>
-        <w:t xml:space="preserve">  * “general advertisement”</w:t>
-      </w:r>
-    </w:p>
-    <w:p>
-      <w:r>
-        <w:t xml:space="preserve">  * “without direct solicitation”</w:t>
+        <w:t>* Restrictions solely prevent misuse of confidential information for competitive purposes</w:t>
       </w:r>
     </w:p>
     <w:p>
       <w:r>
         <w:lastRenderedPageBreak/>
-        <w:t xml:space="preserve">* Clause contains </w:t>
-      </w:r>
-      <w:proofErr w:type="gramStart"/>
-      <w:r>
-        <w:t>all of</w:t>
-      </w:r>
-      <w:proofErr w:type="gramEnd"/>
-      <w:r>
-        <w:t xml:space="preserve"> the following:</w:t>
-      </w:r>
-    </w:p>
-    <w:p>
-      <w:r>
-        <w:t xml:space="preserve">  * “Both Parties agree not to solicit”</w:t>
-      </w:r>
-    </w:p>
-    <w:p>
-      <w:r>
-        <w:t xml:space="preserve">  * “employee or independent contractor of the other Party”</w:t>
-      </w:r>
-    </w:p>
-    <w:p>
-      <w:r>
-        <w:t xml:space="preserve">  * “actively seeks employment”</w:t>
-      </w:r>
-    </w:p>
-    <w:p>
-      <w:r>
-        <w:t xml:space="preserve">  * “general advertisement”</w:t>
-      </w:r>
-    </w:p>
-    <w:p>
-      <w:r>
-        <w:t xml:space="preserve">* Clause contains </w:t>
-      </w:r>
-      <w:proofErr w:type="gramStart"/>
-      <w:r>
-        <w:t>all of</w:t>
-      </w:r>
-      <w:proofErr w:type="gramEnd"/>
-      <w:r>
-        <w:t xml:space="preserve"> the following:</w:t>
-      </w:r>
-    </w:p>
-    <w:p>
-      <w:r>
-        <w:t xml:space="preserve">  * “not to solicit any employee or independent contractor”</w:t>
-      </w:r>
-    </w:p>
-    <w:p>
-      <w:r>
-        <w:t xml:space="preserve">  * “during the term of this Agreement”</w:t>
-      </w:r>
-    </w:p>
-    <w:p>
-      <w:r>
-        <w:t xml:space="preserve">  * “Such restrictions shall not apply”</w:t>
-      </w:r>
-    </w:p>
-    <w:p>
-      <w:r>
-        <w:t xml:space="preserve">  * “without direct solicitation”</w:t>
-      </w:r>
-    </w:p>
-    <w:p>
-      <w:r>
-        <w:t xml:space="preserve">* Clause contains </w:t>
-      </w:r>
-      <w:proofErr w:type="gramStart"/>
-      <w:r>
-        <w:t>all of</w:t>
-      </w:r>
-      <w:proofErr w:type="gramEnd"/>
-      <w:r>
-        <w:t xml:space="preserve"> the following:</w:t>
-      </w:r>
-    </w:p>
-    <w:p>
-      <w:r>
-        <w:t xml:space="preserve">  * “employee or independent contractor of either Party actively seeks employment”</w:t>
-      </w:r>
-    </w:p>
-    <w:p>
-      <w:r>
-        <w:t xml:space="preserve">  * “whether in response to a general advertisement or otherwise”</w:t>
-      </w:r>
-    </w:p>
-    <w:p>
-      <w:r>
-        <w:t xml:space="preserve">  * “without direct solicitation by such employing Party”</w:t>
-      </w:r>
-    </w:p>
-    <w:p>
-      <w:r>
-        <w:t xml:space="preserve">* Clause contains </w:t>
-      </w:r>
-      <w:proofErr w:type="gramStart"/>
-      <w:r>
-        <w:t>all of</w:t>
-      </w:r>
-      <w:proofErr w:type="gramEnd"/>
-      <w:r>
-        <w:t xml:space="preserve"> the following:</w:t>
-      </w:r>
-    </w:p>
-    <w:p>
-      <w:r>
-        <w:t xml:space="preserve">  * “on behalf of any other business enterprise”</w:t>
-      </w:r>
-    </w:p>
-    <w:p>
-      <w:r>
-        <w:t xml:space="preserve">  * “during the term of this Agreement”</w:t>
-      </w:r>
-    </w:p>
-    <w:p>
-      <w:r>
-        <w:t xml:space="preserve">  * “general advertisement”</w:t>
-      </w:r>
-    </w:p>
-    <w:p>
-      <w:r>
-        <w:t xml:space="preserve">  * “without direct solicitation”</w:t>
-      </w:r>
-    </w:p>
-    <w:p>
-      <w:r>
-        <w:t xml:space="preserve">* Do NOT route </w:t>
-      </w:r>
-      <w:proofErr w:type="gramStart"/>
-      <w:r>
-        <w:t>Non-Solicitation</w:t>
-      </w:r>
-      <w:proofErr w:type="gramEnd"/>
-      <w:r>
-        <w:t xml:space="preserve"> if the only matched non-solicitation language is a mutual employee or independent contractor restriction and the same clause contains:</w:t>
-      </w:r>
-    </w:p>
-    <w:p>
-      <w:r>
-        <w:t xml:space="preserve">  * “during the term of this Agreement”</w:t>
-      </w:r>
-    </w:p>
-    <w:p>
-      <w:r>
-        <w:t xml:space="preserve">  * “Such restrictions shall not apply”</w:t>
-      </w:r>
-    </w:p>
-    <w:p>
-      <w:r>
-        <w:t xml:space="preserve">  * “actively seeks employment”</w:t>
-      </w:r>
-    </w:p>
-    <w:p>
-      <w:r>
-        <w:t xml:space="preserve">  * “general advertisement”</w:t>
-      </w:r>
-    </w:p>
-    <w:p>
-      <w:r>
-        <w:t xml:space="preserve">  * “without direct solicitation”</w:t>
+        <w:t>* Standard confidentiality obligations that do not restrict business activities</w:t>
+      </w:r>
+    </w:p>
+    <w:p>
+      <w:r>
+        <w:t>* Provisions explicitly confirming parties may compete freely</w:t>
+      </w:r>
+    </w:p>
+    <w:p>
+      <w:r>
+        <w:t>* “exclusive jurisdiction” / “submit to the exclusive jurisdiction”</w:t>
+      </w:r>
+    </w:p>
+    <w:p>
+      <w:r>
+        <w:t>* “exclusive right to” in the context of court remedies or legal proceedings</w:t>
+      </w:r>
+    </w:p>
+    <w:p>
+      <w:r>
+        <w:t>* “exclusive property of the Disclosing Party” in a Confidential Information ownership clause</w:t>
+      </w:r>
+    </w:p>
+    <w:p>
+      <w:r>
+        <w:t>* “sole and exclusive property” in an IP ownership context</w:t>
+      </w:r>
+    </w:p>
+    <w:p>
+      <w:r>
+        <w:t>* Clause only limits use of Confidential Information to the Purpose or Project</w:t>
+      </w:r>
+    </w:p>
+    <w:p>
+      <w:r>
+        <w:t>* Clause only prohibits use of Confidential Information for purposes outside the NDA purpose</w:t>
+      </w:r>
+    </w:p>
+    <w:p>
+      <w:r>
+        <w:t>* Clause only prohibits contacting customers, suppliers, vendors, or connected persons for appraisal, evaluation, due diligence, Project review, or confidentiality-control purposes</w:t>
+      </w:r>
+    </w:p>
+    <w:p>
+      <w:r>
+        <w:t>* Clause only requires prior written consent before contacting customers, suppliers, vendors, or connected persons, without restricting competition, future services, market participation, or independent business activities</w:t>
+      </w:r>
+    </w:p>
+    <w:p>
+      <w:r>
+        <w:t>* Clause contains “make contact, directly or indirectly” but does not contain a clear competition, exclusivity, future-services, market-participation, customer-diversion, vendor-diversion, or business-opportunity restriction</w:t>
+      </w:r>
+    </w:p>
+    <w:p>
+      <w:r>
+        <w:t>* Clause contains “customer” or “supplier” but does not require the customer or supplier to cease, reduce, discontinue, or refrain from doing business with the Disclosing Party</w:t>
+      </w:r>
+    </w:p>
+    <w:p>
+      <w:r>
+        <w:t>* Clause contains “customer” or “supplier” but does not restrict Accenture from providing services to third parties, competitors, or other clients</w:t>
+      </w:r>
+    </w:p>
+    <w:p>
+      <w:r>
+        <w:t>* Clause contains “customer, supplier, or any other person connected with the Disclosing Party” only in the context of appraisal, evaluation, diligence, Project review, or confidentiality protection</w:t>
+      </w:r>
+    </w:p>
+    <w:p>
+      <w:r>
+        <w:t>* Restrictions limited to not interfering with business relationships, without a clear restriction on competitive activity, future services, market participation, or business opportunity pursuit</w:t>
+      </w:r>
+    </w:p>
+    <w:p>
+      <w:r>
+        <w:t>* General no-contact clauses related to the Project, unless they also include a clear non-compete, exclusivity, customer diversion, vendor diversion, or business opportunity restriction</w:t>
       </w:r>
     </w:p>
     <w:p>
       <w:r>
         <w:lastRenderedPageBreak/>
-        <w:t xml:space="preserve">* Do NOT route </w:t>
-      </w:r>
-      <w:proofErr w:type="gramStart"/>
-      <w:r>
-        <w:t>Non-Solicitation</w:t>
-      </w:r>
-      <w:proofErr w:type="gramEnd"/>
-      <w:r>
-        <w:t xml:space="preserve"> if the same </w:t>
-      </w:r>
-      <w:proofErr w:type="gramStart"/>
-      <w:r>
-        <w:t>Non-Solicitation</w:t>
-      </w:r>
-      <w:proofErr w:type="gramEnd"/>
-      <w:r>
-        <w:t xml:space="preserve"> clause contains BOTH:</w:t>
-      </w:r>
-    </w:p>
-    <w:p>
-      <w:r>
-        <w:t xml:space="preserve">  * “advertisements in the media”</w:t>
-      </w:r>
-    </w:p>
-    <w:p>
-      <w:r>
-        <w:t xml:space="preserve">  * “own initiative”</w:t>
-      </w:r>
-    </w:p>
-    <w:p>
-      <w:r>
-        <w:t xml:space="preserve">* Do NOT route </w:t>
-      </w:r>
-      <w:proofErr w:type="gramStart"/>
-      <w:r>
-        <w:t>Non-Solicitation</w:t>
-      </w:r>
-      <w:proofErr w:type="gramEnd"/>
-      <w:r>
-        <w:t xml:space="preserve"> if the clause is limited to officers only and contains standard public-recruitment carve-outs.</w:t>
-      </w:r>
-    </w:p>
-    <w:p>
-      <w:r>
-        <w:t xml:space="preserve">* Clause contains </w:t>
-      </w:r>
-      <w:proofErr w:type="gramStart"/>
-      <w:r>
-        <w:t>all of</w:t>
-      </w:r>
-      <w:proofErr w:type="gramEnd"/>
-      <w:r>
-        <w:t xml:space="preserve"> the following:</w:t>
-      </w:r>
-    </w:p>
-    <w:p>
-      <w:r>
-        <w:t xml:space="preserve">  * “any officer of the Company”</w:t>
-      </w:r>
-    </w:p>
-    <w:p>
-      <w:r>
-        <w:t xml:space="preserve">  * “generalized searches for employees”</w:t>
-      </w:r>
-    </w:p>
-    <w:p>
-      <w:r>
-        <w:t xml:space="preserve">  * “bona fide public advertisements in the media”</w:t>
-      </w:r>
-    </w:p>
-    <w:p>
-      <w:r>
-        <w:t xml:space="preserve">  * “not targeted specifically at employees of the Company”</w:t>
-      </w:r>
-    </w:p>
-    <w:p>
-      <w:r>
-        <w:t xml:space="preserve">* Clause contains </w:t>
-      </w:r>
-      <w:proofErr w:type="gramStart"/>
-      <w:r>
-        <w:t>all of</w:t>
-      </w:r>
-      <w:proofErr w:type="gramEnd"/>
-      <w:r>
-        <w:t xml:space="preserve"> the following:</w:t>
-      </w:r>
-    </w:p>
-    <w:p>
-      <w:r>
-        <w:t xml:space="preserve">  * “solicitation of any such person”</w:t>
-      </w:r>
-    </w:p>
-    <w:p>
-      <w:r>
-        <w:t xml:space="preserve">  * “generalized searches for employees”</w:t>
-      </w:r>
-    </w:p>
-    <w:p>
-      <w:r>
-        <w:t xml:space="preserve">  * “bona fide public advertisements in the media”</w:t>
-      </w:r>
-    </w:p>
-    <w:p>
-      <w:r>
-        <w:t xml:space="preserve">  * “not targeted specifically”</w:t>
-      </w:r>
-    </w:p>
-    <w:p>
-      <w:r>
-        <w:t xml:space="preserve">* Clause contains </w:t>
-      </w:r>
-      <w:proofErr w:type="gramStart"/>
-      <w:r>
-        <w:t>all of</w:t>
-      </w:r>
-      <w:proofErr w:type="gramEnd"/>
-      <w:r>
-        <w:t xml:space="preserve"> the following:</w:t>
-      </w:r>
-    </w:p>
-    <w:p>
-      <w:r>
-        <w:t xml:space="preserve">  * “employ or engage, or solicit for employment or engagement”</w:t>
-      </w:r>
-    </w:p>
-    <w:p>
-      <w:r>
-        <w:t xml:space="preserve">  * “any officer of the Company”</w:t>
-      </w:r>
-    </w:p>
-    <w:p>
-      <w:r>
-        <w:t xml:space="preserve">  * “bona fide public advertisements in the media”</w:t>
-      </w:r>
-    </w:p>
-    <w:p>
-      <w:r>
-        <w:t xml:space="preserve">  * “not targeted specifically”</w:t>
+        <w:t>* Do NOT route Non-Compete / Exclusivity where “competitor” appears only to exclude competitor consultants, advisors, or representatives from receiving Confidential Information, without requiring Accenture to disclose, notify, indicate, report, limit, stop, or avoid work with a competitor.</w:t>
+      </w:r>
+    </w:p>
+    <w:p>
+      <w:r>
+        <w:t xml:space="preserve">* Do NOT route Non-Compete / Exclusivity where “competitor” appears only in a confidentiality-control provision and does not relate to Accenture </w:t>
+      </w:r>
+      <w:r>
+        <w:t>b</w:t>
+      </w:r>
+      <w:r>
+        <w:t>eing contracted to, working for, consulting for, providing services to, or pursuing work with a competitor.</w:t>
+      </w:r>
+    </w:p>
+    <w:p>
+      <w:r>
+        <w:t>* Do NOT route Non-Compete / Exclusivity where the clause merely states that Confidential Information must not be disclosed to competitors, without any obligation to disclose competitor relationships or restrict business activity.</w:t>
       </w:r>
     </w:p>
     <w:p>
@@ -2642,56 +2643,12 @@
     </w:p>
     <w:p>
       <w:r>
-        <w:t>## Country Supplement Override</w:t>
-      </w:r>
-    </w:p>
-    <w:p>
-      <w:r>
-        <w:t xml:space="preserve">* If the NDA is connected to the Nordics Market Unit and contains any non-solicitation clause, route to </w:t>
-      </w:r>
-      <w:proofErr w:type="gramStart"/>
-      <w:r>
-        <w:t>Non-Solicitation</w:t>
-      </w:r>
-      <w:proofErr w:type="gramEnd"/>
-      <w:r>
-        <w:t xml:space="preserve"> even if standard carve-outs are present.</w:t>
-      </w:r>
-    </w:p>
-    <w:p>
-      <w:r>
-        <w:t>* Nordics non-solicitation must be routed because the playbook states it should be removed in all cases.</w:t>
-      </w:r>
-    </w:p>
-    <w:p>
-      <w:r>
-        <w:t># 6. Non-Compete / Exclusivity</w:t>
-      </w:r>
-    </w:p>
-    <w:p>
-      <w:r>
-        <w:lastRenderedPageBreak/>
-        <w:t>Type: STRATEGIC / COMMERCIAL</w:t>
-      </w:r>
-    </w:p>
-    <w:p>
-      <w:r>
-        <w:t>## Definition</w:t>
-      </w:r>
-    </w:p>
-    <w:p>
-      <w:r>
-        <w:t>Restricts competitive business activities, market participation, provision of services to third parties, provision of services to competitors or other clients, exclusive dealing, pursuit of business opportunities, or engagement with competing enterprises.</w:t>
-      </w:r>
-    </w:p>
-    <w:p>
-      <w:r>
-        <w:t>This risk applies where the NDA clearly limits Accenture’s ability to compete, serve other clients, work with competitors, pursue future business, participate in a market, or conduct business independently.</w:t>
-      </w:r>
-    </w:p>
-    <w:p>
-      <w:r>
-        <w:t>This risk also includes obligations requiring Accenture to disclose, notify, indicate, or report existing or potential work, contracts, consulting relationships, or service relationships with competitors of the client where the obligation is tied to competitor status and may constrain Accenture’s ability to serve other clients or competitors.</w:t>
+        <w:t>## Conflict Resolution Rule</w:t>
+      </w:r>
+    </w:p>
+    <w:p>
+      <w:r>
+        <w:t>If a clause contains customer, supplier, vendor, or business relationship language, route Non-Compete / Exclusivity only if the clause clearly restricts competitive activity, future services, market participation, independent business opportunities, or causes customers/vendors to cease, reduce, discontinue, or refrain from business with the other party.</w:t>
       </w:r>
     </w:p>
     <w:p>
@@ -2701,839 +2658,10 @@
     </w:p>
     <w:p>
       <w:r>
-        <w:t>## Triage Signals</w:t>
-      </w:r>
-    </w:p>
-    <w:p>
-      <w:r>
-        <w:t>* “non-compete”</w:t>
-      </w:r>
-    </w:p>
-    <w:p>
-      <w:r>
-        <w:t>* “non-competition”</w:t>
-      </w:r>
-    </w:p>
-    <w:p>
-      <w:r>
-        <w:t>* “exclusive” or “exclusivity”</w:t>
-      </w:r>
-    </w:p>
-    <w:p>
-      <w:r>
-        <w:t>* “exclusive basis”</w:t>
-      </w:r>
-    </w:p>
-    <w:p>
-      <w:r>
-        <w:t>* “competition restriction”</w:t>
-      </w:r>
-    </w:p>
-    <w:p>
-      <w:r>
-        <w:t>* “restrict services” to third parties</w:t>
-      </w:r>
-    </w:p>
-    <w:p>
-      <w:r>
-        <w:t>* “cannot provide services” to competitors or other clients</w:t>
-      </w:r>
-    </w:p>
-    <w:p>
-      <w:r>
-        <w:t>* “shall not provide services” to competitors or other clients</w:t>
-      </w:r>
-    </w:p>
-    <w:p>
-      <w:r>
-        <w:t>* “shall not enter into direct competition”</w:t>
-      </w:r>
-    </w:p>
-    <w:p>
-      <w:r>
-        <w:t>* “not to enter into direct competition”</w:t>
-      </w:r>
-    </w:p>
-    <w:p>
-      <w:r>
-        <w:t>* “Client Competitor”</w:t>
-      </w:r>
-    </w:p>
-    <w:p>
-      <w:r>
-        <w:t>* “competitor” or “competing enterprise” in a clause restricting business activity</w:t>
-      </w:r>
-    </w:p>
-    <w:p>
-      <w:r>
-        <w:t>* “like industry” in a clause restricting business activity</w:t>
-      </w:r>
-    </w:p>
-    <w:p>
-      <w:r>
-        <w:t>* “offer identical or like services”</w:t>
-      </w:r>
-    </w:p>
-    <w:p>
-      <w:r>
-        <w:lastRenderedPageBreak/>
-        <w:t>* “competitive disadvantage”</w:t>
-      </w:r>
-    </w:p>
-    <w:p>
-      <w:r>
-        <w:t>* “causing any competition”</w:t>
-      </w:r>
-    </w:p>
-    <w:p>
-      <w:r>
-        <w:t>* “deal with one another on an exclusive basis”</w:t>
-      </w:r>
-    </w:p>
-    <w:p>
-      <w:r>
-        <w:t>* “restricts future services”</w:t>
-      </w:r>
-    </w:p>
-    <w:p>
-      <w:r>
-        <w:t>* “provide future services” to other clients is restricted</w:t>
-      </w:r>
-    </w:p>
-    <w:p>
-      <w:r>
-        <w:t>* “pursuing business opportunities” is restricted</w:t>
-      </w:r>
-    </w:p>
-    <w:p>
-      <w:r>
-        <w:t>* “refrain from entering into any new business relationship”</w:t>
-      </w:r>
-    </w:p>
-    <w:p>
-      <w:r>
-        <w:t>* “not directly or indirectly contact, or negotiate with, a third party regarding a potential business relationship”</w:t>
-      </w:r>
-    </w:p>
-    <w:p>
-      <w:r>
-        <w:t>* “persuade any customer” to cease, reduce, or discontinue business</w:t>
-      </w:r>
-    </w:p>
-    <w:p>
-      <w:r>
-        <w:t>* “induce any customer” to cease, reduce, or discontinue business</w:t>
-      </w:r>
-    </w:p>
-    <w:p>
-      <w:r>
-        <w:t>* “persuade any vendor” to cease, reduce, or discontinue business</w:t>
-      </w:r>
-    </w:p>
-    <w:p>
-      <w:r>
-        <w:t>* “induce any vendor” to cease, reduce, or discontinue business</w:t>
-      </w:r>
-    </w:p>
-    <w:p>
-      <w:r>
-        <w:t>* “cease purchasing goods or services”</w:t>
-      </w:r>
-    </w:p>
-    <w:p>
-      <w:r>
-        <w:t>* “cease selling goods and services”</w:t>
-      </w:r>
-    </w:p>
-    <w:p>
-      <w:r>
-        <w:t>* “reduce or discontinue any business relationship”</w:t>
-      </w:r>
-    </w:p>
-    <w:p>
-      <w:r>
-        <w:t>* “prevented or restricted from performing services”</w:t>
-      </w:r>
-    </w:p>
-    <w:p>
-      <w:r>
-        <w:t>* “prevented or restricted from pursuing business opportunities”</w:t>
-      </w:r>
-    </w:p>
-    <w:p>
-      <w:r>
-        <w:t>* “direct competitor of the Client”</w:t>
-      </w:r>
-    </w:p>
-    <w:p>
-      <w:r>
-        <w:t>* “contracted to, working for, or consulting for”</w:t>
-      </w:r>
-    </w:p>
-    <w:p>
-      <w:r>
-        <w:t>* “working for, or consulting for any company which is a direct competitor”</w:t>
-      </w:r>
-    </w:p>
-    <w:p>
-      <w:r>
-        <w:t>* “indicate to you immediately” combined with “direct competitor”</w:t>
-      </w:r>
-    </w:p>
-    <w:p>
-      <w:r>
-        <w:t>* “notify” or “indicate” combined with “direct competitor of the Client”</w:t>
-      </w:r>
-    </w:p>
-    <w:p>
-      <w:r>
-        <w:t>* “disclose” or “report” combined with “working for” and “direct competitor”</w:t>
-      </w:r>
-    </w:p>
-    <w:p>
-      <w:r>
-        <w:t>* Clause contains BOTH:</w:t>
-      </w:r>
-    </w:p>
-    <w:p>
-      <w:r>
-        <w:t xml:space="preserve">  * “direct competitor of the Client”</w:t>
-      </w:r>
-    </w:p>
-    <w:p>
-      <w:r>
-        <w:lastRenderedPageBreak/>
-        <w:t xml:space="preserve">  * “contracted to, working for, or consulting for”</w:t>
-      </w:r>
-    </w:p>
-    <w:p>
-      <w:r>
-        <w:t>* Clause contains BOTH:</w:t>
-      </w:r>
-    </w:p>
-    <w:p>
-      <w:r>
-        <w:t xml:space="preserve">  * “direct competitor”</w:t>
-      </w:r>
-    </w:p>
-    <w:p>
-      <w:r>
-        <w:t xml:space="preserve">  * “working for, or consulting for”</w:t>
-      </w:r>
-    </w:p>
-    <w:p>
-      <w:r>
-        <w:t xml:space="preserve">* Clause contains </w:t>
-      </w:r>
-      <w:proofErr w:type="gramStart"/>
-      <w:r>
-        <w:t>ALL of</w:t>
-      </w:r>
-      <w:proofErr w:type="gramEnd"/>
-      <w:r>
-        <w:t xml:space="preserve"> the following:</w:t>
-      </w:r>
-    </w:p>
-    <w:p>
-      <w:r>
-        <w:t xml:space="preserve">  * “indicate”</w:t>
-      </w:r>
-    </w:p>
-    <w:p>
-      <w:r>
-        <w:t xml:space="preserve">  * “working for”</w:t>
-      </w:r>
-    </w:p>
-    <w:p>
-      <w:r>
-        <w:t xml:space="preserve">  * “consulting for”</w:t>
-      </w:r>
-    </w:p>
-    <w:p>
-      <w:r>
-        <w:t xml:space="preserve">  * “direct competitor”</w:t>
-      </w:r>
-    </w:p>
-    <w:p>
-      <w:r>
-        <w:t xml:space="preserve"> </w:t>
-      </w:r>
-    </w:p>
-    <w:p>
-      <w:r>
-        <w:t>## Do NOT Trigger</w:t>
-      </w:r>
-    </w:p>
-    <w:p>
-      <w:r>
-        <w:t>* Restrictions solely prevent misuse of confidential information for competitive purposes</w:t>
-      </w:r>
-    </w:p>
-    <w:p>
-      <w:r>
-        <w:t>* Standard confidentiality obligations that do not restrict business activities</w:t>
-      </w:r>
-    </w:p>
-    <w:p>
-      <w:r>
-        <w:t>* Provisions explicitly confirming parties may compete freely</w:t>
-      </w:r>
-    </w:p>
-    <w:p>
-      <w:r>
-        <w:t>* “exclusive jurisdiction” / “submit to the exclusive jurisdiction”</w:t>
-      </w:r>
-    </w:p>
-    <w:p>
-      <w:r>
-        <w:t>* “exclusive right to” in the context of court remedies or legal proceedings</w:t>
-      </w:r>
-    </w:p>
-    <w:p>
-      <w:r>
-        <w:t>* “exclusive property of the Disclosing Party” in a Confidential Information ownership clause</w:t>
-      </w:r>
-    </w:p>
-    <w:p>
-      <w:r>
-        <w:t>* “sole and exclusive property” in an IP ownership context</w:t>
-      </w:r>
-    </w:p>
-    <w:p>
-      <w:r>
-        <w:t>* Clause only limits use of Confidential Information to the Purpose or Project</w:t>
-      </w:r>
-    </w:p>
-    <w:p>
-      <w:r>
-        <w:t>* Clause only prohibits use of Confidential Information for purposes outside the NDA purpose</w:t>
-      </w:r>
-    </w:p>
-    <w:p>
-      <w:r>
-        <w:t>* Clause only prohibits contacting customers, suppliers, vendors, or connected persons for appraisal, evaluation, due diligence, Project review, or confidentiality-control purposes</w:t>
-      </w:r>
-    </w:p>
-    <w:p>
-      <w:r>
-        <w:t xml:space="preserve">* Clause only requires prior written consent before contacting customers, suppliers, vendors, or connected </w:t>
-      </w:r>
-      <w:proofErr w:type="gramStart"/>
-      <w:r>
-        <w:t>persons</w:t>
-      </w:r>
-      <w:proofErr w:type="gramEnd"/>
-      <w:r>
-        <w:t>, without restricting competition, future services, market participation, or independent business activities</w:t>
-      </w:r>
-    </w:p>
-    <w:p>
-      <w:r>
-        <w:lastRenderedPageBreak/>
-        <w:t>* Clause contains “make contact, directly or indirectly” but does not contain a clear competition, exclusivity, future-services, market-participation, customer-diversion, vendor-diversion, or business-opportunity restriction</w:t>
-      </w:r>
-    </w:p>
-    <w:p>
-      <w:r>
-        <w:t>* Clause contains “customer” or “supplier” but does not require the customer or supplier to cease, reduce, discontinue, or refrain from doing business with the Disclosing Party</w:t>
-      </w:r>
-    </w:p>
-    <w:p>
-      <w:r>
-        <w:t>* Clause contains “customer” or “supplier” but does not restrict Accenture from providing services to third parties, competitors, or other clients</w:t>
-      </w:r>
-    </w:p>
-    <w:p>
-      <w:r>
-        <w:t>* Clause contains “customer, supplier, or any other person connected with the Disclosing Party” only in the context of appraisal, evaluation, diligence, Project review, or confidentiality protection</w:t>
-      </w:r>
-    </w:p>
-    <w:p>
-      <w:r>
-        <w:t>* Restrictions limited to not interfering with business relationships, without a clear restriction on competitive activity, future services, market participation, or business opportunity pursuit</w:t>
-      </w:r>
-    </w:p>
-    <w:p>
-      <w:r>
-        <w:t xml:space="preserve">* General no-contact clauses related to the Project, unless they also include </w:t>
-      </w:r>
-      <w:proofErr w:type="gramStart"/>
-      <w:r>
-        <w:t>a clear</w:t>
-      </w:r>
-      <w:proofErr w:type="gramEnd"/>
-      <w:r>
-        <w:t xml:space="preserve"> non-compete, exclusivity, customer diversion, vendor diversion, or business opportunity restriction</w:t>
-      </w:r>
-    </w:p>
-    <w:p>
-      <w:r>
-        <w:t>* Do NOT route Non-Compete / Exclusivity where “competitor” appears only to exclude competitor consultants, advisors, or representatives from receiving Confidential Information, without requiring Accenture to disclose, notify, indicate, report, limit, stop, or avoid work with a competitor.</w:t>
-      </w:r>
-    </w:p>
-    <w:p>
-      <w:r>
-        <w:t xml:space="preserve">* Do NOT route Non-Compete / Exclusivity where “competitor” appears only in a confidentiality-control provision and does not relate to Accenture </w:t>
-      </w:r>
-      <w:r>
-        <w:t>b</w:t>
-      </w:r>
-      <w:r>
-        <w:t>eing contracted to, working for, consulting for, providing services to, or pursuing work with a competitor.</w:t>
-      </w:r>
-    </w:p>
-    <w:p>
-      <w:r>
-        <w:t>* Do NOT route Non-Compete / Exclusivity where the clause merely states that Confidential Information must not be disclosed to competitors, without any obligation to disclose competitor relationships or restrict business activity.</w:t>
-      </w:r>
-    </w:p>
-    <w:p>
-      <w:r>
-        <w:t xml:space="preserve"> </w:t>
-      </w:r>
-    </w:p>
-    <w:p>
-      <w:r>
-        <w:t>## Conflict Resolution Rule</w:t>
-      </w:r>
-    </w:p>
-    <w:p>
-      <w:r>
-        <w:t>If a clause contains customer, supplier, vendor, or business relationship language, route Non-Compete / Exclusivity only if the clause clearly restricts competitive activity, future services, market participation, independent business opportunities, or causes customers/vendors to cease, reduce, discontinue, or refrain from business with the other party.</w:t>
-      </w:r>
-    </w:p>
-    <w:p>
-      <w:r>
-        <w:lastRenderedPageBreak/>
-        <w:t xml:space="preserve"> </w:t>
-      </w:r>
-    </w:p>
-    <w:p>
-      <w:r>
         <w:t>If the clause is only a project-related no-contact or consent-before-contact restriction, DO NOT route Non-Compete / Exclusivity.</w:t>
       </w:r>
     </w:p>
-    <w:p>
-      <w:r>
-        <w:t># 7. Additional Requirements</w:t>
-      </w:r>
-    </w:p>
-    <w:p>
-      <w:r>
-        <w:t>Type: JURISDICTIONAL / REGULATORY</w:t>
-      </w:r>
-    </w:p>
-    <w:p>
-      <w:r>
-        <w:t>## Definition</w:t>
-      </w:r>
-    </w:p>
-    <w:p>
-      <w:r>
-        <w:t xml:space="preserve">Non-standard legal, regulatory, </w:t>
-      </w:r>
-      <w:proofErr w:type="gramStart"/>
-      <w:r>
-        <w:t>execution-formality</w:t>
-      </w:r>
-      <w:proofErr w:type="gramEnd"/>
-      <w:r>
-        <w:t>, or jurisdiction-specific obligations that do not fall under the other risk categories and require special routing under the playbook.</w:t>
-      </w:r>
-    </w:p>
-    <w:p>
-      <w:r>
-        <w:t>This includes confirmed ANZ deed execution requirements, Italy-specific insider trading / market abuse requirements, notarization, registration or regulatory filing obligations, and agreements where one of the contracting parties is a confirmed individual person at party-definition level.</w:t>
-      </w:r>
-    </w:p>
-    <w:p>
-      <w:r>
-        <w:t>## Triage Signals</w:t>
-      </w:r>
-    </w:p>
-    <w:p>
-      <w:r>
-        <w:t>* “deed” or “executed as a deed” in an ANZ MU context</w:t>
-      </w:r>
-    </w:p>
-    <w:p>
-      <w:r>
-        <w:t>* “signature by deed” in an ANZ MU context</w:t>
-      </w:r>
-    </w:p>
-    <w:p>
-      <w:r>
-        <w:t>* “signed as a deed” in an ANZ MU context</w:t>
-      </w:r>
-    </w:p>
-    <w:p>
-      <w:r>
-        <w:t>* “notarized”</w:t>
-      </w:r>
-    </w:p>
-    <w:p>
-      <w:r>
-        <w:t>* “notarization”</w:t>
-      </w:r>
-    </w:p>
-    <w:p>
-      <w:r>
-        <w:t>* “registration of this agreement”</w:t>
-      </w:r>
-    </w:p>
-    <w:p>
-      <w:r>
-        <w:t>* “register this agreement”</w:t>
-      </w:r>
-    </w:p>
-    <w:p>
-      <w:r>
-        <w:t>* “file this agreement” with regulator</w:t>
-      </w:r>
-    </w:p>
-    <w:p>
-      <w:r>
-        <w:t>* “filing with regulator”</w:t>
-      </w:r>
-    </w:p>
-    <w:p>
-      <w:r>
-        <w:t>* “regulatory filing”</w:t>
-      </w:r>
-    </w:p>
-    <w:p>
-      <w:r>
-        <w:t>* “filed with regulator”</w:t>
-      </w:r>
-    </w:p>
-    <w:p>
-      <w:r>
-        <w:t>* One of the parties is a confirmed individual person at party-definition level</w:t>
-      </w:r>
-    </w:p>
-    <w:p>
-      <w:r>
-        <w:t>Italy-specific insider trading / market abuse signals require BOTH an Insider / MAR signal AND an Italy nexus.</w:t>
-      </w:r>
-    </w:p>
-    <w:p>
-      <w:r>
-        <w:t xml:space="preserve"> </w:t>
-      </w:r>
-    </w:p>
-    <w:p>
-      <w:r>
-        <w:lastRenderedPageBreak/>
-        <w:t>Insider / MAR signal:</w:t>
-      </w:r>
-    </w:p>
-    <w:p>
-      <w:r>
-        <w:t>* “insider trading”</w:t>
-      </w:r>
-    </w:p>
-    <w:p>
-      <w:r>
-        <w:t>* “inside information”</w:t>
-      </w:r>
-    </w:p>
-    <w:p>
-      <w:r>
-        <w:t>* “market abuse”</w:t>
-      </w:r>
-    </w:p>
-    <w:p>
-      <w:r>
-        <w:t>* “market sensitive information”</w:t>
-      </w:r>
-    </w:p>
-    <w:p>
-      <w:r>
-        <w:t>* “MAR Regulation No 596/2014”</w:t>
-      </w:r>
-    </w:p>
-    <w:p>
-      <w:r>
-        <w:t>* “Regulation (EU) No 596/2014”</w:t>
-      </w:r>
-    </w:p>
-    <w:p>
-      <w:r>
-        <w:t>* “Market Abuse Regulation”</w:t>
-      </w:r>
-    </w:p>
-    <w:p>
-      <w:r>
-        <w:t>* “Insider Register”</w:t>
-      </w:r>
-    </w:p>
-    <w:p>
-      <w:r>
-        <w:t>* “insider list”</w:t>
-      </w:r>
-    </w:p>
-    <w:p>
-      <w:r>
-        <w:t>* “TUF”</w:t>
-      </w:r>
-    </w:p>
-    <w:p>
-      <w:r>
-        <w:t>* “Italian Legislative Decree no. 58/1998”</w:t>
-      </w:r>
-    </w:p>
-    <w:p>
-      <w:r>
-        <w:t xml:space="preserve"> </w:t>
-      </w:r>
-    </w:p>
-    <w:p>
-      <w:r>
-        <w:t>Italy nexus:</w:t>
-      </w:r>
-    </w:p>
-    <w:p>
-      <w:r>
-        <w:t>* “Italy”</w:t>
-      </w:r>
-    </w:p>
-    <w:p>
-      <w:r>
-        <w:t>* “Italian”</w:t>
-      </w:r>
-    </w:p>
-    <w:p>
-      <w:r>
-        <w:t>* “Italian Legislative Decree no. 58/1998”</w:t>
-      </w:r>
-    </w:p>
-    <w:p>
-      <w:r>
-        <w:t>* “TUF”</w:t>
-      </w:r>
-    </w:p>
-    <w:p>
-      <w:r>
-        <w:t>* “PEC”</w:t>
-      </w:r>
-    </w:p>
-    <w:p>
-      <w:r>
-        <w:t>* “Italian NDA”</w:t>
-      </w:r>
-    </w:p>
-    <w:p>
-      <w:r>
-        <w:t>* Italian governing law</w:t>
-      </w:r>
-    </w:p>
-    <w:p>
-      <w:r>
-        <w:t>* Italian party address</w:t>
-      </w:r>
-    </w:p>
-    <w:p>
-      <w:r>
-        <w:t>* Italian company form such as “S.p.A.”, “</w:t>
-      </w:r>
-      <w:proofErr w:type="spellStart"/>
-      <w:r>
-        <w:t>S.r.l</w:t>
-      </w:r>
-      <w:proofErr w:type="spellEnd"/>
-      <w:r>
-        <w:t>.”, or “Società”</w:t>
-      </w:r>
-    </w:p>
-    <w:p>
-      <w:r>
-        <w:t>* Italy Market Unit indicator</w:t>
-      </w:r>
-    </w:p>
-    <w:p>
-      <w:r>
-        <w:t xml:space="preserve"> </w:t>
-      </w:r>
-    </w:p>
     <w:p/>
-    <w:p>
-      <w:r>
-        <w:lastRenderedPageBreak/>
-        <w:t>Route Additional Requirements for insider trading / MAR only if:</w:t>
-      </w:r>
-    </w:p>
-    <w:p>
-      <w:r>
-        <w:t>* at least one Insider / MAR signal is present; AND</w:t>
-      </w:r>
-    </w:p>
-    <w:p>
-      <w:r>
-        <w:t>* at least one Italy nexus signal is present.</w:t>
-      </w:r>
-    </w:p>
-    <w:p>
-      <w:r>
-        <w:t xml:space="preserve"> </w:t>
-      </w:r>
-    </w:p>
-    <w:p>
-      <w:r>
-        <w:t>## Do NOT Trigger</w:t>
-      </w:r>
-    </w:p>
-    <w:p>
-      <w:r>
-        <w:t>* Standard signature clauses</w:t>
-      </w:r>
-    </w:p>
-    <w:p>
-      <w:r>
-        <w:t>* Standard execution blocks</w:t>
-      </w:r>
-    </w:p>
-    <w:p>
-      <w:r>
-        <w:t>* Provisions already covered by other risk categories, especially Individual NDA risk</w:t>
-      </w:r>
-    </w:p>
-    <w:p>
-      <w:r>
-        <w:t>* “Company Registration No.”</w:t>
-      </w:r>
-    </w:p>
-    <w:p>
-      <w:r>
-        <w:t>* “UEN”</w:t>
-      </w:r>
-    </w:p>
-    <w:p>
-      <w:r>
-        <w:t>* “registered office address”</w:t>
-      </w:r>
-    </w:p>
-    <w:p>
-      <w:r>
-        <w:t xml:space="preserve">* </w:t>
-      </w:r>
-      <w:proofErr w:type="gramStart"/>
-      <w:r>
-        <w:t>company</w:t>
-      </w:r>
-      <w:proofErr w:type="gramEnd"/>
-      <w:r>
-        <w:t xml:space="preserve"> incorporation details</w:t>
-      </w:r>
-    </w:p>
-    <w:p>
-      <w:r>
-        <w:t>* Standard company metadata in party definitions, including name, address, jurisdiction of incorporation, registration number, tax number, or statistical number</w:t>
-      </w:r>
-    </w:p>
-    <w:p>
-      <w:r>
-        <w:t>* “file” appears only as a noun referring to documents, records, electronic files, data files, or ordinary document handling</w:t>
-      </w:r>
-    </w:p>
-    <w:p>
-      <w:r>
-        <w:t>* “filing” appears only in litigation, document-management, recordkeeping, or ordinary compliance context</w:t>
-      </w:r>
-    </w:p>
-    <w:p>
-      <w:r>
-        <w:t>* “Persons” refers only to people with access to inside information and not to an individual party to the NDA</w:t>
-      </w:r>
-    </w:p>
-    <w:p>
-      <w:r>
-        <w:t>* Individual name appears only in a signature block</w:t>
-      </w:r>
-    </w:p>
-    <w:p>
-      <w:r>
-        <w:t xml:space="preserve">* Individual </w:t>
-      </w:r>
-      <w:proofErr w:type="gramStart"/>
-      <w:r>
-        <w:t>name appears</w:t>
-      </w:r>
-      <w:proofErr w:type="gramEnd"/>
-      <w:r>
-        <w:t xml:space="preserve"> only as an authorized signer for a legal entity</w:t>
-      </w:r>
-    </w:p>
-    <w:p>
-      <w:r>
-        <w:t>* Individual person reference is in the signature block or relates only to who is signing the NDA for a legal entity</w:t>
-      </w:r>
-    </w:p>
-    <w:p>
-      <w:r>
-        <w:t>* “MAR Regulation No 596/2014” appears without an Italy nexus</w:t>
-      </w:r>
-    </w:p>
-    <w:p>
-      <w:r>
-        <w:t>* “Regulation (EU) No 596/2014” appears without an Italy nexus</w:t>
-      </w:r>
-    </w:p>
-    <w:p>
-      <w:r>
-        <w:t>* “Market Abuse Regulation” appears without an Italy nexus</w:t>
-      </w:r>
-    </w:p>
-    <w:p>
-      <w:r>
-        <w:lastRenderedPageBreak/>
-        <w:t>* “inside information” appears without an Italy nexus</w:t>
-      </w:r>
-    </w:p>
-    <w:p>
-      <w:r>
-        <w:t>* “insider list” appears without an Italy nexus</w:t>
-      </w:r>
-    </w:p>
-    <w:p>
-      <w:r>
-        <w:t>* “dealing embargo” appears without an Italy nexus</w:t>
-      </w:r>
-    </w:p>
-    <w:p>
-      <w:r>
-        <w:t>* “national regulatory authority” appears without an Italy nexus</w:t>
-      </w:r>
-    </w:p>
-    <w:p>
-      <w:r>
-        <w:t>* “Commission Implementing Regulation (EU) 2022/1210” appears without an Italy nexus</w:t>
-      </w:r>
-    </w:p>
-    <w:p>
-      <w:r>
-        <w:t>* General EU, Polish, Austrian, banking, securities, or market-abuse compliance clauses with no Italy nexus</w:t>
-      </w:r>
-    </w:p>
-    <w:p>
-      <w:r>
-        <w:t>* Clause contains BOTH:</w:t>
-      </w:r>
-    </w:p>
-    <w:p>
-      <w:r>
-        <w:t xml:space="preserve">  * “MAR Regulation No 596/2014”</w:t>
-      </w:r>
-    </w:p>
-    <w:p>
-      <w:r>
-        <w:t xml:space="preserve">  * “insider list”</w:t>
-      </w:r>
-    </w:p>
-    <w:p>
-      <w:r>
-        <w:t xml:space="preserve">    but does NOT contain an Italy nexus</w:t>
-      </w:r>
-    </w:p>
     <w:sectPr>
       <w:pgSz w:w="12240" w:h="15840"/>
       <w:pgMar w:top="1440" w:right="1440" w:bottom="1440" w:left="1440" w:header="720" w:footer="720" w:gutter="0"/>
@@ -4370,6 +3498,7 @@
   <w:style w:type="character" w:default="1" w:styleId="DefaultParagraphFont">
     <w:name w:val="Default Paragraph Font"/>
     <w:uiPriority w:val="1"/>
+    <w:semiHidden/>
     <w:unhideWhenUsed/>
   </w:style>
   <w:style w:type="table" w:default="1" w:styleId="TableNormal">
@@ -28874,6 +28003,27 @@
 </file>
 
 <file path=customXml/item1.xml><?xml version="1.0" encoding="utf-8"?>
+<?mso-contentType ?>
+<FormTemplates xmlns="http://schemas.microsoft.com/sharepoint/v3/contenttype/forms">
+  <Display>DocumentLibraryForm</Display>
+  <Edit>DocumentLibraryForm</Edit>
+  <New>DocumentLibraryForm</New>
+</FormTemplates>
+</file>
+
+<file path=customXml/item2.xml><?xml version="1.0" encoding="utf-8"?>
+<p:properties xmlns:p="http://schemas.microsoft.com/office/2006/metadata/properties" xmlns:xsi="http://www.w3.org/2001/XMLSchema-instance" xmlns:pc="http://schemas.microsoft.com/office/infopath/2007/PartnerControls">
+  <documentManagement>
+    <TaxCatchAll xmlns="58fb48c5-ad38-47d1-9aa6-9b4f1dc114f9" xsi:nil="true"/>
+    <lcf76f155ced4ddcb4097134ff3c332f xmlns="aba9ad68-f961-4806-8372-ded3e8039a5f">
+      <Terms xmlns="http://schemas.microsoft.com/office/infopath/2007/PartnerControls"/>
+    </lcf76f155ced4ddcb4097134ff3c332f>
+    <Reusable xmlns="aba9ad68-f961-4806-8372-ded3e8039a5f">true</Reusable>
+  </documentManagement>
+</p:properties>
+</file>
+
+<file path=customXml/item3.xml><?xml version="1.0" encoding="utf-8"?>
 <ct:contentTypeSchema xmlns:ct="http://schemas.microsoft.com/office/2006/metadata/contentType" xmlns:ma="http://schemas.microsoft.com/office/2006/metadata/properties/metaAttributes" ct:_="" ma:_="" ma:contentTypeName="Document" ma:contentTypeID="0x010100A5AA8A3CABF36C429B74A94C24258E55" ma:contentTypeVersion="21" ma:contentTypeDescription="Create a new document." ma:contentTypeScope="" ma:versionID="9d590b9c745b5d4d086e55351edde6c7">
   <xsd:schema xmlns:xsd="http://www.w3.org/2001/XMLSchema" xmlns:xs="http://www.w3.org/2001/XMLSchema" xmlns:p="http://schemas.microsoft.com/office/2006/metadata/properties" xmlns:ns2="aba9ad68-f961-4806-8372-ded3e8039a5f" xmlns:ns3="58fb48c5-ad38-47d1-9aa6-9b4f1dc114f9" targetNamespace="http://schemas.microsoft.com/office/2006/metadata/properties" ma:root="true" ma:fieldsID="656ed3350af39d0ad06ab4725df265a1" ns2:_="" ns3:_="">
     <xsd:import namespace="aba9ad68-f961-4806-8372-ded3e8039a5f"/>
@@ -29140,28 +28290,26 @@
 </ct:contentTypeSchema>
 </file>
 
-<file path=customXml/item2.xml><?xml version="1.0" encoding="utf-8"?>
-<p:properties xmlns:p="http://schemas.microsoft.com/office/2006/metadata/properties" xmlns:xsi="http://www.w3.org/2001/XMLSchema-instance" xmlns:pc="http://schemas.microsoft.com/office/infopath/2007/PartnerControls">
-  <documentManagement>
-    <TaxCatchAll xmlns="58fb48c5-ad38-47d1-9aa6-9b4f1dc114f9" xsi:nil="true"/>
-    <lcf76f155ced4ddcb4097134ff3c332f xmlns="aba9ad68-f961-4806-8372-ded3e8039a5f">
-      <Terms xmlns="http://schemas.microsoft.com/office/infopath/2007/PartnerControls"/>
-    </lcf76f155ced4ddcb4097134ff3c332f>
-    <Reusable xmlns="aba9ad68-f961-4806-8372-ded3e8039a5f">true</Reusable>
-  </documentManagement>
-</p:properties>
+<file path=customXml/itemProps1.xml><?xml version="1.0" encoding="utf-8"?>
+<ds:datastoreItem xmlns:ds="http://schemas.openxmlformats.org/officeDocument/2006/customXml" ds:itemID="{C6DFF534-1887-4C42-BC36-EDACE7DE72C0}">
+  <ds:schemaRefs>
+    <ds:schemaRef ds:uri="http://schemas.microsoft.com/sharepoint/v3/contenttype/forms"/>
+  </ds:schemaRefs>
+</ds:datastoreItem>
 </file>
 
-<file path=customXml/item3.xml><?xml version="1.0" encoding="utf-8"?>
-<?mso-contentType ?>
-<FormTemplates xmlns="http://schemas.microsoft.com/sharepoint/v3/contenttype/forms">
-  <Display>DocumentLibraryForm</Display>
-  <Edit>DocumentLibraryForm</Edit>
-  <New>DocumentLibraryForm</New>
-</FormTemplates>
+<file path=customXml/itemProps2.xml><?xml version="1.0" encoding="utf-8"?>
+<ds:datastoreItem xmlns:ds="http://schemas.openxmlformats.org/officeDocument/2006/customXml" ds:itemID="{25BAFF0C-A05A-49CE-A308-E2413E02AFCD}">
+  <ds:schemaRefs>
+    <ds:schemaRef ds:uri="http://schemas.microsoft.com/office/2006/metadata/properties"/>
+    <ds:schemaRef ds:uri="http://schemas.microsoft.com/office/infopath/2007/PartnerControls"/>
+    <ds:schemaRef ds:uri="58fb48c5-ad38-47d1-9aa6-9b4f1dc114f9"/>
+    <ds:schemaRef ds:uri="aba9ad68-f961-4806-8372-ded3e8039a5f"/>
+  </ds:schemaRefs>
+</ds:datastoreItem>
 </file>
 
-<file path=customXml/itemProps1.xml><?xml version="1.0" encoding="utf-8"?>
+<file path=customXml/itemProps3.xml><?xml version="1.0" encoding="utf-8"?>
 <ds:datastoreItem xmlns:ds="http://schemas.openxmlformats.org/officeDocument/2006/customXml" ds:itemID="{06BBAEB0-F6D0-405B-9BC5-9D7675839774}">
   <ds:schemaRefs>
     <ds:schemaRef ds:uri="http://schemas.microsoft.com/office/2006/metadata/contentType"/>
@@ -29180,25 +28328,6 @@
 </ds:datastoreItem>
 </file>
 
-<file path=customXml/itemProps2.xml><?xml version="1.0" encoding="utf-8"?>
-<ds:datastoreItem xmlns:ds="http://schemas.openxmlformats.org/officeDocument/2006/customXml" ds:itemID="{25BAFF0C-A05A-49CE-A308-E2413E02AFCD}">
-  <ds:schemaRefs>
-    <ds:schemaRef ds:uri="http://schemas.microsoft.com/office/2006/metadata/properties"/>
-    <ds:schemaRef ds:uri="http://schemas.microsoft.com/office/infopath/2007/PartnerControls"/>
-    <ds:schemaRef ds:uri="58fb48c5-ad38-47d1-9aa6-9b4f1dc114f9"/>
-    <ds:schemaRef ds:uri="aba9ad68-f961-4806-8372-ded3e8039a5f"/>
-  </ds:schemaRefs>
-</ds:datastoreItem>
-</file>
-
-<file path=customXml/itemProps3.xml><?xml version="1.0" encoding="utf-8"?>
-<ds:datastoreItem xmlns:ds="http://schemas.openxmlformats.org/officeDocument/2006/customXml" ds:itemID="{C6DFF534-1887-4C42-BC36-EDACE7DE72C0}">
-  <ds:schemaRefs>
-    <ds:schemaRef ds:uri="http://schemas.microsoft.com/sharepoint/v3/contenttype/forms"/>
-  </ds:schemaRefs>
-</ds:datastoreItem>
-</file>
-
 <file path=docMetadata/LabelInfo.xml><?xml version="1.0" encoding="utf-8"?>
 <clbl:labelList xmlns:clbl="http://schemas.microsoft.com/office/2020/mipLabelMetadata">
   <clbl:label id="{0bfa236d-8472-42aa-9a40-ab46036c5596}" enabled="1" method="Standard" siteId="{e0793d39-0939-496d-b129-198edd916feb}" contentBits="0" removed="0"/>

</xml_diff>

<commit_message>
Adjust IP orchestrator triage
</commit_message>
<xml_diff>
--- a/docs/orchestrator_kb.docx
+++ b/docs/orchestrator_kb.docx
@@ -335,7 +335,15 @@
     </w:p>
     <w:p>
       <w:r>
-        <w:t>* One-way confidentiality undertaking executed “in favour of and for the benefit of Client” where the document is structured as:</w:t>
+        <w:t xml:space="preserve">* One-way confidentiality undertaking executed “in </w:t>
+      </w:r>
+      <w:proofErr w:type="spellStart"/>
+      <w:r>
+        <w:t>favour</w:t>
+      </w:r>
+      <w:proofErr w:type="spellEnd"/>
+      <w:r>
+        <w:t xml:space="preserve"> of and for the benefit of Client” where the document is structured as:</w:t>
       </w:r>
     </w:p>
     <w:p>
@@ -361,7 +369,15 @@
     </w:p>
     <w:p>
       <w:r>
-        <w:t>* Confidentiality undertaking where the only clear one-way structure is caused by the format “TO: Client / FROM: Recipient” and the document also contains a separate Individual NDA triage signal requiring Permitted Users, personnel, employees, advisers, agents, representatives, or other persons to execute a non-disclosure undertaking directly in favour of Client</w:t>
+        <w:t xml:space="preserve">* Confidentiality undertaking where the only clear one-way structure is caused by the format “TO: Client / FROM: Recipient” and the document also contains a separate Individual NDA triage signal requiring Permitted Users, personnel, employees, advisers, agents, representatives, or other persons to execute a non-disclosure undertaking directly in </w:t>
+      </w:r>
+      <w:proofErr w:type="spellStart"/>
+      <w:r>
+        <w:t>favour</w:t>
+      </w:r>
+      <w:proofErr w:type="spellEnd"/>
+      <w:r>
+        <w:t xml:space="preserve"> of Client</w:t>
       </w:r>
     </w:p>
     <w:p>
@@ -376,7 +392,15 @@
     </w:p>
     <w:p>
       <w:r>
-        <w:t xml:space="preserve">  * “in favour of and for the benefit of Client”</w:t>
+        <w:t xml:space="preserve">  * “in </w:t>
+      </w:r>
+      <w:proofErr w:type="spellStart"/>
+      <w:r>
+        <w:t>favour</w:t>
+      </w:r>
+      <w:proofErr w:type="spellEnd"/>
+      <w:r>
+        <w:t xml:space="preserve"> of and for the benefit of Client”</w:t>
       </w:r>
     </w:p>
     <w:p>
@@ -391,7 +415,15 @@
     </w:p>
     <w:p>
       <w:r>
-        <w:t xml:space="preserve">  * “executed a non-disclosure Undertaking in favour of Client”</w:t>
+        <w:t xml:space="preserve">  * “executed a non-disclosure Undertaking in </w:t>
+      </w:r>
+      <w:proofErr w:type="spellStart"/>
+      <w:r>
+        <w:t>favour</w:t>
+      </w:r>
+      <w:proofErr w:type="spellEnd"/>
+      <w:r>
+        <w:t xml:space="preserve"> of Client”</w:t>
       </w:r>
     </w:p>
     <w:p>
@@ -401,12 +433,28 @@
     </w:p>
     <w:p>
       <w:r>
-        <w:t xml:space="preserve">  * “Recipient executes this Undertaking in favour of and for the benefit of Client”; and</w:t>
-      </w:r>
-    </w:p>
-    <w:p>
-      <w:r>
-        <w:t xml:space="preserve">  * “Permitted User shall have executed a non-disclosure Undertaking in favour of Client”</w:t>
+        <w:t xml:space="preserve">  * “Recipient executes this Undertaking in </w:t>
+      </w:r>
+      <w:proofErr w:type="spellStart"/>
+      <w:r>
+        <w:t>favour</w:t>
+      </w:r>
+      <w:proofErr w:type="spellEnd"/>
+      <w:r>
+        <w:t xml:space="preserve"> of and for the benefit of Client”; and</w:t>
+      </w:r>
+    </w:p>
+    <w:p>
+      <w:r>
+        <w:t xml:space="preserve">  * “Permitted User shall have executed a non-disclosure Undertaking in </w:t>
+      </w:r>
+      <w:proofErr w:type="spellStart"/>
+      <w:r>
+        <w:t>favour</w:t>
+      </w:r>
+      <w:proofErr w:type="spellEnd"/>
+      <w:r>
+        <w:t xml:space="preserve"> of Client”</w:t>
       </w:r>
     </w:p>
     <w:p>
@@ -638,7 +686,15 @@
     </w:p>
     <w:p>
       <w:r>
-        <w:t>* “Vertragsstrafe”</w:t>
+        <w:t>* “</w:t>
+      </w:r>
+      <w:proofErr w:type="spellStart"/>
+      <w:r>
+        <w:t>Vertragsstrafe</w:t>
+      </w:r>
+      <w:proofErr w:type="spellEnd"/>
+      <w:r>
+        <w:t>”</w:t>
       </w:r>
     </w:p>
     <w:p>
@@ -775,7 +831,15 @@
     </w:p>
     <w:p>
       <w:r>
-        <w:t>Employees, contractors, consultants, Representatives, Authorised Persons, Authorized Persons, or other personnel of Accenture are required to:</w:t>
+        <w:t xml:space="preserve">Employees, contractors, consultants, Representatives, </w:t>
+      </w:r>
+      <w:proofErr w:type="spellStart"/>
+      <w:r>
+        <w:t>Authorised</w:t>
+      </w:r>
+      <w:proofErr w:type="spellEnd"/>
+      <w:r>
+        <w:t xml:space="preserve"> Persons, Authorized Persons, or other personnel of Accenture are required to:</w:t>
       </w:r>
     </w:p>
     <w:p>
@@ -855,7 +919,15 @@
     </w:p>
     <w:p>
       <w:r>
-        <w:t>* “execute a non-disclosure undertaking in favour of Client”</w:t>
+        <w:t xml:space="preserve">* “execute a non-disclosure undertaking in </w:t>
+      </w:r>
+      <w:proofErr w:type="spellStart"/>
+      <w:r>
+        <w:t>favour</w:t>
+      </w:r>
+      <w:proofErr w:type="spellEnd"/>
+      <w:r>
+        <w:t xml:space="preserve"> of Client”</w:t>
       </w:r>
     </w:p>
     <w:p>
@@ -1043,7 +1115,15 @@
     </w:p>
     <w:p>
       <w:r>
-        <w:t xml:space="preserve">  * “in favour of Client”</w:t>
+        <w:t xml:space="preserve">  * “in </w:t>
+      </w:r>
+      <w:proofErr w:type="spellStart"/>
+      <w:r>
+        <w:t>favour</w:t>
+      </w:r>
+      <w:proofErr w:type="spellEnd"/>
+      <w:r>
+        <w:t xml:space="preserve"> of Client”</w:t>
       </w:r>
     </w:p>
     <w:p>
@@ -1389,124 +1469,861 @@
     </w:p>
     <w:p>
       <w:r>
+        <w:t>* “grants ownership of all intellectual property”</w:t>
+      </w:r>
+    </w:p>
+    <w:p>
+      <w:r>
+        <w:lastRenderedPageBreak/>
+        <w:t>* “grant ownership of all intellectual property”</w:t>
+      </w:r>
+    </w:p>
+    <w:p>
+      <w:r>
+        <w:t>* “ownership of all intellectual property disclosed”</w:t>
+      </w:r>
+    </w:p>
+    <w:p>
+      <w:r>
+        <w:t>* Clause contains BOTH:</w:t>
+      </w:r>
+    </w:p>
+    <w:p>
+      <w:r>
+        <w:t xml:space="preserve">  * “grants ownership”</w:t>
+      </w:r>
+    </w:p>
+    <w:p>
+      <w:r>
+        <w:t xml:space="preserve">  * “intellectual property”</w:t>
+      </w:r>
+    </w:p>
+    <w:p>
+      <w:r>
         <w:t xml:space="preserve"> </w:t>
       </w:r>
     </w:p>
     <w:p>
       <w:r>
+        <w:t>## Do NOT Trigger</w:t>
+      </w:r>
+    </w:p>
+    <w:p>
+      <w:r>
+        <w:t>* Each party retains its existing IP</w:t>
+      </w:r>
+    </w:p>
+    <w:p>
+      <w:r>
+        <w:t>* No IP rights are transferred</w:t>
+      </w:r>
+    </w:p>
+    <w:p>
+      <w:r>
+        <w:t>* No license is granted</w:t>
+      </w:r>
+    </w:p>
+    <w:p>
+      <w:r>
+        <w:t>* No rights are granted by implication, estoppel, or otherwise</w:t>
+      </w:r>
+    </w:p>
+    <w:p>
+      <w:r>
+        <w:t>* Confidential Information remains the exclusive property of the Disclosing Party without transferring Accenture-created materials or work product</w:t>
+      </w:r>
+    </w:p>
+    <w:p>
+      <w:r>
+        <w:t>* IP use is limited solely to use of confidential information for the stated purpose</w:t>
+      </w:r>
+    </w:p>
+    <w:p>
+      <w:r>
+        <w:t>* Standard “no license granted” language</w:t>
+      </w:r>
+    </w:p>
+    <w:p>
+      <w:r>
+        <w:t>* “Nothing shall be construed as transferring ownership”</w:t>
+      </w:r>
+    </w:p>
+    <w:p>
+      <w:r>
+        <w:t>* “Company acknowledges it acquires no rights”</w:t>
+      </w:r>
+    </w:p>
+    <w:p>
+      <w:r>
+        <w:t>* “Recipient acquires no rights”</w:t>
+      </w:r>
+    </w:p>
+    <w:p>
+      <w:r>
+        <w:t>* “Discloser retains all rights, title and interest in and to the Proprietary Information”</w:t>
+      </w:r>
+    </w:p>
+    <w:p>
+      <w:r>
+        <w:t>* Background IP definitions where each party retains pre-existing IP</w:t>
+      </w:r>
+    </w:p>
+    <w:p>
+      <w:r>
+        <w:t>* Confidentiality-only obligations with no IP transfer</w:t>
+      </w:r>
+    </w:p>
+    <w:p>
+      <w:r>
+        <w:t>* Clause only states that unauthorized use or disclosure does not grant rights</w:t>
+      </w:r>
+    </w:p>
+    <w:p>
+      <w:r>
+        <w:t>* Clause only confirms that Confidential Information remains owned by the Disclosing Party in a unilateral NDA</w:t>
+      </w:r>
+    </w:p>
+    <w:p>
+      <w:r>
+        <w:t>* Clause only states that intellectual property rights in, emanating from, derived from, or related to Confidential Information belong to the Disclosing Party</w:t>
+      </w:r>
+    </w:p>
+    <w:p>
+      <w:r>
         <w:lastRenderedPageBreak/>
+        <w:t>* Clause only confirms that the Receiving Party / Receiver / Recipient has no rights in respect of Confidential Information except rights expressly granted under the Agreement</w:t>
+      </w:r>
+    </w:p>
+    <w:p>
+      <w:r>
+        <w:t>* Clause only confirms that Confidential Information and related intellectual property rights remain owned by the Disclosing Party</w:t>
+      </w:r>
+    </w:p>
+    <w:p>
+      <w:r>
+        <w:t>* Clause contains ownership-retention language related only to Confidential Information, and does not contain assignment, transfer, vesting, waiver, work product, developed work, works made for hire, inventions assigned, moral rights waiver, deliverables, or feedback ownership language</w:t>
+      </w:r>
+    </w:p>
+    <w:p>
+      <w:r>
+        <w:t>* Do NOT route IP Ownership / Transfer if the clause only confirms ownership or retention of the Disclosing Party’s pre-existing Confidential Information or related intellectual property rights</w:t>
+      </w:r>
+    </w:p>
+    <w:p>
+      <w:r>
+        <w:t>* Do NOT route IP Ownership / Transfer where “property of the Company” or “property of the Disclosing Party” refers only to pre-existing Confidential Information and does not include deliverables, project results, work product, developed work, inventions, copyright, assignment, transfer, vesting, waiver, or feedback ownership language.</w:t>
+      </w:r>
+    </w:p>
+    <w:p>
+      <w:r>
+        <w:t>* Do NOT suppress IP Ownership / Transfer based only on a separate no-license clause if another clause expressly states that deliverables, project results, developed work, or work product will be property of the counterparty.</w:t>
+      </w:r>
+    </w:p>
+    <w:p>
+      <w:r>
+        <w:t xml:space="preserve"> </w:t>
+      </w:r>
+    </w:p>
+    <w:p>
+      <w:r>
+        <w:t>---</w:t>
+      </w:r>
+    </w:p>
+    <w:p>
+      <w:r>
+        <w:t xml:space="preserve"> </w:t>
+      </w:r>
+    </w:p>
+    <w:p>
+      <w:r>
+        <w:t># 5. Non-Solicitation Obligations</w:t>
+      </w:r>
+    </w:p>
+    <w:p>
+      <w:r>
+        <w:t>Type: COMMERCIAL / OPERATIONAL</w:t>
+      </w:r>
+    </w:p>
+    <w:p>
+      <w:r>
+        <w:t>## Definition</w:t>
+      </w:r>
+    </w:p>
+    <w:p>
+      <w:r>
+        <w:t>Restricts the solicitation, recruitment, hiring, employment, engagement, or retention of the other party’s employees, contractors, consultants, directors, officers, agents, or personnel.</w:t>
+      </w:r>
+    </w:p>
+    <w:p>
+      <w:r>
+        <w:t>## Non-Solicitation Snippet Extraction Rule</w:t>
+      </w:r>
+    </w:p>
+    <w:p>
+      <w:r>
+        <w:t>For Non-Solicitation triage only, if any Non-Solicitation Triage Signal is detected, the extracted snippet MUST include:</w:t>
+      </w:r>
+    </w:p>
+    <w:p>
+      <w:r>
+        <w:t>* the full sentence containing the matched Triage Signal;</w:t>
+      </w:r>
+    </w:p>
+    <w:p>
+      <w:r>
+        <w:lastRenderedPageBreak/>
+        <w:t>* the immediately preceding sentence, if any;</w:t>
+      </w:r>
+    </w:p>
+    <w:p>
+      <w:r>
+        <w:t>* the immediately following sentence, if any; and</w:t>
+      </w:r>
+    </w:p>
+    <w:p>
+      <w:r>
+        <w:t>* any carve-out sentence in the same clause beginning with “However,” “Provided,” “provided, however,” “Such restrictions shall not apply,” “This shall not prohibit,” or similar carve-out wording.</w:t>
+      </w:r>
+    </w:p>
+    <w:p>
+      <w:r>
+        <w:t>* “However”</w:t>
+      </w:r>
+    </w:p>
+    <w:p>
+      <w:r>
+        <w:t>* “advertisements in the media”</w:t>
+      </w:r>
+    </w:p>
+    <w:p>
+      <w:r>
+        <w:t>* “own initiative”</w:t>
+      </w:r>
+    </w:p>
+    <w:p>
+      <w:r>
+        <w:t>* “burden of proof”</w:t>
+      </w:r>
+    </w:p>
+    <w:p>
+      <w:r>
+        <w:t>For Non-Solicitation triage only, if the snippet contains either:</w:t>
+      </w:r>
+    </w:p>
+    <w:p>
+      <w:r>
+        <w:t>* “solicit for employment or engagement”; or</w:t>
+      </w:r>
+    </w:p>
+    <w:p>
+      <w:r>
+        <w:t>* “solicit personnel”</w:t>
+      </w:r>
+    </w:p>
+    <w:p>
+      <w:r>
+        <w:t>the extracted snippet MUST include any same-clause carve-out sentence containing:</w:t>
+      </w:r>
+    </w:p>
+    <w:p>
+      <w:r>
+        <w:t>* “generalized searches for employees”</w:t>
+      </w:r>
+    </w:p>
+    <w:p>
+      <w:r>
+        <w:t>* “bona fide public advertisements in the media”</w:t>
+      </w:r>
+    </w:p>
+    <w:p>
+      <w:r>
+        <w:t>* “not targeted specifically”</w:t>
+      </w:r>
+    </w:p>
+    <w:p>
+      <w:r>
+        <w:t>* “voluntarily seeks employment”</w:t>
+      </w:r>
+    </w:p>
+    <w:p>
+      <w:r>
+        <w:t>* “own initiative”</w:t>
+      </w:r>
+    </w:p>
+    <w:p>
+      <w:r>
+        <w:t>* “employment advertisements”</w:t>
+      </w:r>
+    </w:p>
+    <w:p>
+      <w:r>
+        <w:t>* “newspaper”</w:t>
+      </w:r>
+    </w:p>
+    <w:p>
+      <w:r>
+        <w:t>* “trade publication”</w:t>
+      </w:r>
+    </w:p>
+    <w:p>
+      <w:r>
+        <w:t>* “public commercial media”</w:t>
+      </w:r>
+    </w:p>
+    <w:p>
+      <w:r>
+        <w:t>* “general advertisement”</w:t>
+      </w:r>
+    </w:p>
+    <w:p>
+      <w:r>
+        <w:t>* “unsolicited applicants”</w:t>
+      </w:r>
+    </w:p>
+    <w:p>
+      <w:r>
+        <w:t>If the carve-out sentence is not included in the extracted snippet, DO NOT finalize routing for Non-Solicitation until the full clause-level snippet has been captured.</w:t>
+      </w:r>
+    </w:p>
+    <w:p>
+      <w:r>
+        <w:lastRenderedPageBreak/>
+        <w:t>* For Non-Solicitation triage, capture any duration language contained in the same clause or expressly incorporated by that clause. Do not use a separate general agreement-term provision to suppress routing unless the Non-Solicitation clause expressly refers to it.</w:t>
+      </w:r>
+    </w:p>
+    <w:p>
+      <w:r>
+        <w:t>## Triage Signals</w:t>
+      </w:r>
+    </w:p>
+    <w:p>
+      <w:r>
+        <w:t>Route only if one or more of the following appears in an employee/personnel restriction context:</w:t>
+      </w:r>
+    </w:p>
+    <w:p>
+      <w:r>
+        <w:t>* “non-solicitation”</w:t>
+      </w:r>
+    </w:p>
+    <w:p>
+      <w:r>
+        <w:t>* “non-solicitation of employees”</w:t>
+      </w:r>
+    </w:p>
+    <w:p>
+      <w:r>
+        <w:t>* “solicit employees”</w:t>
+      </w:r>
+    </w:p>
+    <w:p>
+      <w:r>
+        <w:t>* “solicit for employment”</w:t>
+      </w:r>
+    </w:p>
+    <w:p>
+      <w:r>
+        <w:t>* “seek to employ”</w:t>
+      </w:r>
+    </w:p>
+    <w:p>
+      <w:r>
+        <w:t>* “seek to retain the services”</w:t>
+      </w:r>
+    </w:p>
+    <w:p>
+      <w:r>
+        <w:t>* “hire any employee”</w:t>
+      </w:r>
+    </w:p>
+    <w:p>
+      <w:r>
+        <w:t>* “employ any employee”</w:t>
+      </w:r>
+    </w:p>
+    <w:p>
+      <w:r>
+        <w:t>* “recruit any employee”</w:t>
+      </w:r>
+    </w:p>
+    <w:p>
+      <w:r>
+        <w:t>* “engage any employee”</w:t>
+      </w:r>
+    </w:p>
+    <w:p>
+      <w:r>
+        <w:t>* “employ, hire, or engage”</w:t>
+      </w:r>
+    </w:p>
+    <w:p>
+      <w:r>
+        <w:t>* “consultant of the Disclosing Party”</w:t>
+      </w:r>
+    </w:p>
+    <w:p>
+      <w:r>
+        <w:t>* “employee of the Disclosing Party”</w:t>
+      </w:r>
+    </w:p>
+    <w:p>
+      <w:r>
+        <w:t>* “other party’s personnel”</w:t>
+      </w:r>
+    </w:p>
+    <w:p>
+      <w:r>
+        <w:t>* “other party’s staff”</w:t>
+      </w:r>
+    </w:p>
+    <w:p>
+      <w:r>
+        <w:t>* “induce any employee to leave”</w:t>
+      </w:r>
+    </w:p>
+    <w:p>
+      <w:r>
+        <w:t>* “persuade any employee to leave”</w:t>
+      </w:r>
+    </w:p>
+    <w:p>
+      <w:r>
+        <w:t>* “encourage any employee to leave”</w:t>
+      </w:r>
+    </w:p>
+    <w:p>
+      <w:r>
+        <w:t>* “entice away”</w:t>
+      </w:r>
+    </w:p>
+    <w:p>
+      <w:r>
+        <w:t>* “Restricted Person”</w:t>
+      </w:r>
+    </w:p>
+    <w:p>
+      <w:r>
+        <w:t>* “solicit, engage, employ”</w:t>
+      </w:r>
+    </w:p>
+    <w:p>
+      <w:r>
+        <w:lastRenderedPageBreak/>
+        <w:t>* “contractor of the other party”</w:t>
+      </w:r>
+    </w:p>
+    <w:p>
+      <w:r>
+        <w:t>* “consultant of the other party”</w:t>
+      </w:r>
+    </w:p>
+    <w:p>
+      <w:r>
+        <w:t>* “director, officer and/or employee”</w:t>
+      </w:r>
+    </w:p>
+    <w:p>
+      <w:r>
+        <w:t>* “employee or independent contractor”</w:t>
+      </w:r>
+    </w:p>
+    <w:p>
+      <w:r>
+        <w:t>* “solicit personnel”</w:t>
+      </w:r>
+    </w:p>
+    <w:p>
+      <w:r>
+        <w:t>* “solicit personnel of the other party”</w:t>
+      </w:r>
+    </w:p>
+    <w:p>
+      <w:r>
+        <w:t>* “inducing them to join such other party’s employ”</w:t>
+      </w:r>
+    </w:p>
+    <w:p>
+      <w:r>
+        <w:t>* Clause contains BOTH:</w:t>
+      </w:r>
+    </w:p>
+    <w:p>
+      <w:r>
+        <w:t xml:space="preserve">  * “solicit personnel”</w:t>
+      </w:r>
+    </w:p>
+    <w:p>
+      <w:r>
+        <w:t xml:space="preserve">  * “other party”</w:t>
+      </w:r>
+    </w:p>
+    <w:p>
+      <w:r>
+        <w:t>* Clause contains BOTH:</w:t>
+      </w:r>
+    </w:p>
+    <w:p>
+      <w:r>
+        <w:t xml:space="preserve">  * “solicit personnel”</w:t>
+      </w:r>
+    </w:p>
+    <w:p>
+      <w:r>
+        <w:t xml:space="preserve">  * “inducing them to join”</w:t>
+      </w:r>
+    </w:p>
+    <w:p>
+      <w:r>
+        <w:t>* Clause contains ALL of the following:</w:t>
+      </w:r>
+    </w:p>
+    <w:p>
+      <w:r>
+        <w:t xml:space="preserve">  * “solicit personnel”</w:t>
+      </w:r>
+    </w:p>
+    <w:p>
+      <w:r>
+        <w:t xml:space="preserve">  * “engaged in the work contemplated”</w:t>
+      </w:r>
+    </w:p>
+    <w:p>
+      <w:r>
+        <w:t xml:space="preserve">  * “join such other party’s employ”</w:t>
+      </w:r>
+    </w:p>
+    <w:p>
+      <w:r>
+        <w:t xml:space="preserve"> </w:t>
+      </w:r>
+    </w:p>
+    <w:p>
+      <w:r>
         <w:t>## Do NOT Trigger</w:t>
       </w:r>
     </w:p>
     <w:p>
       <w:r>
-        <w:t>* Each party retains its existing IP</w:t>
-      </w:r>
-    </w:p>
-    <w:p>
-      <w:r>
-        <w:t>* No IP rights are transferred</w:t>
-      </w:r>
-    </w:p>
-    <w:p>
-      <w:r>
-        <w:t>* No license is granted</w:t>
-      </w:r>
-    </w:p>
-    <w:p>
-      <w:r>
-        <w:t>* No rights are granted by implication, estoppel, or otherwise</w:t>
-      </w:r>
-    </w:p>
-    <w:p>
-      <w:r>
-        <w:t>* Confidential Information remains the exclusive property of the Disclosing Party without transferring Accenture-created materials or work product</w:t>
-      </w:r>
-    </w:p>
-    <w:p>
-      <w:r>
-        <w:t>* IP use is limited solely to use of confidential information for the stated purpose</w:t>
-      </w:r>
-    </w:p>
-    <w:p>
-      <w:r>
-        <w:t>* Standard “no license granted” language</w:t>
-      </w:r>
-    </w:p>
-    <w:p>
-      <w:r>
-        <w:t>* “Nothing shall be construed as transferring ownership”</w:t>
-      </w:r>
-    </w:p>
-    <w:p>
-      <w:r>
-        <w:t>* “Company acknowledges it acquires no rights”</w:t>
-      </w:r>
-    </w:p>
-    <w:p>
-      <w:r>
-        <w:t>* “Recipient acquires no rights”</w:t>
-      </w:r>
-    </w:p>
-    <w:p>
-      <w:r>
-        <w:t>* “Discloser retains all rights, title and interest in and to the Proprietary Information”</w:t>
-      </w:r>
-    </w:p>
-    <w:p>
-      <w:r>
-        <w:t>* Background IP definitions where each party retains pre-existing IP</w:t>
-      </w:r>
-    </w:p>
-    <w:p>
-      <w:r>
-        <w:t>* Confidentiality-only obligations with no IP transfer</w:t>
-      </w:r>
-    </w:p>
-    <w:p>
-      <w:r>
-        <w:t>* Clause only states that unauthorized use or disclosure does not grant rights</w:t>
-      </w:r>
-    </w:p>
-    <w:p>
-      <w:r>
-        <w:t>* Clause only confirms that Confidential Information remains owned by the Disclosing Party in a unilateral NDA</w:t>
-      </w:r>
-    </w:p>
-    <w:p>
-      <w:r>
-        <w:t>* Clause only states that intellectual property rights in, emanating from, derived from, or related to Confidential Information belong to the Disclosing Party</w:t>
-      </w:r>
-    </w:p>
-    <w:p>
-      <w:r>
-        <w:t>* Clause only confirms that the Receiving Party / Receiver / Recipient has no rights in respect of Confidential Information except rights expressly granted under the Agreement</w:t>
-      </w:r>
-    </w:p>
-    <w:p>
-      <w:r>
-        <w:t>* Clause only confirms that Confidential Information and related intellectual property rights remain owned by the Disclosing Party</w:t>
-      </w:r>
-    </w:p>
-    <w:p>
-      <w:r>
-        <w:t>* Clause contains ownership-retention language related only to Confidential Information, and does not contain assignment, transfer, vesting, waiver, work product, developed work, works made for hire, inventions assigned, moral rights waiver, deliverables, or feedback ownership language</w:t>
+        <w:t>* Customer-only solicitation restrictions</w:t>
+      </w:r>
+    </w:p>
+    <w:p>
+      <w:r>
+        <w:t>* Vendor-only solicitation restrictions</w:t>
+      </w:r>
+    </w:p>
+    <w:p>
+      <w:r>
+        <w:t>* Supplier-only solicitation restrictions</w:t>
+      </w:r>
+    </w:p>
+    <w:p>
+      <w:r>
+        <w:t>* Restrictions limited to not interfering with business relationships without employee hiring or solicitation restrictions</w:t>
+      </w:r>
+    </w:p>
+    <w:p>
+      <w:r>
+        <w:t>* Restrictions limited to prospects or clients only</w:t>
       </w:r>
     </w:p>
     <w:p>
       <w:r>
         <w:lastRenderedPageBreak/>
-        <w:t>* Do NOT route IP Ownership / Transfer if the clause only confirms ownership or retention of the Disclosing Party’s pre-existing Confidential Information or related intellectual property rights</w:t>
-      </w:r>
-    </w:p>
-    <w:p>
-      <w:r>
-        <w:t>* Do NOT route IP Ownership / Transfer where “property of the Company” or “property of the Disclosing Party” refers only to pre-existing Confidential Information and does not include deliverables, project results, work product, developed work, inventions, copyright, assignment, transfer, vesting, waiver, or feedback ownership language.</w:t>
-      </w:r>
-    </w:p>
-    <w:p>
-      <w:r>
-        <w:t>* Do NOT suppress IP Ownership / Transfer based only on a separate no-license clause if another clause expressly states that deliverables, project results, developed work, or work product will be property of the counterparty.</w:t>
+        <w:t>* Mutual non-solicitation clause is limited to employees/personnel, includes standard recruitment carve-outs, applies equally to both Parties, and expressly states within the same clause that the non-solicitation restriction lasts 24 months or less</w:t>
+      </w:r>
+    </w:p>
+    <w:p>
+      <w:r>
+        <w:t>* Clause contains both “advertisements in the media” and “own initiative”</w:t>
+      </w:r>
+    </w:p>
+    <w:p>
+      <w:r>
+        <w:t>* Clause contains both “general advertisement” and “unsolicited contact”</w:t>
+      </w:r>
+    </w:p>
+    <w:p>
+      <w:r>
+        <w:t>* Clause contains both “generalized solicitations” and “not specifically targeted”</w:t>
+      </w:r>
+    </w:p>
+    <w:p>
+      <w:r>
+        <w:t>* Clause contains both “public job postings” and “unsolicited applicants”</w:t>
+      </w:r>
+    </w:p>
+    <w:p>
+      <w:r>
+        <w:t>* Clause contains both “bona fide recruitment advertisement” and “employment agency”</w:t>
+      </w:r>
+    </w:p>
+    <w:p>
+      <w:r>
+        <w:t>* Clause contains both “application for employment submitted on an unsolicited basis” and “general advertisement”</w:t>
+      </w:r>
+    </w:p>
+    <w:p>
+      <w:r>
+        <w:t>* Clause is acceptable employee non-solicitation language under the playbook and does not contain a liquidated damages, non-compete, or country supplement trigger</w:t>
+      </w:r>
+    </w:p>
+    <w:p>
+      <w:r>
+        <w:t>* Clause contains all of the following:</w:t>
+      </w:r>
+    </w:p>
+    <w:p>
+      <w:r>
+        <w:t xml:space="preserve">  * “during the term of this Agreement”</w:t>
+      </w:r>
+    </w:p>
+    <w:p>
+      <w:r>
+        <w:t xml:space="preserve">  * “actively seeks employment”</w:t>
+      </w:r>
+    </w:p>
+    <w:p>
+      <w:r>
+        <w:t xml:space="preserve">  * “general advertisement”</w:t>
+      </w:r>
+    </w:p>
+    <w:p>
+      <w:r>
+        <w:t xml:space="preserve">  * “without direct solicitation”</w:t>
+      </w:r>
+    </w:p>
+    <w:p>
+      <w:r>
+        <w:t>* Clause contains all of the following:</w:t>
+      </w:r>
+    </w:p>
+    <w:p>
+      <w:r>
+        <w:t xml:space="preserve">  * “Both Parties agree not to solicit”</w:t>
+      </w:r>
+    </w:p>
+    <w:p>
+      <w:r>
+        <w:t xml:space="preserve">  * “employee or independent contractor of the other Party”</w:t>
+      </w:r>
+    </w:p>
+    <w:p>
+      <w:r>
+        <w:t xml:space="preserve">  * “actively seeks employment”</w:t>
+      </w:r>
+    </w:p>
+    <w:p>
+      <w:r>
+        <w:t xml:space="preserve">  * “general advertisement”</w:t>
+      </w:r>
+    </w:p>
+    <w:p>
+      <w:r>
+        <w:t>* Clause contains all of the following:</w:t>
+      </w:r>
+    </w:p>
+    <w:p>
+      <w:r>
+        <w:t xml:space="preserve">  * “not to solicit any employee or independent contractor”</w:t>
+      </w:r>
+    </w:p>
+    <w:p>
+      <w:r>
+        <w:t xml:space="preserve">  * “during the term of this Agreement”</w:t>
+      </w:r>
+    </w:p>
+    <w:p>
+      <w:r>
+        <w:t xml:space="preserve">  * “Such restrictions shall not apply”</w:t>
+      </w:r>
+    </w:p>
+    <w:p>
+      <w:r>
+        <w:t xml:space="preserve">  * “without direct solicitation”</w:t>
+      </w:r>
+    </w:p>
+    <w:p>
+      <w:r>
+        <w:lastRenderedPageBreak/>
+        <w:t>* Clause contains all of the following:</w:t>
+      </w:r>
+    </w:p>
+    <w:p>
+      <w:r>
+        <w:t xml:space="preserve">  * “employee or independent contractor of either Party actively seeks employment”</w:t>
+      </w:r>
+    </w:p>
+    <w:p>
+      <w:r>
+        <w:t xml:space="preserve">  * “whether in response to a general advertisement or otherwise”</w:t>
+      </w:r>
+    </w:p>
+    <w:p>
+      <w:r>
+        <w:t xml:space="preserve">  * “without direct solicitation by such employing Party”</w:t>
+      </w:r>
+    </w:p>
+    <w:p>
+      <w:r>
+        <w:t>* Clause contains all of the following:</w:t>
+      </w:r>
+    </w:p>
+    <w:p>
+      <w:r>
+        <w:t xml:space="preserve">  * “on behalf of any other business enterprise”</w:t>
+      </w:r>
+    </w:p>
+    <w:p>
+      <w:r>
+        <w:t xml:space="preserve">  * “during the term of this Agreement”</w:t>
+      </w:r>
+    </w:p>
+    <w:p>
+      <w:r>
+        <w:t xml:space="preserve">  * “general advertisement”</w:t>
+      </w:r>
+    </w:p>
+    <w:p>
+      <w:r>
+        <w:t xml:space="preserve">  * “without direct solicitation”</w:t>
+      </w:r>
+    </w:p>
+    <w:p>
+      <w:r>
+        <w:t>* Do NOT route Non-Solicitation if the only matched non-solicitation language is a mutual employee or independent contractor restriction and the same clause contains:</w:t>
+      </w:r>
+    </w:p>
+    <w:p>
+      <w:r>
+        <w:t xml:space="preserve">  * “during the term of this Agreement”</w:t>
+      </w:r>
+    </w:p>
+    <w:p>
+      <w:r>
+        <w:t xml:space="preserve">  * “Such restrictions shall not apply”</w:t>
+      </w:r>
+    </w:p>
+    <w:p>
+      <w:r>
+        <w:t xml:space="preserve">  * “actively seeks employment”</w:t>
+      </w:r>
+    </w:p>
+    <w:p>
+      <w:r>
+        <w:t xml:space="preserve">  * “general advertisement”</w:t>
+      </w:r>
+    </w:p>
+    <w:p>
+      <w:r>
+        <w:t xml:space="preserve">  * “without direct solicitation”</w:t>
+      </w:r>
+    </w:p>
+    <w:p>
+      <w:r>
+        <w:t>* Do NOT route Non-Solicitation if the same Non-Solicitation clause contains BOTH:</w:t>
+      </w:r>
+    </w:p>
+    <w:p>
+      <w:r>
+        <w:t xml:space="preserve">  * “advertisements in the media”</w:t>
+      </w:r>
+    </w:p>
+    <w:p>
+      <w:r>
+        <w:t xml:space="preserve">  * “own initiative”</w:t>
+      </w:r>
+    </w:p>
+    <w:p>
+      <w:r>
+        <w:t>* Do NOT route Non-Solicitation if the clause is limited to officers only and contains standard public-recruitment carve-outs.</w:t>
+      </w:r>
+    </w:p>
+    <w:p>
+      <w:r>
+        <w:t>* Clause contains all of the following:</w:t>
+      </w:r>
+    </w:p>
+    <w:p>
+      <w:r>
+        <w:t xml:space="preserve">  * “any officer of the Company”</w:t>
+      </w:r>
+    </w:p>
+    <w:p>
+      <w:r>
+        <w:t xml:space="preserve">  * “generalized searches for employees”</w:t>
+      </w:r>
+    </w:p>
+    <w:p>
+      <w:r>
+        <w:t xml:space="preserve">  * “bona fide public advertisements in the media”</w:t>
+      </w:r>
+    </w:p>
+    <w:p>
+      <w:r>
+        <w:t xml:space="preserve">  * “not targeted specifically at employees of the Company”</w:t>
+      </w:r>
+    </w:p>
+    <w:p>
+      <w:r>
+        <w:t>* Clause contains all of the following:</w:t>
+      </w:r>
+    </w:p>
+    <w:p>
+      <w:r>
+        <w:lastRenderedPageBreak/>
+        <w:t xml:space="preserve">  * “solicitation of any such person”</w:t>
+      </w:r>
+    </w:p>
+    <w:p>
+      <w:r>
+        <w:t xml:space="preserve">  * “generalized searches for employees”</w:t>
+      </w:r>
+    </w:p>
+    <w:p>
+      <w:r>
+        <w:t xml:space="preserve">  * “bona fide public advertisements in the media”</w:t>
+      </w:r>
+    </w:p>
+    <w:p>
+      <w:r>
+        <w:t xml:space="preserve">  * “not targeted specifically”</w:t>
+      </w:r>
+    </w:p>
+    <w:p>
+      <w:r>
+        <w:t>* Clause contains all of the following:</w:t>
+      </w:r>
+    </w:p>
+    <w:p>
+      <w:r>
+        <w:t xml:space="preserve">  * “employ or engage, or solicit for employment or engagement”</w:t>
+      </w:r>
+    </w:p>
+    <w:p>
+      <w:r>
+        <w:t xml:space="preserve">  * “any officer of the Company”</w:t>
+      </w:r>
+    </w:p>
+    <w:p>
+      <w:r>
+        <w:t xml:space="preserve">  * “bona fide public advertisements in the media”</w:t>
+      </w:r>
+    </w:p>
+    <w:p>
+      <w:r>
+        <w:t xml:space="preserve">  * “not targeted specifically”</w:t>
+      </w:r>
+    </w:p>
+    <w:p>
+      <w:r>
+        <w:t>* Do NOT infer the duration of a Non-Solicitation restriction from the general term, expiration, or termination provision of the Agreement unless the Non-Solicitation clause expressly states that it applies only during that term or expressly cross-references that provision.</w:t>
+      </w:r>
+    </w:p>
+    <w:p/>
+    <w:p>
+      <w:r>
+        <w:t>* If the Non-Solicitation clause does not contain an express duration and does not expressly incorporate the Agreement term, the “24 months or less” Do NOT Trigger rule does not apply.</w:t>
       </w:r>
     </w:p>
     <w:p>
@@ -1516,7 +2333,48 @@
     </w:p>
     <w:p>
       <w:r>
-        <w:t>---</w:t>
+        <w:t>## Country Supplement Override</w:t>
+      </w:r>
+    </w:p>
+    <w:p>
+      <w:r>
+        <w:t>* If the NDA is connected to the Nordics Market Unit and contains any non-solicitation clause, route to Non-Solicitation even if standard carve-outs are present.</w:t>
+      </w:r>
+    </w:p>
+    <w:p>
+      <w:r>
+        <w:t>* Nordics non-solicitation must be routed because the playbook states it should be removed in all cases.</w:t>
+      </w:r>
+    </w:p>
+    <w:p>
+      <w:r>
+        <w:t># 6. Non-Compete / Exclusivity</w:t>
+      </w:r>
+    </w:p>
+    <w:p>
+      <w:r>
+        <w:t>Type: STRATEGIC / COMMERCIAL</w:t>
+      </w:r>
+    </w:p>
+    <w:p>
+      <w:r>
+        <w:t>## Definition</w:t>
+      </w:r>
+    </w:p>
+    <w:p>
+      <w:r>
+        <w:t>Restricts competitive business activities, market participation, provision of services to third parties, provision of services to competitors or other clients, exclusive dealing, pursuit of business opportunities, or engagement with competing enterprises.</w:t>
+      </w:r>
+    </w:p>
+    <w:p>
+      <w:r>
+        <w:lastRenderedPageBreak/>
+        <w:t>This risk applies where the NDA clearly limits Accenture’s ability to compete, serve other clients, work with competitors, pursue future business, participate in a market, or conduct business independently.</w:t>
+      </w:r>
+    </w:p>
+    <w:p>
+      <w:r>
+        <w:t>This risk also includes obligations requiring Accenture to disclose, notify, indicate, or report existing or potential work, contracts, consulting relationships, or service relationships with competitors of the client where the obligation is tied to competitor status and may constrain Accenture’s ability to serve other clients or competitors.</w:t>
       </w:r>
     </w:p>
     <w:p>
@@ -1526,1076 +2384,329 @@
     </w:p>
     <w:p>
       <w:r>
-        <w:t># 5. Non-Solicitation Obligations</w:t>
-      </w:r>
-    </w:p>
-    <w:p>
-      <w:r>
-        <w:t>Type: COMMERCIAL / OPERATIONAL</w:t>
-      </w:r>
-    </w:p>
-    <w:p>
-      <w:r>
-        <w:t>## Definition</w:t>
-      </w:r>
-    </w:p>
-    <w:p>
-      <w:r>
-        <w:t>Restricts the solicitation, recruitment, hiring, employment, engagement, or retention of the other party’s employees, contractors, consultants, directors, officers, agents, or personnel.</w:t>
-      </w:r>
-    </w:p>
-    <w:p>
-      <w:r>
-        <w:t>## Non-Solicitation Snippet Extraction Rule</w:t>
-      </w:r>
-    </w:p>
-    <w:p>
-      <w:r>
-        <w:t>For Non-Solicitation triage only, if any Non-Solicitation Triage Signal is detected, the extracted snippet MUST include:</w:t>
-      </w:r>
-    </w:p>
-    <w:p>
-      <w:r>
-        <w:t>* the full sentence containing the matched Triage Signal;</w:t>
-      </w:r>
-    </w:p>
-    <w:p>
-      <w:r>
-        <w:t>* the immediately preceding sentence, if any;</w:t>
-      </w:r>
-    </w:p>
-    <w:p>
-      <w:r>
-        <w:t>* the immediately following sentence, if any; and</w:t>
-      </w:r>
-    </w:p>
-    <w:p>
-      <w:r>
-        <w:t>* any carve-out sentence in the same clause beginning with “However,” “Provided,” “provided, however,” “Such restrictions shall not apply,” “This shall not prohibit,” or similar carve-out wording.</w:t>
-      </w:r>
-    </w:p>
-    <w:p>
-      <w:r>
-        <w:t>* “However”</w:t>
-      </w:r>
-    </w:p>
-    <w:p>
-      <w:r>
-        <w:t>* “advertisements in the media”</w:t>
+        <w:t>## Triage Signals</w:t>
+      </w:r>
+    </w:p>
+    <w:p>
+      <w:r>
+        <w:t>* “non-compete”</w:t>
+      </w:r>
+    </w:p>
+    <w:p>
+      <w:r>
+        <w:t>* “non-competition”</w:t>
+      </w:r>
+    </w:p>
+    <w:p>
+      <w:r>
+        <w:t>* “exclusive” or “exclusivity”</w:t>
+      </w:r>
+    </w:p>
+    <w:p>
+      <w:r>
+        <w:t>* “exclusive basis”</w:t>
+      </w:r>
+    </w:p>
+    <w:p>
+      <w:r>
+        <w:t>* “competition restriction”</w:t>
+      </w:r>
+    </w:p>
+    <w:p>
+      <w:r>
+        <w:t>* “restrict services” to third parties</w:t>
+      </w:r>
+    </w:p>
+    <w:p>
+      <w:r>
+        <w:t>* “cannot provide services” to competitors or other clients</w:t>
+      </w:r>
+    </w:p>
+    <w:p>
+      <w:r>
+        <w:t>* “shall not provide services” to competitors or other clients</w:t>
+      </w:r>
+    </w:p>
+    <w:p>
+      <w:r>
+        <w:t>* “shall not enter into direct competition”</w:t>
+      </w:r>
+    </w:p>
+    <w:p>
+      <w:r>
+        <w:t>* “not to enter into direct competition”</w:t>
+      </w:r>
+    </w:p>
+    <w:p>
+      <w:r>
+        <w:t>* “Client Competitor”</w:t>
+      </w:r>
+    </w:p>
+    <w:p>
+      <w:r>
+        <w:t>* “competitor” or “competing enterprise” in a clause restricting business activity</w:t>
+      </w:r>
+    </w:p>
+    <w:p>
+      <w:r>
+        <w:t>* “like industry” in a clause restricting business activity</w:t>
+      </w:r>
+    </w:p>
+    <w:p>
+      <w:r>
+        <w:t>* “offer identical or like services”</w:t>
+      </w:r>
+    </w:p>
+    <w:p>
+      <w:r>
+        <w:t>* “competitive disadvantage”</w:t>
+      </w:r>
+    </w:p>
+    <w:p>
+      <w:r>
+        <w:t>* “causing any competition”</w:t>
+      </w:r>
+    </w:p>
+    <w:p>
+      <w:r>
+        <w:t>* “deal with one another on an exclusive basis”</w:t>
+      </w:r>
+    </w:p>
+    <w:p>
+      <w:r>
+        <w:t>* “restricts future services”</w:t>
       </w:r>
     </w:p>
     <w:p>
       <w:r>
         <w:lastRenderedPageBreak/>
-        <w:t>* “own initiative”</w:t>
-      </w:r>
-    </w:p>
-    <w:p>
-      <w:r>
-        <w:t>* “burden of proof”</w:t>
-      </w:r>
-    </w:p>
-    <w:p>
-      <w:r>
-        <w:t>For Non-Solicitation triage only, if the snippet contains either:</w:t>
-      </w:r>
-    </w:p>
-    <w:p>
-      <w:r>
-        <w:t>* “solicit for employment or engagement”; or</w:t>
-      </w:r>
-    </w:p>
-    <w:p>
-      <w:r>
-        <w:t>* “solicit personnel”</w:t>
-      </w:r>
-    </w:p>
-    <w:p>
-      <w:r>
-        <w:t>the extracted snippet MUST include any same-clause carve-out sentence containing:</w:t>
-      </w:r>
-    </w:p>
-    <w:p>
-      <w:r>
-        <w:t>* “generalized searches for employees”</w:t>
-      </w:r>
-    </w:p>
-    <w:p>
-      <w:r>
-        <w:t>* “bona fide public advertisements in the media”</w:t>
-      </w:r>
-    </w:p>
-    <w:p>
-      <w:r>
-        <w:t>* “not targeted specifically”</w:t>
-      </w:r>
-    </w:p>
-    <w:p>
-      <w:r>
-        <w:t>* “voluntarily seeks employment”</w:t>
-      </w:r>
-    </w:p>
-    <w:p>
-      <w:r>
-        <w:t>* “own initiative”</w:t>
-      </w:r>
-    </w:p>
-    <w:p>
-      <w:r>
-        <w:t>* “employment advertisements”</w:t>
-      </w:r>
-    </w:p>
-    <w:p>
-      <w:r>
-        <w:t>* “newspaper”</w:t>
-      </w:r>
-    </w:p>
-    <w:p>
-      <w:r>
-        <w:t>* “trade publication”</w:t>
-      </w:r>
-    </w:p>
-    <w:p>
-      <w:r>
-        <w:t>* “public commercial media”</w:t>
-      </w:r>
-    </w:p>
-    <w:p>
-      <w:r>
-        <w:t>* “general advertisement”</w:t>
-      </w:r>
-    </w:p>
-    <w:p>
-      <w:r>
-        <w:t>* “unsolicited applicants”</w:t>
-      </w:r>
-    </w:p>
-    <w:p>
-      <w:r>
-        <w:t>If the carve-out sentence is not included in the extracted snippet, DO NOT finalize routing for Non-Solicitation until the full clause-level snippet has been captured.</w:t>
-      </w:r>
-    </w:p>
-    <w:p>
-      <w:r>
-        <w:t>* For Non-Solicitation triage, capture any duration language contained in the same clause or expressly incorporated by that clause. Do not use a separate general agreement-term provision to suppress routing unless the Non-Solicitation clause expressly refers to it.</w:t>
-      </w:r>
-    </w:p>
-    <w:p>
-      <w:r>
-        <w:t>## Triage Signals</w:t>
-      </w:r>
-    </w:p>
-    <w:p>
-      <w:r>
-        <w:t>Route only if one or more of the following appears in an employee/personnel restriction context:</w:t>
-      </w:r>
-    </w:p>
-    <w:p>
-      <w:r>
-        <w:t>* “non-solicitation”</w:t>
-      </w:r>
-    </w:p>
-    <w:p>
-      <w:r>
-        <w:t>* “non-solicitation of employees”</w:t>
+        <w:t>* “provide future services” to other clients is restricted</w:t>
+      </w:r>
+    </w:p>
+    <w:p>
+      <w:r>
+        <w:t>* “pursuing business opportunities” is restricted</w:t>
+      </w:r>
+    </w:p>
+    <w:p>
+      <w:r>
+        <w:t>* “refrain from entering into any new business relationship”</w:t>
+      </w:r>
+    </w:p>
+    <w:p>
+      <w:r>
+        <w:t>* “not directly or indirectly contact, or negotiate with, a third party regarding a potential business relationship”</w:t>
+      </w:r>
+    </w:p>
+    <w:p>
+      <w:r>
+        <w:t>* “persuade any customer” to cease, reduce, or discontinue business</w:t>
+      </w:r>
+    </w:p>
+    <w:p>
+      <w:r>
+        <w:t>* “induce any customer” to cease, reduce, or discontinue business</w:t>
+      </w:r>
+    </w:p>
+    <w:p>
+      <w:r>
+        <w:t>* “persuade any vendor” to cease, reduce, or discontinue business</w:t>
+      </w:r>
+    </w:p>
+    <w:p>
+      <w:r>
+        <w:t>* “induce any vendor” to cease, reduce, or discontinue business</w:t>
+      </w:r>
+    </w:p>
+    <w:p>
+      <w:r>
+        <w:t>* “cease purchasing goods or services”</w:t>
+      </w:r>
+    </w:p>
+    <w:p>
+      <w:r>
+        <w:t>* “cease selling goods and services”</w:t>
+      </w:r>
+    </w:p>
+    <w:p>
+      <w:r>
+        <w:t>* “reduce or discontinue any business relationship”</w:t>
+      </w:r>
+    </w:p>
+    <w:p>
+      <w:r>
+        <w:t>* “prevented or restricted from performing services”</w:t>
+      </w:r>
+    </w:p>
+    <w:p>
+      <w:r>
+        <w:t>* “prevented or restricted from pursuing business opportunities”</w:t>
+      </w:r>
+    </w:p>
+    <w:p>
+      <w:r>
+        <w:t>* “direct competitor of the Client”</w:t>
+      </w:r>
+    </w:p>
+    <w:p>
+      <w:r>
+        <w:t>* “contracted to, working for, or consulting for”</w:t>
+      </w:r>
+    </w:p>
+    <w:p>
+      <w:r>
+        <w:t>* “working for, or consulting for any company which is a direct competitor”</w:t>
+      </w:r>
+    </w:p>
+    <w:p>
+      <w:r>
+        <w:t>* “indicate to you immediately” combined with “direct competitor”</w:t>
+      </w:r>
+    </w:p>
+    <w:p>
+      <w:r>
+        <w:t>* “notify” or “indicate” combined with “direct competitor of the Client”</w:t>
+      </w:r>
+    </w:p>
+    <w:p>
+      <w:r>
+        <w:t>* “disclose” or “report” combined with “working for” and “direct competitor”</w:t>
+      </w:r>
+    </w:p>
+    <w:p>
+      <w:r>
+        <w:t>* Clause contains BOTH:</w:t>
+      </w:r>
+    </w:p>
+    <w:p>
+      <w:r>
+        <w:t xml:space="preserve">  * “direct competitor of the Client”</w:t>
+      </w:r>
+    </w:p>
+    <w:p>
+      <w:r>
+        <w:t xml:space="preserve">  * “contracted to, working for, or consulting for”</w:t>
+      </w:r>
+    </w:p>
+    <w:p>
+      <w:r>
+        <w:t>* Clause contains BOTH:</w:t>
+      </w:r>
+    </w:p>
+    <w:p>
+      <w:r>
+        <w:t xml:space="preserve">  * “direct competitor”</w:t>
+      </w:r>
+    </w:p>
+    <w:p>
+      <w:r>
+        <w:t xml:space="preserve">  * “working for, or consulting for”</w:t>
       </w:r>
     </w:p>
     <w:p>
       <w:r>
         <w:lastRenderedPageBreak/>
-        <w:t>* “solicit employees”</w:t>
-      </w:r>
-    </w:p>
-    <w:p>
-      <w:r>
-        <w:t>* “solicit for employment”</w:t>
-      </w:r>
-    </w:p>
-    <w:p>
-      <w:r>
-        <w:t>* “seek to employ”</w:t>
-      </w:r>
-    </w:p>
-    <w:p>
-      <w:r>
-        <w:t>* “seek to retain the services”</w:t>
-      </w:r>
-    </w:p>
-    <w:p>
-      <w:r>
-        <w:t>* “hire any employee”</w:t>
-      </w:r>
-    </w:p>
-    <w:p>
-      <w:r>
-        <w:t>* “employ any employee”</w:t>
-      </w:r>
-    </w:p>
-    <w:p>
-      <w:r>
-        <w:t>* “recruit any employee”</w:t>
-      </w:r>
-    </w:p>
-    <w:p>
-      <w:r>
-        <w:t>* “engage any employee”</w:t>
-      </w:r>
-    </w:p>
-    <w:p>
-      <w:r>
-        <w:t>* “employ, hire, or engage”</w:t>
-      </w:r>
-    </w:p>
-    <w:p>
-      <w:r>
-        <w:t>* “consultant of the Disclosing Party”</w:t>
-      </w:r>
-    </w:p>
-    <w:p>
-      <w:r>
-        <w:t>* “employee of the Disclosing Party”</w:t>
-      </w:r>
-    </w:p>
-    <w:p>
-      <w:r>
-        <w:t>* “other party’s personnel”</w:t>
-      </w:r>
-    </w:p>
-    <w:p>
-      <w:r>
-        <w:t>* “other party’s staff”</w:t>
-      </w:r>
-    </w:p>
-    <w:p>
-      <w:r>
-        <w:t>* “induce any employee to leave”</w:t>
-      </w:r>
-    </w:p>
-    <w:p>
-      <w:r>
-        <w:t>* “persuade any employee to leave”</w:t>
-      </w:r>
-    </w:p>
-    <w:p>
-      <w:r>
-        <w:t>* “encourage any employee to leave”</w:t>
-      </w:r>
-    </w:p>
-    <w:p>
-      <w:r>
-        <w:t>* “entice away”</w:t>
-      </w:r>
-    </w:p>
-    <w:p>
-      <w:r>
-        <w:t>* “Restricted Person”</w:t>
-      </w:r>
-    </w:p>
-    <w:p>
-      <w:r>
-        <w:t>* “solicit, engage, employ”</w:t>
-      </w:r>
-    </w:p>
-    <w:p>
-      <w:r>
-        <w:t>* “contractor of the other party”</w:t>
-      </w:r>
-    </w:p>
-    <w:p>
-      <w:r>
-        <w:t>* “consultant of the other party”</w:t>
-      </w:r>
-    </w:p>
-    <w:p>
-      <w:r>
-        <w:t>* “director, officer and/or employee”</w:t>
-      </w:r>
-    </w:p>
-    <w:p>
-      <w:r>
-        <w:t>* “employee or independent contractor”</w:t>
-      </w:r>
-    </w:p>
-    <w:p>
-      <w:r>
-        <w:t>* “solicit personnel”</w:t>
-      </w:r>
-    </w:p>
-    <w:p>
-      <w:r>
-        <w:t>* “solicit personnel of the other party”</w:t>
-      </w:r>
-    </w:p>
-    <w:p>
-      <w:r>
-        <w:t>* “inducing them to join such other party’s employ”</w:t>
+        <w:t>* Clause contains ALL of the following:</w:t>
+      </w:r>
+    </w:p>
+    <w:p>
+      <w:r>
+        <w:t xml:space="preserve">  * “indicate”</w:t>
+      </w:r>
+    </w:p>
+    <w:p>
+      <w:r>
+        <w:t xml:space="preserve">  * “working for”</w:t>
+      </w:r>
+    </w:p>
+    <w:p>
+      <w:r>
+        <w:t xml:space="preserve">  * “consulting for”</w:t>
+      </w:r>
+    </w:p>
+    <w:p>
+      <w:r>
+        <w:t xml:space="preserve">  * “direct competitor”</w:t>
+      </w:r>
+    </w:p>
+    <w:p>
+      <w:r>
+        <w:t xml:space="preserve"> </w:t>
+      </w:r>
+    </w:p>
+    <w:p>
+      <w:r>
+        <w:t>## Do NOT Trigger</w:t>
+      </w:r>
+    </w:p>
+    <w:p>
+      <w:r>
+        <w:t>* Restrictions solely prevent misuse of confidential information for competitive purposes</w:t>
+      </w:r>
+    </w:p>
+    <w:p>
+      <w:r>
+        <w:t>* Standard confidentiality obligations that do not restrict business activities</w:t>
+      </w:r>
+    </w:p>
+    <w:p>
+      <w:r>
+        <w:t>* Provisions explicitly confirming parties may compete freely</w:t>
+      </w:r>
+    </w:p>
+    <w:p>
+      <w:r>
+        <w:t>* “exclusive jurisdiction” / “submit to the exclusive jurisdiction”</w:t>
+      </w:r>
+    </w:p>
+    <w:p>
+      <w:r>
+        <w:t>* “exclusive right to” in the context of court remedies or legal proceedings</w:t>
+      </w:r>
+    </w:p>
+    <w:p>
+      <w:r>
+        <w:t>* “exclusive property of the Disclosing Party” in a Confidential Information ownership clause</w:t>
+      </w:r>
+    </w:p>
+    <w:p>
+      <w:r>
+        <w:t>* “sole and exclusive property” in an IP ownership context</w:t>
+      </w:r>
+    </w:p>
+    <w:p>
+      <w:r>
+        <w:t>* Clause only limits use of Confidential Information to the Purpose or Project</w:t>
+      </w:r>
+    </w:p>
+    <w:p>
+      <w:r>
+        <w:t>* Clause only prohibits use of Confidential Information for purposes outside the NDA purpose</w:t>
+      </w:r>
+    </w:p>
+    <w:p>
+      <w:r>
+        <w:t>* Clause only prohibits contacting customers, suppliers, vendors, or connected persons for appraisal, evaluation, due diligence, Project review, or confidentiality-control purposes</w:t>
+      </w:r>
+    </w:p>
+    <w:p>
+      <w:r>
+        <w:t>* Clause only requires prior written consent before contacting customers, suppliers, vendors, or connected persons, without restricting competition, future services, market participation, or independent business activities</w:t>
+      </w:r>
+    </w:p>
+    <w:p>
+      <w:r>
+        <w:t>* Clause contains “make contact, directly or indirectly” but does not contain a clear competition, exclusivity, future-services, market-participation, customer-diversion, vendor-diversion, or business-opportunity restriction</w:t>
+      </w:r>
+    </w:p>
+    <w:p>
+      <w:r>
+        <w:t>* Clause contains “customer” or “supplier” but does not require the customer or supplier to cease, reduce, discontinue, or refrain from doing business with the Disclosing Party</w:t>
       </w:r>
     </w:p>
     <w:p>
       <w:r>
         <w:lastRenderedPageBreak/>
-        <w:t>* Clause contains BOTH:</w:t>
-      </w:r>
-    </w:p>
-    <w:p>
-      <w:r>
-        <w:t xml:space="preserve">  * “solicit personnel”</w:t>
-      </w:r>
-    </w:p>
-    <w:p>
-      <w:r>
-        <w:t xml:space="preserve">  * “other party”</w:t>
-      </w:r>
-    </w:p>
-    <w:p>
-      <w:r>
-        <w:t>* Clause contains BOTH:</w:t>
-      </w:r>
-    </w:p>
-    <w:p>
-      <w:r>
-        <w:t xml:space="preserve">  * “solicit personnel”</w:t>
-      </w:r>
-    </w:p>
-    <w:p>
-      <w:r>
-        <w:t xml:space="preserve">  * “inducing them to join”</w:t>
-      </w:r>
-    </w:p>
-    <w:p>
-      <w:r>
-        <w:t>* Clause contains ALL of the following:</w:t>
-      </w:r>
-    </w:p>
-    <w:p>
-      <w:r>
-        <w:t xml:space="preserve">  * “solicit personnel”</w:t>
-      </w:r>
-    </w:p>
-    <w:p>
-      <w:r>
-        <w:t xml:space="preserve">  * “engaged in the work contemplated”</w:t>
-      </w:r>
-    </w:p>
-    <w:p>
-      <w:r>
-        <w:t xml:space="preserve">  * “join such other party’s employ”</w:t>
-      </w:r>
-    </w:p>
-    <w:p>
-      <w:r>
-        <w:t xml:space="preserve"> </w:t>
-      </w:r>
-    </w:p>
-    <w:p>
-      <w:r>
-        <w:t>## Do NOT Trigger</w:t>
-      </w:r>
-    </w:p>
-    <w:p>
-      <w:r>
-        <w:t>* Customer-only solicitation restrictions</w:t>
-      </w:r>
-    </w:p>
-    <w:p>
-      <w:r>
-        <w:t>* Vendor-only solicitation restrictions</w:t>
-      </w:r>
-    </w:p>
-    <w:p>
-      <w:r>
-        <w:t>* Supplier-only solicitation restrictions</w:t>
-      </w:r>
-    </w:p>
-    <w:p>
-      <w:r>
-        <w:t>* Restrictions limited to not interfering with business relationships without employee hiring or solicitation restrictions</w:t>
-      </w:r>
-    </w:p>
-    <w:p>
-      <w:r>
-        <w:t>* Restrictions limited to prospects or clients only</w:t>
-      </w:r>
-    </w:p>
-    <w:p>
-      <w:r>
-        <w:t>* Mutual non-solicitation clause is limited to employees/personnel, includes standard recruitment carve-outs, applies equally to both Parties, and expressly states within the same clause that the non-solicitation restriction lasts 24 months or less</w:t>
-      </w:r>
-    </w:p>
-    <w:p>
-      <w:r>
-        <w:t>* Clause contains both “advertisements in the media” and “own initiative”</w:t>
-      </w:r>
-    </w:p>
-    <w:p>
-      <w:r>
-        <w:t>* Clause contains both “general advertisement” and “unsolicited contact”</w:t>
-      </w:r>
-    </w:p>
-    <w:p>
-      <w:r>
-        <w:t>* Clause contains both “generalized solicitations” and “not specifically targeted”</w:t>
-      </w:r>
-    </w:p>
-    <w:p>
-      <w:r>
-        <w:t>* Clause contains both “public job postings” and “unsolicited applicants”</w:t>
-      </w:r>
-    </w:p>
-    <w:p>
-      <w:r>
-        <w:t>* Clause contains both “bona fide recruitment advertisement” and “employment agency”</w:t>
-      </w:r>
-    </w:p>
-    <w:p>
-      <w:r>
-        <w:lastRenderedPageBreak/>
-        <w:t>* Clause contains both “application for employment submitted on an unsolicited basis” and “general advertisement”</w:t>
-      </w:r>
-    </w:p>
-    <w:p>
-      <w:r>
-        <w:t>* Clause is acceptable employee non-solicitation language under the playbook and does not contain a liquidated damages, non-compete, or country supplement trigger</w:t>
-      </w:r>
-    </w:p>
-    <w:p>
-      <w:r>
-        <w:t>* Clause contains all of the following:</w:t>
-      </w:r>
-    </w:p>
-    <w:p>
-      <w:r>
-        <w:t xml:space="preserve">  * “during the term of this Agreement”</w:t>
-      </w:r>
-    </w:p>
-    <w:p>
-      <w:r>
-        <w:t xml:space="preserve">  * “actively seeks employment”</w:t>
-      </w:r>
-    </w:p>
-    <w:p>
-      <w:r>
-        <w:t xml:space="preserve">  * “general advertisement”</w:t>
-      </w:r>
-    </w:p>
-    <w:p>
-      <w:r>
-        <w:t xml:space="preserve">  * “without direct solicitation”</w:t>
-      </w:r>
-    </w:p>
-    <w:p>
-      <w:r>
-        <w:t>* Clause contains all of the following:</w:t>
-      </w:r>
-    </w:p>
-    <w:p>
-      <w:r>
-        <w:t xml:space="preserve">  * “Both Parties agree not to solicit”</w:t>
-      </w:r>
-    </w:p>
-    <w:p>
-      <w:r>
-        <w:t xml:space="preserve">  * “employee or independent contractor of the other Party”</w:t>
-      </w:r>
-    </w:p>
-    <w:p>
-      <w:r>
-        <w:t xml:space="preserve">  * “actively seeks employment”</w:t>
-      </w:r>
-    </w:p>
-    <w:p>
-      <w:r>
-        <w:t xml:space="preserve">  * “general advertisement”</w:t>
-      </w:r>
-    </w:p>
-    <w:p>
-      <w:r>
-        <w:t>* Clause contains all of the following:</w:t>
-      </w:r>
-    </w:p>
-    <w:p>
-      <w:r>
-        <w:t xml:space="preserve">  * “not to solicit any employee or independent contractor”</w:t>
-      </w:r>
-    </w:p>
-    <w:p>
-      <w:r>
-        <w:t xml:space="preserve">  * “during the term of this Agreement”</w:t>
-      </w:r>
-    </w:p>
-    <w:p>
-      <w:r>
-        <w:t xml:space="preserve">  * “Such restrictions shall not apply”</w:t>
-      </w:r>
-    </w:p>
-    <w:p>
-      <w:r>
-        <w:t xml:space="preserve">  * “without direct solicitation”</w:t>
-      </w:r>
-    </w:p>
-    <w:p>
-      <w:r>
-        <w:t>* Clause contains all of the following:</w:t>
-      </w:r>
-    </w:p>
-    <w:p>
-      <w:r>
-        <w:t xml:space="preserve">  * “employee or independent contractor of either Party actively seeks employment”</w:t>
-      </w:r>
-    </w:p>
-    <w:p>
-      <w:r>
-        <w:t xml:space="preserve">  * “whether in response to a general advertisement or otherwise”</w:t>
-      </w:r>
-    </w:p>
-    <w:p>
-      <w:r>
-        <w:t xml:space="preserve">  * “without direct solicitation by such employing Party”</w:t>
-      </w:r>
-    </w:p>
-    <w:p>
-      <w:r>
-        <w:t>* Clause contains all of the following:</w:t>
-      </w:r>
-    </w:p>
-    <w:p>
-      <w:r>
-        <w:t xml:space="preserve">  * “on behalf of any other business enterprise”</w:t>
-      </w:r>
-    </w:p>
-    <w:p>
-      <w:r>
-        <w:t xml:space="preserve">  * “during the term of this Agreement”</w:t>
-      </w:r>
-    </w:p>
-    <w:p>
-      <w:r>
-        <w:t xml:space="preserve">  * “general advertisement”</w:t>
-      </w:r>
-    </w:p>
-    <w:p>
-      <w:r>
-        <w:lastRenderedPageBreak/>
-        <w:t xml:space="preserve">  * “without direct solicitation”</w:t>
-      </w:r>
-    </w:p>
-    <w:p>
-      <w:r>
-        <w:t>* Do NOT route Non-Solicitation if the only matched non-solicitation language is a mutual employee or independent contractor restriction and the same clause contains:</w:t>
-      </w:r>
-    </w:p>
-    <w:p>
-      <w:r>
-        <w:t xml:space="preserve">  * “during the term of this Agreement”</w:t>
-      </w:r>
-    </w:p>
-    <w:p>
-      <w:r>
-        <w:t xml:space="preserve">  * “Such restrictions shall not apply”</w:t>
-      </w:r>
-    </w:p>
-    <w:p>
-      <w:r>
-        <w:t xml:space="preserve">  * “actively seeks employment”</w:t>
-      </w:r>
-    </w:p>
-    <w:p>
-      <w:r>
-        <w:t xml:space="preserve">  * “general advertisement”</w:t>
-      </w:r>
-    </w:p>
-    <w:p>
-      <w:r>
-        <w:t xml:space="preserve">  * “without direct solicitation”</w:t>
-      </w:r>
-    </w:p>
-    <w:p>
-      <w:r>
-        <w:t>* Do NOT route Non-Solicitation if the same Non-Solicitation clause contains BOTH:</w:t>
-      </w:r>
-    </w:p>
-    <w:p>
-      <w:r>
-        <w:t xml:space="preserve">  * “advertisements in the media”</w:t>
-      </w:r>
-    </w:p>
-    <w:p>
-      <w:r>
-        <w:t xml:space="preserve">  * “own initiative”</w:t>
-      </w:r>
-    </w:p>
-    <w:p>
-      <w:r>
-        <w:t>* Do NOT route Non-Solicitation if the clause is limited to officers only and contains standard public-recruitment carve-outs.</w:t>
-      </w:r>
-    </w:p>
-    <w:p>
-      <w:r>
-        <w:t>* Clause contains all of the following:</w:t>
-      </w:r>
-    </w:p>
-    <w:p>
-      <w:r>
-        <w:t xml:space="preserve">  * “any officer of the Company”</w:t>
-      </w:r>
-    </w:p>
-    <w:p>
-      <w:r>
-        <w:t xml:space="preserve">  * “generalized searches for employees”</w:t>
-      </w:r>
-    </w:p>
-    <w:p>
-      <w:r>
-        <w:t xml:space="preserve">  * “bona fide public advertisements in the media”</w:t>
-      </w:r>
-    </w:p>
-    <w:p>
-      <w:r>
-        <w:t xml:space="preserve">  * “not targeted specifically at employees of the Company”</w:t>
-      </w:r>
-    </w:p>
-    <w:p>
-      <w:r>
-        <w:t>* Clause contains all of the following:</w:t>
-      </w:r>
-    </w:p>
-    <w:p>
-      <w:r>
-        <w:t xml:space="preserve">  * “solicitation of any such person”</w:t>
-      </w:r>
-    </w:p>
-    <w:p>
-      <w:r>
-        <w:t xml:space="preserve">  * “generalized searches for employees”</w:t>
-      </w:r>
-    </w:p>
-    <w:p>
-      <w:r>
-        <w:t xml:space="preserve">  * “bona fide public advertisements in the media”</w:t>
-      </w:r>
-    </w:p>
-    <w:p>
-      <w:r>
-        <w:t xml:space="preserve">  * “not targeted specifically”</w:t>
-      </w:r>
-    </w:p>
-    <w:p>
-      <w:r>
-        <w:t>* Clause contains all of the following:</w:t>
-      </w:r>
-    </w:p>
-    <w:p>
-      <w:r>
-        <w:t xml:space="preserve">  * “employ or engage, or solicit for employment or engagement”</w:t>
-      </w:r>
-    </w:p>
-    <w:p>
-      <w:r>
-        <w:t xml:space="preserve">  * “any officer of the Company”</w:t>
-      </w:r>
-    </w:p>
-    <w:p>
-      <w:r>
-        <w:t xml:space="preserve">  * “bona fide public advertisements in the media”</w:t>
-      </w:r>
-    </w:p>
-    <w:p>
-      <w:r>
-        <w:lastRenderedPageBreak/>
-        <w:t xml:space="preserve">  * “not targeted specifically”</w:t>
-      </w:r>
-    </w:p>
-    <w:p>
-      <w:r>
-        <w:t>* Do NOT infer the duration of a Non-Solicitation restriction from the general term, expiration, or termination provision of the Agreement unless the Non-Solicitation clause expressly states that it applies only during that term or expressly cross-references that provision.</w:t>
-      </w:r>
-    </w:p>
-    <w:p/>
-    <w:p>
-      <w:r>
-        <w:t>* If the Non-Solicitation clause does not contain an express duration and does not expressly incorporate the Agreement term, the “24 months or less” Do NOT Trigger rule does not apply.</w:t>
-      </w:r>
-    </w:p>
-    <w:p>
-      <w:r>
-        <w:t xml:space="preserve"> </w:t>
-      </w:r>
-    </w:p>
-    <w:p>
-      <w:r>
-        <w:t>## Country Supplement Override</w:t>
-      </w:r>
-    </w:p>
-    <w:p>
-      <w:r>
-        <w:t>* If the NDA is connected to the Nordics Market Unit and contains any non-solicitation clause, route to Non-Solicitation even if standard carve-outs are present.</w:t>
-      </w:r>
-    </w:p>
-    <w:p>
-      <w:r>
-        <w:t>* Nordics non-solicitation must be routed because the playbook states it should be removed in all cases.</w:t>
-      </w:r>
-    </w:p>
-    <w:p>
-      <w:r>
-        <w:t># 6. Non-Compete / Exclusivity</w:t>
-      </w:r>
-    </w:p>
-    <w:p>
-      <w:r>
-        <w:t>Type: STRATEGIC / COMMERCIAL</w:t>
-      </w:r>
-    </w:p>
-    <w:p>
-      <w:r>
-        <w:t>## Definition</w:t>
-      </w:r>
-    </w:p>
-    <w:p>
-      <w:r>
-        <w:t>Restricts competitive business activities, market participation, provision of services to third parties, provision of services to competitors or other clients, exclusive dealing, pursuit of business opportunities, or engagement with competing enterprises.</w:t>
-      </w:r>
-    </w:p>
-    <w:p>
-      <w:r>
-        <w:t>This risk applies where the NDA clearly limits Accenture’s ability to compete, serve other clients, work with competitors, pursue future business, participate in a market, or conduct business independently.</w:t>
-      </w:r>
-    </w:p>
-    <w:p>
-      <w:r>
-        <w:t>This risk also includes obligations requiring Accenture to disclose, notify, indicate, or report existing or potential work, contracts, consulting relationships, or service relationships with competitors of the client where the obligation is tied to competitor status and may constrain Accenture’s ability to serve other clients or competitors.</w:t>
-      </w:r>
-    </w:p>
-    <w:p>
-      <w:r>
-        <w:t xml:space="preserve"> </w:t>
-      </w:r>
-    </w:p>
-    <w:p>
-      <w:r>
-        <w:t>## Triage Signals</w:t>
-      </w:r>
-    </w:p>
-    <w:p>
-      <w:r>
-        <w:lastRenderedPageBreak/>
-        <w:t>* “non-compete”</w:t>
-      </w:r>
-    </w:p>
-    <w:p>
-      <w:r>
-        <w:t>* “non-competition”</w:t>
-      </w:r>
-    </w:p>
-    <w:p>
-      <w:r>
-        <w:t>* “exclusive” or “exclusivity”</w:t>
-      </w:r>
-    </w:p>
-    <w:p>
-      <w:r>
-        <w:t>* “exclusive basis”</w:t>
-      </w:r>
-    </w:p>
-    <w:p>
-      <w:r>
-        <w:t>* “competition restriction”</w:t>
-      </w:r>
-    </w:p>
-    <w:p>
-      <w:r>
-        <w:t>* “restrict services” to third parties</w:t>
-      </w:r>
-    </w:p>
-    <w:p>
-      <w:r>
-        <w:t>* “cannot provide services” to competitors or other clients</w:t>
-      </w:r>
-    </w:p>
-    <w:p>
-      <w:r>
-        <w:t>* “shall not provide services” to competitors or other clients</w:t>
-      </w:r>
-    </w:p>
-    <w:p>
-      <w:r>
-        <w:t>* “shall not enter into direct competition”</w:t>
-      </w:r>
-    </w:p>
-    <w:p>
-      <w:r>
-        <w:t>* “not to enter into direct competition”</w:t>
-      </w:r>
-    </w:p>
-    <w:p>
-      <w:r>
-        <w:t>* “Client Competitor”</w:t>
-      </w:r>
-    </w:p>
-    <w:p>
-      <w:r>
-        <w:t>* “competitor” or “competing enterprise” in a clause restricting business activity</w:t>
-      </w:r>
-    </w:p>
-    <w:p>
-      <w:r>
-        <w:t>* “like industry” in a clause restricting business activity</w:t>
-      </w:r>
-    </w:p>
-    <w:p>
-      <w:r>
-        <w:t>* “offer identical or like services”</w:t>
-      </w:r>
-    </w:p>
-    <w:p>
-      <w:r>
-        <w:t>* “competitive disadvantage”</w:t>
-      </w:r>
-    </w:p>
-    <w:p>
-      <w:r>
-        <w:t>* “causing any competition”</w:t>
-      </w:r>
-    </w:p>
-    <w:p>
-      <w:r>
-        <w:t>* “deal with one another on an exclusive basis”</w:t>
-      </w:r>
-    </w:p>
-    <w:p>
-      <w:r>
-        <w:t>* “restricts future services”</w:t>
-      </w:r>
-    </w:p>
-    <w:p>
-      <w:r>
-        <w:t>* “provide future services” to other clients is restricted</w:t>
-      </w:r>
-    </w:p>
-    <w:p>
-      <w:r>
-        <w:t>* “pursuing business opportunities” is restricted</w:t>
-      </w:r>
-    </w:p>
-    <w:p>
-      <w:r>
-        <w:t>* “refrain from entering into any new business relationship”</w:t>
-      </w:r>
-    </w:p>
-    <w:p>
-      <w:r>
-        <w:t>* “not directly or indirectly contact, or negotiate with, a third party regarding a potential business relationship”</w:t>
-      </w:r>
-    </w:p>
-    <w:p>
-      <w:r>
-        <w:t>* “persuade any customer” to cease, reduce, or discontinue business</w:t>
-      </w:r>
-    </w:p>
-    <w:p>
-      <w:r>
-        <w:t>* “induce any customer” to cease, reduce, or discontinue business</w:t>
-      </w:r>
-    </w:p>
-    <w:p>
-      <w:r>
-        <w:t>* “persuade any vendor” to cease, reduce, or discontinue business</w:t>
-      </w:r>
-    </w:p>
-    <w:p>
-      <w:r>
-        <w:lastRenderedPageBreak/>
-        <w:t>* “induce any vendor” to cease, reduce, or discontinue business</w:t>
-      </w:r>
-    </w:p>
-    <w:p>
-      <w:r>
-        <w:t>* “cease purchasing goods or services”</w:t>
-      </w:r>
-    </w:p>
-    <w:p>
-      <w:r>
-        <w:t>* “cease selling goods and services”</w:t>
-      </w:r>
-    </w:p>
-    <w:p>
-      <w:r>
-        <w:t>* “reduce or discontinue any business relationship”</w:t>
-      </w:r>
-    </w:p>
-    <w:p>
-      <w:r>
-        <w:t>* “prevented or restricted from performing services”</w:t>
-      </w:r>
-    </w:p>
-    <w:p>
-      <w:r>
-        <w:t>* “prevented or restricted from pursuing business opportunities”</w:t>
-      </w:r>
-    </w:p>
-    <w:p>
-      <w:r>
-        <w:t>* “direct competitor of the Client”</w:t>
-      </w:r>
-    </w:p>
-    <w:p>
-      <w:r>
-        <w:t>* “contracted to, working for, or consulting for”</w:t>
-      </w:r>
-    </w:p>
-    <w:p>
-      <w:r>
-        <w:t>* “working for, or consulting for any company which is a direct competitor”</w:t>
-      </w:r>
-    </w:p>
-    <w:p>
-      <w:r>
-        <w:t>* “indicate to you immediately” combined with “direct competitor”</w:t>
-      </w:r>
-    </w:p>
-    <w:p>
-      <w:r>
-        <w:t>* “notify” or “indicate” combined with “direct competitor of the Client”</w:t>
-      </w:r>
-    </w:p>
-    <w:p>
-      <w:r>
-        <w:t>* “disclose” or “report” combined with “working for” and “direct competitor”</w:t>
-      </w:r>
-    </w:p>
-    <w:p>
-      <w:r>
-        <w:t>* Clause contains BOTH:</w:t>
-      </w:r>
-    </w:p>
-    <w:p>
-      <w:r>
-        <w:t xml:space="preserve">  * “direct competitor of the Client”</w:t>
-      </w:r>
-    </w:p>
-    <w:p>
-      <w:r>
-        <w:t xml:space="preserve">  * “contracted to, working for, or consulting for”</w:t>
-      </w:r>
-    </w:p>
-    <w:p>
-      <w:r>
-        <w:t>* Clause contains BOTH:</w:t>
-      </w:r>
-    </w:p>
-    <w:p>
-      <w:r>
-        <w:t xml:space="preserve">  * “direct competitor”</w:t>
-      </w:r>
-    </w:p>
-    <w:p>
-      <w:r>
-        <w:t xml:space="preserve">  * “working for, or consulting for”</w:t>
-      </w:r>
-    </w:p>
-    <w:p>
-      <w:r>
-        <w:t>* Clause contains ALL of the following:</w:t>
-      </w:r>
-    </w:p>
-    <w:p>
-      <w:r>
-        <w:t xml:space="preserve">  * “indicate”</w:t>
-      </w:r>
-    </w:p>
-    <w:p>
-      <w:r>
-        <w:t xml:space="preserve">  * “working for”</w:t>
-      </w:r>
-    </w:p>
-    <w:p>
-      <w:r>
-        <w:t xml:space="preserve">  * “consulting for”</w:t>
-      </w:r>
-    </w:p>
-    <w:p>
-      <w:r>
-        <w:t xml:space="preserve">  * “direct competitor”</w:t>
-      </w:r>
-    </w:p>
-    <w:p>
-      <w:r>
-        <w:t xml:space="preserve"> </w:t>
-      </w:r>
-    </w:p>
-    <w:p>
-      <w:r>
-        <w:t>## Do NOT Trigger</w:t>
-      </w:r>
-    </w:p>
-    <w:p>
-      <w:r>
-        <w:t>* Restrictions solely prevent misuse of confidential information for competitive purposes</w:t>
-      </w:r>
-    </w:p>
-    <w:p>
-      <w:r>
-        <w:lastRenderedPageBreak/>
-        <w:t>* Standard confidentiality obligations that do not restrict business activities</w:t>
-      </w:r>
-    </w:p>
-    <w:p>
-      <w:r>
-        <w:t>* Provisions explicitly confirming parties may compete freely</w:t>
-      </w:r>
-    </w:p>
-    <w:p>
-      <w:r>
-        <w:t>* “exclusive jurisdiction” / “submit to the exclusive jurisdiction”</w:t>
-      </w:r>
-    </w:p>
-    <w:p>
-      <w:r>
-        <w:t>* “exclusive right to” in the context of court remedies or legal proceedings</w:t>
-      </w:r>
-    </w:p>
-    <w:p>
-      <w:r>
-        <w:t>* “exclusive property of the Disclosing Party” in a Confidential Information ownership clause</w:t>
-      </w:r>
-    </w:p>
-    <w:p>
-      <w:r>
-        <w:t>* “sole and exclusive property” in an IP ownership context</w:t>
-      </w:r>
-    </w:p>
-    <w:p>
-      <w:r>
-        <w:t>* Clause only limits use of Confidential Information to the Purpose or Project</w:t>
-      </w:r>
-    </w:p>
-    <w:p>
-      <w:r>
-        <w:t>* Clause only prohibits use of Confidential Information for purposes outside the NDA purpose</w:t>
-      </w:r>
-    </w:p>
-    <w:p>
-      <w:r>
-        <w:t>* Clause only prohibits contacting customers, suppliers, vendors, or connected persons for appraisal, evaluation, due diligence, Project review, or confidentiality-control purposes</w:t>
-      </w:r>
-    </w:p>
-    <w:p>
-      <w:r>
-        <w:t>* Clause only requires prior written consent before contacting customers, suppliers, vendors, or connected persons, without restricting competition, future services, market participation, or independent business activities</w:t>
-      </w:r>
-    </w:p>
-    <w:p>
-      <w:r>
-        <w:t>* Clause contains “make contact, directly or indirectly” but does not contain a clear competition, exclusivity, future-services, market-participation, customer-diversion, vendor-diversion, or business-opportunity restriction</w:t>
-      </w:r>
-    </w:p>
-    <w:p>
-      <w:r>
-        <w:t>* Clause contains “customer” or “supplier” but does not require the customer or supplier to cease, reduce, discontinue, or refrain from doing business with the Disclosing Party</w:t>
-      </w:r>
-    </w:p>
-    <w:p>
-      <w:r>
         <w:t>* Clause contains “customer” or “supplier” but does not restrict Accenture from providing services to third parties, competitors, or other clients</w:t>
       </w:r>
     </w:p>
@@ -2616,7 +2727,6 @@
     </w:p>
     <w:p>
       <w:r>
-        <w:lastRenderedPageBreak/>
         <w:t>* Do NOT route Non-Compete / Exclusivity where “competitor” appears only to exclude competitor consultants, advisors, or representatives from receiving Confidential Information, without requiring Accenture to disclose, notify, indicate, report, limit, stop, or avoid work with a competitor.</w:t>
       </w:r>
     </w:p>
@@ -28003,15 +28113,6 @@
 </file>
 
 <file path=customXml/item1.xml><?xml version="1.0" encoding="utf-8"?>
-<?mso-contentType ?>
-<FormTemplates xmlns="http://schemas.microsoft.com/sharepoint/v3/contenttype/forms">
-  <Display>DocumentLibraryForm</Display>
-  <Edit>DocumentLibraryForm</Edit>
-  <New>DocumentLibraryForm</New>
-</FormTemplates>
-</file>
-
-<file path=customXml/item2.xml><?xml version="1.0" encoding="utf-8"?>
 <p:properties xmlns:p="http://schemas.microsoft.com/office/2006/metadata/properties" xmlns:xsi="http://www.w3.org/2001/XMLSchema-instance" xmlns:pc="http://schemas.microsoft.com/office/infopath/2007/PartnerControls">
   <documentManagement>
     <TaxCatchAll xmlns="58fb48c5-ad38-47d1-9aa6-9b4f1dc114f9" xsi:nil="true"/>
@@ -28021,6 +28122,15 @@
     <Reusable xmlns="aba9ad68-f961-4806-8372-ded3e8039a5f">true</Reusable>
   </documentManagement>
 </p:properties>
+</file>
+
+<file path=customXml/item2.xml><?xml version="1.0" encoding="utf-8"?>
+<?mso-contentType ?>
+<FormTemplates xmlns="http://schemas.microsoft.com/sharepoint/v3/contenttype/forms">
+  <Display>DocumentLibraryForm</Display>
+  <Edit>DocumentLibraryForm</Edit>
+  <New>DocumentLibraryForm</New>
+</FormTemplates>
 </file>
 
 <file path=customXml/item3.xml><?xml version="1.0" encoding="utf-8"?>
@@ -28291,20 +28401,20 @@
 </file>
 
 <file path=customXml/itemProps1.xml><?xml version="1.0" encoding="utf-8"?>
-<ds:datastoreItem xmlns:ds="http://schemas.openxmlformats.org/officeDocument/2006/customXml" ds:itemID="{C6DFF534-1887-4C42-BC36-EDACE7DE72C0}">
-  <ds:schemaRefs>
-    <ds:schemaRef ds:uri="http://schemas.microsoft.com/sharepoint/v3/contenttype/forms"/>
-  </ds:schemaRefs>
-</ds:datastoreItem>
-</file>
-
-<file path=customXml/itemProps2.xml><?xml version="1.0" encoding="utf-8"?>
 <ds:datastoreItem xmlns:ds="http://schemas.openxmlformats.org/officeDocument/2006/customXml" ds:itemID="{25BAFF0C-A05A-49CE-A308-E2413E02AFCD}">
   <ds:schemaRefs>
     <ds:schemaRef ds:uri="http://schemas.microsoft.com/office/2006/metadata/properties"/>
     <ds:schemaRef ds:uri="http://schemas.microsoft.com/office/infopath/2007/PartnerControls"/>
     <ds:schemaRef ds:uri="58fb48c5-ad38-47d1-9aa6-9b4f1dc114f9"/>
     <ds:schemaRef ds:uri="aba9ad68-f961-4806-8372-ded3e8039a5f"/>
+  </ds:schemaRefs>
+</ds:datastoreItem>
+</file>
+
+<file path=customXml/itemProps2.xml><?xml version="1.0" encoding="utf-8"?>
+<ds:datastoreItem xmlns:ds="http://schemas.openxmlformats.org/officeDocument/2006/customXml" ds:itemID="{C6DFF534-1887-4C42-BC36-EDACE7DE72C0}">
+  <ds:schemaRefs>
+    <ds:schemaRef ds:uri="http://schemas.microsoft.com/sharepoint/v3/contenttype/forms"/>
   </ds:schemaRefs>
 </ds:datastoreItem>
 </file>

</xml_diff>

<commit_message>
Adjust orchestrator IP Triage
</commit_message>
<xml_diff>
--- a/docs/orchestrator_kb.docx
+++ b/docs/orchestrator_kb.docx
@@ -1480,16 +1480,26 @@
     </w:p>
     <w:p>
       <w:r>
-        <w:t>* “ownership of all intellectual property disclosed”</w:t>
-      </w:r>
-    </w:p>
-    <w:p>
-      <w:r>
         <w:t>* Clause contains BOTH:</w:t>
       </w:r>
     </w:p>
     <w:p>
       <w:r>
+        <w:t xml:space="preserve">  * “grant ownership”</w:t>
+      </w:r>
+    </w:p>
+    <w:p>
+      <w:r>
+        <w:t xml:space="preserve">  * “intellectual property”</w:t>
+      </w:r>
+    </w:p>
+    <w:p>
+      <w:r>
+        <w:t>* Clause contains BOTH:</w:t>
+      </w:r>
+    </w:p>
+    <w:p>
+      <w:r>
         <w:t xml:space="preserve">  * “grants ownership”</w:t>
       </w:r>
     </w:p>
@@ -1585,93 +1595,93 @@
     </w:p>
     <w:p>
       <w:r>
+        <w:lastRenderedPageBreak/>
         <w:t>* Clause only states that intellectual property rights in, emanating from, derived from, or related to Confidential Information belong to the Disclosing Party</w:t>
       </w:r>
     </w:p>
     <w:p>
       <w:r>
+        <w:t>* Clause only confirms that the Receiving Party / Receiver / Recipient has no rights in respect of Confidential Information except rights expressly granted under the Agreement</w:t>
+      </w:r>
+    </w:p>
+    <w:p>
+      <w:r>
+        <w:t>* Clause only confirms that Confidential Information and related intellectual property rights remain owned by the Disclosing Party</w:t>
+      </w:r>
+    </w:p>
+    <w:p>
+      <w:r>
+        <w:t>* Clause contains ownership-retention language related only to Confidential Information, and does not contain assignment, transfer, vesting, waiver, work product, developed work, works made for hire, inventions assigned, moral rights waiver, deliverables, or feedback ownership language</w:t>
+      </w:r>
+    </w:p>
+    <w:p>
+      <w:r>
+        <w:t>* Do NOT route IP Ownership / Transfer if the clause only confirms ownership or retention of the Disclosing Party’s pre-existing Confidential Information or related intellectual property rights</w:t>
+      </w:r>
+    </w:p>
+    <w:p>
+      <w:r>
+        <w:t>* Do NOT route IP Ownership / Transfer where “property of the Company” or “property of the Disclosing Party” refers only to pre-existing Confidential Information and does not include deliverables, project results, work product, developed work, inventions, copyright, assignment, transfer, vesting, waiver, or feedback ownership language.</w:t>
+      </w:r>
+    </w:p>
+    <w:p>
+      <w:r>
+        <w:t>* Do NOT suppress IP Ownership / Transfer based only on a separate no-license clause if another clause expressly states that deliverables, project results, developed work, or work product will be property of the counterparty.</w:t>
+      </w:r>
+    </w:p>
+    <w:p>
+      <w:r>
+        <w:t xml:space="preserve"> </w:t>
+      </w:r>
+    </w:p>
+    <w:p>
+      <w:r>
+        <w:t>---</w:t>
+      </w:r>
+    </w:p>
+    <w:p>
+      <w:r>
+        <w:t xml:space="preserve"> </w:t>
+      </w:r>
+    </w:p>
+    <w:p>
+      <w:r>
+        <w:t># 5. Non-Solicitation Obligations</w:t>
+      </w:r>
+    </w:p>
+    <w:p>
+      <w:r>
+        <w:t>Type: COMMERCIAL / OPERATIONAL</w:t>
+      </w:r>
+    </w:p>
+    <w:p>
+      <w:r>
+        <w:t>## Definition</w:t>
+      </w:r>
+    </w:p>
+    <w:p>
+      <w:r>
+        <w:t>Restricts the solicitation, recruitment, hiring, employment, engagement, or retention of the other party’s employees, contractors, consultants, directors, officers, agents, or personnel.</w:t>
+      </w:r>
+    </w:p>
+    <w:p>
+      <w:r>
+        <w:t>## Non-Solicitation Snippet Extraction Rule</w:t>
+      </w:r>
+    </w:p>
+    <w:p>
+      <w:r>
+        <w:t>For Non-Solicitation triage only, if any Non-Solicitation Triage Signal is detected, the extracted snippet MUST include:</w:t>
+      </w:r>
+    </w:p>
+    <w:p>
+      <w:r>
         <w:lastRenderedPageBreak/>
-        <w:t>* Clause only confirms that the Receiving Party / Receiver / Recipient has no rights in respect of Confidential Information except rights expressly granted under the Agreement</w:t>
-      </w:r>
-    </w:p>
-    <w:p>
-      <w:r>
-        <w:t>* Clause only confirms that Confidential Information and related intellectual property rights remain owned by the Disclosing Party</w:t>
-      </w:r>
-    </w:p>
-    <w:p>
-      <w:r>
-        <w:t>* Clause contains ownership-retention language related only to Confidential Information, and does not contain assignment, transfer, vesting, waiver, work product, developed work, works made for hire, inventions assigned, moral rights waiver, deliverables, or feedback ownership language</w:t>
-      </w:r>
-    </w:p>
-    <w:p>
-      <w:r>
-        <w:t>* Do NOT route IP Ownership / Transfer if the clause only confirms ownership or retention of the Disclosing Party’s pre-existing Confidential Information or related intellectual property rights</w:t>
-      </w:r>
-    </w:p>
-    <w:p>
-      <w:r>
-        <w:t>* Do NOT route IP Ownership / Transfer where “property of the Company” or “property of the Disclosing Party” refers only to pre-existing Confidential Information and does not include deliverables, project results, work product, developed work, inventions, copyright, assignment, transfer, vesting, waiver, or feedback ownership language.</w:t>
-      </w:r>
-    </w:p>
-    <w:p>
-      <w:r>
-        <w:t>* Do NOT suppress IP Ownership / Transfer based only on a separate no-license clause if another clause expressly states that deliverables, project results, developed work, or work product will be property of the counterparty.</w:t>
-      </w:r>
-    </w:p>
-    <w:p>
-      <w:r>
-        <w:t xml:space="preserve"> </w:t>
-      </w:r>
-    </w:p>
-    <w:p>
-      <w:r>
-        <w:t>---</w:t>
-      </w:r>
-    </w:p>
-    <w:p>
-      <w:r>
-        <w:t xml:space="preserve"> </w:t>
-      </w:r>
-    </w:p>
-    <w:p>
-      <w:r>
-        <w:t># 5. Non-Solicitation Obligations</w:t>
-      </w:r>
-    </w:p>
-    <w:p>
-      <w:r>
-        <w:t>Type: COMMERCIAL / OPERATIONAL</w:t>
-      </w:r>
-    </w:p>
-    <w:p>
-      <w:r>
-        <w:t>## Definition</w:t>
-      </w:r>
-    </w:p>
-    <w:p>
-      <w:r>
-        <w:t>Restricts the solicitation, recruitment, hiring, employment, engagement, or retention of the other party’s employees, contractors, consultants, directors, officers, agents, or personnel.</w:t>
-      </w:r>
-    </w:p>
-    <w:p>
-      <w:r>
-        <w:t>## Non-Solicitation Snippet Extraction Rule</w:t>
-      </w:r>
-    </w:p>
-    <w:p>
-      <w:r>
-        <w:t>For Non-Solicitation triage only, if any Non-Solicitation Triage Signal is detected, the extracted snippet MUST include:</w:t>
-      </w:r>
-    </w:p>
-    <w:p>
-      <w:r>
         <w:t>* the full sentence containing the matched Triage Signal;</w:t>
       </w:r>
     </w:p>
     <w:p>
       <w:r>
-        <w:lastRenderedPageBreak/>
         <w:t>* the immediately preceding sentence, if any;</w:t>
       </w:r>
     </w:p>

</xml_diff>